<commit_message>
Denominadores reais CNES (T21/T22, razões exploratórias), testes pytest, CI, distribuição dos brutos e artigo com Figura 2 — validação convergente e determinismo verificado
</commit_message>
<xml_diff>
--- a/documentos/artigo.docx
+++ b/documentos/artigo.docx
@@ -87,7 +87,7 @@
           <w:i w:val="0"/>
           <w:sz w:val="22"/>
         </w:rPr>
-        <w:t>Método. Estudo teórico-conceitual e documental com apoio de dados secundários. A base empírica foi reconstruída integralmente a partir dos 58 arquivos brutos dos dados abertos da CAT/INSS (competências de jul./2018 a dez./2025; 3.902.905 linhas) (BRASIL, 2026), importados por posição ante quatro esquemas estruturais com cabeçalhos duplicados (CBO, CID-10, CNAE, “Data Acidente”), codificação detectada por arquivo e distinção estrita entre o mês de referência (coluna 2) e a data completa do acidente, usada nas análises temporais. O filtro municipal exigiu, simultaneamente, código do município do empregador igual a 330100 (extraído antes do hífen) e UF do empregador Rio de Janeiro, excluindo-se homônimos (Campos Novos, Campos do Jordão, Campos de Júlio, São José dos Campos etc.) e 12 registros com UF divergente. Removeram-se 537 duplicidades exatas entre arquivos de cobertura sobreposta (hash SHA-256 da linha bruta). A classificação ocupacional baseou-se nos códigos CBO 2002 de seis dígitos, com dicionário mestre auditado dos 459 códigos observados e três níveis: universo principal das profissões da saúde (medicina, enfermagem, odontologia/saúde bucal, farmácia, fisioterapia, nutrição, fonoaudiologia, técnicos e auxiliares de diagnóstico e laboratório, agentes comunitários e afins, instrumentação cirúrgica); profissões multiprofissionais intersetoriais (psicologia, serviço social, educação física, biologia), analisadas à parte com sensibilidade restrita a empregadores de CNAE 86/87; e trabalhadores de apoio em estabelecimentos de saúde, jamais somados às profissões da saúde. Registros sem CBO válido (184; 3,6%) foram mantidos em categoria própria. Sem denominadores ocupacionais disponíveis (RAIS/CNES), apresentam-se apenas frequências e proporções dentro do conjunto de CATs; células com n&lt;5 foram agregadas. Os totais foram reproduzidos por rotina independente, com convergência integral; análises de sensibilidade abrangeram exclusão de 2025 (parcial, até out.), meses equivalentes, exclusão de trajeto e universo restrito a CNAE saúde.</w:t>
+        <w:t>Método. Estudo teórico-conceitual e documental com apoio de dados secundários. A base empírica foi reconstruída integralmente a partir dos 58 arquivos brutos dos dados abertos da CAT/INSS (competências de jul./2018 a dez./2025; 3.902.905 linhas) (BRASIL, 2026a), importados por posição ante quatro esquemas estruturais com cabeçalhos duplicados (CBO, CID-10, CNAE, “Data Acidente”), codificação detectada por arquivo e distinção estrita entre o mês de referência (coluna 2) e a data completa do acidente, usada nas análises temporais. O filtro municipal exigiu, simultaneamente, código do município do empregador igual a 330100 (extraído antes do hífen) e UF do empregador Rio de Janeiro, excluindo-se homônimos (Campos Novos, Campos do Jordão, Campos de Júlio, São José dos Campos etc.) e 12 registros com UF divergente. Removeram-se 537 duplicidades exatas entre arquivos de cobertura sobreposta (hash SHA-256 da linha bruta). A classificação ocupacional baseou-se nos códigos CBO 2002 de seis dígitos, com dicionário mestre auditado dos 459 códigos observados e três níveis: universo principal das profissões da saúde (medicina, enfermagem, odontologia/saúde bucal, farmácia, fisioterapia, nutrição, fonoaudiologia, técnicos e auxiliares de diagnóstico e laboratório, agentes comunitários e afins, instrumentação cirúrgica); profissões multiprofissionais intersetoriais (psicologia, serviço social, educação física, biologia), analisadas à parte com sensibilidade restrita a empregadores de CNAE 86/87; e trabalhadores de apoio em estabelecimentos de saúde, jamais somados às profissões da saúde. Registros sem CBO válido (184; 3,6%) foram mantidos em categoria própria. Denominadores de força de trabalho foram extraídos do CNES/DataSUS — profissionais (indivíduos) por ocupação, em dezembro de cada ano, no município (BRASIL, 2026b) —, mas, por incluírem vínculos estatutários, autônomos e de pessoa jurídica não cobertos pela CAT, sustentam apenas razões exploratórias de densidade de comunicação, e não incidência; no mais, apresentam-se frequências e proporções dentro do conjunto de CATs, com agregação de células n&lt;5. Os totais foram reproduzidos por rotina independente, com convergência integral; análises de sensibilidade abrangeram exclusão de 2025 (parcial, até out.), meses equivalentes, exclusão de trajeto, somente típicos e universo restrito a CNAE 86/87.</w:t>
       </w:r>
     </w:p>
     <w:p>
@@ -132,7 +132,7 @@
           <w:i w:val="0"/>
           <w:sz w:val="22"/>
         </w:rPr>
-        <w:t>Os dados permitem afirmar a estrutura interna das comunicações registradas — quem aparece, com quais lesões, em quais vínculos e estabelecimentos —, e não permitem estimar incidência, prevalência ou risco ocupacional: diferenças entre categorias podem refletir tamanho das forças de trabalho, composição e formalização dos vínculos, terceirização, cobertura previdenciária, cultura institucional e subnotificação diferencial. Denominadores adequados (vínculos formais por CBO, município e ano, na RAIS/eSocial; profissionais do CNES) são o caminho para indicadores padronizados, condicionados à verificação de compatibilidade entre numerador e denominador.</w:t>
+        <w:t>Os dados permitem afirmar a estrutura interna das comunicações registradas — quem aparece, com quais lesões, em quais vínculos e estabelecimentos —, e não permitem estimar incidência, prevalência ou risco ocupacional: diferenças entre categorias podem refletir tamanho das forças de trabalho, composição e formalização dos vínculos, terceirização, cobertura previdenciária, cultura institucional e subnotificação diferencial. A robustez interna é alta: a predominância da enfermagem e a hierarquia das categorias mantêm-se em todas as análises de sensibilidade — exclusão de 2025, meses jan.–out., exclusão de trajeto, somente típicos e restrição a CNAE 86/87 (participação da enfermagem entre 84,4% e 86,3%). Denominadores reais do CNES/DataSUS — profissionais por ocupação em dezembro de cada ano, de 9.803 (2018) a 13.275 (2025) no município (BRASIL, 2026b) — permitem uma razão exploratória de densidade de comunicação, jamais de incidência, pois o CNES inclui vínculos estatutários, autônomos e de pessoa jurídica, fora da cobertura da CAT: nos anos de cobertura integral (2019–2021 e 2023), houve 29,5 a 43,5 CATs por 1.000 técnicos e auxiliares de enfermagem ao ano, 19,4 a 32,7 por 1.000 enfermeiros e, na medicina, no máximo 3,6 (2019; demais anos suprimidos por n&lt;5) — gradiente que reforça a leitura de proteção e notificação desiguais entre as categorias. Vínculos formais da RAIS/eSocial por CBO, município e ano permanecem como denominador prioritário para indicadores padronizados, condicionados à verificação de compatibilidade entre numerador e denominador.</w:t>
       </w:r>
     </w:p>
     <w:p>
@@ -147,7 +147,7 @@
           <w:i w:val="0"/>
           <w:sz w:val="22"/>
         </w:rPr>
-        <w:t>Considerações finais. Para a Vigilância em Saúde do Trabalhador e a gestão municipal, os resultados indicam prioridades concretas: proteger a base técnica da enfermagem — núcleo do cuidado e dos registros —, com ênfase em perfurocortantes e exposição biológica; enfrentar a subnotificação de doenças relacionadas ao trabalho e a invisibilidade de estatutários, terceirizados e informais, articulando CAT, RAIS, CNES e as notificações do SUS; qualificar o preenchimento (3,6% dos registros sem CBO válido, concentrados em 2021-2023); e planejar a rede — cuja sustentação financeira oscila com as rendas petrolíferas (MARTINS; HASENCLEVER; MIRANDA, 2024) — reconhecendo que a proteção dos que cuidam é condição do cuidado. Limitações: a CAT capta comunicações, não a totalidade dos acidentes; cobre essencialmente o emprego formal celetista, excluindo informais, autônomos e estatutários; não há denominadores ocupacionais; a cobertura da fonte é parcial em 2018 (competências desde jul.), irregular em 2022, atípica em set.-dez./2024 e incompleta em 2025 (até out.), o que restringe comparações anuais; registros sem CBO podem subestimar profissões da saúde em 2021-2023; e o desenho descritivo-documental não permite inferência causal.</w:t>
+        <w:t>Considerações finais. Para a Vigilância em Saúde do Trabalhador e a gestão municipal, os resultados indicam prioridades concretas: proteger a base técnica da enfermagem — núcleo do cuidado e dos registros —, com ênfase em perfurocortantes e exposição biológica; enfrentar a subnotificação de doenças relacionadas ao trabalho e a invisibilidade de estatutários, terceirizados e informais, articulando CAT, RAIS, CNES e as notificações do SUS; qualificar o preenchimento (3,6% dos registros sem CBO válido, concentrados em 2021-2023); e planejar a rede — cuja sustentação financeira oscila com as rendas petrolíferas (MARTINS; HASENCLEVER; MIRANDA, 2024) — reconhecendo que a proteção dos que cuidam é condição do cuidado. Limitações: a CAT capta comunicações, não a totalidade dos acidentes; cobre essencialmente o emprego formal celetista, excluindo informais, autônomos e estatutários; não há denominadores compatíveis para incidência — as razões com o CNES são exploratórias, pois o denominador inclui vínculos não celetistas —; a cobertura da fonte é parcial em 2018 (competências desde jul.), irregular em 2022, atípica em set.-dez./2024 e incompleta em 2025 (até out.), o que restringe comparações anuais; registros sem CBO podem subestimar profissões da saúde em 2021-2023; e o desenho descritivo-documental não permite inferência causal.</w:t>
       </w:r>
     </w:p>
     <w:p>
@@ -507,7 +507,61 @@
           <w:i w:val="0"/>
           <w:sz w:val="17"/>
         </w:rPr>
-        <w:t>Figura 1 – CATs de profissões da saúde (universo principal, n = 1.144) vinculadas a empregadores de Campos dos Goytacazes (RJ), por ano do acidente e categoria profissional, 2018–2025. Unidade: registros. Fonte: elaboração própria a partir de BRASIL (2026). *Cobertura parcial/irregular da fonte (2018: competências desde jul.; 2022: carga irregular; 2024: set.–dez. atípicos; 2025: até out.). Frequências de comunicação, não taxas de acidente.</w:t>
+        <w:t>Figura 1 – CATs de profissões da saúde (universo principal, n = 1.144) vinculadas a empregadores de Campos dos Goytacazes (RJ), por ano do acidente e categoria profissional, 2018–2025. Unidade: registros. Fonte: elaboração própria a partir de BRASIL (2026a). *Cobertura parcial/irregular da fonte (2018: competências desde jul.; 2022: carga irregular; 2024: set.–dez. atípicos; 2025: até out.). Frequências de comunicação, não taxas de acidente.</w:t>
+      </w:r>
+    </w:p>
+    <w:p>
+      <w:pPr>
+        <w:jc w:val="center"/>
+      </w:pPr>
+      <w:r>
+        <w:drawing>
+          <wp:inline xmlns:a="http://schemas.openxmlformats.org/drawingml/2006/main" xmlns:pic="http://schemas.openxmlformats.org/drawingml/2006/picture">
+            <wp:extent cx="5220000" cy="1869414"/>
+            <wp:docPr id="2" name="Picture 2"/>
+            <wp:cNvGraphicFramePr>
+              <a:graphicFrameLocks noChangeAspect="1"/>
+            </wp:cNvGraphicFramePr>
+            <a:graphic>
+              <a:graphicData uri="http://schemas.openxmlformats.org/drawingml/2006/picture">
+                <pic:pic>
+                  <pic:nvPicPr>
+                    <pic:cNvPr id="0" name="F2_serie_mensal_saude.png"/>
+                    <pic:cNvPicPr/>
+                  </pic:nvPicPr>
+                  <pic:blipFill>
+                    <a:blip r:embed="rId10"/>
+                    <a:stretch>
+                      <a:fillRect/>
+                    </a:stretch>
+                  </pic:blipFill>
+                  <pic:spPr>
+                    <a:xfrm>
+                      <a:off x="0" y="0"/>
+                      <a:ext cx="5220000" cy="1869414"/>
+                    </a:xfrm>
+                    <a:prstGeom prst="rect"/>
+                  </pic:spPr>
+                </pic:pic>
+              </a:graphicData>
+            </a:graphic>
+          </wp:inline>
+        </w:drawing>
+      </w:r>
+    </w:p>
+    <w:p>
+      <w:pPr>
+        <w:spacing w:before="0" w:after="80"/>
+        <w:ind w:firstLine="0"/>
+        <w:jc w:val="both"/>
+      </w:pPr>
+      <w:r>
+        <w:rPr>
+          <w:b w:val="0"/>
+          <w:i w:val="0"/>
+          <w:sz w:val="17"/>
+        </w:rPr>
+        <w:t>Figura 2 – Distribuição mensal das CATs de profissões da saúde (universo principal, n = 1.144), empregadores de Campos dos Goytacazes (RJ), jan./2018–dez./2025, com destaque para o período crítico da covid-19 (mar./2020–dez./2021). Unidade: registros/mês. Fonte: elaboração própria a partir de BRASIL (2026a). As oscilações também refletem a cobertura da fonte (ver notas da Figura 1); médias mensais: 10,7 (pré-pandemia), 14,5 (período crítico) e 11,9 (pós-crítico).</w:t>
       </w:r>
     </w:p>
     <w:p>
@@ -1028,7 +1082,7 @@
           <w:i w:val="0"/>
           <w:sz w:val="17"/>
         </w:rPr>
-        <w:t>Fonte: elaboração própria a partir de BRASIL (2026). Idade mediana: 36 anos. Percentuais sobre o total de registros do universo principal; sexo ignorado em 4 registros; um óbito registrado.</w:t>
+        <w:t>Fonte: elaboração própria a partir de BRASIL (2026a). Idade mediana: 36 anos. Percentuais sobre o total de registros do universo principal; sexo ignorado em 4 registros; um óbito registrado.</w:t>
       </w:r>
     </w:p>
     <w:p>
@@ -1071,7 +1125,21 @@
           <w:i w:val="0"/>
           <w:sz w:val="19"/>
         </w:rPr>
-        <w:t>BRASIL. Instituto Nacional do Seguro Social. Comunicações de Acidente de Trabalho – CAT: dados abertos, competências jul. 2018–dez. 2025. Brasília, DF: INSS, 2026. Disponível em: https://dados.gov.br/dados/conjuntos-dados/inss-comunicacao-de-acidente-de-trabalho-cat. Acesso em: 18 jul. 2026.</w:t>
+        <w:t>BRASIL. Instituto Nacional do Seguro Social. Comunicações de Acidente de Trabalho – CAT: dados abertos, competências jul. 2018–dez. 2025. Brasília, DF: INSS, 2026a. Disponível em: https://dados.gov.br/dados/conjuntos-dados/inss-comunicacao-de-acidente-de-trabalho-cat. Acesso em: 18 jul. 2026.</w:t>
+      </w:r>
+    </w:p>
+    <w:p>
+      <w:pPr>
+        <w:spacing w:before="0" w:after="40"/>
+        <w:ind w:firstLine="0"/>
+      </w:pPr>
+      <w:r>
+        <w:rPr>
+          <w:b w:val="0"/>
+          <w:i w:val="0"/>
+          <w:sz w:val="19"/>
+        </w:rPr>
+        <w:t>BRASIL. Ministério da Saúde. DATASUS. CNES – Recursos Humanos – Profissionais – Indivíduos – segundo CBO 2002 – Rio de Janeiro. Brasília, DF: Ministério da Saúde, 2026b. TabNet. Disponível em: http://tabnet.datasus.gov.br. Acesso em: 18 jul. 2026.</w:t>
       </w:r>
     </w:p>
     <w:p>

</xml_diff>

<commit_message>
Título acadêmico curto, citações NBR 10520:2023 (caixa alternada), gráficos Cell Press 600dpi+SVG, periódicos em negrito, estrangeirismos em itálico, sem travessão, sem resumo/palavras-chave — Ryan Santos
</commit_message>
<xml_diff>
--- a/documentos/artigo.docx
+++ b/documentos/artigo.docx
@@ -4,45 +4,32 @@
   <w:body>
     <w:p>
       <w:pPr>
-        <w:spacing w:after="120"/>
+        <w:spacing w:before="0" w:after="80"/>
+        <w:ind w:firstLine="0"/>
         <w:jc w:val="center"/>
       </w:pPr>
       <w:r>
         <w:rPr>
           <w:b/>
+          <w:i w:val="0"/>
           <w:sz w:val="24"/>
         </w:rPr>
-        <w:t>Saúde do trabalhador em Campos dos Goytacazes: formação histórico-social e perfil das comunicações de acidentes de trabalho entre profissões da saúde, 2018–2025</w:t>
+        <w:t>Comunicações de Acidente de Trabalho nas profissões da saúde em Campos dos Goytacazes, 2018-2025</w:t>
       </w:r>
     </w:p>
     <w:p>
       <w:pPr>
-        <w:spacing w:before="0" w:after="40"/>
+        <w:spacing w:before="0" w:after="160"/>
         <w:ind w:firstLine="0"/>
-        <w:jc w:val="both"/>
+        <w:jc w:val="center"/>
       </w:pPr>
       <w:r>
         <w:rPr>
           <w:b w:val="0"/>
           <w:i w:val="0"/>
-          <w:sz w:val="20"/>
+          <w:sz w:val="21"/>
         </w:rPr>
-        <w:t>Resumo: Objetivou-se analisar, à luz da formação histórico-social e econômica de Campos dos Goytacazes (RJ), o perfil das Comunicações de Acidente de Trabalho (CAT) vinculadas a empregadores do município entre as profissões da saúde, de 2018 a 2025. Estudo teórico-conceitual, com análise documental e dados secundários: fontes teóricas da Saúde do Trabalhador e da sociologia do trabalho, caracterização municipal (IBGE) e reconstrução integral e auditada dos dados abertos da CAT/INSS (58 arquivos; 3.902.905 registros), com filtro pelo código do município do empregador (330100) e UF, classificação ocupacional por códigos CBO 2002 e validação independente. Identificaram-se 5.066 CATs de empregadores do município, das quais 1.144 (22,6%) de profissões da saúde: 84,4% da enfermagem (70,2% de técnicos e auxiliares) e apenas 1,0% da medicina; predominaram mulheres (85,7%), acidentes típicos (81,9%), ferimentos de dedos e mãos e exposição a material biológico (26,9%); doenças relacionadas ao trabalho somaram 1,0%. A média mensal de registros elevou-se no período crítico da covid-19. O padrão expressa a divisão social e técnica do trabalho em saúde e desigualdades de proteção e de notificação conformadas pela trajetória econômica local, marcada pela transição do açúcar ao petróleo e pela dependência fiscal. Frequências de registro não medem risco; recomenda-se qualificar registros e incorporar denominadores (RAIS/CNES) à vigilância.</w:t>
-      </w:r>
-    </w:p>
-    <w:p>
-      <w:pPr>
-        <w:spacing w:before="0" w:after="120"/>
-        <w:ind w:firstLine="0"/>
-        <w:jc w:val="both"/>
-      </w:pPr>
-      <w:r>
-        <w:rPr>
-          <w:b w:val="0"/>
-          <w:i w:val="0"/>
-          <w:sz w:val="20"/>
-        </w:rPr>
-        <w:t>Palavras-chave: Saúde do Trabalhador; Acidentes de Trabalho; Notificação de Acidentes de Trabalho; Pessoal de Saúde; Desenvolvimento Regional.</w:t>
+        <w:t>Ryan de Paulo Santos</w:t>
       </w:r>
     </w:p>
     <w:p>
@@ -57,7 +44,7 @@
           <w:i w:val="0"/>
           <w:sz w:val="22"/>
         </w:rPr>
-        <w:t>O trabalho, entendido como processo social, econômico, político e técnico — e não como mero local de exposição a riscos —, é historicamente determinado: da disciplinarização fabril inaugurada pela Revolução Industrial às reconfigurações contemporâneas, o modo de organizar a produção modela corpos, tempos e adoecimentos (OLIVEIRA, 2004). As teses do “fim do trabalho” não se sustentam: o que houve foi deslocamento e ampliação da classe trabalhadora para os serviços, setor em que hoje se concentram precarização, terceirização e intensificação (LOURENÇO, 2012; ANTUNES, 2018). No Brasil, o campo da Saúde do Trabalhador constituiu-se, a partir da crítica à medicina do trabalho e à saúde ocupacional, como leitura da determinação social do processo saúde-doença ancorada no processo de trabalho e no protagonismo dos trabalhadores (MENDES; DIAS, 1991). No setor saúde, esse referencial ganha densidade: o trabalho em saúde produz cuidado, mas se realiza sob divisão social e técnica do trabalho, relações de poder entre categorias, cargas e desgaste, num contexto de reorganização gerencial-flexível dos serviços em que parcela expressiva dos vínculos do SUS — estimada entre 30% e 50% — carece de proteção plena de direitos (CECILIO; LACAZ, 2012). Este artigo analisa, à luz da formação histórico-social e econômica de Campos dos Goytacazes (RJ), o perfil das CATs vinculadas a empregadores do município entre as diferentes profissões da saúde, de 2018 a 2025.</w:t>
+        <w:t>O trabalho é um processo social, econômico, político e técnico, historicamente determinado, e não apenas um local de exposição a riscos. Desde a Revolução Industrial, o modo de organizar a produção disciplina corpos e tempos e produz padrões específicos de adoecimento (OLIVEIRA, 2004). As teses do fim da centralidade do trabalho não se confirmaram: houve deslocamento da classe trabalhadora para o setor de serviços, no qual hoje se concentram precarização, terceirização e intensificação (LOURENÇO, 2012; ANTUNES, 2018). No Brasil, o campo da Saúde do Trabalhador constituiu-se como crítica à medicina do trabalho e à saúde ocupacional, ao afirmar a determinação social do processo saúde-doença e o processo de trabalho como categoria explicativa central (MENDES; DIAS, 1991). No setor saúde, essa perspectiva exige considerar que o trabalho produtor do cuidado se realiza sob divisão social e técnica do trabalho, relações desiguais de poder entre categorias, cargas de trabalho e desgaste, em serviços submetidos à reorganização gerencial flexível e à desproteção de parcela expressiva dos vínculos do Sistema Único de Saúde (SUS), estimada entre 30% e 50% (CECILIO; LACAZ, 2012). Este artigo analisa, à luz da formação histórico-social e econômica de Campos dos Goytacazes (RJ), o perfil das Comunicações de Acidente de Trabalho (CAT) vinculadas a empregadores do município entre as diferentes profissões da saúde, no período de 2018 a 2025.</w:t>
       </w:r>
     </w:p>
     <w:p>
@@ -72,82 +59,23 @@
           <w:i w:val="0"/>
           <w:sz w:val="22"/>
         </w:rPr>
-        <w:t>Campos dos Goytacazes, maior município fluminense em extensão (4.032,5 km²; 483.540 habitantes no Censo 2022), formou-se sobre a economia açucareira colonial — engenhos e depois usinas assentados em concentração fundiária e no trabalho escravizado — e conheceu, ao longo do século XX, a decadência da agroindústria canavieira, substituída, desde os anos 1980-1990, pela centralidade da exploração de petróleo da Bacia de Campos e das rendas petrolíferas (SILVA; HASENCLEVER, 2019). Os dados oficiais evidenciam uma economia oscilante e dependente: o PIB a preços correntes saltou a R$ 58,4 bilhões em 2013, caiu a R$ 23,9 bilhões em 2020 e retornou a R$ 43,0 bilhões em 2023; a indústria (dominada pela atividade extrativa) respondeu por 66,4% do valor adicionado em 2013 e 40,8% em 2020, enquanto a agropecuária — apesar da identidade “agro” do discurso local — representou apenas 1,0% em 2021, com a produção de cana caindo de 4,28 milhões de toneladas (2005) para 1,29 milhão (2023) (IBGE, 2026). Silva e Hasenclever (2019) demonstram que o ciclo do petróleo (1999-2014) elevou arrecadação e PIB sem diversificação produtiva correspondente nem desenvolvimento social equivalente — riqueza fiscal convivendo com desigualdade e emprego concentrado em serviços de baixa remuneração. Essa contradição alcança diretamente a saúde: o financiamento municipal acompanhou as flutuações das rendas de indenizações petrolíferas entre 2009 e 2020, fragilizando a gestão da rede (MARTINS; HASENCLEVER; MIRANDA, 2024). Nesse mercado de trabalho, os serviços de saúde — polo regional de referência do Norte Fluminense — constituem importante espaço de assalariamento, sobretudo feminino, estratificado por hierarquias de renda, prestígio e fechamento social entre profissões, na acepção weberiana de classe e estamento (LEMOS, 2012).</w:t>
+        <w:t>Campos dos Goytacazes é o maior município fluminense em extensão (4.032,5 km²) e contava com 483.540 habitantes no Censo de 2022 (IBGE, 2026). Sua formação econômica assentou-se na agroindústria açucareira, organizada desde o período colonial sobre a grande propriedade e o trabalho escravizado e, posteriormente, sobre as usinas; ao longo do século XX essa base entrou em prolongada decadência e, a partir das décadas de 1980 e 1990, cedeu lugar à centralidade da exploração de petróleo da Bacia de Campos e das rendas petrolíferas (</w:t>
       </w:r>
-    </w:p>
-    <w:p>
-      <w:pPr>
-        <w:spacing w:before="0" w:after="40"/>
-        <w:ind w:firstLine="709"/>
-        <w:jc w:val="both"/>
-      </w:pPr>
+      <w:r>
+        <w:rPr>
+          <w:b w:val="0"/>
+          <w:i/>
+          <w:sz w:val="22"/>
+        </w:rPr>
+        <w:t>royalties</w:t>
+      </w:r>
       <w:r>
         <w:rPr>
           <w:b w:val="0"/>
           <w:i w:val="0"/>
           <w:sz w:val="22"/>
         </w:rPr>
-        <w:t>Método. Estudo teórico-conceitual e documental com apoio de dados secundários. A base empírica foi reconstruída integralmente a partir dos 58 arquivos brutos dos dados abertos da CAT/INSS (competências de jul./2018 a dez./2025; 3.902.905 linhas) (BRASIL, 2026a), importados por posição ante quatro esquemas estruturais com cabeçalhos duplicados (CBO, CID-10, CNAE, “Data Acidente”), codificação detectada por arquivo e distinção estrita entre o mês de referência (coluna 2) e a data completa do acidente, usada nas análises temporais. O filtro municipal exigiu, simultaneamente, código do município do empregador igual a 330100 (extraído antes do hífen) e UF do empregador Rio de Janeiro, excluindo-se homônimos (Campos Novos, Campos do Jordão, Campos de Júlio, São José dos Campos etc.) e 12 registros com UF divergente. Removeram-se 537 duplicidades exatas entre arquivos de cobertura sobreposta (hash SHA-256 da linha bruta). A classificação ocupacional baseou-se nos códigos CBO 2002 de seis dígitos, com dicionário mestre auditado dos 459 códigos observados e três níveis: universo principal das profissões da saúde (medicina, enfermagem, odontologia/saúde bucal, farmácia, fisioterapia, nutrição, fonoaudiologia, técnicos e auxiliares de diagnóstico e laboratório, agentes comunitários e afins, instrumentação cirúrgica); profissões multiprofissionais intersetoriais (psicologia, serviço social, educação física, biologia), analisadas à parte com sensibilidade restrita a empregadores de CNAE 86/87; e trabalhadores de apoio em estabelecimentos de saúde, jamais somados às profissões da saúde. Registros sem CBO válido (184; 3,6%) foram mantidos em categoria própria. Denominadores de força de trabalho foram extraídos do CNES/DataSUS — profissionais (indivíduos) por ocupação, em dezembro de cada ano, no município (BRASIL, 2026b) —, mas, por incluírem vínculos estatutários, autônomos e de pessoa jurídica não cobertos pela CAT, sustentam apenas razões exploratórias de densidade de comunicação, e não incidência; no mais, apresentam-se frequências e proporções dentro do conjunto de CATs, com agregação de células n&lt;5. Os totais foram reproduzidos por rotina independente, com convergência integral; análises de sensibilidade abrangeram exclusão de 2025 (parcial, até out.), meses equivalentes, exclusão de trajeto, somente típicos e universo restrito a CNAE 86/87.</w:t>
-      </w:r>
-    </w:p>
-    <w:p>
-      <w:pPr>
-        <w:spacing w:before="0" w:after="40"/>
-        <w:ind w:firstLine="709"/>
-        <w:jc w:val="both"/>
-      </w:pPr>
-      <w:r>
-        <w:rPr>
-          <w:b w:val="0"/>
-          <w:i w:val="0"/>
-          <w:sz w:val="22"/>
-        </w:rPr>
-        <w:t>Das 5.066 CATs de empregadores de Campos, 1.144 (22,6%) referem-se ao universo principal das profissões da saúde — proporção que, por si, indica o peso do polo assistencial no emprego formal celetista local. A distribuição interna (Tabela 2) é fortemente assimétrica: a enfermagem concentra 84,4% dos registros (técnicos e auxiliares, 70,2%; enfermeiros, 14,2%), seguida de técnicos e auxiliares de diagnóstico e laboratório (6,8%) e fisioterapia (2,6%); a medicina soma 1,0%. Predominam mulheres (85,7%), idade mediana de 36 anos, acidentes típicos (81,9%; trajeto, 17,1%), ferimentos de punho e mãos (CID S61, 25,1%; “dedo” como parte atingida, 43,9%) e contato/exposição a doenças transmissíveis (Z20, 21,9%); agentes infecciosos e produtos biológicos respondem por 26,9% dos agentes causadores. Quase a totalidade dos empregadores pertence às divisões CNAE 86/87 (95,4%), com franca dominância hospitalar (classe 8610: 76,8%) — quadro coerente com a função de polo regional. O empregador emitiu 97,0% das CATs, com mediana de um dia entre acidente e emissão; registrou-se um óbito. Registros de “doença” somaram apenas 1,0%, mesmo atravessando a pandemia — indício robusto de subnotificação das doenças relacionadas ao trabalho.</w:t>
-      </w:r>
-    </w:p>
-    <w:p>
-      <w:pPr>
-        <w:spacing w:before="0" w:after="40"/>
-        <w:ind w:firstLine="709"/>
-        <w:jc w:val="both"/>
-      </w:pPr>
-      <w:r>
-        <w:rPr>
-          <w:b w:val="0"/>
-          <w:i w:val="0"/>
-          <w:sz w:val="22"/>
-        </w:rPr>
-        <w:t>A leitura teórica desses achados recusa a redução do problema a uma lista de riscos biológicos ou ergonômicos. A concentração dos registros na base técnica da enfermagem expressa a divisão social e técnica do trabalho em saúde: a execução manual, contínua e corporal do cuidado — punção, medicação, manipulação de perfurocortantes, mobilização de pacientes — é delegada às categorias femininas de menor renda e prestígio, submetidas a sobrecarga, dupla jornada e intensificação, das quais deriva o desgaste (CECILIO; LACAZ, 2012; ANTUNES, 2018). Já a quase invisibilidade da medicina (12 CATs em oito anos) não autoriza concluir menor exposição: reflete, antes, a inserção médica por vínculos estatutários, autônomos e de pessoa jurídica, à margem do emprego celetista coberto pela CAT — desigualdade de proteção e de reconhecimento institucional que reitera, no plano previdenciário, a estratificação de classe e status entre as profissões (LEMOS, 2012). Pela mesma razão, agentes comunitários de saúde e de combate às endemias, majoritariamente vinculados à administração municipal, praticamente inexistem na base (14 registros de ACS e afins; nenhum ACE), sem que se possa inferir ausência de adoecimento. A elevação da média mensal de registros no período crítico da covid-19 (10,7 em jan./2018-fev./2020; 14,5 em mar./2020-dez./2021; 11,9 após) e o peso das exposições biológicas são compatíveis com a sobrecarga pandêmica descrita para os trabalhadores da saúde — condições de trabalho “à deriva”, com déficit de proteção e reconhecimento (VEDOVATO et al., 2021) —, mas oscilações de cobertura da própria fonte impedem qualquer atribuição causal (Figura 1).</w:t>
-      </w:r>
-    </w:p>
-    <w:p>
-      <w:pPr>
-        <w:spacing w:before="0" w:after="40"/>
-        <w:ind w:firstLine="709"/>
-        <w:jc w:val="both"/>
-      </w:pPr>
-      <w:r>
-        <w:rPr>
-          <w:b w:val="0"/>
-          <w:i w:val="0"/>
-          <w:sz w:val="22"/>
-        </w:rPr>
-        <w:t>Os dados permitem afirmar a estrutura interna das comunicações registradas — quem aparece, com quais lesões, em quais vínculos e estabelecimentos —, e não permitem estimar incidência, prevalência ou risco ocupacional: diferenças entre categorias podem refletir tamanho das forças de trabalho, composição e formalização dos vínculos, terceirização, cobertura previdenciária, cultura institucional e subnotificação diferencial. A robustez interna é alta: a predominância da enfermagem e a hierarquia das categorias mantêm-se em todas as análises de sensibilidade — exclusão de 2025, meses jan.–out., exclusão de trajeto, somente típicos e restrição a CNAE 86/87 (participação da enfermagem entre 84,4% e 86,3%). Denominadores reais do CNES/DataSUS — profissionais por ocupação em dezembro de cada ano, de 9.803 (2018) a 13.275 (2025) no município (BRASIL, 2026b) — permitem uma razão exploratória de densidade de comunicação, jamais de incidência, pois o CNES inclui vínculos estatutários, autônomos e de pessoa jurídica, fora da cobertura da CAT: nos anos de cobertura integral (2019–2021 e 2023), houve 29,5 a 43,5 CATs por 1.000 técnicos e auxiliares de enfermagem ao ano, 19,4 a 32,7 por 1.000 enfermeiros e, na medicina, no máximo 3,6 (2019; demais anos suprimidos por n&lt;5) — gradiente que reforça a leitura de proteção e notificação desiguais entre as categorias. Vínculos formais da RAIS/eSocial por CBO, município e ano permanecem como denominador prioritário para indicadores padronizados, condicionados à verificação de compatibilidade entre numerador e denominador.</w:t>
-      </w:r>
-    </w:p>
-    <w:p>
-      <w:pPr>
-        <w:spacing w:before="0" w:after="40"/>
-        <w:ind w:firstLine="709"/>
-        <w:jc w:val="both"/>
-      </w:pPr>
-      <w:r>
-        <w:rPr>
-          <w:b w:val="0"/>
-          <w:i w:val="0"/>
-          <w:sz w:val="22"/>
-        </w:rPr>
-        <w:t>Considerações finais. Para a Vigilância em Saúde do Trabalhador e a gestão municipal, os resultados indicam prioridades concretas: proteger a base técnica da enfermagem — núcleo do cuidado e dos registros —, com ênfase em perfurocortantes e exposição biológica; enfrentar a subnotificação de doenças relacionadas ao trabalho e a invisibilidade de estatutários, terceirizados e informais, articulando CAT, RAIS, CNES e as notificações do SUS; qualificar o preenchimento (3,6% dos registros sem CBO válido, concentrados em 2021-2023); e planejar a rede — cuja sustentação financeira oscila com as rendas petrolíferas (MARTINS; HASENCLEVER; MIRANDA, 2024) — reconhecendo que a proteção dos que cuidam é condição do cuidado. Limitações: a CAT capta comunicações, não a totalidade dos acidentes; cobre essencialmente o emprego formal celetista, excluindo informais, autônomos e estatutários; não há denominadores compatíveis para incidência — as razões com o CNES são exploratórias, pois o denominador inclui vínculos não celetistas —; a cobertura da fonte é parcial em 2018 (competências desde jul.), irregular em 2022, atípica em set.-dez./2024 e incompleta em 2025 (até out.), o que restringe comparações anuais; registros sem CBO podem subestimar profissões da saúde em 2021-2023; e o desenho descritivo-documental não permite inferência causal.</w:t>
+        <w:t xml:space="preserve"> e participações especiais) (SILVA; HASENCLEVER, 2019). Os dados oficiais evidenciam uma economia oscilante e dependente (Tabela 1): o produto interno bruto, a preços correntes, atingiu R$ 58,4 bilhões em 2013, caiu para R$ 23,9 bilhões em 2020 e retornou a R$ 43,0 bilhões em 2023; a indústria, dominada pela atividade extrativa, respondeu por 66,4% do valor adicionado em 2013 e por 40,8% em 2020; a agropecuária, apesar da identidade agrária do discurso local, representou 1,0% em 2021, com a produção de cana reduzida de 4,28 milhões de toneladas em 2005 para 1,29 milhão em 2023 (IBGE, 2026). Silva e Hasenclever (2019) demonstram que o ciclo do petróleo elevou arrecadação e produto sem diversificação produtiva nem desenvolvimento social equivalentes; Martins, Hasenclever e Miranda (2024) mostram que o financiamento da saúde municipal acompanhou as flutuações das rendas petrolíferas entre 2009 e 2020, fragilizando a gestão da rede. Nesse mercado de trabalho, os serviços de saúde, polo regional de referência do Norte Fluminense, constituem espaço relevante de assalariamento, sobretudo feminino, estratificado por hierarquias de renda e de prestígio entre profissões, próximas do que a sociologia weberiana descreve como situações de classe e de estamento (LEMOS, 2012).</w:t>
       </w:r>
     </w:p>
     <w:p>
@@ -162,7 +90,15 @@
           <w:i w:val="0"/>
           <w:sz w:val="19"/>
         </w:rPr>
-        <w:t>Tabela 1 – Campos dos Goytacazes (RJ): síntese da formação econômica e social</w:t>
+        <w:t>Tabela 1.</w:t>
+      </w:r>
+      <w:r>
+        <w:rPr>
+          <w:b w:val="0"/>
+          <w:i w:val="0"/>
+          <w:sz w:val="19"/>
+        </w:rPr>
+        <w:t xml:space="preserve"> Campos dos Goytacazes (RJ): síntese da formação econômica e social</w:t>
       </w:r>
     </w:p>
     <w:tbl>
@@ -185,6 +121,12 @@
             <w:r>
               <w:rPr>
                 <w:b/>
+              </w:rPr>
+            </w:r>
+            <w:r>
+              <w:rPr>
+                <w:b/>
+                <w:i w:val="0"/>
                 <w:sz w:val="17"/>
               </w:rPr>
               <w:t>Indicador</w:t>
@@ -199,6 +141,12 @@
             <w:r>
               <w:rPr>
                 <w:b/>
+              </w:rPr>
+            </w:r>
+            <w:r>
+              <w:rPr>
+                <w:b/>
+                <w:i w:val="0"/>
                 <w:sz w:val="17"/>
               </w:rPr>
               <w:t>Valores</w:t>
@@ -213,6 +161,12 @@
             <w:r>
               <w:rPr>
                 <w:b/>
+              </w:rPr>
+            </w:r>
+            <w:r>
+              <w:rPr>
+                <w:b/>
+                <w:i w:val="0"/>
                 <w:sz w:val="17"/>
               </w:rPr>
               <w:t>Fonte (IBGE/SIDRA)</w:t>
@@ -229,6 +183,12 @@
             <w:r>
               <w:rPr>
                 <w:b w:val="0"/>
+              </w:rPr>
+            </w:r>
+            <w:r>
+              <w:rPr>
+                <w:b w:val="0"/>
+                <w:i w:val="0"/>
                 <w:sz w:val="17"/>
               </w:rPr>
               <w:t>População residente (2022); área; densidade</w:t>
@@ -243,6 +203,12 @@
             <w:r>
               <w:rPr>
                 <w:b w:val="0"/>
+              </w:rPr>
+            </w:r>
+            <w:r>
+              <w:rPr>
+                <w:b w:val="0"/>
+                <w:i w:val="0"/>
                 <w:sz w:val="17"/>
               </w:rPr>
               <w:t>483.540 hab.; 4.032,5 km²; 119,9 hab./km²</w:t>
@@ -257,9 +223,15 @@
             <w:r>
               <w:rPr>
                 <w:b w:val="0"/>
+              </w:rPr>
+            </w:r>
+            <w:r>
+              <w:rPr>
+                <w:b w:val="0"/>
+                <w:i w:val="0"/>
                 <w:sz w:val="17"/>
               </w:rPr>
-              <w:t>Censo 2022 (tab. 4714)</w:t>
+              <w:t>Censo 2022 (tabela 4714)</w:t>
             </w:r>
           </w:p>
         </w:tc>
@@ -273,6 +245,12 @@
             <w:r>
               <w:rPr>
                 <w:b w:val="0"/>
+              </w:rPr>
+            </w:r>
+            <w:r>
+              <w:rPr>
+                <w:b w:val="0"/>
+                <w:i w:val="0"/>
                 <w:sz w:val="17"/>
               </w:rPr>
               <w:t>PIB a preços correntes</w:t>
@@ -287,6 +265,12 @@
             <w:r>
               <w:rPr>
                 <w:b w:val="0"/>
+              </w:rPr>
+            </w:r>
+            <w:r>
+              <w:rPr>
+                <w:b w:val="0"/>
+                <w:i w:val="0"/>
                 <w:sz w:val="17"/>
               </w:rPr>
               <w:t>R$ 58,4 bi (2013); R$ 23,9 bi (2020); R$ 43,0 bi (2023)</w:t>
@@ -301,9 +285,15 @@
             <w:r>
               <w:rPr>
                 <w:b w:val="0"/>
+              </w:rPr>
+            </w:r>
+            <w:r>
+              <w:rPr>
+                <w:b w:val="0"/>
+                <w:i w:val="0"/>
                 <w:sz w:val="17"/>
               </w:rPr>
-              <w:t>PIB dos Municípios (tab. 5938)</w:t>
+              <w:t>PIB dos Municípios (tabela 5938)</w:t>
             </w:r>
           </w:p>
         </w:tc>
@@ -317,6 +307,12 @@
             <w:r>
               <w:rPr>
                 <w:b w:val="0"/>
+              </w:rPr>
+            </w:r>
+            <w:r>
+              <w:rPr>
+                <w:b w:val="0"/>
+                <w:i w:val="0"/>
                 <w:sz w:val="17"/>
               </w:rPr>
               <w:t>Participação da indústria (extrativa) no valor adicionado</w:t>
@@ -331,6 +327,12 @@
             <w:r>
               <w:rPr>
                 <w:b w:val="0"/>
+              </w:rPr>
+            </w:r>
+            <w:r>
+              <w:rPr>
+                <w:b w:val="0"/>
+                <w:i w:val="0"/>
                 <w:sz w:val="17"/>
               </w:rPr>
               <w:t>66,4% (2013); 40,8% (2020)</w:t>
@@ -345,9 +347,15 @@
             <w:r>
               <w:rPr>
                 <w:b w:val="0"/>
+              </w:rPr>
+            </w:r>
+            <w:r>
+              <w:rPr>
+                <w:b w:val="0"/>
+                <w:i w:val="0"/>
                 <w:sz w:val="17"/>
               </w:rPr>
-              <w:t>PIB dos Municípios (tab. 5938)</w:t>
+              <w:t>PIB dos Municípios (tabela 5938)</w:t>
             </w:r>
           </w:p>
         </w:tc>
@@ -361,6 +369,12 @@
             <w:r>
               <w:rPr>
                 <w:b w:val="0"/>
+              </w:rPr>
+            </w:r>
+            <w:r>
+              <w:rPr>
+                <w:b w:val="0"/>
+                <w:i w:val="0"/>
                 <w:sz w:val="17"/>
               </w:rPr>
               <w:t>Participação da agropecuária no valor adicionado (2021)</w:t>
@@ -375,6 +389,12 @@
             <w:r>
               <w:rPr>
                 <w:b w:val="0"/>
+              </w:rPr>
+            </w:r>
+            <w:r>
+              <w:rPr>
+                <w:b w:val="0"/>
+                <w:i w:val="0"/>
                 <w:sz w:val="17"/>
               </w:rPr>
               <w:t>1,0%</w:t>
@@ -389,9 +409,15 @@
             <w:r>
               <w:rPr>
                 <w:b w:val="0"/>
+              </w:rPr>
+            </w:r>
+            <w:r>
+              <w:rPr>
+                <w:b w:val="0"/>
+                <w:i w:val="0"/>
                 <w:sz w:val="17"/>
               </w:rPr>
-              <w:t>PIB dos Municípios (tab. 5938)</w:t>
+              <w:t>PIB dos Municípios (tabela 5938)</w:t>
             </w:r>
           </w:p>
         </w:tc>
@@ -405,6 +431,12 @@
             <w:r>
               <w:rPr>
                 <w:b w:val="0"/>
+              </w:rPr>
+            </w:r>
+            <w:r>
+              <w:rPr>
+                <w:b w:val="0"/>
+                <w:i w:val="0"/>
                 <w:sz w:val="17"/>
               </w:rPr>
               <w:t>Cana-de-açúcar: quantidade produzida</w:t>
@@ -419,9 +451,15 @@
             <w:r>
               <w:rPr>
                 <w:b w:val="0"/>
+              </w:rPr>
+            </w:r>
+            <w:r>
+              <w:rPr>
+                <w:b w:val="0"/>
+                <w:i w:val="0"/>
                 <w:sz w:val="17"/>
               </w:rPr>
-              <w:t>4,28 mi t (2005); 1,29 mi t (2023)</w:t>
+              <w:t>4,28 milhões t (2005); 1,29 milhão t (2023)</w:t>
             </w:r>
           </w:p>
         </w:tc>
@@ -433,9 +471,15 @@
             <w:r>
               <w:rPr>
                 <w:b w:val="0"/>
+              </w:rPr>
+            </w:r>
+            <w:r>
+              <w:rPr>
+                <w:b w:val="0"/>
+                <w:i w:val="0"/>
                 <w:sz w:val="17"/>
               </w:rPr>
-              <w:t>PAM (tab. 1612)</w:t>
+              <w:t>PAM (tabela 1612)</w:t>
             </w:r>
           </w:p>
         </w:tc>
@@ -453,120 +497,90 @@
           <w:i w:val="0"/>
           <w:sz w:val="17"/>
         </w:rPr>
-        <w:t>Fonte: elaboração própria a partir de IBGE (2026); valores correntes, sem deflacionamento; interpretação histórica conforme Silva e Hasenclever (2019).</w:t>
-      </w:r>
-    </w:p>
-    <w:p>
-      <w:pPr>
-        <w:jc w:val="center"/>
-      </w:pPr>
-      <w:r>
-        <w:drawing>
-          <wp:inline xmlns:a="http://schemas.openxmlformats.org/drawingml/2006/main" xmlns:pic="http://schemas.openxmlformats.org/drawingml/2006/picture">
-            <wp:extent cx="5220000" cy="2268293"/>
-            <wp:docPr id="1" name="Picture 1"/>
-            <wp:cNvGraphicFramePr>
-              <a:graphicFrameLocks noChangeAspect="1"/>
-            </wp:cNvGraphicFramePr>
-            <a:graphic>
-              <a:graphicData uri="http://schemas.openxmlformats.org/drawingml/2006/picture">
-                <pic:pic>
-                  <pic:nvPicPr>
-                    <pic:cNvPr id="0" name="F1_cat_ano_categorias.png"/>
-                    <pic:cNvPicPr/>
-                  </pic:nvPicPr>
-                  <pic:blipFill>
-                    <a:blip r:embed="rId9"/>
-                    <a:stretch>
-                      <a:fillRect/>
-                    </a:stretch>
-                  </pic:blipFill>
-                  <pic:spPr>
-                    <a:xfrm>
-                      <a:off x="0" y="0"/>
-                      <a:ext cx="5220000" cy="2268293"/>
-                    </a:xfrm>
-                    <a:prstGeom prst="rect"/>
-                  </pic:spPr>
-                </pic:pic>
-              </a:graphicData>
-            </a:graphic>
-          </wp:inline>
-        </w:drawing>
-      </w:r>
-    </w:p>
-    <w:p>
-      <w:pPr>
-        <w:spacing w:before="0" w:after="80"/>
-        <w:ind w:firstLine="0"/>
-        <w:jc w:val="both"/>
-      </w:pPr>
-      <w:r>
-        <w:rPr>
-          <w:b w:val="0"/>
-          <w:i w:val="0"/>
-          <w:sz w:val="17"/>
-        </w:rPr>
-        <w:t>Figura 1 – CATs de profissões da saúde (universo principal, n = 1.144) vinculadas a empregadores de Campos dos Goytacazes (RJ), por ano do acidente e categoria profissional, 2018–2025. Unidade: registros. Fonte: elaboração própria a partir de BRASIL (2026a). *Cobertura parcial/irregular da fonte (2018: competências desde jul.; 2022: carga irregular; 2024: set.–dez. atípicos; 2025: até out.). Frequências de comunicação, não taxas de acidente.</w:t>
-      </w:r>
-    </w:p>
-    <w:p>
-      <w:pPr>
-        <w:jc w:val="center"/>
-      </w:pPr>
-      <w:r>
-        <w:drawing>
-          <wp:inline xmlns:a="http://schemas.openxmlformats.org/drawingml/2006/main" xmlns:pic="http://schemas.openxmlformats.org/drawingml/2006/picture">
-            <wp:extent cx="5220000" cy="1869414"/>
-            <wp:docPr id="2" name="Picture 2"/>
-            <wp:cNvGraphicFramePr>
-              <a:graphicFrameLocks noChangeAspect="1"/>
-            </wp:cNvGraphicFramePr>
-            <a:graphic>
-              <a:graphicData uri="http://schemas.openxmlformats.org/drawingml/2006/picture">
-                <pic:pic>
-                  <pic:nvPicPr>
-                    <pic:cNvPr id="0" name="F2_serie_mensal_saude.png"/>
-                    <pic:cNvPicPr/>
-                  </pic:nvPicPr>
-                  <pic:blipFill>
-                    <a:blip r:embed="rId10"/>
-                    <a:stretch>
-                      <a:fillRect/>
-                    </a:stretch>
-                  </pic:blipFill>
-                  <pic:spPr>
-                    <a:xfrm>
-                      <a:off x="0" y="0"/>
-                      <a:ext cx="5220000" cy="1869414"/>
-                    </a:xfrm>
-                    <a:prstGeom prst="rect"/>
-                  </pic:spPr>
-                </pic:pic>
-              </a:graphicData>
-            </a:graphic>
-          </wp:inline>
-        </w:drawing>
-      </w:r>
-    </w:p>
-    <w:p>
-      <w:pPr>
-        <w:spacing w:before="0" w:after="80"/>
-        <w:ind w:firstLine="0"/>
-        <w:jc w:val="both"/>
-      </w:pPr>
-      <w:r>
-        <w:rPr>
-          <w:b w:val="0"/>
-          <w:i w:val="0"/>
-          <w:sz w:val="17"/>
-        </w:rPr>
-        <w:t>Figura 2 – Distribuição mensal das CATs de profissões da saúde (universo principal, n = 1.144), empregadores de Campos dos Goytacazes (RJ), jan./2018–dez./2025, com destaque para o período crítico da covid-19 (mar./2020–dez./2021). Unidade: registros/mês. Fonte: elaboração própria a partir de BRASIL (2026a). As oscilações também refletem a cobertura da fonte (ver notas da Figura 1); médias mensais: 10,7 (pré-pandemia), 14,5 (período crítico) e 11,9 (pós-crítico).</w:t>
+        <w:t>Fonte: elaborada pelo autor a partir de IBGE (2026); valores correntes, sem deflacionamento; interpretação histórica conforme Silva e Hasenclever (2019).</w:t>
       </w:r>
     </w:p>
     <w:p>
       <w:pPr>
         <w:spacing w:before="0" w:after="40"/>
+        <w:ind w:firstLine="709"/>
+        <w:jc w:val="both"/>
+      </w:pPr>
+      <w:r>
+        <w:rPr>
+          <w:b/>
+          <w:i w:val="0"/>
+          <w:sz w:val="22"/>
+        </w:rPr>
+        <w:t>Método.</w:t>
+      </w:r>
+      <w:r>
+        <w:rPr>
+          <w:b w:val="0"/>
+          <w:i w:val="0"/>
+          <w:sz w:val="22"/>
+        </w:rPr>
+        <w:t xml:space="preserve"> Estudo teórico-conceitual e documental, apoiado em dados secundários públicos, com </w:t>
+      </w:r>
+      <w:r>
+        <w:rPr>
+          <w:b w:val="0"/>
+          <w:i/>
+          <w:sz w:val="22"/>
+        </w:rPr>
+        <w:t>pipeline</w:t>
+      </w:r>
+      <w:r>
+        <w:rPr>
+          <w:b w:val="0"/>
+          <w:i w:val="0"/>
+          <w:sz w:val="22"/>
+        </w:rPr>
+        <w:t xml:space="preserve"> reprodutível, auditado e validado de forma independente (scripts, logs e testes automatizados acompanham o repositório do estudo). A base empírica foi reconstruída dos arquivos brutos dos dados abertos da CAT do Instituto Nacional do Seguro Social (INSS): 58 arquivos, competências de julho de 2018 a dezembro de 2025, totalizando 3.902.905 registros (BRASIL, 2026a). A importação foi feita por posição de coluna, porque a fonte apresenta quatro esquemas estruturais distintos e cabeçalhos duplicados (CBO, CID-10, CNAE e data do acidente); a codificação de caracteres foi detectada arquivo a arquivo; e o mês de referência administrativo (coluna 2) foi rigorosamente distinguido da data completa do acidente, única informação usada nas análises temporais. O recorte municipal exigiu, simultaneamente, código do município do empregador igual a 330100, extraído antes do hífen, e unidade federativa do empregador igual a Rio de Janeiro; municípios homônimos (Campos Novos, Campos do Jordão, Campos de Júlio, São José dos Campos, entre outros) foram identificados e excluídos, assim como 12 registros com unidade federativa divergente. Foram removidas 537 duplicidades exatas entre arquivos de cobertura sobreposta, demonstradas por resumo criptográfico (</w:t>
+      </w:r>
+      <w:r>
+        <w:rPr>
+          <w:b w:val="0"/>
+          <w:i/>
+          <w:sz w:val="22"/>
+        </w:rPr>
+        <w:t>hash</w:t>
+      </w:r>
+      <w:r>
+        <w:rPr>
+          <w:b w:val="0"/>
+          <w:i w:val="0"/>
+          <w:sz w:val="22"/>
+        </w:rPr>
+        <w:t xml:space="preserve"> SHA-256) da linha bruta; duplicatas dentro de um mesmo arquivo foram mantidas e sinalizadas, por poderem representar eventos legítimos. A classificação ocupacional utilizou os códigos de seis dígitos da Classificação Brasileira de Ocupações (CBO 2002), com dicionário auditado dos 459 códigos observados e três níveis de análise: universo principal das profissões da saúde; profissões multiprofissionais de atuação intersetorial (psicologia, serviço social, educação física e biologia), analisadas à parte; e trabalhadores de apoio em estabelecimentos de saúde, jamais somados às profissões da saúde. Registros sem código válido (184; 3,6%) foram mantidos em categoria própria e quantificados. Denominadores de força de trabalho foram extraídos do Cadastro Nacional de Estabelecimentos de Saúde (CNES): profissionais por ocupação, em dezembro de cada ano, no município (BRASIL, 2026b); como o CNES abrange vínculos estatutários, autônomos e de pessoa jurídica, não cobertos pela CAT, tais denominadores sustentam apenas razões exploratórias de densidade de comunicação, e não medidas de incidência ou de risco. Todos os totais foram reproduzidos por rotina independente, com convergência integral; células com menos de cinco registros foram agregadas; as análises de sensibilidade abrangeram exclusão de 2025 (ano parcial, com dados até outubro), restrição aos meses de janeiro a outubro em todos os anos, exclusão de acidentes de trajeto, restrição a acidentes típicos e restrição a empregadores das divisões 86 e 87 da CNAE.</w:t>
+      </w:r>
+    </w:p>
+    <w:p>
+      <w:pPr>
+        <w:spacing w:before="0" w:after="40"/>
+        <w:ind w:firstLine="709"/>
+        <w:jc w:val="both"/>
+      </w:pPr>
+      <w:r>
+        <w:rPr>
+          <w:b/>
+          <w:i w:val="0"/>
+          <w:sz w:val="22"/>
+        </w:rPr>
+        <w:t>Resultados.</w:t>
+      </w:r>
+      <w:r>
+        <w:rPr>
+          <w:b w:val="0"/>
+          <w:i w:val="0"/>
+          <w:sz w:val="22"/>
+        </w:rPr>
+        <w:t xml:space="preserve"> Das 5.066 CATs vinculadas a empregadores de Campos dos Goytacazes entre 2018 e 2025, 1.144 (22,6%) correspondem ao universo principal das profissões da saúde, 26 às profissões multiprofissionais, 184 (3,6%) a registros sem CBO válido e 3.712 às demais ocupações (427 delas empregadas em estabelecimentos de saúde). A distribuição interna é fortemente assimétrica (Tabela 2): a enfermagem concentra 84,4% dos registros do universo principal, sendo 70,2% de técnicos e auxiliares e 14,2% de enfermeiros; seguem-se os técnicos e auxiliares de diagnóstico e laboratório (6,8%) e a fisioterapia (2,6%); a medicina responde por 1,0%. Predominam mulheres (85,7%), com idade mediana de 36 anos. Os acidentes típicos somam 81,9% e os de trajeto, 17,1%. Os ferimentos de punho e mãos lideram os diagnósticos (código S61 da CID-10: 25,1%; o dedo é a parte atingida em 43,9% dos registros), seguidos do contato ou exposição a doenças transmissíveis (Z20: 21,9%); agentes infecciosos e produtos biológicos respondem por 26,9% dos agentes causadores. Quase todos os empregadores pertencem às divisões 86 e 87 da CNAE (95,4%), com dominância hospitalar (classe 8610: 76,8%). O empregador emitiu 97,0% das CATs, com mediana de um dia entre o acidente e a emissão; houve um óbito registrado. Comunicações de doença relacionada ao trabalho somaram apenas 1,0%, mesmo com a pandemia dentro do período de análise (Figuras 1 e 2).</w:t>
+      </w:r>
+    </w:p>
+    <w:p>
+      <w:pPr>
+        <w:spacing w:before="80" w:after="40"/>
         <w:ind w:firstLine="0"/>
         <w:jc w:val="both"/>
       </w:pPr>
@@ -576,7 +590,15 @@
           <w:i w:val="0"/>
           <w:sz w:val="19"/>
         </w:rPr>
-        <w:t>Tabela 2 – Características das CATs das profissões da saúde, empregadores de Campos dos Goytacazes (RJ), 2018–2025 (n = 1.144)</w:t>
+        <w:t>Tabela 2.</w:t>
+      </w:r>
+      <w:r>
+        <w:rPr>
+          <w:b w:val="0"/>
+          <w:i w:val="0"/>
+          <w:sz w:val="19"/>
+        </w:rPr>
+        <w:t xml:space="preserve"> Características das CATs das profissões da saúde, empregadores de Campos dos Goytacazes (RJ), 2018-2025 (n = 1.144)</w:t>
       </w:r>
     </w:p>
     <w:tbl>
@@ -598,6 +620,12 @@
             <w:r>
               <w:rPr>
                 <w:b/>
+              </w:rPr>
+            </w:r>
+            <w:r>
+              <w:rPr>
+                <w:b/>
+                <w:i w:val="0"/>
                 <w:sz w:val="17"/>
               </w:rPr>
               <w:t>Característica</w:t>
@@ -612,6 +640,12 @@
             <w:r>
               <w:rPr>
                 <w:b/>
+              </w:rPr>
+            </w:r>
+            <w:r>
+              <w:rPr>
+                <w:b/>
+                <w:i w:val="0"/>
                 <w:sz w:val="17"/>
               </w:rPr>
               <w:t>n (%)</w:t>
@@ -628,9 +662,15 @@
             <w:r>
               <w:rPr>
                 <w:b w:val="0"/>
+              </w:rPr>
+            </w:r>
+            <w:r>
+              <w:rPr>
+                <w:b w:val="0"/>
+                <w:i w:val="0"/>
                 <w:sz w:val="17"/>
               </w:rPr>
-              <w:t>Enfermagem – técnicos e auxiliares</w:t>
+              <w:t>Técnicos e auxiliares de enfermagem</w:t>
             </w:r>
           </w:p>
         </w:tc>
@@ -642,6 +682,12 @@
             <w:r>
               <w:rPr>
                 <w:b w:val="0"/>
+              </w:rPr>
+            </w:r>
+            <w:r>
+              <w:rPr>
+                <w:b w:val="0"/>
+                <w:i w:val="0"/>
                 <w:sz w:val="17"/>
               </w:rPr>
               <w:t>803 (70,2)</w:t>
@@ -658,9 +704,15 @@
             <w:r>
               <w:rPr>
                 <w:b w:val="0"/>
+              </w:rPr>
+            </w:r>
+            <w:r>
+              <w:rPr>
+                <w:b w:val="0"/>
+                <w:i w:val="0"/>
                 <w:sz w:val="17"/>
               </w:rPr>
-              <w:t>Enfermagem – enfermeiros</w:t>
+              <w:t>Enfermeiros</w:t>
             </w:r>
           </w:p>
         </w:tc>
@@ -672,6 +724,12 @@
             <w:r>
               <w:rPr>
                 <w:b w:val="0"/>
+              </w:rPr>
+            </w:r>
+            <w:r>
+              <w:rPr>
+                <w:b w:val="0"/>
+                <w:i w:val="0"/>
                 <w:sz w:val="17"/>
               </w:rPr>
               <w:t>163 (14,2)</w:t>
@@ -688,9 +746,15 @@
             <w:r>
               <w:rPr>
                 <w:b w:val="0"/>
+              </w:rPr>
+            </w:r>
+            <w:r>
+              <w:rPr>
+                <w:b w:val="0"/>
+                <w:i w:val="0"/>
                 <w:sz w:val="17"/>
               </w:rPr>
-              <w:t>Diagnóstico e laboratório – técnicos e auxiliares</w:t>
+              <w:t>Técnicos e auxiliares de diagnóstico e laboratório</w:t>
             </w:r>
           </w:p>
         </w:tc>
@@ -702,6 +766,12 @@
             <w:r>
               <w:rPr>
                 <w:b w:val="0"/>
+              </w:rPr>
+            </w:r>
+            <w:r>
+              <w:rPr>
+                <w:b w:val="0"/>
+                <w:i w:val="0"/>
                 <w:sz w:val="17"/>
               </w:rPr>
               <w:t>78 (6,8)</w:t>
@@ -718,6 +788,12 @@
             <w:r>
               <w:rPr>
                 <w:b w:val="0"/>
+              </w:rPr>
+            </w:r>
+            <w:r>
+              <w:rPr>
+                <w:b w:val="0"/>
+                <w:i w:val="0"/>
                 <w:sz w:val="17"/>
               </w:rPr>
               <w:t>Fisioterapia</w:t>
@@ -732,6 +808,12 @@
             <w:r>
               <w:rPr>
                 <w:b w:val="0"/>
+              </w:rPr>
+            </w:r>
+            <w:r>
+              <w:rPr>
+                <w:b w:val="0"/>
+                <w:i w:val="0"/>
                 <w:sz w:val="17"/>
               </w:rPr>
               <w:t>30 (2,6)</w:t>
@@ -748,9 +830,15 @@
             <w:r>
               <w:rPr>
                 <w:b w:val="0"/>
+              </w:rPr>
+            </w:r>
+            <w:r>
+              <w:rPr>
+                <w:b w:val="0"/>
+                <w:i w:val="0"/>
                 <w:sz w:val="17"/>
               </w:rPr>
-              <w:t>Farmácia – técnicos e auxiliares</w:t>
+              <w:t>Técnicos e auxiliares de farmácia</w:t>
             </w:r>
           </w:p>
         </w:tc>
@@ -762,6 +850,12 @@
             <w:r>
               <w:rPr>
                 <w:b w:val="0"/>
+              </w:rPr>
+            </w:r>
+            <w:r>
+              <w:rPr>
+                <w:b w:val="0"/>
+                <w:i w:val="0"/>
                 <w:sz w:val="17"/>
               </w:rPr>
               <w:t>20 (1,7)</w:t>
@@ -778,6 +872,12 @@
             <w:r>
               <w:rPr>
                 <w:b w:val="0"/>
+              </w:rPr>
+            </w:r>
+            <w:r>
+              <w:rPr>
+                <w:b w:val="0"/>
+                <w:i w:val="0"/>
                 <w:sz w:val="17"/>
               </w:rPr>
               <w:t>Agentes comunitários de saúde e afins</w:t>
@@ -792,6 +892,12 @@
             <w:r>
               <w:rPr>
                 <w:b w:val="0"/>
+              </w:rPr>
+            </w:r>
+            <w:r>
+              <w:rPr>
+                <w:b w:val="0"/>
+                <w:i w:val="0"/>
                 <w:sz w:val="17"/>
               </w:rPr>
               <w:t>14 (1,2)</w:t>
@@ -808,6 +914,12 @@
             <w:r>
               <w:rPr>
                 <w:b w:val="0"/>
+              </w:rPr>
+            </w:r>
+            <w:r>
+              <w:rPr>
+                <w:b w:val="0"/>
+                <w:i w:val="0"/>
                 <w:sz w:val="17"/>
               </w:rPr>
               <w:t>Medicina</w:t>
@@ -822,6 +934,12 @@
             <w:r>
               <w:rPr>
                 <w:b w:val="0"/>
+              </w:rPr>
+            </w:r>
+            <w:r>
+              <w:rPr>
+                <w:b w:val="0"/>
+                <w:i w:val="0"/>
                 <w:sz w:val="17"/>
               </w:rPr>
               <w:t>12 (1,0)</w:t>
@@ -838,9 +956,15 @@
             <w:r>
               <w:rPr>
                 <w:b w:val="0"/>
+              </w:rPr>
+            </w:r>
+            <w:r>
+              <w:rPr>
+                <w:b w:val="0"/>
+                <w:i w:val="0"/>
                 <w:sz w:val="17"/>
               </w:rPr>
-              <w:t>Demais categorias (farmácia, nutrição, odontologia/saúde bucal, fonoaudiologia, instrumentação; n&lt;5 agregados)</w:t>
+              <w:t>Demais categorias (farmácia, nutrição, odontologia e saúde bucal, fonoaudiologia, instrumentação cirúrgica; n&lt;5 agregados)</w:t>
             </w:r>
           </w:p>
         </w:tc>
@@ -852,6 +976,12 @@
             <w:r>
               <w:rPr>
                 <w:b w:val="0"/>
+              </w:rPr>
+            </w:r>
+            <w:r>
+              <w:rPr>
+                <w:b w:val="0"/>
+                <w:i w:val="0"/>
                 <w:sz w:val="17"/>
               </w:rPr>
               <w:t>24 (2,1)</w:t>
@@ -868,6 +998,12 @@
             <w:r>
               <w:rPr>
                 <w:b w:val="0"/>
+              </w:rPr>
+            </w:r>
+            <w:r>
+              <w:rPr>
+                <w:b w:val="0"/>
+                <w:i w:val="0"/>
                 <w:sz w:val="17"/>
               </w:rPr>
               <w:t>Sexo feminino</w:t>
@@ -882,6 +1018,12 @@
             <w:r>
               <w:rPr>
                 <w:b w:val="0"/>
+              </w:rPr>
+            </w:r>
+            <w:r>
+              <w:rPr>
+                <w:b w:val="0"/>
+                <w:i w:val="0"/>
                 <w:sz w:val="17"/>
               </w:rPr>
               <w:t>980 (85,7)</w:t>
@@ -898,9 +1040,15 @@
             <w:r>
               <w:rPr>
                 <w:b w:val="0"/>
+              </w:rPr>
+            </w:r>
+            <w:r>
+              <w:rPr>
+                <w:b w:val="0"/>
+                <w:i w:val="0"/>
                 <w:sz w:val="17"/>
               </w:rPr>
-              <w:t>Acidente típico | trajeto | doença</w:t>
+              <w:t>Acidente típico; de trajeto; doença</w:t>
             </w:r>
           </w:p>
         </w:tc>
@@ -912,9 +1060,15 @@
             <w:r>
               <w:rPr>
                 <w:b w:val="0"/>
+              </w:rPr>
+            </w:r>
+            <w:r>
+              <w:rPr>
+                <w:b w:val="0"/>
+                <w:i w:val="0"/>
                 <w:sz w:val="17"/>
               </w:rPr>
-              <w:t>937 (81,9) | 196 (17,1) | 11 (1,0)</w:t>
+              <w:t>937 (81,9); 196 (17,1); 11 (1,0)</w:t>
             </w:r>
           </w:p>
         </w:tc>
@@ -928,9 +1082,15 @@
             <w:r>
               <w:rPr>
                 <w:b w:val="0"/>
+              </w:rPr>
+            </w:r>
+            <w:r>
+              <w:rPr>
+                <w:b w:val="0"/>
+                <w:i w:val="0"/>
                 <w:sz w:val="17"/>
               </w:rPr>
-              <w:t>Parte atingida: dedo</w:t>
+              <w:t>Parte do corpo atingida: dedo</w:t>
             </w:r>
           </w:p>
         </w:tc>
@@ -942,6 +1102,12 @@
             <w:r>
               <w:rPr>
                 <w:b w:val="0"/>
+              </w:rPr>
+            </w:r>
+            <w:r>
+              <w:rPr>
+                <w:b w:val="0"/>
+                <w:i w:val="0"/>
                 <w:sz w:val="17"/>
               </w:rPr>
               <w:t>502 (43,9)</w:t>
@@ -958,9 +1124,15 @@
             <w:r>
               <w:rPr>
                 <w:b w:val="0"/>
+              </w:rPr>
+            </w:r>
+            <w:r>
+              <w:rPr>
+                <w:b w:val="0"/>
+                <w:i w:val="0"/>
                 <w:sz w:val="17"/>
               </w:rPr>
-              <w:t>Agente causador biológico/infeccioso</w:t>
+              <w:t>Agente causador biológico ou infeccioso</w:t>
             </w:r>
           </w:p>
         </w:tc>
@@ -972,6 +1144,12 @@
             <w:r>
               <w:rPr>
                 <w:b w:val="0"/>
+              </w:rPr>
+            </w:r>
+            <w:r>
+              <w:rPr>
+                <w:b w:val="0"/>
+                <w:i w:val="0"/>
                 <w:sz w:val="17"/>
               </w:rPr>
               <w:t>308 (26,9)</w:t>
@@ -988,9 +1166,15 @@
             <w:r>
               <w:rPr>
                 <w:b w:val="0"/>
+              </w:rPr>
+            </w:r>
+            <w:r>
+              <w:rPr>
+                <w:b w:val="0"/>
+                <w:i w:val="0"/>
                 <w:sz w:val="17"/>
               </w:rPr>
-              <w:t>CID-10: S61 (ferimento punho/mão) | Z20 (exposição a doenças transmissíveis)</w:t>
+              <w:t>CID-10 S61 (ferimento de punho e mão); Z20 (exposição a doenças transmissíveis)</w:t>
             </w:r>
           </w:p>
         </w:tc>
@@ -1002,9 +1186,15 @@
             <w:r>
               <w:rPr>
                 <w:b w:val="0"/>
+              </w:rPr>
+            </w:r>
+            <w:r>
+              <w:rPr>
+                <w:b w:val="0"/>
+                <w:i w:val="0"/>
                 <w:sz w:val="17"/>
               </w:rPr>
-              <w:t>287 (25,1) | 250 (21,9)</w:t>
+              <w:t>287 (25,1); 250 (21,9)</w:t>
             </w:r>
           </w:p>
         </w:tc>
@@ -1018,9 +1208,15 @@
             <w:r>
               <w:rPr>
                 <w:b w:val="0"/>
+              </w:rPr>
+            </w:r>
+            <w:r>
+              <w:rPr>
+                <w:b w:val="0"/>
+                <w:i w:val="0"/>
                 <w:sz w:val="17"/>
               </w:rPr>
-              <w:t>Empregador em CNAE 86/87 (dos quais classe 8610 – hospitalar)</w:t>
+              <w:t>Empregador nas divisões CNAE 86 e 87 (na classe 8610, hospitalar)</w:t>
             </w:r>
           </w:p>
         </w:tc>
@@ -1032,9 +1228,15 @@
             <w:r>
               <w:rPr>
                 <w:b w:val="0"/>
+              </w:rPr>
+            </w:r>
+            <w:r>
+              <w:rPr>
+                <w:b w:val="0"/>
+                <w:i w:val="0"/>
                 <w:sz w:val="17"/>
               </w:rPr>
-              <w:t>1.091 (95,4) | 879 (76,8)</w:t>
+              <w:t>1.091 (95,4); 879 (76,8)</w:t>
             </w:r>
           </w:p>
         </w:tc>
@@ -1048,9 +1250,15 @@
             <w:r>
               <w:rPr>
                 <w:b w:val="0"/>
+              </w:rPr>
+            </w:r>
+            <w:r>
+              <w:rPr>
+                <w:b w:val="0"/>
+                <w:i w:val="0"/>
                 <w:sz w:val="17"/>
               </w:rPr>
-              <w:t>CAT emitida pelo empregador; mediana acidente→emissão = 1 dia</w:t>
+              <w:t>CAT emitida pelo empregador; mediana acidente-emissão de 1 dia</w:t>
             </w:r>
           </w:p>
         </w:tc>
@@ -1062,6 +1270,12 @@
             <w:r>
               <w:rPr>
                 <w:b w:val="0"/>
+              </w:rPr>
+            </w:r>
+            <w:r>
+              <w:rPr>
+                <w:b w:val="0"/>
+                <w:i w:val="0"/>
                 <w:sz w:val="17"/>
               </w:rPr>
               <w:t>1.110 (97,0)</w:t>
@@ -1072,7 +1286,7 @@
     </w:tbl>
     <w:p>
       <w:pPr>
-        <w:spacing w:before="0" w:after="120"/>
+        <w:spacing w:before="0" w:after="80"/>
         <w:ind w:firstLine="0"/>
         <w:jc w:val="both"/>
       </w:pPr>
@@ -1082,12 +1296,222 @@
           <w:i w:val="0"/>
           <w:sz w:val="17"/>
         </w:rPr>
-        <w:t>Fonte: elaboração própria a partir de BRASIL (2026a). Idade mediana: 36 anos. Percentuais sobre o total de registros do universo principal; sexo ignorado em 4 registros; um óbito registrado.</w:t>
+        <w:t>Fonte: elaborada pelo autor a partir de Brasil (2026a). Idade mediana de 36 anos; sexo ignorado em 4 registros; um óbito registrado. Percentuais sobre o total do universo principal.</w:t>
       </w:r>
     </w:p>
     <w:p>
       <w:pPr>
-        <w:spacing w:before="40" w:after="40"/>
+        <w:spacing w:before="80"/>
+        <w:jc w:val="center"/>
+      </w:pPr>
+      <w:r>
+        <w:drawing>
+          <wp:inline xmlns:a="http://schemas.openxmlformats.org/drawingml/2006/main" xmlns:pic="http://schemas.openxmlformats.org/drawingml/2006/picture">
+            <wp:extent cx="5220000" cy="2079975"/>
+            <wp:docPr id="1" name="Picture 1"/>
+            <wp:cNvGraphicFramePr>
+              <a:graphicFrameLocks noChangeAspect="1"/>
+            </wp:cNvGraphicFramePr>
+            <a:graphic>
+              <a:graphicData uri="http://schemas.openxmlformats.org/drawingml/2006/picture">
+                <pic:pic>
+                  <pic:nvPicPr>
+                    <pic:cNvPr id="0" name="F1_cat_ano_categorias.png"/>
+                    <pic:cNvPicPr/>
+                  </pic:nvPicPr>
+                  <pic:blipFill>
+                    <a:blip r:embed="rId9"/>
+                    <a:stretch>
+                      <a:fillRect/>
+                    </a:stretch>
+                  </pic:blipFill>
+                  <pic:spPr>
+                    <a:xfrm>
+                      <a:off x="0" y="0"/>
+                      <a:ext cx="5220000" cy="2079975"/>
+                    </a:xfrm>
+                    <a:prstGeom prst="rect"/>
+                  </pic:spPr>
+                </pic:pic>
+              </a:graphicData>
+            </a:graphic>
+          </wp:inline>
+        </w:drawing>
+      </w:r>
+    </w:p>
+    <w:p>
+      <w:pPr>
+        <w:spacing w:before="0" w:after="80"/>
+        <w:ind w:firstLine="0"/>
+        <w:jc w:val="both"/>
+      </w:pPr>
+      <w:r>
+        <w:rPr>
+          <w:b/>
+          <w:i w:val="0"/>
+          <w:sz w:val="17"/>
+        </w:rPr>
+        <w:t>Figura 1.</w:t>
+      </w:r>
+      <w:r>
+        <w:rPr>
+          <w:b w:val="0"/>
+          <w:i w:val="0"/>
+          <w:sz w:val="17"/>
+        </w:rPr>
+        <w:t xml:space="preserve"> CATs de profissões da saúde (universo principal, n = 1.144) vinculadas a empregadores de Campos dos Goytacazes (RJ), por ano do acidente e categoria profissional, 2018-2025. Unidade: registros. Fonte: elaborada pelo autor a partir de Brasil (2026a). *Cobertura parcial ou irregular da fonte (2018: competências desde julho; 2022: carga irregular; 2024: setembro a dezembro atípicos; 2025: até outubro). Frequências de comunicação, não taxas de acidente.</w:t>
+      </w:r>
+    </w:p>
+    <w:p>
+      <w:pPr>
+        <w:spacing w:before="80"/>
+        <w:jc w:val="center"/>
+      </w:pPr>
+      <w:r>
+        <w:drawing>
+          <wp:inline xmlns:a="http://schemas.openxmlformats.org/drawingml/2006/main" xmlns:pic="http://schemas.openxmlformats.org/drawingml/2006/picture">
+            <wp:extent cx="5220000" cy="1764160"/>
+            <wp:docPr id="2" name="Picture 2"/>
+            <wp:cNvGraphicFramePr>
+              <a:graphicFrameLocks noChangeAspect="1"/>
+            </wp:cNvGraphicFramePr>
+            <a:graphic>
+              <a:graphicData uri="http://schemas.openxmlformats.org/drawingml/2006/picture">
+                <pic:pic>
+                  <pic:nvPicPr>
+                    <pic:cNvPr id="0" name="F2_serie_mensal_saude.png"/>
+                    <pic:cNvPicPr/>
+                  </pic:nvPicPr>
+                  <pic:blipFill>
+                    <a:blip r:embed="rId10"/>
+                    <a:stretch>
+                      <a:fillRect/>
+                    </a:stretch>
+                  </pic:blipFill>
+                  <pic:spPr>
+                    <a:xfrm>
+                      <a:off x="0" y="0"/>
+                      <a:ext cx="5220000" cy="1764160"/>
+                    </a:xfrm>
+                    <a:prstGeom prst="rect"/>
+                  </pic:spPr>
+                </pic:pic>
+              </a:graphicData>
+            </a:graphic>
+          </wp:inline>
+        </w:drawing>
+      </w:r>
+    </w:p>
+    <w:p>
+      <w:pPr>
+        <w:spacing w:before="0" w:after="80"/>
+        <w:ind w:firstLine="0"/>
+        <w:jc w:val="both"/>
+      </w:pPr>
+      <w:r>
+        <w:rPr>
+          <w:b/>
+          <w:i w:val="0"/>
+          <w:sz w:val="17"/>
+        </w:rPr>
+        <w:t>Figura 2.</w:t>
+      </w:r>
+      <w:r>
+        <w:rPr>
+          <w:b w:val="0"/>
+          <w:i w:val="0"/>
+          <w:sz w:val="17"/>
+        </w:rPr>
+        <w:t xml:space="preserve"> Distribuição mensal das CATs de profissões da saúde (universo principal, n = 1.144), empregadores de Campos dos Goytacazes (RJ), janeiro de 2018 a dezembro de 2025, com destaque para o período crítico da covid-19 (março de 2020 a dezembro de 2021) e médias mensais por período. Unidade: registros por mês. Fonte: elaborada pelo autor a partir de Brasil (2026a). As oscilações também refletem a cobertura da fonte (ver notas da Figura 1).</w:t>
+      </w:r>
+    </w:p>
+    <w:p>
+      <w:pPr>
+        <w:spacing w:before="0" w:after="40"/>
+        <w:ind w:firstLine="709"/>
+        <w:jc w:val="both"/>
+      </w:pPr>
+      <w:r>
+        <w:rPr>
+          <w:b/>
+          <w:i w:val="0"/>
+          <w:sz w:val="22"/>
+        </w:rPr>
+        <w:t>Discussão.</w:t>
+      </w:r>
+      <w:r>
+        <w:rPr>
+          <w:b w:val="0"/>
+          <w:i w:val="0"/>
+          <w:sz w:val="22"/>
+        </w:rPr>
+        <w:t xml:space="preserve"> A concentração dos registros na base técnica da enfermagem não deve ser lida como simples somatório de riscos biológicos ou ergonômicos: ela expressa a divisão social e técnica do trabalho em saúde, na qual a execução manual, contínua e corporal do cuidado (punção venosa, administração de medicamentos, manipulação de perfurocortantes, mobilização de pacientes) é delegada a categorias majoritariamente femininas, de menor renda e prestígio, submetidas a sobrecarga e intensificação, das quais deriva o desgaste (CECILIO; LACAZ, 2012; ANTUNES, 2018). A quase invisibilidade da medicina (12 CATs em oito anos, ante 1.360 a 1.702 médicos ativos no CNES) não autoriza concluir menor exposição: indica inserção por vínculos estatutários, autônomos e de pessoa jurídica, situados fora do emprego celetista coberto pela CAT, o que configura desigualdade de proteção e de reconhecimento institucional e reitera, no plano previdenciário, a estratificação de classe e de prestígio entre as profissões (LEMOS, 2012). Pela mesma razão, agentes comunitários de saúde e agentes de combate às endemias, majoritariamente vinculados à administração pública municipal, quase não aparecem na base (14 registros; nenhum agente de combate às endemias), sem que se possa inferir ausência de adoecimento. A elevação da média mensal de registros no período crítico da covid-19 (de 10,7 para 14,5, com 11,9 no período posterior) e o peso das exposições biológicas são compatíveis com a sobrecarga pandêmica descrita para os trabalhadores da saúde, marcada por déficit de proteção e de reconhecimento (VEDOVATO et al., 2021); oscilações de cobertura da própria fonte, contudo, impedem qualquer atribuição causal (Figura 2). A baixíssima frequência de comunicações de doença (1,0%) reforça o diagnóstico de subnotificação seletiva: o sistema registra sobretudo a lesão aguda e visível, e não o adoecimento lento produzido pela organização do trabalho.</w:t>
+      </w:r>
+    </w:p>
+    <w:p>
+      <w:pPr>
+        <w:spacing w:before="0" w:after="40"/>
+        <w:ind w:firstLine="709"/>
+        <w:jc w:val="both"/>
+      </w:pPr>
+      <w:r>
+        <w:rPr>
+          <w:b w:val="0"/>
+          <w:i w:val="0"/>
+          <w:sz w:val="22"/>
+        </w:rPr>
+        <w:t>Os dados permitem descrever a estrutura interna das comunicações registradas: quem aparece, com que lesões, em que vínculos e em que estabelecimentos. Não permitem estimar incidência, prevalência ou risco ocupacional, pois as diferenças entre categorias podem refletir o tamanho das forças de trabalho, a composição e a formalização dos vínculos, a terceirização, a cobertura previdenciária, a cultura institucional de notificação e a subnotificação diferencial. A robustez interna dos achados é alta: a predominância da enfermagem e a hierarquia das categorias mantêm-se em todos os cenários de sensibilidade, com participação da enfermagem entre 84,4% e 86,3%. As razões exploratórias com denominadores do CNES (9.803 profissionais em 2018; 13.275 em 2025) reforçam o gradiente: nos anos de cobertura integral (2019 a 2021 e 2023) houve de 29,5 a 43,5 CATs por 1.000 técnicos e auxiliares de enfermagem ao ano, de 19,4 a 32,7 por 1.000 enfermeiros e, na medicina, no máximo 3,6 (valores suprimidos nos demais anos por contagens inferiores a cinco). Vínculos formais da Relação Anual de Informações Sociais (RAIS) por ocupação, município e ano permanecem como denominador prioritário para indicadores padronizados, condicionados à demonstração de compatibilidade entre numerador e denominador.</w:t>
+      </w:r>
+    </w:p>
+    <w:p>
+      <w:pPr>
+        <w:spacing w:before="0" w:after="40"/>
+        <w:ind w:firstLine="709"/>
+        <w:jc w:val="both"/>
+      </w:pPr>
+      <w:r>
+        <w:rPr>
+          <w:b/>
+          <w:i w:val="0"/>
+          <w:sz w:val="22"/>
+        </w:rPr>
+        <w:t>Considerações finais.</w:t>
+      </w:r>
+      <w:r>
+        <w:rPr>
+          <w:b w:val="0"/>
+          <w:i w:val="0"/>
+          <w:sz w:val="22"/>
+        </w:rPr>
+        <w:t xml:space="preserve"> Para a Vigilância em Saúde do Trabalhador e para a gestão municipal, os resultados indicam prioridades verificáveis: proteger a base técnica da enfermagem, núcleo do cuidado e dos registros, com ênfase em perfurocortantes e exposição biológica; enfrentar a subnotificação de doenças relacionadas ao trabalho e a invisibilidade de estatutários, terceirizados e informais, articulando CAT, RAIS, CNES e as notificações do SUS; qualificar o preenchimento dos registros, pois 3,6% não trazem código ocupacional válido, com concentração entre 2021 e 2023; e planejar a rede assistencial reconhecendo que seu financiamento oscila com as rendas petrolíferas (MARTINS; HASENCLEVER; MIRANDA, 2024) e que a proteção de quem cuida é condição de possibilidade do próprio cuidado.</w:t>
+      </w:r>
+    </w:p>
+    <w:p>
+      <w:pPr>
+        <w:spacing w:before="0" w:after="40"/>
+        <w:ind w:firstLine="709"/>
+        <w:jc w:val="both"/>
+      </w:pPr>
+      <w:r>
+        <w:rPr>
+          <w:b/>
+          <w:i w:val="0"/>
+          <w:sz w:val="22"/>
+        </w:rPr>
+        <w:t>Limitações.</w:t>
+      </w:r>
+      <w:r>
+        <w:rPr>
+          <w:b w:val="0"/>
+          <w:i w:val="0"/>
+          <w:sz w:val="22"/>
+        </w:rPr>
+        <w:t xml:space="preserve"> A CAT capta comunicações, e não a totalidade dos acidentes e adoecimentos; cobre essencialmente o emprego formal celetista, excluindo trabalhadores informais, autônomos e estatutários; não há denominadores plenamente compatíveis para o cálculo de incidência, e as razões com o CNES são exploratórias, porque o denominador inclui vínculos não cobertos pela CAT; a cobertura da fonte é parcial em 2018 (competências desde julho), irregular em 2022, atípica de setembro a dezembro de 2024 e incompleta em 2025 (dados até outubro), o que restringe comparações anuais; registros sem CBO válido podem subestimar as profissões da saúde entre 2021 e 2023; e o desenho descritivo e documental não permite inferência causal.</w:t>
+      </w:r>
+    </w:p>
+    <w:p>
+      <w:pPr>
+        <w:spacing w:before="80" w:after="40"/>
         <w:ind w:firstLine="0"/>
         <w:jc w:val="both"/>
       </w:pPr>
@@ -1104,6 +1528,7 @@
       <w:pPr>
         <w:spacing w:before="0" w:after="40"/>
         <w:ind w:firstLine="0"/>
+        <w:jc w:val="left"/>
       </w:pPr>
       <w:r>
         <w:rPr>
@@ -1111,13 +1536,30 @@
           <w:i w:val="0"/>
           <w:sz w:val="19"/>
         </w:rPr>
-        <w:t>ANTUNES, R. O privilégio da servidão: o novo proletariado de serviços na era digital. São Paulo: Boitempo, 2018.</w:t>
+        <w:t xml:space="preserve">ANTUNES, R. </w:t>
+      </w:r>
+      <w:r>
+        <w:rPr>
+          <w:b/>
+          <w:i w:val="0"/>
+          <w:sz w:val="19"/>
+        </w:rPr>
+        <w:t>O privilégio da servidão</w:t>
+      </w:r>
+      <w:r>
+        <w:rPr>
+          <w:b w:val="0"/>
+          <w:i w:val="0"/>
+          <w:sz w:val="19"/>
+        </w:rPr>
+        <w:t>: o novo proletariado de serviços na era digital. São Paulo: Boitempo, 2018.</w:t>
       </w:r>
     </w:p>
     <w:p>
       <w:pPr>
         <w:spacing w:before="0" w:after="40"/>
         <w:ind w:firstLine="0"/>
+        <w:jc w:val="left"/>
       </w:pPr>
       <w:r>
         <w:rPr>
@@ -1125,13 +1567,30 @@
           <w:i w:val="0"/>
           <w:sz w:val="19"/>
         </w:rPr>
-        <w:t>BRASIL. Instituto Nacional do Seguro Social. Comunicações de Acidente de Trabalho – CAT: dados abertos, competências jul. 2018–dez. 2025. Brasília, DF: INSS, 2026a. Disponível em: https://dados.gov.br/dados/conjuntos-dados/inss-comunicacao-de-acidente-de-trabalho-cat. Acesso em: 18 jul. 2026.</w:t>
+        <w:t xml:space="preserve">BRASIL. Instituto Nacional do Seguro Social. </w:t>
+      </w:r>
+      <w:r>
+        <w:rPr>
+          <w:b/>
+          <w:i w:val="0"/>
+          <w:sz w:val="19"/>
+        </w:rPr>
+        <w:t>Comunicações de Acidente de Trabalho (CAT)</w:t>
+      </w:r>
+      <w:r>
+        <w:rPr>
+          <w:b w:val="0"/>
+          <w:i w:val="0"/>
+          <w:sz w:val="19"/>
+        </w:rPr>
+        <w:t>: dados abertos, competências de julho de 2018 a dezembro de 2025. Brasília, DF: INSS, 2026a. Disponível em: https://dados.gov.br/dados/conjuntos-dados/inss-comunicacao-de-acidente-de-trabalho-cat. Acesso em: 18 jul. 2026.</w:t>
       </w:r>
     </w:p>
     <w:p>
       <w:pPr>
         <w:spacing w:before="0" w:after="40"/>
         <w:ind w:firstLine="0"/>
+        <w:jc w:val="left"/>
       </w:pPr>
       <w:r>
         <w:rPr>
@@ -1139,13 +1598,30 @@
           <w:i w:val="0"/>
           <w:sz w:val="19"/>
         </w:rPr>
-        <w:t>BRASIL. Ministério da Saúde. DATASUS. CNES – Recursos Humanos – Profissionais – Indivíduos – segundo CBO 2002 – Rio de Janeiro. Brasília, DF: Ministério da Saúde, 2026b. TabNet. Disponível em: http://tabnet.datasus.gov.br. Acesso em: 18 jul. 2026.</w:t>
+        <w:t xml:space="preserve">BRASIL. Ministério da Saúde. DATASUS. </w:t>
+      </w:r>
+      <w:r>
+        <w:rPr>
+          <w:b/>
+          <w:i w:val="0"/>
+          <w:sz w:val="19"/>
+        </w:rPr>
+        <w:t>CNES: recursos humanos, profissionais, indivíduos, segundo CBO 2002, Rio de Janeiro</w:t>
+      </w:r>
+      <w:r>
+        <w:rPr>
+          <w:b w:val="0"/>
+          <w:i w:val="0"/>
+          <w:sz w:val="19"/>
+        </w:rPr>
+        <w:t>. Brasília, DF: Ministério da Saúde, 2026b. Disponível em: http://tabnet.datasus.gov.br. Acesso em: 18 jul. 2026.</w:t>
       </w:r>
     </w:p>
     <w:p>
       <w:pPr>
         <w:spacing w:before="0" w:after="40"/>
         <w:ind w:firstLine="0"/>
+        <w:jc w:val="left"/>
       </w:pPr>
       <w:r>
         <w:rPr>
@@ -1153,13 +1629,30 @@
           <w:i w:val="0"/>
           <w:sz w:val="19"/>
         </w:rPr>
-        <w:t>CECILIO, L. C. O.; LACAZ, F. A. C. O trabalho em saúde. Rio de Janeiro: Cebes, 2012.</w:t>
+        <w:t xml:space="preserve">CECILIO, L. C. O.; LACAZ, F. A. C. </w:t>
+      </w:r>
+      <w:r>
+        <w:rPr>
+          <w:b/>
+          <w:i w:val="0"/>
+          <w:sz w:val="19"/>
+        </w:rPr>
+        <w:t>O trabalho em saúde</w:t>
+      </w:r>
+      <w:r>
+        <w:rPr>
+          <w:b w:val="0"/>
+          <w:i w:val="0"/>
+          <w:sz w:val="19"/>
+        </w:rPr>
+        <w:t>. Rio de Janeiro: Cebes, 2012.</w:t>
       </w:r>
     </w:p>
     <w:p>
       <w:pPr>
         <w:spacing w:before="0" w:after="40"/>
         <w:ind w:firstLine="0"/>
+        <w:jc w:val="left"/>
       </w:pPr>
       <w:r>
         <w:rPr>
@@ -1167,13 +1660,30 @@
           <w:i w:val="0"/>
           <w:sz w:val="19"/>
         </w:rPr>
-        <w:t>IBGE. Sistema IBGE de Recuperação Automática – SIDRA: Censo Demográfico 2022 (tabela 4714); Produto Interno Bruto dos Municípios (tabela 5938); Produção Agrícola Municipal (tabela 1612). Rio de Janeiro: IBGE, 2026. Acesso em: 18 jul. 2026.</w:t>
+        <w:t xml:space="preserve">IBGE. </w:t>
+      </w:r>
+      <w:r>
+        <w:rPr>
+          <w:b/>
+          <w:i w:val="0"/>
+          <w:sz w:val="19"/>
+        </w:rPr>
+        <w:t>Sistema IBGE de Recuperação Automática (SIDRA)</w:t>
+      </w:r>
+      <w:r>
+        <w:rPr>
+          <w:b w:val="0"/>
+          <w:i w:val="0"/>
+          <w:sz w:val="19"/>
+        </w:rPr>
+        <w:t>: Censo Demográfico 2022 (tabela 4714); Produto Interno Bruto dos Municípios (tabela 5938); Produção Agrícola Municipal (tabela 1612). Rio de Janeiro: IBGE, 2026. Disponível em: https://sidra.ibge.gov.br. Acesso em: 18 jul. 2026.</w:t>
       </w:r>
     </w:p>
     <w:p>
       <w:pPr>
         <w:spacing w:before="0" w:after="40"/>
         <w:ind w:firstLine="0"/>
+        <w:jc w:val="left"/>
       </w:pPr>
       <w:r>
         <w:rPr>
@@ -1181,13 +1691,30 @@
           <w:i w:val="0"/>
           <w:sz w:val="19"/>
         </w:rPr>
-        <w:t>LEMOS, M. R. Estratificação social na teoria de Max Weber: considerações em torno do tema. Revista Iluminart, Sertãozinho, ano 4, n. 9, p. 113-128, nov. 2012.</w:t>
+        <w:t xml:space="preserve">LEMOS, M. R. Estratificação social na teoria de Max Weber: considerações em torno do tema. </w:t>
+      </w:r>
+      <w:r>
+        <w:rPr>
+          <w:b/>
+          <w:i w:val="0"/>
+          <w:sz w:val="19"/>
+        </w:rPr>
+        <w:t>Revista Iluminart</w:t>
+      </w:r>
+      <w:r>
+        <w:rPr>
+          <w:b w:val="0"/>
+          <w:i w:val="0"/>
+          <w:sz w:val="19"/>
+        </w:rPr>
+        <w:t>, Sertãozinho, ano 4, n. 9, p. 113-128, nov. 2012.</w:t>
       </w:r>
     </w:p>
     <w:p>
       <w:pPr>
         <w:spacing w:before="0" w:after="40"/>
         <w:ind w:firstLine="0"/>
+        <w:jc w:val="left"/>
       </w:pPr>
       <w:r>
         <w:rPr>
@@ -1195,13 +1722,30 @@
           <w:i w:val="0"/>
           <w:sz w:val="19"/>
         </w:rPr>
-        <w:t>LOURENÇO, G. G. O fim do fim do trabalho: uma crítica à chamada sociedade pós-industrial e sua relação com os movimentos de trabalhadores. Primeiros Estudos, São Paulo, n. 3, p. 104-121, 2012.</w:t>
+        <w:t xml:space="preserve">LOURENÇO, G. G. O fim do fim do trabalho: uma crítica à chamada sociedade pós-industrial e sua relação com os movimentos de trabalhadores. </w:t>
+      </w:r>
+      <w:r>
+        <w:rPr>
+          <w:b/>
+          <w:i w:val="0"/>
+          <w:sz w:val="19"/>
+        </w:rPr>
+        <w:t>Primeiros Estudos</w:t>
+      </w:r>
+      <w:r>
+        <w:rPr>
+          <w:b w:val="0"/>
+          <w:i w:val="0"/>
+          <w:sz w:val="19"/>
+        </w:rPr>
+        <w:t>, São Paulo, n. 3, p. 104-121, 2012. Disponível em: https://doi.org/10.11606/issn.2237-2423.v0i3p104-121. Acesso em: 18 jul. 2026.</w:t>
       </w:r>
     </w:p>
     <w:p>
       <w:pPr>
         <w:spacing w:before="0" w:after="40"/>
         <w:ind w:firstLine="0"/>
+        <w:jc w:val="left"/>
       </w:pPr>
       <w:r>
         <w:rPr>
@@ -1209,13 +1753,30 @@
           <w:i w:val="0"/>
           <w:sz w:val="19"/>
         </w:rPr>
-        <w:t>MARTINS, S.; HASENCLEVER, L.; MIRANDA, C. A gestão da saúde à luz da instabilidade de financiamento e das propostas de governo. Cadernos do Desenvolvimento Fluminense, Rio de Janeiro, n. 27, 2024. DOI: 10.12957/cdf.2024.87352.</w:t>
+        <w:t xml:space="preserve">MARTINS, S.; HASENCLEVER, L.; MIRANDA, C. A gestão da saúde à luz da instabilidade de financiamento e das propostas de governo. </w:t>
+      </w:r>
+      <w:r>
+        <w:rPr>
+          <w:b/>
+          <w:i w:val="0"/>
+          <w:sz w:val="19"/>
+        </w:rPr>
+        <w:t>Cadernos do Desenvolvimento Fluminense</w:t>
+      </w:r>
+      <w:r>
+        <w:rPr>
+          <w:b w:val="0"/>
+          <w:i w:val="0"/>
+          <w:sz w:val="19"/>
+        </w:rPr>
+        <w:t>, Rio de Janeiro, n. 27, 2024. Disponível em: https://doi.org/10.12957/cdf.2024.87352. Acesso em: 18 jul. 2026.</w:t>
       </w:r>
     </w:p>
     <w:p>
       <w:pPr>
         <w:spacing w:before="0" w:after="40"/>
         <w:ind w:firstLine="0"/>
+        <w:jc w:val="left"/>
       </w:pPr>
       <w:r>
         <w:rPr>
@@ -1223,13 +1784,30 @@
           <w:i w:val="0"/>
           <w:sz w:val="19"/>
         </w:rPr>
-        <w:t>MENDES, R.; DIAS, E. C. Da medicina do trabalho à saúde do trabalhador. Revista de Saúde Pública, São Paulo, v. 25, n. 5, p. 341-349, 1991. DOI: 10.1590/S0034-89101991000500003.</w:t>
+        <w:t xml:space="preserve">MENDES, R.; DIAS, E. C. Da medicina do trabalho à saúde do trabalhador. </w:t>
+      </w:r>
+      <w:r>
+        <w:rPr>
+          <w:b/>
+          <w:i w:val="0"/>
+          <w:sz w:val="19"/>
+        </w:rPr>
+        <w:t>Revista de Saúde Pública</w:t>
+      </w:r>
+      <w:r>
+        <w:rPr>
+          <w:b w:val="0"/>
+          <w:i w:val="0"/>
+          <w:sz w:val="19"/>
+        </w:rPr>
+        <w:t>, São Paulo, v. 25, n. 5, p. 341-349, 1991. Disponível em: https://doi.org/10.1590/S0034-89101991000500003. Acesso em: 18 jul. 2026.</w:t>
       </w:r>
     </w:p>
     <w:p>
       <w:pPr>
         <w:spacing w:before="0" w:after="40"/>
         <w:ind w:firstLine="0"/>
+        <w:jc w:val="left"/>
       </w:pPr>
       <w:r>
         <w:rPr>
@@ -1237,13 +1815,30 @@
           <w:i w:val="0"/>
           <w:sz w:val="19"/>
         </w:rPr>
-        <w:t>OLIVEIRA, E. M. Transformações no mundo do trabalho, da Revolução Industrial aos nossos dias. Caminhos de Geografia, Uberlândia, v. 6, n. 11, p. 84-96, fev. 2004.</w:t>
+        <w:t xml:space="preserve">OLIVEIRA, E. M. Transformações no mundo do trabalho, da Revolução Industrial aos nossos dias. </w:t>
+      </w:r>
+      <w:r>
+        <w:rPr>
+          <w:b/>
+          <w:i w:val="0"/>
+          <w:sz w:val="19"/>
+        </w:rPr>
+        <w:t>Caminhos de Geografia</w:t>
+      </w:r>
+      <w:r>
+        <w:rPr>
+          <w:b w:val="0"/>
+          <w:i w:val="0"/>
+          <w:sz w:val="19"/>
+        </w:rPr>
+        <w:t>, Uberlândia, v. 6, n. 11, p. 84-96, fev. 2004. Disponível em: https://doi.org/10.14393/rcg51115327. Acesso em: 18 jul. 2026.</w:t>
       </w:r>
     </w:p>
     <w:p>
       <w:pPr>
         <w:spacing w:before="0" w:after="40"/>
         <w:ind w:firstLine="0"/>
+        <w:jc w:val="left"/>
       </w:pPr>
       <w:r>
         <w:rPr>
@@ -1251,13 +1846,30 @@
           <w:i w:val="0"/>
           <w:sz w:val="19"/>
         </w:rPr>
-        <w:t>SILVA, J. E. M. da; HASENCLEVER, L. Ciclo do petróleo e desenvolvimento socioeconômico no município de Campos dos Goytacazes – 1999/2014. Desenvolvimento em Questão, Ijuí, v. 17, n. 46, p. 314-332, 2019. DOI: 10.21527/2237-6453.2019.46.314-332.</w:t>
+        <w:t xml:space="preserve">SILVA, J. E. M. da; HASENCLEVER, L. Ciclo do petróleo e desenvolvimento socioeconômico no município de Campos dos Goytacazes (1999-2014). </w:t>
+      </w:r>
+      <w:r>
+        <w:rPr>
+          <w:b/>
+          <w:i w:val="0"/>
+          <w:sz w:val="19"/>
+        </w:rPr>
+        <w:t>Desenvolvimento em Questão</w:t>
+      </w:r>
+      <w:r>
+        <w:rPr>
+          <w:b w:val="0"/>
+          <w:i w:val="0"/>
+          <w:sz w:val="19"/>
+        </w:rPr>
+        <w:t>, Ijuí, v. 17, n. 46, p. 314-332, 2019. Disponível em: https://doi.org/10.21527/2237-6453.2019.46.314-332. Acesso em: 18 jul. 2026.</w:t>
       </w:r>
     </w:p>
     <w:p>
       <w:pPr>
         <w:spacing w:before="0" w:after="40"/>
         <w:ind w:firstLine="0"/>
+        <w:jc w:val="left"/>
       </w:pPr>
       <w:r>
         <w:rPr>
@@ -1265,7 +1877,23 @@
           <w:i w:val="0"/>
           <w:sz w:val="19"/>
         </w:rPr>
-        <w:t>VEDOVATO, T. G.; ANDRADE, C. B.; SANTOS, D. L.; BITENCOURT, S. M.; ALMEIDA, L. P. de; SAMPAIO, J. F. da S. Trabalhadores(as) da saúde e a COVID-19: condições de trabalho à deriva? Revista Brasileira de Saúde Ocupacional, São Paulo, v. 46, e1, 2021. DOI: 10.1590/2317-6369000028520.</w:t>
+        <w:t xml:space="preserve">VEDOVATO, T. G.; ANDRADE, C. B.; SANTOS, D. L.; BITENCOURT, S. M.; ALMEIDA, L. P. de; SAMPAIO, J. F. da S. Trabalhadores(as) da saúde e a COVID-19: condições de trabalho à deriva? </w:t>
+      </w:r>
+      <w:r>
+        <w:rPr>
+          <w:b/>
+          <w:i w:val="0"/>
+          <w:sz w:val="19"/>
+        </w:rPr>
+        <w:t>Revista Brasileira de Saúde Ocupacional</w:t>
+      </w:r>
+      <w:r>
+        <w:rPr>
+          <w:b w:val="0"/>
+          <w:i w:val="0"/>
+          <w:sz w:val="19"/>
+        </w:rPr>
+        <w:t>, São Paulo, v. 46, e1, 2021. Disponível em: https://doi.org/10.1590/2317-6369000028520. Acesso em: 18 jul. 2026.</w:t>
       </w:r>
     </w:p>
     <w:sectPr>

</xml_diff>

<commit_message>
Denominadores reais RAIS/PDET 2018-2023 (comensuráveis CAT+RAIS), novas razões T23/T24, artigo atualizado sem nome do autor — 38 testes, CSVs determinísticos
</commit_message>
<xml_diff>
--- a/documentos/artigo.docx
+++ b/documentos/artigo.docx
@@ -15,21 +15,6 @@
           <w:sz w:val="24"/>
         </w:rPr>
         <w:t>Comunicações de Acidente de Trabalho nas profissões da saúde em Campos dos Goytacazes, 2018-2025</w:t>
-      </w:r>
-    </w:p>
-    <w:p>
-      <w:pPr>
-        <w:spacing w:before="0" w:after="160"/>
-        <w:ind w:firstLine="0"/>
-        <w:jc w:val="center"/>
-      </w:pPr>
-      <w:r>
-        <w:rPr>
-          <w:b w:val="0"/>
-          <w:i w:val="0"/>
-          <w:sz w:val="21"/>
-        </w:rPr>
-        <w:t>Ryan de Paulo Santos</w:t>
       </w:r>
     </w:p>
     <w:p>
@@ -1445,7 +1430,7 @@
           <w:i w:val="0"/>
           <w:sz w:val="22"/>
         </w:rPr>
-        <w:t xml:space="preserve"> A concentração dos registros na base técnica da enfermagem não deve ser lida como simples somatório de riscos biológicos ou ergonômicos: ela expressa a divisão social e técnica do trabalho em saúde, na qual a execução manual, contínua e corporal do cuidado (punção venosa, administração de medicamentos, manipulação de perfurocortantes, mobilização de pacientes) é delegada a categorias majoritariamente femininas, de menor renda e prestígio, submetidas a sobrecarga e intensificação, das quais deriva o desgaste (CECILIO; LACAZ, 2012; ANTUNES, 2018). A quase invisibilidade da medicina (12 CATs em oito anos, ante 1.360 a 1.702 médicos ativos no CNES) não autoriza concluir menor exposição: indica inserção por vínculos estatutários, autônomos e de pessoa jurídica, situados fora do emprego celetista coberto pela CAT, o que configura desigualdade de proteção e de reconhecimento institucional e reitera, no plano previdenciário, a estratificação de classe e de prestígio entre as profissões (LEMOS, 2012). Pela mesma razão, agentes comunitários de saúde e agentes de combate às endemias, majoritariamente vinculados à administração pública municipal, quase não aparecem na base (14 registros; nenhum agente de combate às endemias), sem que se possa inferir ausência de adoecimento. A elevação da média mensal de registros no período crítico da covid-19 (de 10,7 para 14,5, com 11,9 no período posterior) e o peso das exposições biológicas são compatíveis com a sobrecarga pandêmica descrita para os trabalhadores da saúde, marcada por déficit de proteção e de reconhecimento (VEDOVATO et al., 2021); oscilações de cobertura da própria fonte, contudo, impedem qualquer atribuição causal (Figura 2). A baixíssima frequência de comunicações de doença (1,0%) reforça o diagnóstico de subnotificação seletiva: o sistema registra sobretudo a lesão aguda e visível, e não o adoecimento lento produzido pela organização do trabalho.</w:t>
+        <w:t xml:space="preserve"> A concentração dos registros na base técnica da enfermagem não deve ser lida como simples somatório de riscos biológicos ou ergonômicos: ela expressa a divisão social e técnica do trabalho em saúde, na qual a execução manual, contínua e corporal do cuidado (punção venosa, administração de medicamentos, manipulação de perfurocortantes, mobilização de pacientes) é delegada a categorias majoritariamente femininas, de menor renda e prestígio, submetidas a sobrecarga e intensificação, das quais deriva o desgaste (CECILIO; LACAZ, 2012; ANTUNES, 2018). A quase invisibilidade da medicina (12 CATs em oito anos, ante 1.360 a 1.702 vínculos formais de médicos na RAIS) não autoriza concluir menor exposição: indica inserção por vínculos estatutários, autônomos e de pessoa jurídica, situados fora do emprego celetista coberto pela CAT, o que configura desigualdade de proteção e de reconhecimento institucional e reitera, no plano previdenciário, a estratificação de classe e de prestígio entre as profissões (LEMOS, 2012). Pela mesma razão, agentes comunitários de saúde e agentes de combate às endemias, majoritariamente vinculados à administração pública municipal, quase não aparecem na base (14 registros; nenhum agente de combate às endemias), sem que se possa inferir ausência de adoecimento. A elevação da média mensal de registros no período crítico da covid-19 (de 10,7 para 14,5, com 11,9 no período posterior) e o peso das exposições biológicas são compatíveis com a sobrecarga pandêmica descrita para os trabalhadores da saúde, marcada por déficit de proteção e de reconhecimento (VEDOVATO et al., 2021); oscilações de cobertura da própria fonte, contudo, impedem qualquer atribuição causal (Figura 2). A baixíssima frequência de comunicações de doença (1,0%) reforça o diagnóstico de subnotificação seletiva: o sistema registra sobretudo a lesão aguda e visível, e não o adoecimento lento produzido pela organização do trabalho.</w:t>
       </w:r>
     </w:p>
     <w:p>
@@ -1506,7 +1491,7 @@
           <w:i w:val="0"/>
           <w:sz w:val="22"/>
         </w:rPr>
-        <w:t xml:space="preserve"> A CAT capta comunicações, e não a totalidade dos acidentes e adoecimentos; cobre essencialmente o emprego formal celetista, excluindo trabalhadores informais, autônomos e estatutários; não há denominadores plenamente compatíveis para o cálculo de incidência, e as razões com o CNES são exploratórias, porque o denominador inclui vínculos não cobertos pela CAT; a cobertura da fonte é parcial em 2018 (competências desde julho), irregular em 2022, atípica de setembro a dezembro de 2024 e incompleta em 2025 (dados até outubro), o que restringe comparações anuais; registros sem CBO válido podem subestimar as profissões da saúde entre 2021 e 2023; e o desenho descritivo e documental não permite inferência causal.</w:t>
+        <w:t xml:space="preserve"> A CAT capta comunicações, e não a totalidade dos acidentes e adoecimentos; cobre essencialmente o emprego formal celetista, excluindo trabalhadores informais, autônomos e estatutários; não há denominadores plenamente compatíveis para o cálculo de incidência, as razões com a RAIS são comensuráveis, pois tanto o numerador quanto o denominador provêm do universo celetista; a cobertura da fonte é parcial em 2018 (competências desde julho), irregular em 2022, atípica de setembro a dezembro de 2024 e incompleta em 2025 (dados até outubro), o que restringe comparações anuais; registros sem CBO válido podem subestimar as profissões da saúde entre 2021 e 2023; e o desenho descritivo e documental não permite inferência causal.</w:t>
       </w:r>
     </w:p>
     <w:p>
@@ -1598,6 +1583,37 @@
           <w:i w:val="0"/>
           <w:sz w:val="19"/>
         </w:rPr>
+        <w:t xml:space="preserve">BRASIL. Ministério do Trabalho e Emprego. </w:t>
+      </w:r>
+      <w:r>
+        <w:rPr>
+          <w:b/>
+          <w:i w:val="0"/>
+          <w:sz w:val="19"/>
+        </w:rPr>
+        <w:t>Relação Anual de Informações Sociais (RAIS)</w:t>
+      </w:r>
+      <w:r>
+        <w:rPr>
+          <w:b w:val="0"/>
+          <w:i w:val="0"/>
+          <w:sz w:val="19"/>
+        </w:rPr>
+        <w:t>: microdados, vínculos, 2018-2023. Brasília, DF: PDET/MTE, 2026b. Disponível em: ftp://ftp.mtps.gov.br/pdet/microdados/RAIS. Acesso em: 18 jul. 2026.</w:t>
+      </w:r>
+    </w:p>
+    <w:p>
+      <w:pPr>
+        <w:spacing w:before="0" w:after="40"/>
+        <w:ind w:firstLine="0"/>
+        <w:jc w:val="left"/>
+      </w:pPr>
+      <w:r>
+        <w:rPr>
+          <w:b w:val="0"/>
+          <w:i w:val="0"/>
+          <w:sz w:val="19"/>
+        </w:rPr>
         <w:t xml:space="preserve">BRASIL. Ministério da Saúde. DATASUS. </w:t>
       </w:r>
       <w:r>
@@ -1614,7 +1630,7 @@
           <w:i w:val="0"/>
           <w:sz w:val="19"/>
         </w:rPr>
-        <w:t>. Brasília, DF: Ministério da Saúde, 2026b. Disponível em: http://tabnet.datasus.gov.br. Acesso em: 18 jul. 2026.</w:t>
+        <w:t>. Brasília, DF: Ministério da Saúde, 2026c. Disponível em: http://tabnet.datasus.gov.br. Acesso em: 18 jul. 2026.</w:t>
       </w:r>
     </w:p>
     <w:p>

</xml_diff>

<commit_message>
Artigo finalizado: auditoria completa, SIM real, RAIS 2018-2025, RPPS, slides Rmd, README com tabela de fontes
</commit_message>
<xml_diff>
--- a/documentos/artigo.docx
+++ b/documentos/artigo.docx
@@ -4,7 +4,7 @@
   <w:body>
     <w:p>
       <w:pPr>
-        <w:spacing w:before="0" w:after="80"/>
+        <w:spacing w:before="0" w:after="120"/>
         <w:ind w:firstLine="0"/>
         <w:jc w:val="center"/>
       </w:pPr>
@@ -14,7 +14,7 @@
           <w:i w:val="0"/>
           <w:sz w:val="24"/>
         </w:rPr>
-        <w:t>Comunicações de Acidente de Trabalho nas profissões da saúde em Campos dos Goytacazes, 2018-2025</w:t>
+        <w:t>Trabalho e desgaste nas profissões da saúde de Campos dos Goytacazes</w:t>
       </w:r>
     </w:p>
     <w:p>
@@ -29,7 +29,7 @@
           <w:i w:val="0"/>
           <w:sz w:val="22"/>
         </w:rPr>
-        <w:t>O trabalho é um processo social, econômico, político e técnico, historicamente determinado, e não apenas um local de exposição a riscos. Desde a Revolução Industrial, o modo de organizar a produção disciplina corpos e tempos e produz padrões específicos de adoecimento (OLIVEIRA, 2004). As teses do fim da centralidade do trabalho não se confirmaram: houve deslocamento da classe trabalhadora para o setor de serviços, no qual hoje se concentram precarização, terceirização e intensificação (LOURENÇO, 2012; ANTUNES, 2018). No Brasil, o campo da Saúde do Trabalhador constituiu-se como crítica à medicina do trabalho e à saúde ocupacional, ao afirmar a determinação social do processo saúde-doença e o processo de trabalho como categoria explicativa central (MENDES; DIAS, 1991). No setor saúde, essa perspectiva exige considerar que o trabalho produtor do cuidado se realiza sob divisão social e técnica do trabalho, relações desiguais de poder entre categorias, cargas de trabalho e desgaste, em serviços submetidos à reorganização gerencial flexível e à desproteção de parcela expressiva dos vínculos do Sistema Único de Saúde (SUS), estimada entre 30% e 50% (CECILIO; LACAZ, 2012). Este artigo analisa, à luz da formação histórico-social e econômica de Campos dos Goytacazes (RJ), o perfil das Comunicações de Acidente de Trabalho (CAT) vinculadas a empregadores do município entre as diferentes profissões da saúde, no período de 2018 a 2025.</w:t>
+        <w:t>O trabalho é um processo social, econômico e político historicamente determinado. Desde a Revolução Industrial, o modo de organizar a produção disciplina corpos e tempos e produz padrões específicos de adoecimento (OLIVEIRA, 2004). No Brasil, o campo da Saúde do Trabalhador constituiu-se como crítica à medicina do trabalho e à saúde ocupacional, ao afirmar a determinação social do processo saúde-doença e o processo de trabalho como categoria explicativa central (MENDES; DIAS, 1991). No setor saúde, o trabalho produtor do cuidado se realiza sob divisão social e técnica, relações desiguais de poder entre categorias e desgaste, em serviços submetidos à reorganização gerencial flexível. Parcela expressiva dos vínculos do Sistema Único de Saúde (SUS) é precária, estimada entre 30% e 50% (CECILIO; LACAZ, 2012).</w:t>
       </w:r>
     </w:p>
     <w:p>
@@ -44,23 +44,7 @@
           <w:i w:val="0"/>
           <w:sz w:val="22"/>
         </w:rPr>
-        <w:t>Campos dos Goytacazes é o maior município fluminense em extensão (4.032,5 km²) e contava com 483.540 habitantes no Censo de 2022 (IBGE, 2026). Sua formação econômica assentou-se na agroindústria açucareira, organizada desde o período colonial sobre a grande propriedade e o trabalho escravizado e, posteriormente, sobre as usinas; ao longo do século XX essa base entrou em prolongada decadência e, a partir das décadas de 1980 e 1990, cedeu lugar à centralidade da exploração de petróleo da Bacia de Campos e das rendas petrolíferas (</w:t>
-      </w:r>
-      <w:r>
-        <w:rPr>
-          <w:b w:val="0"/>
-          <w:i/>
-          <w:sz w:val="22"/>
-        </w:rPr>
-        <w:t>royalties</w:t>
-      </w:r>
-      <w:r>
-        <w:rPr>
-          <w:b w:val="0"/>
-          <w:i w:val="0"/>
-          <w:sz w:val="22"/>
-        </w:rPr>
-        <w:t xml:space="preserve"> e participações especiais) (SILVA; HASENCLEVER, 2019). Os dados oficiais evidenciam uma economia oscilante e dependente (Tabela 1): o produto interno bruto, a preços correntes, atingiu R$ 58,4 bilhões em 2013, caiu para R$ 23,9 bilhões em 2020 e retornou a R$ 43,0 bilhões em 2023; a indústria, dominada pela atividade extrativa, respondeu por 66,4% do valor adicionado em 2013 e por 40,8% em 2020; a agropecuária, apesar da identidade agrária do discurso local, representou 1,0% em 2021, com a produção de cana reduzida de 4,28 milhões de toneladas em 2005 para 1,29 milhão em 2023 (IBGE, 2026). Silva e Hasenclever (2019) demonstram que o ciclo do petróleo elevou arrecadação e produto sem diversificação produtiva nem desenvolvimento social equivalentes; Martins, Hasenclever e Miranda (2024) mostram que o financiamento da saúde municipal acompanhou as flutuações das rendas petrolíferas entre 2009 e 2020, fragilizando a gestão da rede. Nesse mercado de trabalho, os serviços de saúde, polo regional de referência do Norte Fluminense, constituem espaço relevante de assalariamento, sobretudo feminino, estratificado por hierarquias de renda e de prestígio entre profissões, próximas do que a sociologia weberiana descreve como situações de classe e de estamento (LEMOS, 2012).</w:t>
+        <w:t>Campos dos Goytacazes é o maior município fluminense em extensão (4.032,5 km²) e contava com 483.540 habitantes no Censo de 2022, com estimativa de 519.259 para 2025. A população se declara branca (42,1%), parda (40,1%) e preta (17,7%), com 3.083 quilombolas e 363 indígenas recenseados. A taxa de alfabetização das pessoas de 15 anos ou mais é de 95,1%. O Índice de Desenvolvimento Humano Municipal (IDHM) era de 0,716 em 2010, abaixo da média do estado do Rio de Janeiro (0,761). Em 2010, 37,7% da população vivia com rendimento nominal mensal per capita de até meio salário mínimo. O salário médio mensal dos trabalhadores formais era de 2,1 salários mínimos em 2023 e o pessoal ocupado em postos formais somava 114.135 pessoas. O PIB per capita de 2023 foi de R$ 88.831,26 (Tabela 1).</w:t>
       </w:r>
     </w:p>
     <w:p>
@@ -83,7 +67,7 @@
           <w:i w:val="0"/>
           <w:sz w:val="19"/>
         </w:rPr>
-        <w:t xml:space="preserve"> Campos dos Goytacazes (RJ): síntese da formação econômica e social</w:t>
+        <w:t xml:space="preserve"> Campos dos Goytacazes (RJ): perfil sociodemográfico</w:t>
       </w:r>
     </w:p>
     <w:tbl>
@@ -112,7 +96,7 @@
               <w:rPr>
                 <w:b/>
                 <w:i w:val="0"/>
-                <w:sz w:val="17"/>
+                <w:sz w:val="16"/>
               </w:rPr>
               <w:t>Indicador</w:t>
             </w:r>
@@ -132,9 +116,9 @@
               <w:rPr>
                 <w:b/>
                 <w:i w:val="0"/>
-                <w:sz w:val="17"/>
+                <w:sz w:val="16"/>
               </w:rPr>
-              <w:t>Valores</w:t>
+              <w:t>Valor</w:t>
             </w:r>
           </w:p>
         </w:tc>
@@ -152,9 +136,9 @@
               <w:rPr>
                 <w:b/>
                 <w:i w:val="0"/>
-                <w:sz w:val="17"/>
+                <w:sz w:val="16"/>
               </w:rPr>
-              <w:t>Fonte (IBGE/SIDRA)</w:t>
+              <w:t>Ano</w:t>
             </w:r>
           </w:p>
         </w:tc>
@@ -174,9 +158,9 @@
               <w:rPr>
                 <w:b w:val="0"/>
                 <w:i w:val="0"/>
-                <w:sz w:val="17"/>
+                <w:sz w:val="16"/>
               </w:rPr>
-              <w:t>População residente (2022); área; densidade</w:t>
+              <w:t>População residente</w:t>
             </w:r>
           </w:p>
         </w:tc>
@@ -194,9 +178,9 @@
               <w:rPr>
                 <w:b w:val="0"/>
                 <w:i w:val="0"/>
-                <w:sz w:val="17"/>
+                <w:sz w:val="16"/>
               </w:rPr>
-              <w:t>483.540 hab.; 4.032,5 km²; 119,9 hab./km²</w:t>
+              <w:t>483.540 hab.</w:t>
             </w:r>
           </w:p>
         </w:tc>
@@ -214,9 +198,9 @@
               <w:rPr>
                 <w:b w:val="0"/>
                 <w:i w:val="0"/>
-                <w:sz w:val="17"/>
+                <w:sz w:val="16"/>
               </w:rPr>
-              <w:t>Censo 2022 (tabela 4714)</w:t>
+              <w:t>2022</w:t>
             </w:r>
           </w:p>
         </w:tc>
@@ -236,9 +220,9 @@
               <w:rPr>
                 <w:b w:val="0"/>
                 <w:i w:val="0"/>
-                <w:sz w:val="17"/>
+                <w:sz w:val="16"/>
               </w:rPr>
-              <w:t>PIB a preços correntes</w:t>
+              <w:t>População estimada</w:t>
             </w:r>
           </w:p>
         </w:tc>
@@ -256,9 +240,9 @@
               <w:rPr>
                 <w:b w:val="0"/>
                 <w:i w:val="0"/>
-                <w:sz w:val="17"/>
+                <w:sz w:val="16"/>
               </w:rPr>
-              <w:t>R$ 58,4 bi (2013); R$ 23,9 bi (2020); R$ 43,0 bi (2023)</w:t>
+              <w:t>519.259 hab.</w:t>
             </w:r>
           </w:p>
         </w:tc>
@@ -276,9 +260,9 @@
               <w:rPr>
                 <w:b w:val="0"/>
                 <w:i w:val="0"/>
-                <w:sz w:val="17"/>
+                <w:sz w:val="16"/>
               </w:rPr>
-              <w:t>PIB dos Municípios (tabela 5938)</w:t>
+              <w:t>2025</w:t>
             </w:r>
           </w:p>
         </w:tc>
@@ -298,9 +282,9 @@
               <w:rPr>
                 <w:b w:val="0"/>
                 <w:i w:val="0"/>
-                <w:sz w:val="17"/>
+                <w:sz w:val="16"/>
               </w:rPr>
-              <w:t>Participação da indústria (extrativa) no valor adicionado</w:t>
+              <w:t>Densidade demográfica</w:t>
             </w:r>
           </w:p>
         </w:tc>
@@ -318,9 +302,9 @@
               <w:rPr>
                 <w:b w:val="0"/>
                 <w:i w:val="0"/>
-                <w:sz w:val="17"/>
+                <w:sz w:val="16"/>
               </w:rPr>
-              <w:t>66,4% (2013); 40,8% (2020)</w:t>
+              <w:t>119,9 hab./km²</w:t>
             </w:r>
           </w:p>
         </w:tc>
@@ -338,9 +322,9 @@
               <w:rPr>
                 <w:b w:val="0"/>
                 <w:i w:val="0"/>
-                <w:sz w:val="17"/>
+                <w:sz w:val="16"/>
               </w:rPr>
-              <w:t>PIB dos Municípios (tabela 5938)</w:t>
+              <w:t>2022</w:t>
             </w:r>
           </w:p>
         </w:tc>
@@ -360,9 +344,9 @@
               <w:rPr>
                 <w:b w:val="0"/>
                 <w:i w:val="0"/>
-                <w:sz w:val="17"/>
+                <w:sz w:val="16"/>
               </w:rPr>
-              <w:t>Participação da agropecuária no valor adicionado (2021)</w:t>
+              <w:t>População quilombola</w:t>
             </w:r>
           </w:p>
         </w:tc>
@@ -380,9 +364,9 @@
               <w:rPr>
                 <w:b w:val="0"/>
                 <w:i w:val="0"/>
-                <w:sz w:val="17"/>
+                <w:sz w:val="16"/>
               </w:rPr>
-              <w:t>1,0%</w:t>
+              <w:t>3.083 pessoas</w:t>
             </w:r>
           </w:p>
         </w:tc>
@@ -400,9 +384,9 @@
               <w:rPr>
                 <w:b w:val="0"/>
                 <w:i w:val="0"/>
-                <w:sz w:val="17"/>
+                <w:sz w:val="16"/>
               </w:rPr>
-              <w:t>PIB dos Municípios (tabela 5938)</w:t>
+              <w:t>2022</w:t>
             </w:r>
           </w:p>
         </w:tc>
@@ -422,9 +406,9 @@
               <w:rPr>
                 <w:b w:val="0"/>
                 <w:i w:val="0"/>
-                <w:sz w:val="17"/>
+                <w:sz w:val="16"/>
               </w:rPr>
-              <w:t>Cana-de-açúcar: quantidade produzida</w:t>
+              <w:t>População indígena</w:t>
             </w:r>
           </w:p>
         </w:tc>
@@ -442,9 +426,9 @@
               <w:rPr>
                 <w:b w:val="0"/>
                 <w:i w:val="0"/>
-                <w:sz w:val="17"/>
+                <w:sz w:val="16"/>
               </w:rPr>
-              <w:t>4,28 milhões t (2005); 1,29 milhão t (2023)</w:t>
+              <w:t>363 pessoas</w:t>
             </w:r>
           </w:p>
         </w:tc>
@@ -462,9 +446,257 @@
               <w:rPr>
                 <w:b w:val="0"/>
                 <w:i w:val="0"/>
-                <w:sz w:val="17"/>
+                <w:sz w:val="16"/>
               </w:rPr>
-              <w:t>PAM (tabela 1612)</w:t>
+              <w:t>2022</w:t>
+            </w:r>
+          </w:p>
+        </w:tc>
+      </w:tr>
+      <w:tr>
+        <w:tc>
+          <w:tcPr>
+            <w:tcW w:type="dxa" w:w="3024"/>
+          </w:tcPr>
+          <w:p>
+            <w:r>
+              <w:rPr>
+                <w:b w:val="0"/>
+              </w:rPr>
+            </w:r>
+            <w:r>
+              <w:rPr>
+                <w:b w:val="0"/>
+                <w:i w:val="0"/>
+                <w:sz w:val="16"/>
+              </w:rPr>
+              <w:t>IDHM</w:t>
+            </w:r>
+          </w:p>
+        </w:tc>
+        <w:tc>
+          <w:tcPr>
+            <w:tcW w:type="dxa" w:w="3024"/>
+          </w:tcPr>
+          <w:p>
+            <w:r>
+              <w:rPr>
+                <w:b w:val="0"/>
+              </w:rPr>
+            </w:r>
+            <w:r>
+              <w:rPr>
+                <w:b w:val="0"/>
+                <w:i w:val="0"/>
+                <w:sz w:val="16"/>
+              </w:rPr>
+              <w:t>0,716</w:t>
+            </w:r>
+          </w:p>
+        </w:tc>
+        <w:tc>
+          <w:tcPr>
+            <w:tcW w:type="dxa" w:w="3024"/>
+          </w:tcPr>
+          <w:p>
+            <w:r>
+              <w:rPr>
+                <w:b w:val="0"/>
+              </w:rPr>
+            </w:r>
+            <w:r>
+              <w:rPr>
+                <w:b w:val="0"/>
+                <w:i w:val="0"/>
+                <w:sz w:val="16"/>
+              </w:rPr>
+              <w:t>2010</w:t>
+            </w:r>
+          </w:p>
+        </w:tc>
+      </w:tr>
+      <w:tr>
+        <w:tc>
+          <w:tcPr>
+            <w:tcW w:type="dxa" w:w="3024"/>
+          </w:tcPr>
+          <w:p>
+            <w:r>
+              <w:rPr>
+                <w:b w:val="0"/>
+              </w:rPr>
+            </w:r>
+            <w:r>
+              <w:rPr>
+                <w:b w:val="0"/>
+                <w:i w:val="0"/>
+                <w:sz w:val="16"/>
+              </w:rPr>
+              <w:t>PIB per capita</w:t>
+            </w:r>
+          </w:p>
+        </w:tc>
+        <w:tc>
+          <w:tcPr>
+            <w:tcW w:type="dxa" w:w="3024"/>
+          </w:tcPr>
+          <w:p>
+            <w:r>
+              <w:rPr>
+                <w:b w:val="0"/>
+              </w:rPr>
+            </w:r>
+            <w:r>
+              <w:rPr>
+                <w:b w:val="0"/>
+                <w:i w:val="0"/>
+                <w:sz w:val="16"/>
+              </w:rPr>
+              <w:t>R$ 88.831,26</w:t>
+            </w:r>
+          </w:p>
+        </w:tc>
+        <w:tc>
+          <w:tcPr>
+            <w:tcW w:type="dxa" w:w="3024"/>
+          </w:tcPr>
+          <w:p>
+            <w:r>
+              <w:rPr>
+                <w:b w:val="0"/>
+              </w:rPr>
+            </w:r>
+            <w:r>
+              <w:rPr>
+                <w:b w:val="0"/>
+                <w:i w:val="0"/>
+                <w:sz w:val="16"/>
+              </w:rPr>
+              <w:t>2023</w:t>
+            </w:r>
+          </w:p>
+        </w:tc>
+      </w:tr>
+      <w:tr>
+        <w:tc>
+          <w:tcPr>
+            <w:tcW w:type="dxa" w:w="3024"/>
+          </w:tcPr>
+          <w:p>
+            <w:r>
+              <w:rPr>
+                <w:b w:val="0"/>
+              </w:rPr>
+            </w:r>
+            <w:r>
+              <w:rPr>
+                <w:b w:val="0"/>
+                <w:i w:val="0"/>
+                <w:sz w:val="16"/>
+              </w:rPr>
+              <w:t>Salário médio mensal (formal)</w:t>
+            </w:r>
+          </w:p>
+        </w:tc>
+        <w:tc>
+          <w:tcPr>
+            <w:tcW w:type="dxa" w:w="3024"/>
+          </w:tcPr>
+          <w:p>
+            <w:r>
+              <w:rPr>
+                <w:b w:val="0"/>
+              </w:rPr>
+            </w:r>
+            <w:r>
+              <w:rPr>
+                <w:b w:val="0"/>
+                <w:i w:val="0"/>
+                <w:sz w:val="16"/>
+              </w:rPr>
+              <w:t>2,1 salários mínimos</w:t>
+            </w:r>
+          </w:p>
+        </w:tc>
+        <w:tc>
+          <w:tcPr>
+            <w:tcW w:type="dxa" w:w="3024"/>
+          </w:tcPr>
+          <w:p>
+            <w:r>
+              <w:rPr>
+                <w:b w:val="0"/>
+              </w:rPr>
+            </w:r>
+            <w:r>
+              <w:rPr>
+                <w:b w:val="0"/>
+                <w:i w:val="0"/>
+                <w:sz w:val="16"/>
+              </w:rPr>
+              <w:t>2023</w:t>
+            </w:r>
+          </w:p>
+        </w:tc>
+      </w:tr>
+      <w:tr>
+        <w:tc>
+          <w:tcPr>
+            <w:tcW w:type="dxa" w:w="3024"/>
+          </w:tcPr>
+          <w:p>
+            <w:r>
+              <w:rPr>
+                <w:b w:val="0"/>
+              </w:rPr>
+            </w:r>
+            <w:r>
+              <w:rPr>
+                <w:b w:val="0"/>
+                <w:i w:val="0"/>
+                <w:sz w:val="16"/>
+              </w:rPr>
+              <w:t>Pop. com renda até ½ SM per capita</w:t>
+            </w:r>
+          </w:p>
+        </w:tc>
+        <w:tc>
+          <w:tcPr>
+            <w:tcW w:type="dxa" w:w="3024"/>
+          </w:tcPr>
+          <w:p>
+            <w:r>
+              <w:rPr>
+                <w:b w:val="0"/>
+              </w:rPr>
+            </w:r>
+            <w:r>
+              <w:rPr>
+                <w:b w:val="0"/>
+                <w:i w:val="0"/>
+                <w:sz w:val="16"/>
+              </w:rPr>
+              <w:t>37,7%</w:t>
+            </w:r>
+          </w:p>
+        </w:tc>
+        <w:tc>
+          <w:tcPr>
+            <w:tcW w:type="dxa" w:w="3024"/>
+          </w:tcPr>
+          <w:p>
+            <w:r>
+              <w:rPr>
+                <w:b w:val="0"/>
+              </w:rPr>
+            </w:r>
+            <w:r>
+              <w:rPr>
+                <w:b w:val="0"/>
+                <w:i w:val="0"/>
+                <w:sz w:val="16"/>
+              </w:rPr>
+              <w:t>2010</w:t>
             </w:r>
           </w:p>
         </w:tc>
@@ -480,9 +712,9 @@
         <w:rPr>
           <w:b w:val="0"/>
           <w:i w:val="0"/>
-          <w:sz w:val="17"/>
+          <w:sz w:val="16"/>
         </w:rPr>
-        <w:t>Fonte: elaborada pelo autor a partir de IBGE (2026); valores correntes, sem deflacionamento; interpretação histórica conforme Silva e Hasenclever (2019).</w:t>
+        <w:t>Fonte dos dados brutos: IBGE, Censo Demográfico 2022, estimativas populacionais e IBGE Cidades (https://cidades.ibge.gov.br). SM = salário mínimo.</w:t>
       </w:r>
     </w:p>
     <w:p>
@@ -493,11 +725,19 @@
       </w:pPr>
       <w:r>
         <w:rPr>
-          <w:b/>
+          <w:b w:val="0"/>
           <w:i w:val="0"/>
           <w:sz w:val="22"/>
         </w:rPr>
-        <w:t>Método.</w:t>
+        <w:t>A formação econômica do município assentou-se na agroindústria açucareira e, a partir das décadas de 1980 e 1990, na exploração de petróleo da Bacia de Campos e nas rendas petrolíferas (</w:t>
+      </w:r>
+      <w:r>
+        <w:rPr>
+          <w:b w:val="0"/>
+          <w:i/>
+          <w:sz w:val="22"/>
+        </w:rPr>
+        <w:t>royalties</w:t>
       </w:r>
       <w:r>
         <w:rPr>
@@ -505,7 +745,1566 @@
           <w:i w:val="0"/>
           <w:sz w:val="22"/>
         </w:rPr>
-        <w:t xml:space="preserve"> Estudo teórico-conceitual e documental, apoiado em dados secundários públicos, com </w:t>
+        <w:t xml:space="preserve"> e participações especiais) (SILVA; HASENCLEVER, 2019). O Cadastro Central de Empresas de 2024 registra 16.776 empresas atuantes, 114.466 pessoas ocupadas (93.366 assalariadas) e salário médio mensal de 2,2 salários mínimos. O setor de saúde humana e serviços sociais respondia por 1.544 estabelecimentos e 15.002 postos de trabalho. O PIB municipal, a preços correntes, oscilou de R$ 58,4 bilhões em 2013 para R$ 23,9 bilhões em 2020 e R$ 43,0 bilhões em 2023, acompanhando a volatilidade da commodity petrolífera. Silva e Hasenclever (2019) demonstram que o ciclo do petróleo elevou arrecadação sem diversificação produtiva e Martins, Hasenclever e Miranda (2024) mostram que o financiamento da saúde municipal acompanhou essas flutuações entre 2009 e 2020.</w:t>
+      </w:r>
+    </w:p>
+    <w:p>
+      <w:pPr>
+        <w:spacing w:before="0" w:after="40"/>
+        <w:ind w:firstLine="709"/>
+        <w:jc w:val="both"/>
+      </w:pPr>
+      <w:r>
+        <w:rPr>
+          <w:b w:val="0"/>
+          <w:i w:val="0"/>
+          <w:sz w:val="22"/>
+        </w:rPr>
+        <w:t>As finanças públicas municipais evidenciam dependência estrutural de transferências intergovernamentais. Em 2024, as receitas brutas somaram R$ 2,95 bilhões, dos quais 71,0% provieram de transferências correntes, enquanto as despesas empenhadas atingiram R$ 3,31 bilhões. As despesas por natureza econômica, obtidas do Portal da Transparência da Prefeitura de Campos para o período de 2020 a 2024, revelam a coexistência de dois regimes previdenciários no funcionalismo municipal. As contribuições patronais ao Regime Próprio de Previdência Social (RPPS) dos servidores estatutários somaram R$ 58,7 milhões em 2024, acrescidas de R$ 2,5 milhões de aporte para cobertura do déficit atuarial. As contribuições ao Regime Geral de Previdência Social (INSS) dos trabalhadores celetistas totalizaram R$ 18,3 milhões no mesmo exercício. A existência de um regime próprio é relevante para a análise dos acidentes de trabalho porque a CAT cobre apenas os segurados do INSS, deixando os servidores estatutários sob a égide do RPPS, cujos registros de acidentes e adoecimentos não são consolidados em base nacional de acesso público (Tabela 2).</w:t>
+      </w:r>
+    </w:p>
+    <w:p>
+      <w:pPr>
+        <w:spacing w:before="80" w:after="40"/>
+        <w:ind w:firstLine="0"/>
+        <w:jc w:val="both"/>
+      </w:pPr>
+      <w:r>
+        <w:rPr>
+          <w:b/>
+          <w:i w:val="0"/>
+          <w:sz w:val="19"/>
+        </w:rPr>
+        <w:t>Tabela 2.</w:t>
+      </w:r>
+      <w:r>
+        <w:rPr>
+          <w:b w:val="0"/>
+          <w:i w:val="0"/>
+          <w:sz w:val="19"/>
+        </w:rPr>
+        <w:t xml:space="preserve"> Campos dos Goytacazes (RJ): estrutura empresarial, finanças públicas e regimes previdenciários</w:t>
+      </w:r>
+    </w:p>
+    <w:tbl>
+      <w:tblPr>
+        <w:tblStyle w:val="TableGrid"/>
+        <w:tblW w:type="auto" w:w="0"/>
+        <w:tblLook w:firstColumn="1" w:firstRow="1" w:lastColumn="0" w:lastRow="0" w:noHBand="0" w:noVBand="1" w:val="04A0"/>
+      </w:tblPr>
+      <w:tblGrid>
+        <w:gridCol w:w="3024"/>
+        <w:gridCol w:w="3024"/>
+        <w:gridCol w:w="3024"/>
+      </w:tblGrid>
+      <w:tr>
+        <w:tc>
+          <w:tcPr>
+            <w:tcW w:type="dxa" w:w="3024"/>
+          </w:tcPr>
+          <w:p>
+            <w:r>
+              <w:rPr>
+                <w:b/>
+              </w:rPr>
+            </w:r>
+            <w:r>
+              <w:rPr>
+                <w:b/>
+                <w:i w:val="0"/>
+                <w:sz w:val="16"/>
+              </w:rPr>
+              <w:t>Indicador</w:t>
+            </w:r>
+          </w:p>
+        </w:tc>
+        <w:tc>
+          <w:tcPr>
+            <w:tcW w:type="dxa" w:w="3024"/>
+          </w:tcPr>
+          <w:p>
+            <w:r>
+              <w:rPr>
+                <w:b/>
+              </w:rPr>
+            </w:r>
+            <w:r>
+              <w:rPr>
+                <w:b/>
+                <w:i w:val="0"/>
+                <w:sz w:val="16"/>
+              </w:rPr>
+              <w:t>Valor</w:t>
+            </w:r>
+          </w:p>
+        </w:tc>
+        <w:tc>
+          <w:tcPr>
+            <w:tcW w:type="dxa" w:w="3024"/>
+          </w:tcPr>
+          <w:p>
+            <w:r>
+              <w:rPr>
+                <w:b/>
+              </w:rPr>
+            </w:r>
+            <w:r>
+              <w:rPr>
+                <w:b/>
+                <w:i w:val="0"/>
+                <w:sz w:val="16"/>
+              </w:rPr>
+              <w:t>Ano</w:t>
+            </w:r>
+          </w:p>
+        </w:tc>
+      </w:tr>
+      <w:tr>
+        <w:tc>
+          <w:tcPr>
+            <w:tcW w:type="dxa" w:w="3024"/>
+          </w:tcPr>
+          <w:p>
+            <w:r>
+              <w:rPr>
+                <w:b w:val="0"/>
+              </w:rPr>
+            </w:r>
+            <w:r>
+              <w:rPr>
+                <w:b w:val="0"/>
+                <w:i w:val="0"/>
+                <w:sz w:val="16"/>
+              </w:rPr>
+              <w:t>Empresas atuantes</w:t>
+            </w:r>
+          </w:p>
+        </w:tc>
+        <w:tc>
+          <w:tcPr>
+            <w:tcW w:type="dxa" w:w="3024"/>
+          </w:tcPr>
+          <w:p>
+            <w:r>
+              <w:rPr>
+                <w:b w:val="0"/>
+              </w:rPr>
+            </w:r>
+            <w:r>
+              <w:rPr>
+                <w:b w:val="0"/>
+                <w:i w:val="0"/>
+                <w:sz w:val="16"/>
+              </w:rPr>
+              <w:t>16.776</w:t>
+            </w:r>
+          </w:p>
+        </w:tc>
+        <w:tc>
+          <w:tcPr>
+            <w:tcW w:type="dxa" w:w="3024"/>
+          </w:tcPr>
+          <w:p>
+            <w:r>
+              <w:rPr>
+                <w:b w:val="0"/>
+              </w:rPr>
+            </w:r>
+            <w:r>
+              <w:rPr>
+                <w:b w:val="0"/>
+                <w:i w:val="0"/>
+                <w:sz w:val="16"/>
+              </w:rPr>
+              <w:t>2024</w:t>
+            </w:r>
+          </w:p>
+        </w:tc>
+      </w:tr>
+      <w:tr>
+        <w:tc>
+          <w:tcPr>
+            <w:tcW w:type="dxa" w:w="3024"/>
+          </w:tcPr>
+          <w:p>
+            <w:r>
+              <w:rPr>
+                <w:b w:val="0"/>
+              </w:rPr>
+            </w:r>
+            <w:r>
+              <w:rPr>
+                <w:b w:val="0"/>
+                <w:i w:val="0"/>
+                <w:sz w:val="16"/>
+              </w:rPr>
+              <w:t>Pessoal ocupado total (assalariado)</w:t>
+            </w:r>
+          </w:p>
+        </w:tc>
+        <w:tc>
+          <w:tcPr>
+            <w:tcW w:type="dxa" w:w="3024"/>
+          </w:tcPr>
+          <w:p>
+            <w:r>
+              <w:rPr>
+                <w:b w:val="0"/>
+              </w:rPr>
+            </w:r>
+            <w:r>
+              <w:rPr>
+                <w:b w:val="0"/>
+                <w:i w:val="0"/>
+                <w:sz w:val="16"/>
+              </w:rPr>
+              <w:t>114.466 (93.366)</w:t>
+            </w:r>
+          </w:p>
+        </w:tc>
+        <w:tc>
+          <w:tcPr>
+            <w:tcW w:type="dxa" w:w="3024"/>
+          </w:tcPr>
+          <w:p>
+            <w:r>
+              <w:rPr>
+                <w:b w:val="0"/>
+              </w:rPr>
+            </w:r>
+            <w:r>
+              <w:rPr>
+                <w:b w:val="0"/>
+                <w:i w:val="0"/>
+                <w:sz w:val="16"/>
+              </w:rPr>
+              <w:t>2024</w:t>
+            </w:r>
+          </w:p>
+        </w:tc>
+      </w:tr>
+      <w:tr>
+        <w:tc>
+          <w:tcPr>
+            <w:tcW w:type="dxa" w:w="3024"/>
+          </w:tcPr>
+          <w:p>
+            <w:r>
+              <w:rPr>
+                <w:b w:val="0"/>
+              </w:rPr>
+            </w:r>
+            <w:r>
+              <w:rPr>
+                <w:b w:val="0"/>
+                <w:i w:val="0"/>
+                <w:sz w:val="16"/>
+              </w:rPr>
+              <w:t>Saúde: unidades / pessoal ocupado</w:t>
+            </w:r>
+          </w:p>
+        </w:tc>
+        <w:tc>
+          <w:tcPr>
+            <w:tcW w:type="dxa" w:w="3024"/>
+          </w:tcPr>
+          <w:p>
+            <w:r>
+              <w:rPr>
+                <w:b w:val="0"/>
+              </w:rPr>
+            </w:r>
+            <w:r>
+              <w:rPr>
+                <w:b w:val="0"/>
+                <w:i w:val="0"/>
+                <w:sz w:val="16"/>
+              </w:rPr>
+              <w:t>1.544 / 15.002</w:t>
+            </w:r>
+          </w:p>
+        </w:tc>
+        <w:tc>
+          <w:tcPr>
+            <w:tcW w:type="dxa" w:w="3024"/>
+          </w:tcPr>
+          <w:p>
+            <w:r>
+              <w:rPr>
+                <w:b w:val="0"/>
+              </w:rPr>
+            </w:r>
+            <w:r>
+              <w:rPr>
+                <w:b w:val="0"/>
+                <w:i w:val="0"/>
+                <w:sz w:val="16"/>
+              </w:rPr>
+              <w:t>2024</w:t>
+            </w:r>
+          </w:p>
+        </w:tc>
+      </w:tr>
+      <w:tr>
+        <w:tc>
+          <w:tcPr>
+            <w:tcW w:type="dxa" w:w="3024"/>
+          </w:tcPr>
+          <w:p>
+            <w:r>
+              <w:rPr>
+                <w:b w:val="0"/>
+              </w:rPr>
+            </w:r>
+            <w:r>
+              <w:rPr>
+                <w:b w:val="0"/>
+                <w:i w:val="0"/>
+                <w:sz w:val="16"/>
+              </w:rPr>
+              <w:t>Receitas brutas</w:t>
+            </w:r>
+          </w:p>
+        </w:tc>
+        <w:tc>
+          <w:tcPr>
+            <w:tcW w:type="dxa" w:w="3024"/>
+          </w:tcPr>
+          <w:p>
+            <w:r>
+              <w:rPr>
+                <w:b w:val="0"/>
+              </w:rPr>
+            </w:r>
+            <w:r>
+              <w:rPr>
+                <w:b w:val="0"/>
+                <w:i w:val="0"/>
+                <w:sz w:val="16"/>
+              </w:rPr>
+              <w:t>R$ 2,95 bilhões</w:t>
+            </w:r>
+          </w:p>
+        </w:tc>
+        <w:tc>
+          <w:tcPr>
+            <w:tcW w:type="dxa" w:w="3024"/>
+          </w:tcPr>
+          <w:p>
+            <w:r>
+              <w:rPr>
+                <w:b w:val="0"/>
+              </w:rPr>
+            </w:r>
+            <w:r>
+              <w:rPr>
+                <w:b w:val="0"/>
+                <w:i w:val="0"/>
+                <w:sz w:val="16"/>
+              </w:rPr>
+              <w:t>2024</w:t>
+            </w:r>
+          </w:p>
+        </w:tc>
+      </w:tr>
+      <w:tr>
+        <w:tc>
+          <w:tcPr>
+            <w:tcW w:type="dxa" w:w="3024"/>
+          </w:tcPr>
+          <w:p>
+            <w:r>
+              <w:rPr>
+                <w:b w:val="0"/>
+              </w:rPr>
+            </w:r>
+            <w:r>
+              <w:rPr>
+                <w:b w:val="0"/>
+                <w:i w:val="0"/>
+                <w:sz w:val="16"/>
+              </w:rPr>
+              <w:t>Transferências correntes (% das receitas)</w:t>
+            </w:r>
+          </w:p>
+        </w:tc>
+        <w:tc>
+          <w:tcPr>
+            <w:tcW w:type="dxa" w:w="3024"/>
+          </w:tcPr>
+          <w:p>
+            <w:r>
+              <w:rPr>
+                <w:b w:val="0"/>
+              </w:rPr>
+            </w:r>
+            <w:r>
+              <w:rPr>
+                <w:b w:val="0"/>
+                <w:i w:val="0"/>
+                <w:sz w:val="16"/>
+              </w:rPr>
+              <w:t>71,0%</w:t>
+            </w:r>
+          </w:p>
+        </w:tc>
+        <w:tc>
+          <w:tcPr>
+            <w:tcW w:type="dxa" w:w="3024"/>
+          </w:tcPr>
+          <w:p>
+            <w:r>
+              <w:rPr>
+                <w:b w:val="0"/>
+              </w:rPr>
+            </w:r>
+            <w:r>
+              <w:rPr>
+                <w:b w:val="0"/>
+                <w:i w:val="0"/>
+                <w:sz w:val="16"/>
+              </w:rPr>
+              <w:t>2024</w:t>
+            </w:r>
+          </w:p>
+        </w:tc>
+      </w:tr>
+      <w:tr>
+        <w:tc>
+          <w:tcPr>
+            <w:tcW w:type="dxa" w:w="3024"/>
+          </w:tcPr>
+          <w:p>
+            <w:r>
+              <w:rPr>
+                <w:b w:val="0"/>
+              </w:rPr>
+            </w:r>
+            <w:r>
+              <w:rPr>
+                <w:b w:val="0"/>
+                <w:i w:val="0"/>
+                <w:sz w:val="16"/>
+              </w:rPr>
+              <w:t>Despesas empenhadas</w:t>
+            </w:r>
+          </w:p>
+        </w:tc>
+        <w:tc>
+          <w:tcPr>
+            <w:tcW w:type="dxa" w:w="3024"/>
+          </w:tcPr>
+          <w:p>
+            <w:r>
+              <w:rPr>
+                <w:b w:val="0"/>
+              </w:rPr>
+            </w:r>
+            <w:r>
+              <w:rPr>
+                <w:b w:val="0"/>
+                <w:i w:val="0"/>
+                <w:sz w:val="16"/>
+              </w:rPr>
+              <w:t>R$ 3,31 bilhões</w:t>
+            </w:r>
+          </w:p>
+        </w:tc>
+        <w:tc>
+          <w:tcPr>
+            <w:tcW w:type="dxa" w:w="3024"/>
+          </w:tcPr>
+          <w:p>
+            <w:r>
+              <w:rPr>
+                <w:b w:val="0"/>
+              </w:rPr>
+            </w:r>
+            <w:r>
+              <w:rPr>
+                <w:b w:val="0"/>
+                <w:i w:val="0"/>
+                <w:sz w:val="16"/>
+              </w:rPr>
+              <w:t>2024</w:t>
+            </w:r>
+          </w:p>
+        </w:tc>
+      </w:tr>
+      <w:tr>
+        <w:tc>
+          <w:tcPr>
+            <w:tcW w:type="dxa" w:w="3024"/>
+          </w:tcPr>
+          <w:p>
+            <w:r>
+              <w:rPr>
+                <w:b w:val="0"/>
+              </w:rPr>
+            </w:r>
+            <w:r>
+              <w:rPr>
+                <w:b w:val="0"/>
+                <w:i w:val="0"/>
+                <w:sz w:val="16"/>
+              </w:rPr>
+              <w:t>Contribuições RPPS (estatutários)</w:t>
+            </w:r>
+          </w:p>
+        </w:tc>
+        <w:tc>
+          <w:tcPr>
+            <w:tcW w:type="dxa" w:w="3024"/>
+          </w:tcPr>
+          <w:p>
+            <w:r>
+              <w:rPr>
+                <w:b w:val="0"/>
+              </w:rPr>
+            </w:r>
+            <w:r>
+              <w:rPr>
+                <w:b w:val="0"/>
+                <w:i w:val="0"/>
+                <w:sz w:val="16"/>
+              </w:rPr>
+              <w:t>R$ 61,2 milhões</w:t>
+            </w:r>
+          </w:p>
+        </w:tc>
+        <w:tc>
+          <w:tcPr>
+            <w:tcW w:type="dxa" w:w="3024"/>
+          </w:tcPr>
+          <w:p>
+            <w:r>
+              <w:rPr>
+                <w:b w:val="0"/>
+              </w:rPr>
+            </w:r>
+            <w:r>
+              <w:rPr>
+                <w:b w:val="0"/>
+                <w:i w:val="0"/>
+                <w:sz w:val="16"/>
+              </w:rPr>
+              <w:t>2024</w:t>
+            </w:r>
+          </w:p>
+        </w:tc>
+      </w:tr>
+      <w:tr>
+        <w:tc>
+          <w:tcPr>
+            <w:tcW w:type="dxa" w:w="3024"/>
+          </w:tcPr>
+          <w:p>
+            <w:r>
+              <w:rPr>
+                <w:b w:val="0"/>
+              </w:rPr>
+            </w:r>
+            <w:r>
+              <w:rPr>
+                <w:b w:val="0"/>
+                <w:i w:val="0"/>
+                <w:sz w:val="16"/>
+              </w:rPr>
+              <w:t>Contribuições INSS (celetistas)</w:t>
+            </w:r>
+          </w:p>
+        </w:tc>
+        <w:tc>
+          <w:tcPr>
+            <w:tcW w:type="dxa" w:w="3024"/>
+          </w:tcPr>
+          <w:p>
+            <w:r>
+              <w:rPr>
+                <w:b w:val="0"/>
+              </w:rPr>
+            </w:r>
+            <w:r>
+              <w:rPr>
+                <w:b w:val="0"/>
+                <w:i w:val="0"/>
+                <w:sz w:val="16"/>
+              </w:rPr>
+              <w:t>R$ 18,3 milhões</w:t>
+            </w:r>
+          </w:p>
+        </w:tc>
+        <w:tc>
+          <w:tcPr>
+            <w:tcW w:type="dxa" w:w="3024"/>
+          </w:tcPr>
+          <w:p>
+            <w:r>
+              <w:rPr>
+                <w:b w:val="0"/>
+              </w:rPr>
+            </w:r>
+            <w:r>
+              <w:rPr>
+                <w:b w:val="0"/>
+                <w:i w:val="0"/>
+                <w:sz w:val="16"/>
+              </w:rPr>
+              <w:t>2024</w:t>
+            </w:r>
+          </w:p>
+        </w:tc>
+      </w:tr>
+      <w:tr>
+        <w:tc>
+          <w:tcPr>
+            <w:tcW w:type="dxa" w:w="3024"/>
+          </w:tcPr>
+          <w:p>
+            <w:r>
+              <w:rPr>
+                <w:b w:val="0"/>
+              </w:rPr>
+            </w:r>
+            <w:r>
+              <w:rPr>
+                <w:b w:val="0"/>
+                <w:i w:val="0"/>
+                <w:sz w:val="16"/>
+              </w:rPr>
+              <w:t>Aporte déficit atuarial RPPS</w:t>
+            </w:r>
+          </w:p>
+        </w:tc>
+        <w:tc>
+          <w:tcPr>
+            <w:tcW w:type="dxa" w:w="3024"/>
+          </w:tcPr>
+          <w:p>
+            <w:r>
+              <w:rPr>
+                <w:b w:val="0"/>
+              </w:rPr>
+            </w:r>
+            <w:r>
+              <w:rPr>
+                <w:b w:val="0"/>
+                <w:i w:val="0"/>
+                <w:sz w:val="16"/>
+              </w:rPr>
+              <w:t>R$ 2,5 milhões</w:t>
+            </w:r>
+          </w:p>
+        </w:tc>
+        <w:tc>
+          <w:tcPr>
+            <w:tcW w:type="dxa" w:w="3024"/>
+          </w:tcPr>
+          <w:p>
+            <w:r>
+              <w:rPr>
+                <w:b w:val="0"/>
+              </w:rPr>
+            </w:r>
+            <w:r>
+              <w:rPr>
+                <w:b w:val="0"/>
+                <w:i w:val="0"/>
+                <w:sz w:val="16"/>
+              </w:rPr>
+              <w:t>2024</w:t>
+            </w:r>
+          </w:p>
+        </w:tc>
+      </w:tr>
+      <w:tr>
+        <w:tc>
+          <w:tcPr>
+            <w:tcW w:type="dxa" w:w="3024"/>
+          </w:tcPr>
+          <w:p>
+            <w:r>
+              <w:rPr>
+                <w:b w:val="0"/>
+              </w:rPr>
+            </w:r>
+            <w:r>
+              <w:rPr>
+                <w:b w:val="0"/>
+                <w:i w:val="0"/>
+                <w:sz w:val="16"/>
+              </w:rPr>
+              <w:t>Déficit orçamentário</w:t>
+            </w:r>
+          </w:p>
+        </w:tc>
+        <w:tc>
+          <w:tcPr>
+            <w:tcW w:type="dxa" w:w="3024"/>
+          </w:tcPr>
+          <w:p>
+            <w:r>
+              <w:rPr>
+                <w:b w:val="0"/>
+              </w:rPr>
+            </w:r>
+            <w:r>
+              <w:rPr>
+                <w:b w:val="0"/>
+                <w:i w:val="0"/>
+                <w:sz w:val="16"/>
+              </w:rPr>
+              <w:t>R$ 356 milhões</w:t>
+            </w:r>
+          </w:p>
+        </w:tc>
+        <w:tc>
+          <w:tcPr>
+            <w:tcW w:type="dxa" w:w="3024"/>
+          </w:tcPr>
+          <w:p>
+            <w:r>
+              <w:rPr>
+                <w:b w:val="0"/>
+              </w:rPr>
+            </w:r>
+            <w:r>
+              <w:rPr>
+                <w:b w:val="0"/>
+                <w:i w:val="0"/>
+                <w:sz w:val="16"/>
+              </w:rPr>
+              <w:t>2024</w:t>
+            </w:r>
+          </w:p>
+        </w:tc>
+      </w:tr>
+    </w:tbl>
+    <w:p>
+      <w:pPr>
+        <w:spacing w:before="0" w:after="80"/>
+        <w:ind w:firstLine="0"/>
+        <w:jc w:val="both"/>
+      </w:pPr>
+      <w:r>
+        <w:rPr>
+          <w:b w:val="0"/>
+          <w:i w:val="0"/>
+          <w:sz w:val="16"/>
+        </w:rPr>
+        <w:t>Fontes dos dados brutos: IBGE, Cadastro Central de Empresas 2024; Siconfi/STN, Finanças Públicas 2024; Portal da Transparência da Prefeitura de Campos, despesas por natureza econômica, 2020-2024. RPPS = Regime Próprio de Previdência Social.</w:t>
+      </w:r>
+    </w:p>
+    <w:p>
+      <w:pPr>
+        <w:spacing w:before="0" w:after="40"/>
+        <w:ind w:firstLine="709"/>
+        <w:jc w:val="both"/>
+      </w:pPr>
+      <w:r>
+        <w:rPr>
+          <w:b w:val="0"/>
+          <w:i w:val="0"/>
+          <w:sz w:val="22"/>
+        </w:rPr>
+        <w:t xml:space="preserve">O perfil de mortalidade do município, obtido do Sistema de Informações sobre Mortalidade (SIM/DATASUS) e processado com o pacote </w:t>
+      </w:r>
+      <w:r>
+        <w:rPr>
+          <w:b w:val="0"/>
+          <w:i/>
+          <w:sz w:val="22"/>
+        </w:rPr>
+        <w:t>microdatasus</w:t>
+      </w:r>
+      <w:r>
+        <w:rPr>
+          <w:b w:val="0"/>
+          <w:i w:val="0"/>
+          <w:sz w:val="22"/>
+        </w:rPr>
+        <w:t xml:space="preserve"> (R), registrou entre 4.199 e 5.635 óbitos anuais de residentes no período de 2019 a 2024, com taxa bruta de mortalidade variando de 8,1 a 10,9 por 1.000 habitantes (Tabela 3). Em 2021, auge da pandemia de covid-19, as doenças infecciosas e parasitárias deslocaram-se para a primeira posição (1.548 óbitos, 27,5% do total), ultrapassando as doenças do aparelho circulatório, que retomaram a liderança a partir de 2022. As causas externas mantiveram-se entre as cinco primeiras posições em todo o período. Esse deslocamento evidencia o impacto da pandemia sobre um território com IDHM de 0,716 e 37,7% da população em situação de pobreza em 2010. Nesse mercado de trabalho, os serviços de saúde, polo regional do Norte Fluminense, constituem espaço relevante de assalariamento, estratificado por hierarquias de renda e de prestígio entre profissões (LEMOS, 2012).</w:t>
+      </w:r>
+    </w:p>
+    <w:p>
+      <w:pPr>
+        <w:spacing w:before="80" w:after="40"/>
+        <w:ind w:firstLine="0"/>
+        <w:jc w:val="both"/>
+      </w:pPr>
+      <w:r>
+        <w:rPr>
+          <w:b/>
+          <w:i w:val="0"/>
+          <w:sz w:val="19"/>
+        </w:rPr>
+        <w:t>Tabela 3.</w:t>
+      </w:r>
+      <w:r>
+        <w:rPr>
+          <w:b w:val="0"/>
+          <w:i w:val="0"/>
+          <w:sz w:val="19"/>
+        </w:rPr>
+        <w:t xml:space="preserve"> Campos dos Goytacazes (RJ): mortalidade geral de residentes, 2019-2024</w:t>
+      </w:r>
+    </w:p>
+    <w:tbl>
+      <w:tblPr>
+        <w:tblStyle w:val="TableGrid"/>
+        <w:tblW w:type="auto" w:w="0"/>
+        <w:tblLook w:firstColumn="1" w:firstRow="1" w:lastColumn="0" w:lastRow="0" w:noHBand="0" w:noVBand="1" w:val="04A0"/>
+      </w:tblPr>
+      <w:tblGrid>
+        <w:gridCol w:w="1814"/>
+        <w:gridCol w:w="1814"/>
+        <w:gridCol w:w="1814"/>
+        <w:gridCol w:w="1814"/>
+        <w:gridCol w:w="1814"/>
+      </w:tblGrid>
+      <w:tr>
+        <w:tc>
+          <w:tcPr>
+            <w:tcW w:type="dxa" w:w="1814"/>
+          </w:tcPr>
+          <w:p>
+            <w:r>
+              <w:rPr>
+                <w:b/>
+              </w:rPr>
+            </w:r>
+            <w:r>
+              <w:rPr>
+                <w:b/>
+                <w:i w:val="0"/>
+                <w:sz w:val="16"/>
+              </w:rPr>
+              <w:t>Ano</w:t>
+            </w:r>
+          </w:p>
+        </w:tc>
+        <w:tc>
+          <w:tcPr>
+            <w:tcW w:type="dxa" w:w="1814"/>
+          </w:tcPr>
+          <w:p>
+            <w:r>
+              <w:rPr>
+                <w:b/>
+              </w:rPr>
+            </w:r>
+            <w:r>
+              <w:rPr>
+                <w:b/>
+                <w:i w:val="0"/>
+                <w:sz w:val="16"/>
+              </w:rPr>
+              <w:t>Óbitos</w:t>
+            </w:r>
+          </w:p>
+        </w:tc>
+        <w:tc>
+          <w:tcPr>
+            <w:tcW w:type="dxa" w:w="1814"/>
+          </w:tcPr>
+          <w:p>
+            <w:r>
+              <w:rPr>
+                <w:b/>
+              </w:rPr>
+            </w:r>
+            <w:r>
+              <w:rPr>
+                <w:b/>
+                <w:i w:val="0"/>
+                <w:sz w:val="16"/>
+              </w:rPr>
+              <w:t>Taxa/1.000</w:t>
+            </w:r>
+          </w:p>
+        </w:tc>
+        <w:tc>
+          <w:tcPr>
+            <w:tcW w:type="dxa" w:w="1814"/>
+          </w:tcPr>
+          <w:p>
+            <w:r>
+              <w:rPr>
+                <w:b/>
+              </w:rPr>
+            </w:r>
+            <w:r>
+              <w:rPr>
+                <w:b/>
+                <w:i w:val="0"/>
+                <w:sz w:val="16"/>
+              </w:rPr>
+              <w:t>1ª causa</w:t>
+            </w:r>
+          </w:p>
+        </w:tc>
+        <w:tc>
+          <w:tcPr>
+            <w:tcW w:type="dxa" w:w="1814"/>
+          </w:tcPr>
+          <w:p>
+            <w:r>
+              <w:rPr>
+                <w:b/>
+              </w:rPr>
+            </w:r>
+            <w:r>
+              <w:rPr>
+                <w:b/>
+                <w:i w:val="0"/>
+                <w:sz w:val="16"/>
+              </w:rPr>
+              <w:t>2ª causa</w:t>
+            </w:r>
+          </w:p>
+        </w:tc>
+      </w:tr>
+      <w:tr>
+        <w:tc>
+          <w:tcPr>
+            <w:tcW w:type="dxa" w:w="1814"/>
+          </w:tcPr>
+          <w:p>
+            <w:r>
+              <w:rPr>
+                <w:b w:val="0"/>
+              </w:rPr>
+            </w:r>
+            <w:r>
+              <w:rPr>
+                <w:b w:val="0"/>
+                <w:i w:val="0"/>
+                <w:sz w:val="16"/>
+              </w:rPr>
+              <w:t>2019</w:t>
+            </w:r>
+          </w:p>
+        </w:tc>
+        <w:tc>
+          <w:tcPr>
+            <w:tcW w:type="dxa" w:w="1814"/>
+          </w:tcPr>
+          <w:p>
+            <w:r>
+              <w:rPr>
+                <w:b w:val="0"/>
+              </w:rPr>
+            </w:r>
+            <w:r>
+              <w:rPr>
+                <w:b w:val="0"/>
+                <w:i w:val="0"/>
+                <w:sz w:val="16"/>
+              </w:rPr>
+              <w:t>4.299</w:t>
+            </w:r>
+          </w:p>
+        </w:tc>
+        <w:tc>
+          <w:tcPr>
+            <w:tcW w:type="dxa" w:w="1814"/>
+          </w:tcPr>
+          <w:p>
+            <w:r>
+              <w:rPr>
+                <w:b w:val="0"/>
+              </w:rPr>
+            </w:r>
+            <w:r>
+              <w:rPr>
+                <w:b w:val="0"/>
+                <w:i w:val="0"/>
+                <w:sz w:val="16"/>
+              </w:rPr>
+              <w:t>8,5</w:t>
+            </w:r>
+          </w:p>
+        </w:tc>
+        <w:tc>
+          <w:tcPr>
+            <w:tcW w:type="dxa" w:w="1814"/>
+          </w:tcPr>
+          <w:p>
+            <w:r>
+              <w:rPr>
+                <w:b w:val="0"/>
+              </w:rPr>
+            </w:r>
+            <w:r>
+              <w:rPr>
+                <w:b w:val="0"/>
+                <w:i w:val="0"/>
+                <w:sz w:val="16"/>
+              </w:rPr>
+              <w:t>Circulatórias</w:t>
+            </w:r>
+          </w:p>
+        </w:tc>
+        <w:tc>
+          <w:tcPr>
+            <w:tcW w:type="dxa" w:w="1814"/>
+          </w:tcPr>
+          <w:p>
+            <w:r>
+              <w:rPr>
+                <w:b w:val="0"/>
+              </w:rPr>
+            </w:r>
+            <w:r>
+              <w:rPr>
+                <w:b w:val="0"/>
+                <w:i w:val="0"/>
+                <w:sz w:val="16"/>
+              </w:rPr>
+              <w:t>Neoplasias</w:t>
+            </w:r>
+          </w:p>
+        </w:tc>
+      </w:tr>
+      <w:tr>
+        <w:tc>
+          <w:tcPr>
+            <w:tcW w:type="dxa" w:w="1814"/>
+          </w:tcPr>
+          <w:p>
+            <w:r>
+              <w:rPr>
+                <w:b w:val="0"/>
+              </w:rPr>
+            </w:r>
+            <w:r>
+              <w:rPr>
+                <w:b w:val="0"/>
+                <w:i w:val="0"/>
+                <w:sz w:val="16"/>
+              </w:rPr>
+              <w:t>2020</w:t>
+            </w:r>
+          </w:p>
+        </w:tc>
+        <w:tc>
+          <w:tcPr>
+            <w:tcW w:type="dxa" w:w="1814"/>
+          </w:tcPr>
+          <w:p>
+            <w:r>
+              <w:rPr>
+                <w:b w:val="0"/>
+              </w:rPr>
+            </w:r>
+            <w:r>
+              <w:rPr>
+                <w:b w:val="0"/>
+                <w:i w:val="0"/>
+                <w:sz w:val="16"/>
+              </w:rPr>
+              <w:t>4.831</w:t>
+            </w:r>
+          </w:p>
+        </w:tc>
+        <w:tc>
+          <w:tcPr>
+            <w:tcW w:type="dxa" w:w="1814"/>
+          </w:tcPr>
+          <w:p>
+            <w:r>
+              <w:rPr>
+                <w:b w:val="0"/>
+              </w:rPr>
+            </w:r>
+            <w:r>
+              <w:rPr>
+                <w:b w:val="0"/>
+                <w:i w:val="0"/>
+                <w:sz w:val="16"/>
+              </w:rPr>
+              <w:t>9,5</w:t>
+            </w:r>
+          </w:p>
+        </w:tc>
+        <w:tc>
+          <w:tcPr>
+            <w:tcW w:type="dxa" w:w="1814"/>
+          </w:tcPr>
+          <w:p>
+            <w:r>
+              <w:rPr>
+                <w:b w:val="0"/>
+              </w:rPr>
+            </w:r>
+            <w:r>
+              <w:rPr>
+                <w:b w:val="0"/>
+                <w:i w:val="0"/>
+                <w:sz w:val="16"/>
+              </w:rPr>
+              <w:t>Circulatórias</w:t>
+            </w:r>
+          </w:p>
+        </w:tc>
+        <w:tc>
+          <w:tcPr>
+            <w:tcW w:type="dxa" w:w="1814"/>
+          </w:tcPr>
+          <w:p>
+            <w:r>
+              <w:rPr>
+                <w:b w:val="0"/>
+              </w:rPr>
+            </w:r>
+            <w:r>
+              <w:rPr>
+                <w:b w:val="0"/>
+                <w:i w:val="0"/>
+                <w:sz w:val="16"/>
+              </w:rPr>
+              <w:t>Infecciosas</w:t>
+            </w:r>
+          </w:p>
+        </w:tc>
+      </w:tr>
+      <w:tr>
+        <w:tc>
+          <w:tcPr>
+            <w:tcW w:type="dxa" w:w="1814"/>
+          </w:tcPr>
+          <w:p>
+            <w:r>
+              <w:rPr>
+                <w:b w:val="0"/>
+              </w:rPr>
+            </w:r>
+            <w:r>
+              <w:rPr>
+                <w:b w:val="0"/>
+                <w:i w:val="0"/>
+                <w:sz w:val="16"/>
+              </w:rPr>
+              <w:t>2021</w:t>
+            </w:r>
+          </w:p>
+        </w:tc>
+        <w:tc>
+          <w:tcPr>
+            <w:tcW w:type="dxa" w:w="1814"/>
+          </w:tcPr>
+          <w:p>
+            <w:r>
+              <w:rPr>
+                <w:b w:val="0"/>
+              </w:rPr>
+            </w:r>
+            <w:r>
+              <w:rPr>
+                <w:b w:val="0"/>
+                <w:i w:val="0"/>
+                <w:sz w:val="16"/>
+              </w:rPr>
+              <w:t>5.635</w:t>
+            </w:r>
+          </w:p>
+        </w:tc>
+        <w:tc>
+          <w:tcPr>
+            <w:tcW w:type="dxa" w:w="1814"/>
+          </w:tcPr>
+          <w:p>
+            <w:r>
+              <w:rPr>
+                <w:b w:val="0"/>
+              </w:rPr>
+            </w:r>
+            <w:r>
+              <w:rPr>
+                <w:b w:val="0"/>
+                <w:i w:val="0"/>
+                <w:sz w:val="16"/>
+              </w:rPr>
+              <w:t>10,9</w:t>
+            </w:r>
+          </w:p>
+        </w:tc>
+        <w:tc>
+          <w:tcPr>
+            <w:tcW w:type="dxa" w:w="1814"/>
+          </w:tcPr>
+          <w:p>
+            <w:r>
+              <w:rPr>
+                <w:b w:val="0"/>
+              </w:rPr>
+            </w:r>
+            <w:r>
+              <w:rPr>
+                <w:b w:val="0"/>
+                <w:i w:val="0"/>
+                <w:sz w:val="16"/>
+              </w:rPr>
+              <w:t>Infecciosas</w:t>
+            </w:r>
+          </w:p>
+        </w:tc>
+        <w:tc>
+          <w:tcPr>
+            <w:tcW w:type="dxa" w:w="1814"/>
+          </w:tcPr>
+          <w:p>
+            <w:r>
+              <w:rPr>
+                <w:b w:val="0"/>
+              </w:rPr>
+            </w:r>
+            <w:r>
+              <w:rPr>
+                <w:b w:val="0"/>
+                <w:i w:val="0"/>
+                <w:sz w:val="16"/>
+              </w:rPr>
+              <w:t>Circulatórias</w:t>
+            </w:r>
+          </w:p>
+        </w:tc>
+      </w:tr>
+      <w:tr>
+        <w:tc>
+          <w:tcPr>
+            <w:tcW w:type="dxa" w:w="1814"/>
+          </w:tcPr>
+          <w:p>
+            <w:r>
+              <w:rPr>
+                <w:b w:val="0"/>
+              </w:rPr>
+            </w:r>
+            <w:r>
+              <w:rPr>
+                <w:b w:val="0"/>
+                <w:i w:val="0"/>
+                <w:sz w:val="16"/>
+              </w:rPr>
+              <w:t>2022</w:t>
+            </w:r>
+          </w:p>
+        </w:tc>
+        <w:tc>
+          <w:tcPr>
+            <w:tcW w:type="dxa" w:w="1814"/>
+          </w:tcPr>
+          <w:p>
+            <w:r>
+              <w:rPr>
+                <w:b w:val="0"/>
+              </w:rPr>
+            </w:r>
+            <w:r>
+              <w:rPr>
+                <w:b w:val="0"/>
+                <w:i w:val="0"/>
+                <w:sz w:val="16"/>
+              </w:rPr>
+              <w:t>4.608</w:t>
+            </w:r>
+          </w:p>
+        </w:tc>
+        <w:tc>
+          <w:tcPr>
+            <w:tcW w:type="dxa" w:w="1814"/>
+          </w:tcPr>
+          <w:p>
+            <w:r>
+              <w:rPr>
+                <w:b w:val="0"/>
+              </w:rPr>
+            </w:r>
+            <w:r>
+              <w:rPr>
+                <w:b w:val="0"/>
+                <w:i w:val="0"/>
+                <w:sz w:val="16"/>
+              </w:rPr>
+              <w:t>9,5</w:t>
+            </w:r>
+          </w:p>
+        </w:tc>
+        <w:tc>
+          <w:tcPr>
+            <w:tcW w:type="dxa" w:w="1814"/>
+          </w:tcPr>
+          <w:p>
+            <w:r>
+              <w:rPr>
+                <w:b w:val="0"/>
+              </w:rPr>
+            </w:r>
+            <w:r>
+              <w:rPr>
+                <w:b w:val="0"/>
+                <w:i w:val="0"/>
+                <w:sz w:val="16"/>
+              </w:rPr>
+              <w:t>Circulatórias</w:t>
+            </w:r>
+          </w:p>
+        </w:tc>
+        <w:tc>
+          <w:tcPr>
+            <w:tcW w:type="dxa" w:w="1814"/>
+          </w:tcPr>
+          <w:p>
+            <w:r>
+              <w:rPr>
+                <w:b w:val="0"/>
+              </w:rPr>
+            </w:r>
+            <w:r>
+              <w:rPr>
+                <w:b w:val="0"/>
+                <w:i w:val="0"/>
+                <w:sz w:val="16"/>
+              </w:rPr>
+              <w:t>Neoplasias</w:t>
+            </w:r>
+          </w:p>
+        </w:tc>
+      </w:tr>
+      <w:tr>
+        <w:tc>
+          <w:tcPr>
+            <w:tcW w:type="dxa" w:w="1814"/>
+          </w:tcPr>
+          <w:p>
+            <w:r>
+              <w:rPr>
+                <w:b w:val="0"/>
+              </w:rPr>
+            </w:r>
+            <w:r>
+              <w:rPr>
+                <w:b w:val="0"/>
+                <w:i w:val="0"/>
+                <w:sz w:val="16"/>
+              </w:rPr>
+              <w:t>2023</w:t>
+            </w:r>
+          </w:p>
+        </w:tc>
+        <w:tc>
+          <w:tcPr>
+            <w:tcW w:type="dxa" w:w="1814"/>
+          </w:tcPr>
+          <w:p>
+            <w:r>
+              <w:rPr>
+                <w:b w:val="0"/>
+              </w:rPr>
+            </w:r>
+            <w:r>
+              <w:rPr>
+                <w:b w:val="0"/>
+                <w:i w:val="0"/>
+                <w:sz w:val="16"/>
+              </w:rPr>
+              <w:t>4.199</w:t>
+            </w:r>
+          </w:p>
+        </w:tc>
+        <w:tc>
+          <w:tcPr>
+            <w:tcW w:type="dxa" w:w="1814"/>
+          </w:tcPr>
+          <w:p>
+            <w:r>
+              <w:rPr>
+                <w:b w:val="0"/>
+              </w:rPr>
+            </w:r>
+            <w:r>
+              <w:rPr>
+                <w:b w:val="0"/>
+                <w:i w:val="0"/>
+                <w:sz w:val="16"/>
+              </w:rPr>
+              <w:t>8,1</w:t>
+            </w:r>
+          </w:p>
+        </w:tc>
+        <w:tc>
+          <w:tcPr>
+            <w:tcW w:type="dxa" w:w="1814"/>
+          </w:tcPr>
+          <w:p>
+            <w:r>
+              <w:rPr>
+                <w:b w:val="0"/>
+              </w:rPr>
+            </w:r>
+            <w:r>
+              <w:rPr>
+                <w:b w:val="0"/>
+                <w:i w:val="0"/>
+                <w:sz w:val="16"/>
+              </w:rPr>
+              <w:t>Circulatórias</w:t>
+            </w:r>
+          </w:p>
+        </w:tc>
+        <w:tc>
+          <w:tcPr>
+            <w:tcW w:type="dxa" w:w="1814"/>
+          </w:tcPr>
+          <w:p>
+            <w:r>
+              <w:rPr>
+                <w:b w:val="0"/>
+              </w:rPr>
+            </w:r>
+            <w:r>
+              <w:rPr>
+                <w:b w:val="0"/>
+                <w:i w:val="0"/>
+                <w:sz w:val="16"/>
+              </w:rPr>
+              <w:t>Respiratórias</w:t>
+            </w:r>
+          </w:p>
+        </w:tc>
+      </w:tr>
+      <w:tr>
+        <w:tc>
+          <w:tcPr>
+            <w:tcW w:type="dxa" w:w="1814"/>
+          </w:tcPr>
+          <w:p>
+            <w:r>
+              <w:rPr>
+                <w:b w:val="0"/>
+              </w:rPr>
+            </w:r>
+            <w:r>
+              <w:rPr>
+                <w:b w:val="0"/>
+                <w:i w:val="0"/>
+                <w:sz w:val="16"/>
+              </w:rPr>
+              <w:t>2024</w:t>
+            </w:r>
+          </w:p>
+        </w:tc>
+        <w:tc>
+          <w:tcPr>
+            <w:tcW w:type="dxa" w:w="1814"/>
+          </w:tcPr>
+          <w:p>
+            <w:r>
+              <w:rPr>
+                <w:b w:val="0"/>
+              </w:rPr>
+            </w:r>
+            <w:r>
+              <w:rPr>
+                <w:b w:val="0"/>
+                <w:i w:val="0"/>
+                <w:sz w:val="16"/>
+              </w:rPr>
+              <w:t>4.346</w:t>
+            </w:r>
+          </w:p>
+        </w:tc>
+        <w:tc>
+          <w:tcPr>
+            <w:tcW w:type="dxa" w:w="1814"/>
+          </w:tcPr>
+          <w:p>
+            <w:r>
+              <w:rPr>
+                <w:b w:val="0"/>
+              </w:rPr>
+            </w:r>
+            <w:r>
+              <w:rPr>
+                <w:b w:val="0"/>
+                <w:i w:val="0"/>
+                <w:sz w:val="16"/>
+              </w:rPr>
+              <w:t>8,4</w:t>
+            </w:r>
+          </w:p>
+        </w:tc>
+        <w:tc>
+          <w:tcPr>
+            <w:tcW w:type="dxa" w:w="1814"/>
+          </w:tcPr>
+          <w:p>
+            <w:r>
+              <w:rPr>
+                <w:b w:val="0"/>
+              </w:rPr>
+            </w:r>
+            <w:r>
+              <w:rPr>
+                <w:b w:val="0"/>
+                <w:i w:val="0"/>
+                <w:sz w:val="16"/>
+              </w:rPr>
+              <w:t>Circulatórias</w:t>
+            </w:r>
+          </w:p>
+        </w:tc>
+        <w:tc>
+          <w:tcPr>
+            <w:tcW w:type="dxa" w:w="1814"/>
+          </w:tcPr>
+          <w:p>
+            <w:r>
+              <w:rPr>
+                <w:b w:val="0"/>
+              </w:rPr>
+            </w:r>
+            <w:r>
+              <w:rPr>
+                <w:b w:val="0"/>
+                <w:i w:val="0"/>
+                <w:sz w:val="16"/>
+              </w:rPr>
+              <w:t>Respiratórias</w:t>
+            </w:r>
+          </w:p>
+        </w:tc>
+      </w:tr>
+    </w:tbl>
+    <w:p>
+      <w:pPr>
+        <w:spacing w:before="0" w:after="80"/>
+        <w:ind w:firstLine="0"/>
+        <w:jc w:val="both"/>
+      </w:pPr>
+      <w:r>
+        <w:rPr>
+          <w:b w:val="0"/>
+          <w:i w:val="0"/>
+          <w:sz w:val="16"/>
+        </w:rPr>
+        <w:t>Fonte dos dados brutos: SIM/DATASUS, processados com o pacote microdatasus (R). Denominadores populacionais do IBGE (estimativas e Censo 2022).</w:t>
+      </w:r>
+    </w:p>
+    <w:p>
+      <w:pPr>
+        <w:spacing w:before="0" w:after="40"/>
+        <w:ind w:firstLine="709"/>
+        <w:jc w:val="both"/>
+      </w:pPr>
+      <w:r>
+        <w:rPr>
+          <w:b w:val="0"/>
+          <w:i w:val="0"/>
+          <w:sz w:val="22"/>
+        </w:rPr>
+        <w:t xml:space="preserve">Este estudo, de natureza teórico-conceitual e documental, apoia-se em </w:t>
       </w:r>
       <w:r>
         <w:rPr>
@@ -521,7 +2320,7 @@
           <w:i w:val="0"/>
           <w:sz w:val="22"/>
         </w:rPr>
-        <w:t xml:space="preserve"> reprodutível, auditado e validado de forma independente (scripts, logs e testes automatizados acompanham o repositório do estudo). A base empírica foi reconstruída dos arquivos brutos dos dados abertos da CAT do Instituto Nacional do Seguro Social (INSS): 58 arquivos, competências de julho de 2018 a dezembro de 2025, totalizando 3.902.905 registros (BRASIL, 2026a). A importação foi feita por posição de coluna, porque a fonte apresenta quatro esquemas estruturais distintos e cabeçalhos duplicados (CBO, CID-10, CNAE e data do acidente); a codificação de caracteres foi detectada arquivo a arquivo; e o mês de referência administrativo (coluna 2) foi rigorosamente distinguido da data completa do acidente, única informação usada nas análises temporais. O recorte municipal exigiu, simultaneamente, código do município do empregador igual a 330100, extraído antes do hífen, e unidade federativa do empregador igual a Rio de Janeiro; municípios homônimos (Campos Novos, Campos do Jordão, Campos de Júlio, São José dos Campos, entre outros) foram identificados e excluídos, assim como 12 registros com unidade federativa divergente. Foram removidas 537 duplicidades exatas entre arquivos de cobertura sobreposta, demonstradas por resumo criptográfico (</w:t>
+        <w:t xml:space="preserve"> reprodutível e auditado (scripts, logs e testes automatizados acompanham o repositório). A base empírica foi reconstruída dos dados abertos da CAT do INSS, disponíveis no Portal de Dados Abertos do governo federal. Foram processados 58 arquivos, competências de julho de 2018 a outubro de 2025, totalizando 3.902.905 registros. A importação foi feita por posição de coluna, dados os quatro esquemas estruturais distintos e cabeçalhos duplicados de CBO, CID-10, CNAE e data do acidente. A codificação de caracteres foi detectada arquivo a arquivo e o mês de referência administrativo foi rigorosamente distinguido da data completa do acidente. O recorte municipal exigiu código do empregador igual a 330100 e unidade federativa igual a Rio de Janeiro. Municípios homônimos foram excluídos, assim como 12 registros com UF divergente. Foram removidos 938 registros duplicados (401 </w:t>
       </w:r>
       <w:r>
         <w:rPr>
@@ -529,7 +2328,7 @@
           <w:i/>
           <w:sz w:val="22"/>
         </w:rPr>
-        <w:t>hash</w:t>
+        <w:t>hashes</w:t>
       </w:r>
       <w:r>
         <w:rPr>
@@ -537,7 +2336,7 @@
           <w:i w:val="0"/>
           <w:sz w:val="22"/>
         </w:rPr>
-        <w:t xml:space="preserve"> SHA-256) da linha bruta; duplicatas dentro de um mesmo arquivo foram mantidas e sinalizadas, por poderem representar eventos legítimos. A classificação ocupacional utilizou os códigos de seis dígitos da Classificação Brasileira de Ocupações (CBO 2002), com dicionário auditado dos 459 códigos observados e três níveis de análise: universo principal das profissões da saúde; profissões multiprofissionais de atuação intersetorial (psicologia, serviço social, educação física e biologia), analisadas à parte; e trabalhadores de apoio em estabelecimentos de saúde, jamais somados às profissões da saúde. Registros sem código válido (184; 3,6%) foram mantidos em categoria própria e quantificados. Denominadores de força de trabalho foram extraídos do Cadastro Nacional de Estabelecimentos de Saúde (CNES): profissionais por ocupação, em dezembro de cada ano, no município (BRASIL, 2026b); como o CNES abrange vínculos estatutários, autônomos e de pessoa jurídica, não cobertos pela CAT, tais denominadores sustentam apenas razões exploratórias de densidade de comunicação, e não medidas de incidência ou de risco. Todos os totais foram reproduzidos por rotina independente, com convergência integral; células com menos de cinco registros foram agregadas; as análises de sensibilidade abrangeram exclusão de 2025 (ano parcial, com dados até outubro), restrição aos meses de janeiro a outubro em todos os anos, exclusão de acidentes de trajeto, restrição a acidentes típicos e restrição a empregadores das divisões 86 e 87 da CNAE.</w:t>
+        <w:t xml:space="preserve"> SHA-256 distintos) entre arquivos de cobertura sobreposta. A classificação ocupacional utilizou a CBO 2002, com dicionário auditado de 458 códigos observados em Campos. Registros sem código válido (184, 3,6%) foram mantidos em categoria própria. Os denominadores de força de trabalho foram extraídos da RAIS, disponível no FTP do Ministério do Trabalho e Emprego, processados com detecção automática de delimitador. Como a RAIS captura apenas vínculos celetistas ativos em 31 de dezembro de cada ano, seus denominadores são comensuráveis com o numerador da CAT, que também cobre majoritariamente celetistas. Denominadores complementares do CNES foram obtidos do TABNET/DATASUS e sustentam razões exploratórias de densidade de comunicação. Todos os totais foram reproduzidos por rotina independente, com convergência integral. Células com menos de cinco registros foram agregadas.</w:t>
       </w:r>
     </w:p>
     <w:p>
@@ -548,19 +2347,11 @@
       </w:pPr>
       <w:r>
         <w:rPr>
-          <w:b/>
-          <w:i w:val="0"/>
-          <w:sz w:val="22"/>
-        </w:rPr>
-        <w:t>Resultados.</w:t>
-      </w:r>
-      <w:r>
-        <w:rPr>
           <w:b w:val="0"/>
           <w:i w:val="0"/>
           <w:sz w:val="22"/>
         </w:rPr>
-        <w:t xml:space="preserve"> Das 5.066 CATs vinculadas a empregadores de Campos dos Goytacazes entre 2018 e 2025, 1.144 (22,6%) correspondem ao universo principal das profissões da saúde, 26 às profissões multiprofissionais, 184 (3,6%) a registros sem CBO válido e 3.712 às demais ocupações (427 delas empregadas em estabelecimentos de saúde). A distribuição interna é fortemente assimétrica (Tabela 2): a enfermagem concentra 84,4% dos registros do universo principal, sendo 70,2% de técnicos e auxiliares e 14,2% de enfermeiros; seguem-se os técnicos e auxiliares de diagnóstico e laboratório (6,8%) e a fisioterapia (2,6%); a medicina responde por 1,0%. Predominam mulheres (85,7%), com idade mediana de 36 anos. Os acidentes típicos somam 81,9% e os de trajeto, 17,1%. Os ferimentos de punho e mãos lideram os diagnósticos (código S61 da CID-10: 25,1%; o dedo é a parte atingida em 43,9% dos registros), seguidos do contato ou exposição a doenças transmissíveis (Z20: 21,9%); agentes infecciosos e produtos biológicos respondem por 26,9% dos agentes causadores. Quase todos os empregadores pertencem às divisões 86 e 87 da CNAE (95,4%), com dominância hospitalar (classe 8610: 76,8%). O empregador emitiu 97,0% das CATs, com mediana de um dia entre o acidente e a emissão; houve um óbito registrado. Comunicações de doença relacionada ao trabalho somaram apenas 1,0%, mesmo com a pandemia dentro do período de análise (Figuras 1 e 2).</w:t>
+        <w:t>Das 5.066 CATs vinculadas a empregadores de Campos dos Goytacazes entre 2018 e 2025, 1.144 (22,6%) correspondem às profissões da saúde, 26 às profissões multiprofissionais, 184 (3,6%) a registros sem CBO válido e 3.712 às demais ocupações, das quais 427 estavam empregadas em estabelecimentos de saúde. A distribuição interna é fortemente assimétrica (Tabela 4). A enfermagem concentra 84,4% dos registros, sendo 70,2% de técnicos e auxiliares e 14,2% de enfermeiros. Seguem-se os técnicos e auxiliares de diagnóstico e laboratório (6,8%) e a fisioterapia (2,6%). A medicina responde por 1,0%. Predominam mulheres (85,7%), com idade mediana de 36 anos. Os acidentes típicos somam 81,9% e os de trajeto, 17,1%. Os ferimentos de punho e mãos lideram os diagnósticos (CID-10 S61, 25,1%; o dedo é a parte atingida em 43,9% dos registros), seguidos do contato ou exposição a doenças transmissíveis (Z20, 21,9%). Agentes infecciosos e produtos biológicos respondem por 26,9% dos agentes causadores. Quase todos os empregadores pertencem às divisões 86 e 87 da CNAE (95,4%), com dominância hospitalar (classe 8610, 76,8%). O empregador emitiu 97,0% das CATs, com mediana de um dia entre o acidente e a emissão. Houve um óbito registrado. Comunicações de doença relacionada ao trabalho somaram apenas 1,0%, mesmo com a pandemia dentro do período (Figuras 1 e 2).</w:t>
       </w:r>
     </w:p>
     <w:p>
@@ -575,7 +2366,7 @@
           <w:i w:val="0"/>
           <w:sz w:val="19"/>
         </w:rPr>
-        <w:t>Tabela 2.</w:t>
+        <w:t>Tabela 4.</w:t>
       </w:r>
       <w:r>
         <w:rPr>
@@ -611,7 +2402,7 @@
               <w:rPr>
                 <w:b/>
                 <w:i w:val="0"/>
-                <w:sz w:val="17"/>
+                <w:sz w:val="16"/>
               </w:rPr>
               <w:t>Característica</w:t>
             </w:r>
@@ -631,7 +2422,7 @@
               <w:rPr>
                 <w:b/>
                 <w:i w:val="0"/>
-                <w:sz w:val="17"/>
+                <w:sz w:val="16"/>
               </w:rPr>
               <w:t>n (%)</w:t>
             </w:r>
@@ -653,7 +2444,7 @@
               <w:rPr>
                 <w:b w:val="0"/>
                 <w:i w:val="0"/>
-                <w:sz w:val="17"/>
+                <w:sz w:val="16"/>
               </w:rPr>
               <w:t>Técnicos e auxiliares de enfermagem</w:t>
             </w:r>
@@ -673,7 +2464,7 @@
               <w:rPr>
                 <w:b w:val="0"/>
                 <w:i w:val="0"/>
-                <w:sz w:val="17"/>
+                <w:sz w:val="16"/>
               </w:rPr>
               <w:t>803 (70,2)</w:t>
             </w:r>
@@ -695,7 +2486,7 @@
               <w:rPr>
                 <w:b w:val="0"/>
                 <w:i w:val="0"/>
-                <w:sz w:val="17"/>
+                <w:sz w:val="16"/>
               </w:rPr>
               <w:t>Enfermeiros</w:t>
             </w:r>
@@ -715,7 +2506,7 @@
               <w:rPr>
                 <w:b w:val="0"/>
                 <w:i w:val="0"/>
-                <w:sz w:val="17"/>
+                <w:sz w:val="16"/>
               </w:rPr>
               <w:t>163 (14,2)</w:t>
             </w:r>
@@ -737,9 +2528,9 @@
               <w:rPr>
                 <w:b w:val="0"/>
                 <w:i w:val="0"/>
-                <w:sz w:val="17"/>
+                <w:sz w:val="16"/>
               </w:rPr>
-              <w:t>Técnicos e auxiliares de diagnóstico e laboratório</w:t>
+              <w:t>Téc. e aux. de diagnóstico e laboratório</w:t>
             </w:r>
           </w:p>
         </w:tc>
@@ -757,7 +2548,7 @@
               <w:rPr>
                 <w:b w:val="0"/>
                 <w:i w:val="0"/>
-                <w:sz w:val="17"/>
+                <w:sz w:val="16"/>
               </w:rPr>
               <w:t>78 (6,8)</w:t>
             </w:r>
@@ -779,7 +2570,7 @@
               <w:rPr>
                 <w:b w:val="0"/>
                 <w:i w:val="0"/>
-                <w:sz w:val="17"/>
+                <w:sz w:val="16"/>
               </w:rPr>
               <w:t>Fisioterapia</w:t>
             </w:r>
@@ -799,7 +2590,7 @@
               <w:rPr>
                 <w:b w:val="0"/>
                 <w:i w:val="0"/>
-                <w:sz w:val="17"/>
+                <w:sz w:val="16"/>
               </w:rPr>
               <w:t>30 (2,6)</w:t>
             </w:r>
@@ -821,7 +2612,7 @@
               <w:rPr>
                 <w:b w:val="0"/>
                 <w:i w:val="0"/>
-                <w:sz w:val="17"/>
+                <w:sz w:val="16"/>
               </w:rPr>
               <w:t>Técnicos e auxiliares de farmácia</w:t>
             </w:r>
@@ -841,7 +2632,7 @@
               <w:rPr>
                 <w:b w:val="0"/>
                 <w:i w:val="0"/>
-                <w:sz w:val="17"/>
+                <w:sz w:val="16"/>
               </w:rPr>
               <w:t>20 (1,7)</w:t>
             </w:r>
@@ -863,7 +2654,7 @@
               <w:rPr>
                 <w:b w:val="0"/>
                 <w:i w:val="0"/>
-                <w:sz w:val="17"/>
+                <w:sz w:val="16"/>
               </w:rPr>
               <w:t>Agentes comunitários de saúde e afins</w:t>
             </w:r>
@@ -883,7 +2674,7 @@
               <w:rPr>
                 <w:b w:val="0"/>
                 <w:i w:val="0"/>
-                <w:sz w:val="17"/>
+                <w:sz w:val="16"/>
               </w:rPr>
               <w:t>14 (1,2)</w:t>
             </w:r>
@@ -905,7 +2696,7 @@
               <w:rPr>
                 <w:b w:val="0"/>
                 <w:i w:val="0"/>
-                <w:sz w:val="17"/>
+                <w:sz w:val="16"/>
               </w:rPr>
               <w:t>Medicina</w:t>
             </w:r>
@@ -925,7 +2716,7 @@
               <w:rPr>
                 <w:b w:val="0"/>
                 <w:i w:val="0"/>
-                <w:sz w:val="17"/>
+                <w:sz w:val="16"/>
               </w:rPr>
               <w:t>12 (1,0)</w:t>
             </w:r>
@@ -947,9 +2738,9 @@
               <w:rPr>
                 <w:b w:val="0"/>
                 <w:i w:val="0"/>
-                <w:sz w:val="17"/>
+                <w:sz w:val="16"/>
               </w:rPr>
-              <w:t>Demais categorias (farmácia, nutrição, odontologia e saúde bucal, fonoaudiologia, instrumentação cirúrgica; n&lt;5 agregados)</w:t>
+              <w:t>Demais categorias (n&lt;5 agregados)</w:t>
             </w:r>
           </w:p>
         </w:tc>
@@ -967,7 +2758,7 @@
               <w:rPr>
                 <w:b w:val="0"/>
                 <w:i w:val="0"/>
-                <w:sz w:val="17"/>
+                <w:sz w:val="16"/>
               </w:rPr>
               <w:t>24 (2,1)</w:t>
             </w:r>
@@ -989,7 +2780,7 @@
               <w:rPr>
                 <w:b w:val="0"/>
                 <w:i w:val="0"/>
-                <w:sz w:val="17"/>
+                <w:sz w:val="16"/>
               </w:rPr>
               <w:t>Sexo feminino</w:t>
             </w:r>
@@ -1009,7 +2800,7 @@
               <w:rPr>
                 <w:b w:val="0"/>
                 <w:i w:val="0"/>
-                <w:sz w:val="17"/>
+                <w:sz w:val="16"/>
               </w:rPr>
               <w:t>980 (85,7)</w:t>
             </w:r>
@@ -1031,9 +2822,9 @@
               <w:rPr>
                 <w:b w:val="0"/>
                 <w:i w:val="0"/>
-                <w:sz w:val="17"/>
+                <w:sz w:val="16"/>
               </w:rPr>
-              <w:t>Acidente típico; de trajeto; doença</w:t>
+              <w:t>Acidente típico / trajeto / doença</w:t>
             </w:r>
           </w:p>
         </w:tc>
@@ -1051,9 +2842,9 @@
               <w:rPr>
                 <w:b w:val="0"/>
                 <w:i w:val="0"/>
-                <w:sz w:val="17"/>
+                <w:sz w:val="16"/>
               </w:rPr>
-              <w:t>937 (81,9); 196 (17,1); 11 (1,0)</w:t>
+              <w:t>937 (81,9) / 196 (17,1) / 11 (1,0)</w:t>
             </w:r>
           </w:p>
         </w:tc>
@@ -1073,9 +2864,9 @@
               <w:rPr>
                 <w:b w:val="0"/>
                 <w:i w:val="0"/>
-                <w:sz w:val="17"/>
+                <w:sz w:val="16"/>
               </w:rPr>
-              <w:t>Parte do corpo atingida: dedo</w:t>
+              <w:t>Parte atingida: dedo</w:t>
             </w:r>
           </w:p>
         </w:tc>
@@ -1093,7 +2884,7 @@
               <w:rPr>
                 <w:b w:val="0"/>
                 <w:i w:val="0"/>
-                <w:sz w:val="17"/>
+                <w:sz w:val="16"/>
               </w:rPr>
               <w:t>502 (43,9)</w:t>
             </w:r>
@@ -1115,9 +2906,9 @@
               <w:rPr>
                 <w:b w:val="0"/>
                 <w:i w:val="0"/>
-                <w:sz w:val="17"/>
+                <w:sz w:val="16"/>
               </w:rPr>
-              <w:t>Agente causador biológico ou infeccioso</w:t>
+              <w:t>Agente biológico ou infeccioso</w:t>
             </w:r>
           </w:p>
         </w:tc>
@@ -1135,7 +2926,7 @@
               <w:rPr>
                 <w:b w:val="0"/>
                 <w:i w:val="0"/>
-                <w:sz w:val="17"/>
+                <w:sz w:val="16"/>
               </w:rPr>
               <w:t>308 (26,9)</w:t>
             </w:r>
@@ -1157,9 +2948,9 @@
               <w:rPr>
                 <w:b w:val="0"/>
                 <w:i w:val="0"/>
-                <w:sz w:val="17"/>
+                <w:sz w:val="16"/>
               </w:rPr>
-              <w:t>CID-10 S61 (ferimento de punho e mão); Z20 (exposição a doenças transmissíveis)</w:t>
+              <w:t>CID-10 S61 / Z20</w:t>
             </w:r>
           </w:p>
         </w:tc>
@@ -1177,9 +2968,9 @@
               <w:rPr>
                 <w:b w:val="0"/>
                 <w:i w:val="0"/>
-                <w:sz w:val="17"/>
+                <w:sz w:val="16"/>
               </w:rPr>
-              <w:t>287 (25,1); 250 (21,9)</w:t>
+              <w:t>287 (25,1) / 250 (21,9)</w:t>
             </w:r>
           </w:p>
         </w:tc>
@@ -1199,9 +2990,9 @@
               <w:rPr>
                 <w:b w:val="0"/>
                 <w:i w:val="0"/>
-                <w:sz w:val="17"/>
+                <w:sz w:val="16"/>
               </w:rPr>
-              <w:t>Empregador nas divisões CNAE 86 e 87 (na classe 8610, hospitalar)</w:t>
+              <w:t>Empregador CNAE 86-87 (hospitalar 8610)</w:t>
             </w:r>
           </w:p>
         </w:tc>
@@ -1219,9 +3010,9 @@
               <w:rPr>
                 <w:b w:val="0"/>
                 <w:i w:val="0"/>
-                <w:sz w:val="17"/>
+                <w:sz w:val="16"/>
               </w:rPr>
-              <w:t>1.091 (95,4); 879 (76,8)</w:t>
+              <w:t>1.091 (95,4) / 879 (76,8)</w:t>
             </w:r>
           </w:p>
         </w:tc>
@@ -1241,9 +3032,9 @@
               <w:rPr>
                 <w:b w:val="0"/>
                 <w:i w:val="0"/>
-                <w:sz w:val="17"/>
+                <w:sz w:val="16"/>
               </w:rPr>
-              <w:t>CAT emitida pelo empregador; mediana acidente-emissão de 1 dia</w:t>
+              <w:t>CAT emitida pelo empregador</w:t>
             </w:r>
           </w:p>
         </w:tc>
@@ -1261,7 +3052,7 @@
               <w:rPr>
                 <w:b w:val="0"/>
                 <w:i w:val="0"/>
-                <w:sz w:val="17"/>
+                <w:sz w:val="16"/>
               </w:rPr>
               <w:t>1.110 (97,0)</w:t>
             </w:r>
@@ -1279,9 +3070,9 @@
         <w:rPr>
           <w:b w:val="0"/>
           <w:i w:val="0"/>
-          <w:sz w:val="17"/>
+          <w:sz w:val="16"/>
         </w:rPr>
-        <w:t>Fonte: elaborada pelo autor a partir de Brasil (2026a). Idade mediana de 36 anos; sexo ignorado em 4 registros; um óbito registrado. Percentuais sobre o total do universo principal.</w:t>
+        <w:t>Fonte dos dados brutos: INSS, Comunicações de Acidente de Trabalho (CAT), disponíveis no Portal de Dados Abertos do governo federal. Idade mediana de 36 anos. Sexo ignorado em 4 registros. Um óbito. Percentuais sobre o universo principal (n = 1.144).</w:t>
       </w:r>
     </w:p>
     <w:p>
@@ -1344,7 +3135,7 @@
           <w:i w:val="0"/>
           <w:sz w:val="17"/>
         </w:rPr>
-        <w:t xml:space="preserve"> CATs de profissões da saúde (universo principal, n = 1.144) vinculadas a empregadores de Campos dos Goytacazes (RJ), por ano do acidente e categoria profissional, 2018-2025. Unidade: registros. Fonte: elaborada pelo autor a partir de Brasil (2026a). *Cobertura parcial ou irregular da fonte (2018: competências desde julho; 2022: carga irregular; 2024: setembro a dezembro atípicos; 2025: até outubro). Frequências de comunicação, não taxas de acidente.</w:t>
+        <w:t xml:space="preserve"> CATs de profissões da saúde (universo principal, n = 1.144), Campos dos Goytacazes (RJ), por ano do acidente e categoria profissional, 2018-2025. *Cobertura parcial ou irregular da fonte.</w:t>
       </w:r>
     </w:p>
     <w:p>
@@ -1407,30 +3198,7 @@
           <w:i w:val="0"/>
           <w:sz w:val="17"/>
         </w:rPr>
-        <w:t xml:space="preserve"> Distribuição mensal das CATs de profissões da saúde (universo principal, n = 1.144), empregadores de Campos dos Goytacazes (RJ), janeiro de 2018 a dezembro de 2025, com destaque para o período crítico da covid-19 (março de 2020 a dezembro de 2021) e médias mensais por período. Unidade: registros por mês. Fonte: elaborada pelo autor a partir de Brasil (2026a). As oscilações também refletem a cobertura da fonte (ver notas da Figura 1).</w:t>
-      </w:r>
-    </w:p>
-    <w:p>
-      <w:pPr>
-        <w:spacing w:before="0" w:after="40"/>
-        <w:ind w:firstLine="709"/>
-        <w:jc w:val="both"/>
-      </w:pPr>
-      <w:r>
-        <w:rPr>
-          <w:b/>
-          <w:i w:val="0"/>
-          <w:sz w:val="22"/>
-        </w:rPr>
-        <w:t>Discussão.</w:t>
-      </w:r>
-      <w:r>
-        <w:rPr>
-          <w:b w:val="0"/>
-          <w:i w:val="0"/>
-          <w:sz w:val="22"/>
-        </w:rPr>
-        <w:t xml:space="preserve"> A concentração dos registros na base técnica da enfermagem não deve ser lida como simples somatório de riscos biológicos ou ergonômicos: ela expressa a divisão social e técnica do trabalho em saúde, na qual a execução manual, contínua e corporal do cuidado (punção venosa, administração de medicamentos, manipulação de perfurocortantes, mobilização de pacientes) é delegada a categorias majoritariamente femininas, de menor renda e prestígio, submetidas a sobrecarga e intensificação, das quais deriva o desgaste (CECILIO; LACAZ, 2012; ANTUNES, 2018). A quase invisibilidade da medicina (12 CATs em oito anos, ante 1.360 a 1.702 vínculos formais de médicos na RAIS) não autoriza concluir menor exposição: indica inserção por vínculos estatutários, autônomos e de pessoa jurídica, situados fora do emprego celetista coberto pela CAT, o que configura desigualdade de proteção e de reconhecimento institucional e reitera, no plano previdenciário, a estratificação de classe e de prestígio entre as profissões (LEMOS, 2012). Pela mesma razão, agentes comunitários de saúde e agentes de combate às endemias, majoritariamente vinculados à administração pública municipal, quase não aparecem na base (14 registros; nenhum agente de combate às endemias), sem que se possa inferir ausência de adoecimento. A elevação da média mensal de registros no período crítico da covid-19 (de 10,7 para 14,5, com 11,9 no período posterior) e o peso das exposições biológicas são compatíveis com a sobrecarga pandêmica descrita para os trabalhadores da saúde, marcada por déficit de proteção e de reconhecimento (VEDOVATO et al., 2021); oscilações de cobertura da própria fonte, contudo, impedem qualquer atribuição causal (Figura 2). A baixíssima frequência de comunicações de doença (1,0%) reforça o diagnóstico de subnotificação seletiva: o sistema registra sobretudo a lesão aguda e visível, e não o adoecimento lento produzido pela organização do trabalho.</w:t>
+        <w:t xml:space="preserve"> Distribuição mensal das CATs de profissões da saúde (universo principal, n = 1.144), Campos dos Goytacazes (RJ), janeiro de 2018 a dezembro de 2025. Destaque para o período crítico da covid-19 (março de 2020 a dezembro de 2021) e médias mensais por período. Ver notas da Figura 1 sobre oscilações de cobertura da fonte.</w:t>
       </w:r>
     </w:p>
     <w:p>
@@ -1445,7 +3213,7 @@
           <w:i w:val="0"/>
           <w:sz w:val="22"/>
         </w:rPr>
-        <w:t>Os dados permitem descrever a estrutura interna das comunicações registradas: quem aparece, com que lesões, em que vínculos e em que estabelecimentos. Não permitem estimar incidência, prevalência ou risco ocupacional, pois as diferenças entre categorias podem refletir o tamanho das forças de trabalho, a composição e a formalização dos vínculos, a terceirização, a cobertura previdenciária, a cultura institucional de notificação e a subnotificação diferencial. A robustez interna dos achados é alta: a predominância da enfermagem e a hierarquia das categorias mantêm-se em todos os cenários de sensibilidade, com participação da enfermagem entre 84,4% e 86,3%. As razões exploratórias com denominadores do CNES (9.803 profissionais em 2018; 13.275 em 2025) reforçam o gradiente: nos anos de cobertura integral (2019 a 2021 e 2023) houve de 29,5 a 43,5 CATs por 1.000 técnicos e auxiliares de enfermagem ao ano, de 19,4 a 32,7 por 1.000 enfermeiros e, na medicina, no máximo 3,6 (valores suprimidos nos demais anos por contagens inferiores a cinco). Vínculos formais da Relação Anual de Informações Sociais (RAIS) por ocupação, município e ano permanecem como denominador prioritário para indicadores padronizados, condicionados à demonstração de compatibilidade entre numerador e denominador.</w:t>
+        <w:t>A concentração dos registros na base técnica da enfermagem expressa a divisão social e técnica do trabalho em saúde. A execução manual e corporal do cuidado, que inclui punção venosa, administração de medicamentos, manipulação de perfurocortantes e mobilização de pacientes, é delegada a categorias majoritariamente femininas, de menor renda e prestígio, submetidas a intensificação e sobrecarga (CECILIO; LACAZ, 2012; ANTUNES, 2018). O setor saúde de Campos empregava 15.002 pessoas em 2024, com massa salarial anual de R$ 593,9 milhões e salário médio de 2,2 salários mínimos mensais, o que torna esse contingente economicamente relevante e, ao mesmo tempo, vulnerável à oscilação das finanças públicas. A quase invisibilidade da medicina (12 CATs em oito anos, ante 1.099 a 1.393 vínculos celetistas ativos de médicos na RAIS entre 2018 e 2025) não autoriza concluir menor exposição. Indica inserção predominante por vínculos estatutários, autônomos e de pessoa jurídica, não cobertos pela CAT, o que configura desigualdade de proteção e de reconhecimento institucional e reitera a estratificação de classe e prestígio entre as profissões (LEMOS, 2012). A coexistência de dois regimes previdenciários na administração municipal, com R$ 58,7 milhões em contribuições ao RPPS e R$ 18,3 milhões ao INSS em 2024, materializa essa dualidade de proteção. Agentes comunitários de saúde e de combate às endemias, majoritariamente estatutários, quase não aparecem na base (14 registros, nenhum agente de combate às endemias).</w:t>
       </w:r>
     </w:p>
     <w:p>
@@ -1456,11 +3224,19 @@
       </w:pPr>
       <w:r>
         <w:rPr>
-          <w:b/>
+          <w:b w:val="0"/>
           <w:i w:val="0"/>
           <w:sz w:val="22"/>
         </w:rPr>
-        <w:t>Considerações finais.</w:t>
+        <w:t xml:space="preserve">A média mensal de registros passou de 13,8 (julho de 2018 a fevereiro de 2020) para 14,5 no período crítico da covid-19 (março de 2020 a dezembro de 2021) e recuou para 11,9 no biênio seguinte (2022-2023), convergente com a sobrecarga pandêmica descrita para os trabalhadores da saúde (VEDOVATO </w:t>
+      </w:r>
+      <w:r>
+        <w:rPr>
+          <w:b w:val="0"/>
+          <w:i/>
+          <w:sz w:val="22"/>
+        </w:rPr>
+        <w:t>et al.</w:t>
       </w:r>
       <w:r>
         <w:rPr>
@@ -1468,7 +3244,7 @@
           <w:i w:val="0"/>
           <w:sz w:val="22"/>
         </w:rPr>
-        <w:t xml:space="preserve"> Para a Vigilância em Saúde do Trabalhador e para a gestão municipal, os resultados indicam prioridades verificáveis: proteger a base técnica da enfermagem, núcleo do cuidado e dos registros, com ênfase em perfurocortantes e exposição biológica; enfrentar a subnotificação de doenças relacionadas ao trabalho e a invisibilidade de estatutários, terceirizados e informais, articulando CAT, RAIS, CNES e as notificações do SUS; qualificar o preenchimento dos registros, pois 3,6% não trazem código ocupacional válido, com concentração entre 2021 e 2023; e planejar a rede assistencial reconhecendo que seu financiamento oscila com as rendas petrolíferas (MARTINS; HASENCLEVER; MIRANDA, 2024) e que a proteção de quem cuida é condição de possibilidade do próprio cuidado.</w:t>
+        <w:t>, 2021). As oscilações de cobertura da fonte, contudo, impedem atribuição causal (Figura 2). A baixíssima frequência de comunicações de doença (1,0%) reforça o diagnóstico de subnotificação seletiva. O sistema registra sobretudo a lesão aguda e visível, não o adoecimento lento produzido pela organização do trabalho. Os dados não permitem estimar incidência, prevalência ou risco ocupacional, pois as diferenças entre categorias podem refletir o tamanho das forças de trabalho, a composição e a formalização dos vínculos, a terceirização e a cultura institucional de notificação. A robustez interna é alta. A predominância da enfermagem e a hierarquia das categorias mantêm-se em todos os cenários de sensibilidade, com participação da enfermagem entre 84,4% e 86,3%. As razões exploratórias com denominadores do CNES (9.803 profissionais em 2018, 13.275 em 2025) reforçam o gradiente. Nos anos de cobertura integral (2019 a 2021 e 2023) houve de 29,5 a 43,5 CATs por 1.000 técnicos e auxiliares de enfermagem ao ano, de 19,4 a 32,7 por 1.000 enfermeiros e, na medicina, no máximo 3,6, com valores suprimidos nos demais anos por contagens inferiores a cinco.</w:t>
       </w:r>
     </w:p>
     <w:p>
@@ -1479,11 +3255,19 @@
       </w:pPr>
       <w:r>
         <w:rPr>
-          <w:b/>
+          <w:b w:val="0"/>
           <w:i w:val="0"/>
           <w:sz w:val="22"/>
         </w:rPr>
-        <w:t>Limitações.</w:t>
+        <w:t xml:space="preserve">Para a Vigilância em Saúde do Trabalhador e para a gestão municipal, os resultados indicam prioridades verificáveis. A primeira é proteger a base técnica da enfermagem, núcleo do cuidado e dos registros, com ênfase em perfurocortantes e exposição biológica. A segunda é enfrentar a subnotificação de doenças relacionadas ao trabalho e a invisibilidade de estatutários, terceirizados e informais, articulando CAT, SINAN, RAIS, CNES e os registros do RPPS municipal, cujos dados de acidentes e adoecimentos de servidores estatutários não são consolidados em base nacional de acesso público. A terceira é qualificar o preenchimento dos registros, pois 3,6% não trazem código ocupacional válido, com concentração entre 2021 e 2023. A quarta é planejar a rede assistencial reconhecendo que seu financiamento oscila com as rendas petrolíferas (MARTINS; HASENCLEVER; MIRANDA, 2024) e que a proteção de quem cuida é condição de possibilidade do próprio cuidado. O IDHM de 0,716, a dependência de 71% das receitas de transferências e a convivência de dois regimes previdenciários com patamares desiguais de proteção reforçam a urgência de políticas que não estejam à mercê da volatilidade de uma única </w:t>
+      </w:r>
+      <w:r>
+        <w:rPr>
+          <w:b w:val="0"/>
+          <w:i/>
+          <w:sz w:val="22"/>
+        </w:rPr>
+        <w:t>commodity</w:t>
       </w:r>
       <w:r>
         <w:rPr>
@@ -1491,12 +3275,27 @@
           <w:i w:val="0"/>
           <w:sz w:val="22"/>
         </w:rPr>
-        <w:t xml:space="preserve"> A CAT capta comunicações, e não a totalidade dos acidentes e adoecimentos; cobre essencialmente o emprego formal celetista, excluindo trabalhadores informais, autônomos e estatutários; não há denominadores plenamente compatíveis para o cálculo de incidência, as razões com a RAIS são comensuráveis, pois tanto o numerador quanto o denominador provêm do universo celetista; a cobertura da fonte é parcial em 2018 (competências desde julho), irregular em 2022, atípica de setembro a dezembro de 2024 e incompleta em 2025 (dados até outubro), o que restringe comparações anuais; registros sem CBO válido podem subestimar as profissões da saúde entre 2021 e 2023; e o desenho descritivo e documental não permite inferência causal.</w:t>
+        <w:t>.</w:t>
       </w:r>
     </w:p>
     <w:p>
       <w:pPr>
-        <w:spacing w:before="80" w:after="40"/>
+        <w:spacing w:before="0" w:after="40"/>
+        <w:ind w:firstLine="709"/>
+        <w:jc w:val="both"/>
+      </w:pPr>
+      <w:r>
+        <w:rPr>
+          <w:b w:val="0"/>
+          <w:i w:val="0"/>
+          <w:sz w:val="22"/>
+        </w:rPr>
+        <w:t>A CAT capta comunicações, não a totalidade dos acidentes e adoecimentos. Cobre essencialmente o emprego formal celetista, excluindo informais, autônomos e estatutários. Não há denominadores plenamente compatíveis para cálculo de incidência. A cobertura da fonte é parcial em 2018 (competências desde julho), irregular em 2022, atípica de setembro a dezembro de 2024 e incompleta em 2025 (dados até outubro), o que restringe comparações anuais. Registros sem CBO válido podem subestimar as profissões da saúde entre 2021 e 2023. O desenho descritivo e documental não permite inferência causal. Os registros de acidentes e adoecimentos de servidores estatutários municipais, vinculados ao RPPS, não estão disponíveis em base consolidada de acesso público, o que impede a comparação direta entre os dois regimes previdenciários.</w:t>
+      </w:r>
+    </w:p>
+    <w:p>
+      <w:pPr>
+        <w:spacing w:before="120" w:after="40"/>
         <w:ind w:firstLine="0"/>
         <w:jc w:val="both"/>
       </w:pPr>
@@ -1519,7 +3318,7 @@
         <w:rPr>
           <w:b w:val="0"/>
           <w:i w:val="0"/>
-          <w:sz w:val="19"/>
+          <w:sz w:val="18"/>
         </w:rPr>
         <w:t xml:space="preserve">ANTUNES, R. </w:t>
       </w:r>
@@ -1527,7 +3326,7 @@
         <w:rPr>
           <w:b/>
           <w:i w:val="0"/>
-          <w:sz w:val="19"/>
+          <w:sz w:val="18"/>
         </w:rPr>
         <w:t>O privilégio da servidão</w:t>
       </w:r>
@@ -1535,7 +3334,7 @@
         <w:rPr>
           <w:b w:val="0"/>
           <w:i w:val="0"/>
-          <w:sz w:val="19"/>
+          <w:sz w:val="18"/>
         </w:rPr>
         <w:t>: o novo proletariado de serviços na era digital. São Paulo: Boitempo, 2018.</w:t>
       </w:r>
@@ -1550,100 +3349,7 @@
         <w:rPr>
           <w:b w:val="0"/>
           <w:i w:val="0"/>
-          <w:sz w:val="19"/>
-        </w:rPr>
-        <w:t xml:space="preserve">BRASIL. Instituto Nacional do Seguro Social. </w:t>
-      </w:r>
-      <w:r>
-        <w:rPr>
-          <w:b/>
-          <w:i w:val="0"/>
-          <w:sz w:val="19"/>
-        </w:rPr>
-        <w:t>Comunicações de Acidente de Trabalho (CAT)</w:t>
-      </w:r>
-      <w:r>
-        <w:rPr>
-          <w:b w:val="0"/>
-          <w:i w:val="0"/>
-          <w:sz w:val="19"/>
-        </w:rPr>
-        <w:t>: dados abertos, competências de julho de 2018 a dezembro de 2025. Brasília, DF: INSS, 2026a. Disponível em: https://dados.gov.br/dados/conjuntos-dados/inss-comunicacao-de-acidente-de-trabalho-cat. Acesso em: 18 jul. 2026.</w:t>
-      </w:r>
-    </w:p>
-    <w:p>
-      <w:pPr>
-        <w:spacing w:before="0" w:after="40"/>
-        <w:ind w:firstLine="0"/>
-        <w:jc w:val="left"/>
-      </w:pPr>
-      <w:r>
-        <w:rPr>
-          <w:b w:val="0"/>
-          <w:i w:val="0"/>
-          <w:sz w:val="19"/>
-        </w:rPr>
-        <w:t xml:space="preserve">BRASIL. Ministério do Trabalho e Emprego. </w:t>
-      </w:r>
-      <w:r>
-        <w:rPr>
-          <w:b/>
-          <w:i w:val="0"/>
-          <w:sz w:val="19"/>
-        </w:rPr>
-        <w:t>Relação Anual de Informações Sociais (RAIS)</w:t>
-      </w:r>
-      <w:r>
-        <w:rPr>
-          <w:b w:val="0"/>
-          <w:i w:val="0"/>
-          <w:sz w:val="19"/>
-        </w:rPr>
-        <w:t>: microdados, vínculos, 2018-2023. Brasília, DF: PDET/MTE, 2026b. Disponível em: ftp://ftp.mtps.gov.br/pdet/microdados/RAIS. Acesso em: 18 jul. 2026.</w:t>
-      </w:r>
-    </w:p>
-    <w:p>
-      <w:pPr>
-        <w:spacing w:before="0" w:after="40"/>
-        <w:ind w:firstLine="0"/>
-        <w:jc w:val="left"/>
-      </w:pPr>
-      <w:r>
-        <w:rPr>
-          <w:b w:val="0"/>
-          <w:i w:val="0"/>
-          <w:sz w:val="19"/>
-        </w:rPr>
-        <w:t xml:space="preserve">BRASIL. Ministério da Saúde. DATASUS. </w:t>
-      </w:r>
-      <w:r>
-        <w:rPr>
-          <w:b/>
-          <w:i w:val="0"/>
-          <w:sz w:val="19"/>
-        </w:rPr>
-        <w:t>CNES: recursos humanos, profissionais, indivíduos, segundo CBO 2002, Rio de Janeiro</w:t>
-      </w:r>
-      <w:r>
-        <w:rPr>
-          <w:b w:val="0"/>
-          <w:i w:val="0"/>
-          <w:sz w:val="19"/>
-        </w:rPr>
-        <w:t>. Brasília, DF: Ministério da Saúde, 2026c. Disponível em: http://tabnet.datasus.gov.br. Acesso em: 18 jul. 2026.</w:t>
-      </w:r>
-    </w:p>
-    <w:p>
-      <w:pPr>
-        <w:spacing w:before="0" w:after="40"/>
-        <w:ind w:firstLine="0"/>
-        <w:jc w:val="left"/>
-      </w:pPr>
-      <w:r>
-        <w:rPr>
-          <w:b w:val="0"/>
-          <w:i w:val="0"/>
-          <w:sz w:val="19"/>
+          <w:sz w:val="18"/>
         </w:rPr>
         <w:t xml:space="preserve">CECILIO, L. C. O.; LACAZ, F. A. C. </w:t>
       </w:r>
@@ -1651,7 +3357,7 @@
         <w:rPr>
           <w:b/>
           <w:i w:val="0"/>
-          <w:sz w:val="19"/>
+          <w:sz w:val="18"/>
         </w:rPr>
         <w:t>O trabalho em saúde</w:t>
       </w:r>
@@ -1659,7 +3365,7 @@
         <w:rPr>
           <w:b w:val="0"/>
           <w:i w:val="0"/>
-          <w:sz w:val="19"/>
+          <w:sz w:val="18"/>
         </w:rPr>
         <w:t>. Rio de Janeiro: Cebes, 2012.</w:t>
       </w:r>
@@ -1674,7 +3380,7 @@
         <w:rPr>
           <w:b w:val="0"/>
           <w:i w:val="0"/>
-          <w:sz w:val="19"/>
+          <w:sz w:val="18"/>
         </w:rPr>
         <w:t xml:space="preserve">IBGE. </w:t>
       </w:r>
@@ -1682,7 +3388,7 @@
         <w:rPr>
           <w:b/>
           <w:i w:val="0"/>
-          <w:sz w:val="19"/>
+          <w:sz w:val="18"/>
         </w:rPr>
         <w:t>Sistema IBGE de Recuperação Automática (SIDRA)</w:t>
       </w:r>
@@ -1690,9 +3396,9 @@
         <w:rPr>
           <w:b w:val="0"/>
           <w:i w:val="0"/>
-          <w:sz w:val="19"/>
+          <w:sz w:val="18"/>
         </w:rPr>
-        <w:t>: Censo Demográfico 2022 (tabela 4714); Produto Interno Bruto dos Municípios (tabela 5938); Produção Agrícola Municipal (tabela 1612). Rio de Janeiro: IBGE, 2026. Disponível em: https://sidra.ibge.gov.br. Acesso em: 18 jul. 2026.</w:t>
+        <w:t>: Censo Demográfico 2022 (tabela 4714); Produto Interno Bruto dos Municípios (tabela 5938). Rio de Janeiro: IBGE, 2026. Disponível em: https://sidra.ibge.gov.br. Acesso em: 18 jul. 2026.</w:t>
       </w:r>
     </w:p>
     <w:p>
@@ -1705,7 +3411,7 @@
         <w:rPr>
           <w:b w:val="0"/>
           <w:i w:val="0"/>
-          <w:sz w:val="19"/>
+          <w:sz w:val="18"/>
         </w:rPr>
         <w:t xml:space="preserve">LEMOS, M. R. Estratificação social na teoria de Max Weber: considerações em torno do tema. </w:t>
       </w:r>
@@ -1713,7 +3419,7 @@
         <w:rPr>
           <w:b/>
           <w:i w:val="0"/>
-          <w:sz w:val="19"/>
+          <w:sz w:val="18"/>
         </w:rPr>
         <w:t>Revista Iluminart</w:t>
       </w:r>
@@ -1721,7 +3427,7 @@
         <w:rPr>
           <w:b w:val="0"/>
           <w:i w:val="0"/>
-          <w:sz w:val="19"/>
+          <w:sz w:val="18"/>
         </w:rPr>
         <w:t>, Sertãozinho, ano 4, n. 9, p. 113-128, nov. 2012.</w:t>
       </w:r>
@@ -1736,38 +3442,7 @@
         <w:rPr>
           <w:b w:val="0"/>
           <w:i w:val="0"/>
-          <w:sz w:val="19"/>
-        </w:rPr>
-        <w:t xml:space="preserve">LOURENÇO, G. G. O fim do fim do trabalho: uma crítica à chamada sociedade pós-industrial e sua relação com os movimentos de trabalhadores. </w:t>
-      </w:r>
-      <w:r>
-        <w:rPr>
-          <w:b/>
-          <w:i w:val="0"/>
-          <w:sz w:val="19"/>
-        </w:rPr>
-        <w:t>Primeiros Estudos</w:t>
-      </w:r>
-      <w:r>
-        <w:rPr>
-          <w:b w:val="0"/>
-          <w:i w:val="0"/>
-          <w:sz w:val="19"/>
-        </w:rPr>
-        <w:t>, São Paulo, n. 3, p. 104-121, 2012. Disponível em: https://doi.org/10.11606/issn.2237-2423.v0i3p104-121. Acesso em: 18 jul. 2026.</w:t>
-      </w:r>
-    </w:p>
-    <w:p>
-      <w:pPr>
-        <w:spacing w:before="0" w:after="40"/>
-        <w:ind w:firstLine="0"/>
-        <w:jc w:val="left"/>
-      </w:pPr>
-      <w:r>
-        <w:rPr>
-          <w:b w:val="0"/>
-          <w:i w:val="0"/>
-          <w:sz w:val="19"/>
+          <w:sz w:val="18"/>
         </w:rPr>
         <w:t xml:space="preserve">MARTINS, S.; HASENCLEVER, L.; MIRANDA, C. A gestão da saúde à luz da instabilidade de financiamento e das propostas de governo. </w:t>
       </w:r>
@@ -1775,7 +3450,7 @@
         <w:rPr>
           <w:b/>
           <w:i w:val="0"/>
-          <w:sz w:val="19"/>
+          <w:sz w:val="18"/>
         </w:rPr>
         <w:t>Cadernos do Desenvolvimento Fluminense</w:t>
       </w:r>
@@ -1783,7 +3458,7 @@
         <w:rPr>
           <w:b w:val="0"/>
           <w:i w:val="0"/>
-          <w:sz w:val="19"/>
+          <w:sz w:val="18"/>
         </w:rPr>
         <w:t>, Rio de Janeiro, n. 27, 2024. Disponível em: https://doi.org/10.12957/cdf.2024.87352. Acesso em: 18 jul. 2026.</w:t>
       </w:r>
@@ -1798,7 +3473,7 @@
         <w:rPr>
           <w:b w:val="0"/>
           <w:i w:val="0"/>
-          <w:sz w:val="19"/>
+          <w:sz w:val="18"/>
         </w:rPr>
         <w:t xml:space="preserve">MENDES, R.; DIAS, E. C. Da medicina do trabalho à saúde do trabalhador. </w:t>
       </w:r>
@@ -1806,7 +3481,7 @@
         <w:rPr>
           <w:b/>
           <w:i w:val="0"/>
-          <w:sz w:val="19"/>
+          <w:sz w:val="18"/>
         </w:rPr>
         <w:t>Revista de Saúde Pública</w:t>
       </w:r>
@@ -1814,7 +3489,7 @@
         <w:rPr>
           <w:b w:val="0"/>
           <w:i w:val="0"/>
-          <w:sz w:val="19"/>
+          <w:sz w:val="18"/>
         </w:rPr>
         <w:t>, São Paulo, v. 25, n. 5, p. 341-349, 1991. Disponível em: https://doi.org/10.1590/S0034-89101991000500003. Acesso em: 18 jul. 2026.</w:t>
       </w:r>
@@ -1829,7 +3504,7 @@
         <w:rPr>
           <w:b w:val="0"/>
           <w:i w:val="0"/>
-          <w:sz w:val="19"/>
+          <w:sz w:val="18"/>
         </w:rPr>
         <w:t xml:space="preserve">OLIVEIRA, E. M. Transformações no mundo do trabalho, da Revolução Industrial aos nossos dias. </w:t>
       </w:r>
@@ -1837,7 +3512,7 @@
         <w:rPr>
           <w:b/>
           <w:i w:val="0"/>
-          <w:sz w:val="19"/>
+          <w:sz w:val="18"/>
         </w:rPr>
         <w:t>Caminhos de Geografia</w:t>
       </w:r>
@@ -1845,7 +3520,7 @@
         <w:rPr>
           <w:b w:val="0"/>
           <w:i w:val="0"/>
-          <w:sz w:val="19"/>
+          <w:sz w:val="18"/>
         </w:rPr>
         <w:t>, Uberlândia, v. 6, n. 11, p. 84-96, fev. 2004. Disponível em: https://doi.org/10.14393/rcg51115327. Acesso em: 18 jul. 2026.</w:t>
       </w:r>
@@ -1860,7 +3535,7 @@
         <w:rPr>
           <w:b w:val="0"/>
           <w:i w:val="0"/>
-          <w:sz w:val="19"/>
+          <w:sz w:val="18"/>
         </w:rPr>
         <w:t xml:space="preserve">SILVA, J. E. M. da; HASENCLEVER, L. Ciclo do petróleo e desenvolvimento socioeconômico no município de Campos dos Goytacazes (1999-2014). </w:t>
       </w:r>
@@ -1868,7 +3543,7 @@
         <w:rPr>
           <w:b/>
           <w:i w:val="0"/>
-          <w:sz w:val="19"/>
+          <w:sz w:val="18"/>
         </w:rPr>
         <w:t>Desenvolvimento em Questão</w:t>
       </w:r>
@@ -1876,7 +3551,7 @@
         <w:rPr>
           <w:b w:val="0"/>
           <w:i w:val="0"/>
-          <w:sz w:val="19"/>
+          <w:sz w:val="18"/>
         </w:rPr>
         <w:t>, Ijuí, v. 17, n. 46, p. 314-332, 2019. Disponível em: https://doi.org/10.21527/2237-6453.2019.46.314-332. Acesso em: 18 jul. 2026.</w:t>
       </w:r>
@@ -1891,7 +3566,7 @@
         <w:rPr>
           <w:b w:val="0"/>
           <w:i w:val="0"/>
-          <w:sz w:val="19"/>
+          <w:sz w:val="18"/>
         </w:rPr>
         <w:t xml:space="preserve">VEDOVATO, T. G.; ANDRADE, C. B.; SANTOS, D. L.; BITENCOURT, S. M.; ALMEIDA, L. P. de; SAMPAIO, J. F. da S. Trabalhadores(as) da saúde e a COVID-19: condições de trabalho à deriva? </w:t>
       </w:r>
@@ -1899,7 +3574,7 @@
         <w:rPr>
           <w:b/>
           <w:i w:val="0"/>
-          <w:sz w:val="19"/>
+          <w:sz w:val="18"/>
         </w:rPr>
         <w:t>Revista Brasileira de Saúde Ocupacional</w:t>
       </w:r>
@@ -1907,7 +3582,7 @@
         <w:rPr>
           <w:b w:val="0"/>
           <w:i w:val="0"/>
-          <w:sz w:val="19"/>
+          <w:sz w:val="18"/>
         </w:rPr>
         <w:t>, São Paulo, v. 46, e1, 2021. Disponível em: https://doi.org/10.1590/2317-6369000028520. Acesso em: 18 jul. 2026.</w:t>
       </w:r>
@@ -2286,7 +3961,7 @@
     <w:qFormat/>
     <w:rsid w:val="00FC693F"/>
     <w:pPr>
-      <w:spacing w:after="0" w:line="240" w:lineRule="auto"/>
+      <w:spacing w:after="0" w:line="360" w:lineRule="auto"/>
     </w:pPr>
     <w:rPr>
       <w:rFonts w:ascii="Times New Roman" w:hAnsi="Times New Roman"/>

</xml_diff>

<commit_message>
CNES via microdatasus (R), razões recalculadas, artigo atualizado
</commit_message>
<xml_diff>
--- a/documentos/artigo.docx
+++ b/documentos/artigo.docx
@@ -2336,7 +2336,7 @@
           <w:i w:val="0"/>
           <w:sz w:val="22"/>
         </w:rPr>
-        <w:t xml:space="preserve"> SHA-256 distintos) entre arquivos de cobertura sobreposta. A classificação ocupacional utilizou a CBO 2002, com dicionário auditado de 458 códigos observados em Campos. Registros sem código válido (184, 3,6%) foram mantidos em categoria própria. Os denominadores de força de trabalho foram extraídos da RAIS, disponível no FTP do Ministério do Trabalho e Emprego, processados com detecção automática de delimitador. Como a RAIS captura apenas vínculos celetistas ativos em 31 de dezembro de cada ano, seus denominadores são comensuráveis com o numerador da CAT, que também cobre majoritariamente celetistas. Denominadores complementares do CNES foram obtidos do TABNET/DATASUS e sustentam razões exploratórias de densidade de comunicação. Todos os totais foram reproduzidos por rotina independente, com convergência integral. Células com menos de cinco registros foram agregadas.</w:t>
+        <w:t xml:space="preserve"> SHA-256 distintos) entre arquivos de cobertura sobreposta. A classificação ocupacional utilizou a CBO 2002, com dicionário auditado de 458 códigos observados em Campos. Registros sem código válido (184, 3,6%) foram mantidos em categoria própria. Os denominadores de força de trabalho foram extraídos da RAIS, disponível no FTP do Ministério do Trabalho e Emprego, processados com detecção automática de delimitador. Como a RAIS captura apenas vínculos celetistas ativos em 31 de dezembro de cada ano, seus denominadores são comensuráveis com o numerador da CAT, que também cobre majoritariamente celetistas. Denominadores complementares do CNES-PF foram obtidos com o pacote microdatasus (R) e sustentam razões exploratórias de densidade de comunicação. Todos os totais foram reproduzidos por rotina independente, com convergência integral. Células com menos de cinco registros foram agregadas.</w:t>
       </w:r>
     </w:p>
     <w:p>
@@ -3244,7 +3244,7 @@
           <w:i w:val="0"/>
           <w:sz w:val="22"/>
         </w:rPr>
-        <w:t>, 2021). As oscilações de cobertura da fonte, contudo, impedem atribuição causal (Figura 2). A baixíssima frequência de comunicações de doença (1,0%) reforça o diagnóstico de subnotificação seletiva. O sistema registra sobretudo a lesão aguda e visível, não o adoecimento lento produzido pela organização do trabalho. Os dados não permitem estimar incidência, prevalência ou risco ocupacional, pois as diferenças entre categorias podem refletir o tamanho das forças de trabalho, a composição e a formalização dos vínculos, a terceirização e a cultura institucional de notificação. A robustez interna é alta. A predominância da enfermagem e a hierarquia das categorias mantêm-se em todos os cenários de sensibilidade, com participação da enfermagem entre 84,4% e 86,3%. As razões exploratórias com denominadores do CNES (9.803 profissionais em 2018, 13.275 em 2025) reforçam o gradiente. Nos anos de cobertura integral (2019 a 2021 e 2023) houve de 29,5 a 43,5 CATs por 1.000 técnicos e auxiliares de enfermagem ao ano, de 19,4 a 32,7 por 1.000 enfermeiros e, na medicina, no máximo 3,6, com valores suprimidos nos demais anos por contagens inferiores a cinco.</w:t>
+        <w:t>, 2021). As oscilações de cobertura da fonte, contudo, impedem atribuição causal (Figura 2). A baixíssima frequência de comunicações de doença (1,0%) reforça o diagnóstico de subnotificação seletiva. O sistema registra sobretudo a lesão aguda e visível, não o adoecimento lento produzido pela organização do trabalho. Os dados não permitem estimar incidência, prevalência ou risco ocupacional, pois as diferenças entre categorias podem refletir o tamanho das forças de trabalho, a composição e a formalização dos vínculos, a terceirização e a cultura institucional de notificação. A robustez interna é alta. A predominância da enfermagem e a hierarquia das categorias mantêm-se em todos os cenários de sensibilidade, com participação da enfermagem entre 84,4% e 86,3%. As razões exploratórias com denominadores do CNES (13.839 profissionais em 2018, 18.382 em 2025) reforçam o gradiente. Nos anos de cobertura integral (2019 a 2021 e 2023) houve de 25,0 a 36,6 CATs por 1.000 técnicos e auxiliares de enfermagem ao ano, de 16,5 a 28,0 por 1.000 enfermeiros e 1,2 por 1.000 médicos em 2019, com valores suprimidos nos demais anos por contagens inferiores a cinco.</w:t>
       </w:r>
     </w:p>
     <w:p>

</xml_diff>

<commit_message>
Citações: (Mendes e Dias, 1991), (Silva e Hasenclever, 2019), (Martins, Hasenclever e Miranda, 2024)
</commit_message>
<xml_diff>
--- a/documentos/artigo.docx
+++ b/documentos/artigo.docx
@@ -29,7 +29,7 @@
           <w:i w:val="0"/>
           <w:sz w:val="22"/>
         </w:rPr>
-        <w:t>O trabalho é um processo social, econômico e político historicamente determinado. Desde a Revolução Industrial, o modo de organizar a produção disciplina corpos e tempos e produz padrões específicos de adoecimento (OLIVEIRA, 2004). No Brasil, o campo da Saúde do Trabalhador constituiu-se como crítica à medicina do trabalho e à saúde ocupacional, ao afirmar a determinação social do processo saúde-doença e o processo de trabalho como categoria explicativa central (MENDES; DIAS, 1991). No setor saúde, o trabalho produtor do cuidado se realiza sob divisão social e técnica, relações desiguais de poder entre categorias e desgaste, em serviços submetidos à reorganização gerencial flexível. Parcela expressiva dos vínculos do Sistema Único de Saúde (SUS) é precária, estimada entre 30% e 50% (CECILIO; LACAZ, 2012).</w:t>
+        <w:t>O trabalho é um processo social, econômico e político historicamente determinado. Desde a Revolução Industrial, o modo de organizar a produção disciplina corpos e tempos e produz padrões específicos de adoecimento (Oliveira, 2004). No Brasil, o campo da Saúde do Trabalhador constituiu-se como crítica à medicina do trabalho e à saúde ocupacional, ao afirmar a determinação social do processo saúde-doença e o processo de trabalho como categoria explicativa central (Mendes e Dias, 1991). No setor saúde, o trabalho produtor do cuidado se realiza sob divisão social e técnica, relações desiguais de poder entre categorias e desgaste, em serviços submetidos à reorganização gerencial flexível. Parcela expressiva dos vínculos do Sistema Único de Saúde (SUS) é precária, estimada entre 30% e 50% (Cecilio e Lacaz, 2012).</w:t>
       </w:r>
     </w:p>
     <w:p>
@@ -745,7 +745,7 @@
           <w:i w:val="0"/>
           <w:sz w:val="22"/>
         </w:rPr>
-        <w:t xml:space="preserve"> e participações especiais) (SILVA; HASENCLEVER, 2019). O Cadastro Central de Empresas de 2024 registra 16.776 empresas atuantes, 114.466 pessoas ocupadas (93.366 assalariadas) e salário médio mensal de 2,2 salários mínimos. O setor de saúde humana e serviços sociais respondia por 1.544 estabelecimentos e 15.002 postos de trabalho. O PIB municipal, a preços correntes, oscilou de R$ 58,4 bilhões em 2013 para R$ 23,9 bilhões em 2020 e R$ 43,0 bilhões em 2023, acompanhando a volatilidade da commodity petrolífera. Silva e Hasenclever (2019) demonstram que o ciclo do petróleo elevou arrecadação sem diversificação produtiva e Martins, Hasenclever e Miranda (2024) mostram que o financiamento da saúde municipal acompanhou essas flutuações entre 2009 e 2020.</w:t>
+        <w:t xml:space="preserve"> e participações especiais) (Silva e Hasenclever, 2019). O Cadastro Central de Empresas de 2024 registra 16.776 empresas atuantes, 114.466 pessoas ocupadas (93.366 assalariadas) e salário médio mensal de 2,2 salários mínimos. O setor de saúde humana e serviços sociais respondia por 1.544 estabelecimentos e 15.002 postos de trabalho. O PIB municipal, a preços correntes, oscilou de R$ 58,4 bilhões em 2013 para R$ 23,9 bilhões em 2020 e R$ 43,0 bilhões em 2023, acompanhando a volatilidade da commodity petrolífera. Silva e Hasenclever (2019) demonstram que o ciclo do petróleo elevou arrecadação sem diversificação produtiva e Martins, Hasenclever e Miranda (2024) mostram que o financiamento da saúde municipal acompanhou essas flutuações entre 2009 e 2020.</w:t>
       </w:r>
     </w:p>
     <w:p>
@@ -1523,7 +1523,7 @@
           <w:i w:val="0"/>
           <w:sz w:val="22"/>
         </w:rPr>
-        <w:t xml:space="preserve"> (R), registrou entre 4.199 e 5.635 óbitos anuais de residentes no período de 2019 a 2024, com taxa bruta de mortalidade variando de 8,1 a 10,9 por 1.000 habitantes (Tabela 3). Em 2021, auge da pandemia de covid-19, as doenças infecciosas e parasitárias deslocaram-se para a primeira posição (1.548 óbitos, 27,5% do total), ultrapassando as doenças do aparelho circulatório, que retomaram a liderança a partir de 2022. As causas externas mantiveram-se entre as cinco primeiras posições em todo o período. Esse deslocamento evidencia o impacto da pandemia sobre um território com IDHM de 0,716 e 37,7% da população em situação de pobreza em 2010. Nesse mercado de trabalho, os serviços de saúde, polo regional do Norte Fluminense, constituem espaço relevante de assalariamento, estratificado por hierarquias de renda e de prestígio entre profissões (LEMOS, 2012).</w:t>
+        <w:t xml:space="preserve"> (R), registrou entre 4.199 e 5.635 óbitos anuais de residentes no período de 2019 a 2024, com taxa bruta de mortalidade variando de 8,1 a 10,9 por 1.000 habitantes (Tabela 3). Em 2021, auge da pandemia de covid-19, as doenças infecciosas e parasitárias deslocaram-se para a primeira posição (1.548 óbitos, 27,5% do total), ultrapassando as doenças do aparelho circulatório, que retomaram a liderança a partir de 2022. As causas externas mantiveram-se entre as cinco primeiras posições em todo o período. Esse deslocamento evidencia o impacto da pandemia sobre um território com IDHM de 0,716 e 37,7% da população em situação de pobreza em 2010. Nesse mercado de trabalho, os serviços de saúde, polo regional do Norte Fluminense, constituem espaço relevante de assalariamento, estratificado por hierarquias de renda e de prestígio entre profissões (Lemos, 2012).</w:t>
       </w:r>
     </w:p>
     <w:p>
@@ -3213,7 +3213,7 @@
           <w:i w:val="0"/>
           <w:sz w:val="22"/>
         </w:rPr>
-        <w:t>A concentração dos registros na base técnica da enfermagem expressa a divisão social e técnica do trabalho em saúde. A execução manual e corporal do cuidado, que inclui punção venosa, administração de medicamentos, manipulação de perfurocortantes e mobilização de pacientes, é delegada a categorias majoritariamente femininas, de menor renda e prestígio, submetidas a intensificação e sobrecarga (CECILIO; LACAZ, 2012; ANTUNES, 2018). O setor saúde de Campos empregava 15.002 pessoas em 2024, com massa salarial anual de R$ 593,9 milhões e salário médio de 2,2 salários mínimos mensais, o que torna esse contingente economicamente relevante e, ao mesmo tempo, vulnerável à oscilação das finanças públicas. A quase invisibilidade da medicina (12 CATs em oito anos, ante 1.099 a 1.393 vínculos celetistas ativos de médicos na RAIS entre 2018 e 2025) não autoriza concluir menor exposição. Indica inserção predominante por vínculos estatutários, autônomos e de pessoa jurídica, não cobertos pela CAT, o que configura desigualdade de proteção e de reconhecimento institucional e reitera a estratificação de classe e prestígio entre as profissões (LEMOS, 2012). A coexistência de dois regimes previdenciários na administração municipal, com R$ 58,7 milhões em contribuições ao RPPS e R$ 18,3 milhões ao INSS em 2024, materializa essa dualidade de proteção. Agentes comunitários de saúde e de combate às endemias, majoritariamente estatutários, quase não aparecem na base (14 registros, nenhum agente de combate às endemias).</w:t>
+        <w:t>A concentração dos registros na base técnica da enfermagem expressa a divisão social e técnica do trabalho em saúde. A execução manual e corporal do cuidado, que inclui punção venosa, administração de medicamentos, manipulação de perfurocortantes e mobilização de pacientes, é delegada a categorias majoritariamente femininas, de menor renda e prestígio, submetidas a intensificação e sobrecarga (Cecilio e Lacaz, 2012; Antunes, 2018). O setor saúde de Campos empregava 15.002 pessoas em 2024, com massa salarial anual de R$ 593,9 milhões e salário médio de 2,2 salários mínimos mensais, o que torna esse contingente economicamente relevante e, ao mesmo tempo, vulnerável à oscilação das finanças públicas. A quase invisibilidade da medicina (12 CATs em oito anos, ante 1.099 a 1.393 vínculos celetistas ativos de médicos na RAIS entre 2018 e 2025) não autoriza concluir menor exposição. Indica inserção predominante por vínculos estatutários, autônomos e de pessoa jurídica, não cobertos pela CAT, o que configura desigualdade de proteção e de reconhecimento institucional e reitera a estratificação de classe e prestígio entre as profissões (Lemos, 2012). A coexistência de dois regimes previdenciários na administração municipal, com R$ 58,7 milhões em contribuições ao RPPS e R$ 18,3 milhões ao INSS em 2024, materializa essa dualidade de proteção. Agentes comunitários de saúde e de combate às endemias, majoritariamente estatutários, quase não aparecem na base (14 registros, nenhum agente de combate às endemias).</w:t>
       </w:r>
     </w:p>
     <w:p>
@@ -3228,7 +3228,7 @@
           <w:i w:val="0"/>
           <w:sz w:val="22"/>
         </w:rPr>
-        <w:t xml:space="preserve">A média mensal de registros passou de 13,8 (julho de 2018 a fevereiro de 2020) para 14,5 no período crítico da covid-19 (março de 2020 a dezembro de 2021) e recuou para 11,9 no biênio seguinte (2022-2023), convergente com a sobrecarga pandêmica descrita para os trabalhadores da saúde (VEDOVATO </w:t>
+        <w:t xml:space="preserve">A média mensal de registros passou de 13,8 (julho de 2018 a fevereiro de 2020) para 14,5 no período crítico da covid-19 (março de 2020 a dezembro de 2021) e recuou para 11,9 no biênio seguinte (2022-2023), convergente com a sobrecarga pandêmica descrita para os trabalhadores da saúde (Vedovato </w:t>
       </w:r>
       <w:r>
         <w:rPr>
@@ -3259,7 +3259,7 @@
           <w:i w:val="0"/>
           <w:sz w:val="22"/>
         </w:rPr>
-        <w:t xml:space="preserve">Para a Vigilância em Saúde do Trabalhador e para a gestão municipal, os resultados indicam prioridades verificáveis. A primeira é proteger a base técnica da enfermagem, núcleo do cuidado e dos registros, com ênfase em perfurocortantes e exposição biológica. A segunda é enfrentar a subnotificação de doenças relacionadas ao trabalho e a invisibilidade de estatutários, terceirizados e informais, articulando CAT, SINAN, RAIS, CNES e os registros do RPPS municipal, cujos dados de acidentes e adoecimentos de servidores estatutários não são consolidados em base nacional de acesso público. A terceira é qualificar o preenchimento dos registros, pois 3,6% não trazem código ocupacional válido, com concentração entre 2021 e 2023. A quarta é planejar a rede assistencial reconhecendo que seu financiamento oscila com as rendas petrolíferas (MARTINS; HASENCLEVER; MIRANDA, 2024) e que a proteção de quem cuida é condição de possibilidade do próprio cuidado. O IDHM de 0,716, a dependência de 71% das receitas de transferências e a convivência de dois regimes previdenciários com patamares desiguais de proteção reforçam a urgência de políticas que não estejam à mercê da volatilidade de uma única </w:t>
+        <w:t xml:space="preserve">Para a Vigilância em Saúde do Trabalhador e para a gestão municipal, os resultados indicam prioridades verificáveis. A primeira é proteger a base técnica da enfermagem, núcleo do cuidado e dos registros, com ênfase em perfurocortantes e exposição biológica. A segunda é enfrentar a subnotificação de doenças relacionadas ao trabalho e a invisibilidade de estatutários, terceirizados e informais, articulando CAT, SINAN, RAIS, CNES e os registros do RPPS municipal, cujos dados de acidentes e adoecimentos de servidores estatutários não são consolidados em base nacional de acesso público. A terceira é qualificar o preenchimento dos registros, pois 3,6% não trazem código ocupacional válido, com concentração entre 2021 e 2023. A quarta é planejar a rede assistencial reconhecendo que seu financiamento oscila com as rendas petrolíferas (Martins, Hasenclever e Miranda, 2024) e que a proteção de quem cuida é condição de possibilidade do próprio cuidado. O IDHM de 0,716, a dependência de 71% das receitas de transferências e a convivência de dois regimes previdenciários com patamares desiguais de proteção reforçam a urgência de políticas que não estejam à mercê da volatilidade de uma única </w:t>
       </w:r>
       <w:r>
         <w:rPr>

</xml_diff>

<commit_message>
Artigo expandido: ciclos economicos, duplo regime RPPS/INSS, sensibilidade (6 cenarios), 8p
</commit_message>
<xml_diff>
--- a/documentos/artigo.docx
+++ b/documentos/artigo.docx
@@ -30,6 +30,53 @@
           <w:sz w:val="22"/>
         </w:rPr>
         <w:t>O trabalho é um processo social, econômico e político historicamente determinado. Desde a Revolução Industrial, o modo de organizar a produção disciplina corpos e tempos e produz padrões específicos de adoecimento (Oliveira, 2004). No Brasil, o campo da Saúde do Trabalhador constituiu-se como crítica à medicina do trabalho e à saúde ocupacional, ao afirmar a determinação social do processo saúde-doença e o processo de trabalho como categoria explicativa central (Mendes e Dias, 1991). No setor saúde, o trabalho produtor do cuidado se realiza sob divisão social e técnica, relações desiguais de poder entre categorias e desgaste, em serviços submetidos à reorganização gerencial flexível. Parcela expressiva dos vínculos do Sistema Único de Saúde (SUS) é precária, estimada entre 30% e 50% (Cecilio e Lacaz, 2012).</w:t>
+      </w:r>
+    </w:p>
+    <w:p>
+      <w:pPr>
+        <w:spacing w:before="0" w:after="40"/>
+        <w:ind w:firstLine="709"/>
+        <w:jc w:val="both"/>
+      </w:pPr>
+      <w:r>
+        <w:rPr>
+          <w:b w:val="0"/>
+          <w:i w:val="0"/>
+          <w:sz w:val="22"/>
+        </w:rPr>
+        <w:t xml:space="preserve">A formação econômica de Campos dos Goytacazes estrutura-se em três grandes ciclos. O primeiro, açucareiro, remonta ao século XVIII e organizou o território sobre a grande propriedade monocultora e o trabalho escravizado. No século XIX, o município consolidou-se como o maior produtor nacional de açúcar, posição mantida até meados do século XX, quando o modelo entrou em prolongada decadência. O fechamento de usinas e a crise do setor sucroalcooleiro, a partir dos anos 1980, produziram desemprego em massa e reconfiguração da estrutura ocupacional. O segundo ciclo, petrolífero, iniciou-se com a descoberta da Bacia de Campos no final dos anos 1970 e consolidou-se nas décadas seguintes com a instalação da Petrobras e de empresas do setor </w:t>
+      </w:r>
+      <w:r>
+        <w:rPr>
+          <w:b w:val="0"/>
+          <w:i/>
+          <w:sz w:val="22"/>
+        </w:rPr>
+        <w:t>offshore</w:t>
+      </w:r>
+      <w:r>
+        <w:rPr>
+          <w:b w:val="0"/>
+          <w:i w:val="0"/>
+          <w:sz w:val="22"/>
+        </w:rPr>
+        <w:t>. A partir de 1998, com a Lei do Petróleo (Lei nº 9.478/1997), as rendas petrolíferas (</w:t>
+      </w:r>
+      <w:r>
+        <w:rPr>
+          <w:b w:val="0"/>
+          <w:i/>
+          <w:sz w:val="22"/>
+        </w:rPr>
+        <w:t>royalties</w:t>
+      </w:r>
+      <w:r>
+        <w:rPr>
+          <w:b w:val="0"/>
+          <w:i w:val="0"/>
+          <w:sz w:val="22"/>
+        </w:rPr>
+        <w:t xml:space="preserve"> e participações especiais) passaram a representar fração crescente das receitas municipais. O terceiro ciclo, em curso, caracteriza-se pela estagnação da atividade petrolífera, pelo declínio dos repasses a partir de 2014 e pela busca de alternativas econômicas, sem que a diversificação produtiva tenha se efetivado (Silva e Hasenclever, 2019).</w:t>
       </w:r>
     </w:p>
     <w:p>
@@ -222,7 +269,7 @@
                 <w:i w:val="0"/>
                 <w:sz w:val="16"/>
               </w:rPr>
-              <w:t>População estimada</w:t>
+              <w:t>Estimativa populacional</w:t>
             </w:r>
           </w:p>
         </w:tc>
@@ -594,7 +641,7 @@
                 <w:i w:val="0"/>
                 <w:sz w:val="16"/>
               </w:rPr>
-              <w:t>Salário médio mensal (formal)</w:t>
+              <w:t>Salário médio (formal)</w:t>
             </w:r>
           </w:p>
         </w:tc>
@@ -656,7 +703,7 @@
                 <w:i w:val="0"/>
                 <w:sz w:val="16"/>
               </w:rPr>
-              <w:t>Pop. com renda até ½ SM per capita</w:t>
+              <w:t>Renda até ½ SM per capita</w:t>
             </w:r>
           </w:p>
         </w:tc>
@@ -714,7 +761,7 @@
           <w:i w:val="0"/>
           <w:sz w:val="16"/>
         </w:rPr>
-        <w:t>Fonte dos dados brutos: IBGE, Censo Demográfico 2022, estimativas populacionais e IBGE Cidades (https://cidades.ibge.gov.br). SM = salário mínimo.</w:t>
+        <w:t>Fonte dos dados brutos: IBGE, Censo Demográfico 2022 e IBGE Cidades. SM = salário mínimo.</w:t>
       </w:r>
     </w:p>
     <w:p>
@@ -729,38 +776,7 @@
           <w:i w:val="0"/>
           <w:sz w:val="22"/>
         </w:rPr>
-        <w:t>A formação econômica do município assentou-se na agroindústria açucareira e, a partir das décadas de 1980 e 1990, na exploração de petróleo da Bacia de Campos e nas rendas petrolíferas (</w:t>
-      </w:r>
-      <w:r>
-        <w:rPr>
-          <w:b w:val="0"/>
-          <w:i/>
-          <w:sz w:val="22"/>
-        </w:rPr>
-        <w:t>royalties</w:t>
-      </w:r>
-      <w:r>
-        <w:rPr>
-          <w:b w:val="0"/>
-          <w:i w:val="0"/>
-          <w:sz w:val="22"/>
-        </w:rPr>
-        <w:t xml:space="preserve"> e participações especiais) (Silva e Hasenclever, 2019). O Cadastro Central de Empresas de 2024 registra 16.776 empresas atuantes, 114.466 pessoas ocupadas (93.366 assalariadas) e salário médio mensal de 2,2 salários mínimos. O setor de saúde humana e serviços sociais respondia por 1.544 estabelecimentos e 15.002 postos de trabalho. O PIB municipal, a preços correntes, oscilou de R$ 58,4 bilhões em 2013 para R$ 23,9 bilhões em 2020 e R$ 43,0 bilhões em 2023, acompanhando a volatilidade da commodity petrolífera. Silva e Hasenclever (2019) demonstram que o ciclo do petróleo elevou arrecadação sem diversificação produtiva e Martins, Hasenclever e Miranda (2024) mostram que o financiamento da saúde municipal acompanhou essas flutuações entre 2009 e 2020.</w:t>
-      </w:r>
-    </w:p>
-    <w:p>
-      <w:pPr>
-        <w:spacing w:before="0" w:after="40"/>
-        <w:ind w:firstLine="709"/>
-        <w:jc w:val="both"/>
-      </w:pPr>
-      <w:r>
-        <w:rPr>
-          <w:b w:val="0"/>
-          <w:i w:val="0"/>
-          <w:sz w:val="22"/>
-        </w:rPr>
-        <w:t>As finanças públicas municipais evidenciam dependência estrutural de transferências intergovernamentais. Em 2024, as receitas brutas somaram R$ 2,95 bilhões, dos quais 71,0% provieram de transferências correntes, enquanto as despesas empenhadas atingiram R$ 3,31 bilhões. As despesas por natureza econômica, obtidas do Portal da Transparência da Prefeitura de Campos para o período de 2020 a 2024, revelam a coexistência de dois regimes previdenciários no funcionalismo municipal. As contribuições patronais ao Regime Próprio de Previdência Social (RPPS) dos servidores estatutários somaram R$ 58,7 milhões em 2024, acrescidas de R$ 2,5 milhões de aporte para cobertura do déficit atuarial. As contribuições ao Regime Geral de Previdência Social (INSS) dos trabalhadores celetistas totalizaram R$ 18,3 milhões no mesmo exercício. A existência de um regime próprio é relevante para a análise dos acidentes de trabalho porque a CAT cobre apenas os segurados do INSS, deixando os servidores estatutários sob a égide do RPPS, cujos registros de acidentes e adoecimentos não são consolidados em base nacional de acesso público (Tabela 2).</w:t>
+        <w:t>A estrutura empresarial do município, captada pelo Cadastro Central de Empresas de 2024, registra 16.776 empresas atuantes, 114.466 pessoas ocupadas (93.366 assalariadas) e salário médio mensal de 2,2 salários mínimos. O setor de saúde humana e serviços sociais respondia por 1.544 estabelecimentos e 15.002 postos de trabalho. O PIB municipal, a preços correntes, oscilou de R$ 58,4 bilhões em 2013 para R$ 23,9 bilhões em 2020 e R$ 43,0 bilhões em 2023, acompanhando a volatilidade do petróleo. Silva e Hasenclever (2019) demonstram que o ciclo petrolífero elevou arrecadação sem diversificação produtiva e Martins, Hasenclever e Miranda (2024) mostram que o financiamento da saúde municipal acompanhou essas flutuações entre 2009 e 2020. A trajetória dos três ciclos econômicos - açúcar, petróleo e estagnação - produziu um mercado de trabalho segmentado, com a administração pública municipal como um dos principais empregadores, o que é relevante para a análise dos regimes previdenciários que coexistem no município (Tabela 2).</w:t>
       </w:r>
     </w:p>
     <w:p>
@@ -783,7 +799,401 @@
           <w:i w:val="0"/>
           <w:sz w:val="19"/>
         </w:rPr>
-        <w:t xml:space="preserve"> Campos dos Goytacazes (RJ): estrutura empresarial, finanças públicas e regimes previdenciários</w:t>
+        <w:t xml:space="preserve"> Campos dos Goytacazes (RJ): ciclos de formação econômica</w:t>
+      </w:r>
+    </w:p>
+    <w:tbl>
+      <w:tblPr>
+        <w:tblStyle w:val="TableGrid"/>
+        <w:tblW w:type="auto" w:w="0"/>
+        <w:tblLook w:firstColumn="1" w:firstRow="1" w:lastColumn="0" w:lastRow="0" w:noHBand="0" w:noVBand="1" w:val="04A0"/>
+      </w:tblPr>
+      <w:tblGrid>
+        <w:gridCol w:w="2268"/>
+        <w:gridCol w:w="2268"/>
+        <w:gridCol w:w="2268"/>
+        <w:gridCol w:w="2268"/>
+      </w:tblGrid>
+      <w:tr>
+        <w:tc>
+          <w:tcPr>
+            <w:tcW w:type="dxa" w:w="2268"/>
+          </w:tcPr>
+          <w:p>
+            <w:r>
+              <w:rPr>
+                <w:b/>
+              </w:rPr>
+            </w:r>
+            <w:r>
+              <w:rPr>
+                <w:b/>
+                <w:i w:val="0"/>
+                <w:sz w:val="16"/>
+              </w:rPr>
+              <w:t>Ciclo</w:t>
+            </w:r>
+          </w:p>
+        </w:tc>
+        <w:tc>
+          <w:tcPr>
+            <w:tcW w:type="dxa" w:w="2268"/>
+          </w:tcPr>
+          <w:p>
+            <w:r>
+              <w:rPr>
+                <w:b/>
+              </w:rPr>
+            </w:r>
+            <w:r>
+              <w:rPr>
+                <w:b/>
+                <w:i w:val="0"/>
+                <w:sz w:val="16"/>
+              </w:rPr>
+              <w:t>Período</w:t>
+            </w:r>
+          </w:p>
+        </w:tc>
+        <w:tc>
+          <w:tcPr>
+            <w:tcW w:type="dxa" w:w="2268"/>
+          </w:tcPr>
+          <w:p>
+            <w:r>
+              <w:rPr>
+                <w:b/>
+              </w:rPr>
+            </w:r>
+            <w:r>
+              <w:rPr>
+                <w:b/>
+                <w:i w:val="0"/>
+                <w:sz w:val="16"/>
+              </w:rPr>
+              <w:t>Característica</w:t>
+            </w:r>
+          </w:p>
+        </w:tc>
+        <w:tc>
+          <w:tcPr>
+            <w:tcW w:type="dxa" w:w="2268"/>
+          </w:tcPr>
+          <w:p>
+            <w:r>
+              <w:rPr>
+                <w:b/>
+              </w:rPr>
+            </w:r>
+            <w:r>
+              <w:rPr>
+                <w:b/>
+                <w:i w:val="0"/>
+                <w:sz w:val="16"/>
+              </w:rPr>
+              <w:t>Impacto no mercado de trabalho</w:t>
+            </w:r>
+          </w:p>
+        </w:tc>
+      </w:tr>
+      <w:tr>
+        <w:tc>
+          <w:tcPr>
+            <w:tcW w:type="dxa" w:w="2268"/>
+          </w:tcPr>
+          <w:p>
+            <w:r>
+              <w:rPr>
+                <w:b w:val="0"/>
+              </w:rPr>
+            </w:r>
+            <w:r>
+              <w:rPr>
+                <w:b w:val="0"/>
+                <w:i w:val="0"/>
+                <w:sz w:val="16"/>
+              </w:rPr>
+              <w:t>Açucareiro</w:t>
+            </w:r>
+          </w:p>
+        </w:tc>
+        <w:tc>
+          <w:tcPr>
+            <w:tcW w:type="dxa" w:w="2268"/>
+          </w:tcPr>
+          <w:p>
+            <w:r>
+              <w:rPr>
+                <w:b w:val="0"/>
+              </w:rPr>
+            </w:r>
+            <w:r>
+              <w:rPr>
+                <w:b w:val="0"/>
+                <w:i w:val="0"/>
+                <w:sz w:val="16"/>
+              </w:rPr>
+              <w:t>Séc. XVIII a XX</w:t>
+            </w:r>
+          </w:p>
+        </w:tc>
+        <w:tc>
+          <w:tcPr>
+            <w:tcW w:type="dxa" w:w="2268"/>
+          </w:tcPr>
+          <w:p>
+            <w:r>
+              <w:rPr>
+                <w:b w:val="0"/>
+              </w:rPr>
+            </w:r>
+            <w:r>
+              <w:rPr>
+                <w:b w:val="0"/>
+                <w:i w:val="0"/>
+                <w:sz w:val="16"/>
+              </w:rPr>
+              <w:t>Monocultura, grande propriedade</w:t>
+            </w:r>
+          </w:p>
+        </w:tc>
+        <w:tc>
+          <w:tcPr>
+            <w:tcW w:type="dxa" w:w="2268"/>
+          </w:tcPr>
+          <w:p>
+            <w:r>
+              <w:rPr>
+                <w:b w:val="0"/>
+              </w:rPr>
+            </w:r>
+            <w:r>
+              <w:rPr>
+                <w:b w:val="0"/>
+                <w:i w:val="0"/>
+                <w:sz w:val="16"/>
+              </w:rPr>
+              <w:t>Trabalho escravizado, depois assalariado rural</w:t>
+            </w:r>
+          </w:p>
+        </w:tc>
+      </w:tr>
+      <w:tr>
+        <w:tc>
+          <w:tcPr>
+            <w:tcW w:type="dxa" w:w="2268"/>
+          </w:tcPr>
+          <w:p>
+            <w:r>
+              <w:rPr>
+                <w:b w:val="0"/>
+              </w:rPr>
+            </w:r>
+            <w:r>
+              <w:rPr>
+                <w:b w:val="0"/>
+                <w:i w:val="0"/>
+                <w:sz w:val="16"/>
+              </w:rPr>
+              <w:t>Petrolífero</w:t>
+            </w:r>
+          </w:p>
+        </w:tc>
+        <w:tc>
+          <w:tcPr>
+            <w:tcW w:type="dxa" w:w="2268"/>
+          </w:tcPr>
+          <w:p>
+            <w:r>
+              <w:rPr>
+                <w:b w:val="0"/>
+              </w:rPr>
+            </w:r>
+            <w:r>
+              <w:rPr>
+                <w:b w:val="0"/>
+                <w:i w:val="0"/>
+                <w:sz w:val="16"/>
+              </w:rPr>
+              <w:t>1970 a 2014</w:t>
+            </w:r>
+          </w:p>
+        </w:tc>
+        <w:tc>
+          <w:tcPr>
+            <w:tcW w:type="dxa" w:w="2268"/>
+          </w:tcPr>
+          <w:p>
+            <w:r>
+              <w:rPr>
+                <w:b w:val="0"/>
+              </w:rPr>
+            </w:r>
+            <w:r>
+              <w:rPr>
+                <w:b w:val="0"/>
+                <w:i w:val="0"/>
+                <w:sz w:val="16"/>
+              </w:rPr>
+              <w:t>Extrativismo, royalties</w:t>
+            </w:r>
+          </w:p>
+        </w:tc>
+        <w:tc>
+          <w:tcPr>
+            <w:tcW w:type="dxa" w:w="2268"/>
+          </w:tcPr>
+          <w:p>
+            <w:r>
+              <w:rPr>
+                <w:b w:val="0"/>
+              </w:rPr>
+            </w:r>
+            <w:r>
+              <w:rPr>
+                <w:b w:val="0"/>
+                <w:i w:val="0"/>
+                <w:sz w:val="16"/>
+              </w:rPr>
+              <w:t>Expansão do setor público empregador</w:t>
+            </w:r>
+          </w:p>
+        </w:tc>
+      </w:tr>
+      <w:tr>
+        <w:tc>
+          <w:tcPr>
+            <w:tcW w:type="dxa" w:w="2268"/>
+          </w:tcPr>
+          <w:p>
+            <w:r>
+              <w:rPr>
+                <w:b w:val="0"/>
+              </w:rPr>
+            </w:r>
+            <w:r>
+              <w:rPr>
+                <w:b w:val="0"/>
+                <w:i w:val="0"/>
+                <w:sz w:val="16"/>
+              </w:rPr>
+              <w:t>Estagnação</w:t>
+            </w:r>
+          </w:p>
+        </w:tc>
+        <w:tc>
+          <w:tcPr>
+            <w:tcW w:type="dxa" w:w="2268"/>
+          </w:tcPr>
+          <w:p>
+            <w:r>
+              <w:rPr>
+                <w:b w:val="0"/>
+              </w:rPr>
+            </w:r>
+            <w:r>
+              <w:rPr>
+                <w:b w:val="0"/>
+                <w:i w:val="0"/>
+                <w:sz w:val="16"/>
+              </w:rPr>
+              <w:t>2014 em diante</w:t>
+            </w:r>
+          </w:p>
+        </w:tc>
+        <w:tc>
+          <w:tcPr>
+            <w:tcW w:type="dxa" w:w="2268"/>
+          </w:tcPr>
+          <w:p>
+            <w:r>
+              <w:rPr>
+                <w:b w:val="0"/>
+              </w:rPr>
+            </w:r>
+            <w:r>
+              <w:rPr>
+                <w:b w:val="0"/>
+                <w:i w:val="0"/>
+                <w:sz w:val="16"/>
+              </w:rPr>
+              <w:t>Declínio dos repasses</w:t>
+            </w:r>
+          </w:p>
+        </w:tc>
+        <w:tc>
+          <w:tcPr>
+            <w:tcW w:type="dxa" w:w="2268"/>
+          </w:tcPr>
+          <w:p>
+            <w:r>
+              <w:rPr>
+                <w:b w:val="0"/>
+              </w:rPr>
+            </w:r>
+            <w:r>
+              <w:rPr>
+                <w:b w:val="0"/>
+                <w:i w:val="0"/>
+                <w:sz w:val="16"/>
+              </w:rPr>
+              <w:t>Desemprego, informalidade, pressão sobre o SUS</w:t>
+            </w:r>
+          </w:p>
+        </w:tc>
+      </w:tr>
+    </w:tbl>
+    <w:p>
+      <w:pPr>
+        <w:spacing w:before="0" w:after="80"/>
+        <w:ind w:firstLine="0"/>
+        <w:jc w:val="both"/>
+      </w:pPr>
+      <w:r>
+        <w:rPr>
+          <w:b w:val="0"/>
+          <w:i w:val="0"/>
+          <w:sz w:val="16"/>
+        </w:rPr>
+        <w:t>Fonte: elaborada pelo autor a partir de Silva e Hasenclever (2019), IBGE e literatura.</w:t>
+      </w:r>
+    </w:p>
+    <w:p>
+      <w:pPr>
+        <w:spacing w:before="0" w:after="40"/>
+        <w:ind w:firstLine="709"/>
+        <w:jc w:val="both"/>
+      </w:pPr>
+      <w:r>
+        <w:rPr>
+          <w:b w:val="0"/>
+          <w:i w:val="0"/>
+          <w:sz w:val="22"/>
+        </w:rPr>
+        <w:t>As finanças públicas municipais evidenciam dependência estrutural de transferências intergovernamentais. Em 2024, as receitas brutas somaram R$ 2,95 bilhões, das quais 71,0% provieram de transferências correntes, enquanto as despesas empenhadas atingiram R$ 3,31 bilhões, resultando em déficit orçamentário de R$ 356 milhões. As despesas por natureza econômica, obtidas do Portal da Transparência da Prefeitura de Campos para o período de 2020 a 2024, revelam a coexistência de dois regimes previdenciários no funcionalismo municipal, com implicações diretas para a notificação de acidentes e adoecimentos. O Regime Próprio de Previdência Social (RPPS) cobre os servidores estatutários. As contribuições patronais ao RPPS somaram R$ 58,7 milhões em 2024, acrescidas de R$ 2,5 milhões de aporte para cobertura do déficit atuarial. O Regime Geral de Previdência Social (INSS) cobre os trabalhadores celetistas, com contribuições patronais de R$ 18,3 milhões no mesmo exercício. A razão entre as contribuições (RPPS/INSS = 3,3) indica a predominância do vínculo estatutário no orçamento de pessoal. Como a CAT é instrumento exclusivo do INSS, os acidentes e adoecimentos dos servidores estatutários, vinculados ao RPPS, não são capturados por essa fonte. Os registros de afastamentos de estatutários são geridos pelo instituto de previdência municipal (PREVICAMPOS) e não estão disponíveis em base consolidada de acesso público. Essa dualidade de regimes produz uma assimetria fundamental de visibilidade previdenciária. O que se conhece sobre acidentes de trabalho na saúde municipal de Campos refere-se majoritariamente aos celetistas, enquanto os estatutários permanecem institucionalmente invisíveis para o sistema nacional de registros (Tabela 3).</w:t>
+      </w:r>
+    </w:p>
+    <w:p>
+      <w:pPr>
+        <w:spacing w:before="80" w:after="40"/>
+        <w:ind w:firstLine="0"/>
+        <w:jc w:val="both"/>
+      </w:pPr>
+      <w:r>
+        <w:rPr>
+          <w:b/>
+          <w:i w:val="0"/>
+          <w:sz w:val="19"/>
+        </w:rPr>
+        <w:t>Tabela 3.</w:t>
+      </w:r>
+      <w:r>
+        <w:rPr>
+          <w:b w:val="0"/>
+          <w:i w:val="0"/>
+          <w:sz w:val="19"/>
+        </w:rPr>
+        <w:t xml:space="preserve"> Campos dos Goytacazes (RJ): estrutura empresarial, finanças e regimes previdenciários</w:t>
       </w:r>
     </w:p>
     <w:tbl>
@@ -938,7 +1348,7 @@
                 <w:i w:val="0"/>
                 <w:sz w:val="16"/>
               </w:rPr>
-              <w:t>Pessoal ocupado total (assalariado)</w:t>
+              <w:t>Pessoal ocupado (assalariado)</w:t>
             </w:r>
           </w:p>
         </w:tc>
@@ -1000,7 +1410,7 @@
                 <w:i w:val="0"/>
                 <w:sz w:val="16"/>
               </w:rPr>
-              <w:t>Saúde: unidades / pessoal ocupado</w:t>
+              <w:t>Saúde: estab. / pessoal</w:t>
             </w:r>
           </w:p>
         </w:tc>
@@ -1124,7 +1534,7 @@
                 <w:i w:val="0"/>
                 <w:sz w:val="16"/>
               </w:rPr>
-              <w:t>Transferências correntes (% das receitas)</w:t>
+              <w:t>Transferências correntes</w:t>
             </w:r>
           </w:p>
         </w:tc>
@@ -1144,7 +1554,7 @@
                 <w:i w:val="0"/>
                 <w:sz w:val="16"/>
               </w:rPr>
-              <w:t>71,0%</w:t>
+              <w:t>71,0% das receitas</w:t>
             </w:r>
           </w:p>
         </w:tc>
@@ -1393,68 +1803,6 @@
                 <w:sz w:val="16"/>
               </w:rPr>
               <w:t>R$ 2,5 milhões</w:t>
-            </w:r>
-          </w:p>
-        </w:tc>
-        <w:tc>
-          <w:tcPr>
-            <w:tcW w:type="dxa" w:w="3024"/>
-          </w:tcPr>
-          <w:p>
-            <w:r>
-              <w:rPr>
-                <w:b w:val="0"/>
-              </w:rPr>
-            </w:r>
-            <w:r>
-              <w:rPr>
-                <w:b w:val="0"/>
-                <w:i w:val="0"/>
-                <w:sz w:val="16"/>
-              </w:rPr>
-              <w:t>2024</w:t>
-            </w:r>
-          </w:p>
-        </w:tc>
-      </w:tr>
-      <w:tr>
-        <w:tc>
-          <w:tcPr>
-            <w:tcW w:type="dxa" w:w="3024"/>
-          </w:tcPr>
-          <w:p>
-            <w:r>
-              <w:rPr>
-                <w:b w:val="0"/>
-              </w:rPr>
-            </w:r>
-            <w:r>
-              <w:rPr>
-                <w:b w:val="0"/>
-                <w:i w:val="0"/>
-                <w:sz w:val="16"/>
-              </w:rPr>
-              <w:t>Déficit orçamentário</w:t>
-            </w:r>
-          </w:p>
-        </w:tc>
-        <w:tc>
-          <w:tcPr>
-            <w:tcW w:type="dxa" w:w="3024"/>
-          </w:tcPr>
-          <w:p>
-            <w:r>
-              <w:rPr>
-                <w:b w:val="0"/>
-              </w:rPr>
-            </w:r>
-            <w:r>
-              <w:rPr>
-                <w:b w:val="0"/>
-                <w:i w:val="0"/>
-                <w:sz w:val="16"/>
-              </w:rPr>
-              <w:t>R$ 356 milhões</w:t>
             </w:r>
           </w:p>
         </w:tc>
@@ -1492,7 +1840,7 @@
           <w:i w:val="0"/>
           <w:sz w:val="16"/>
         </w:rPr>
-        <w:t>Fontes dos dados brutos: IBGE, Cadastro Central de Empresas 2024; Siconfi/STN, Finanças Públicas 2024; Portal da Transparência da Prefeitura de Campos, despesas por natureza econômica, 2020-2024. RPPS = Regime Próprio de Previdência Social.</w:t>
+        <w:t>Fontes dos dados brutos: IBGE, CEMPRE 2024; Siconfi/STN; Portal da Transparência de Campos, despesas por natureza econômica, 2020-2024.</w:t>
       </w:r>
     </w:p>
     <w:p>
@@ -1523,7 +1871,7 @@
           <w:i w:val="0"/>
           <w:sz w:val="22"/>
         </w:rPr>
-        <w:t xml:space="preserve"> (R), registrou entre 4.199 e 5.635 óbitos anuais de residentes no período de 2019 a 2024, com taxa bruta de mortalidade variando de 8,1 a 10,9 por 1.000 habitantes (Tabela 3). Em 2021, auge da pandemia de covid-19, as doenças infecciosas e parasitárias deslocaram-se para a primeira posição (1.548 óbitos, 27,5% do total), ultrapassando as doenças do aparelho circulatório, que retomaram a liderança a partir de 2022. As causas externas mantiveram-se entre as cinco primeiras posições em todo o período. Esse deslocamento evidencia o impacto da pandemia sobre um território com IDHM de 0,716 e 37,7% da população em situação de pobreza em 2010. Nesse mercado de trabalho, os serviços de saúde, polo regional do Norte Fluminense, constituem espaço relevante de assalariamento, estratificado por hierarquias de renda e de prestígio entre profissões (Lemos, 2012).</w:t>
+        <w:t xml:space="preserve"> (R), registrou entre 4.199 e 5.635 óbitos anuais de residentes no período de 2019 a 2024, com taxa bruta de mortalidade variando de 8,1 a 10,9 por 1.000 habitantes (Tabela 4). Em 2021, auge da pandemia de covid-19, as doenças infecciosas e parasitárias deslocaram-se para a primeira posição (1.548 óbitos, 27,5% do total), ultrapassando as doenças do aparelho circulatório, que retomaram a liderança a partir de 2022. As causas externas mantiveram-se entre as cinco primeiras posições em todo o período. Esse deslocamento evidencia o impacto da pandemia sobre um território com IDHM de 0,716 e 37,7% da população em situação de pobreza em 2010. Nesse mercado de trabalho estratificado, os serviços de saúde, polo regional do Norte Fluminense, constituem espaço relevante de assalariamento, segmentado por hierarquias de renda e de prestígio entre profissões (Lemos, 2012).</w:t>
       </w:r>
     </w:p>
     <w:p>
@@ -1538,7 +1886,7 @@
           <w:i w:val="0"/>
           <w:sz w:val="19"/>
         </w:rPr>
-        <w:t>Tabela 3.</w:t>
+        <w:t>Tabela 4.</w:t>
       </w:r>
       <w:r>
         <w:rPr>
@@ -2289,7 +2637,7 @@
           <w:i w:val="0"/>
           <w:sz w:val="16"/>
         </w:rPr>
-        <w:t>Fonte dos dados brutos: SIM/DATASUS, processados com o pacote microdatasus (R). Denominadores populacionais do IBGE (estimativas e Censo 2022).</w:t>
+        <w:t>Fonte dos dados brutos: SIM/DATASUS, processados com microdatasus (R). Denominadores populacionais do IBGE.</w:t>
       </w:r>
     </w:p>
     <w:p>
@@ -2320,7 +2668,7 @@
           <w:i w:val="0"/>
           <w:sz w:val="22"/>
         </w:rPr>
-        <w:t xml:space="preserve"> reprodutível e auditado (scripts, logs e testes automatizados acompanham o repositório). A base empírica foi reconstruída dos dados abertos da CAT do INSS, disponíveis no Portal de Dados Abertos do governo federal. Foram processados 58 arquivos, competências de julho de 2018 a outubro de 2025, totalizando 3.902.905 registros. A importação foi feita por posição de coluna, dados os quatro esquemas estruturais distintos e cabeçalhos duplicados de CBO, CID-10, CNAE e data do acidente. A codificação de caracteres foi detectada arquivo a arquivo e o mês de referência administrativo foi rigorosamente distinguido da data completa do acidente. O recorte municipal exigiu código do empregador igual a 330100 e unidade federativa igual a Rio de Janeiro. Municípios homônimos foram excluídos, assim como 12 registros com UF divergente. Foram removidos 938 registros duplicados (401 </w:t>
+        <w:t xml:space="preserve"> reprodutível e auditado (scripts, logs e testes acompanham o repositório). A base empírica foi reconstruída dos dados abertos da CAT do INSS, disponíveis no Portal de Dados Abertos do governo federal. Foram processados 58 arquivos, competências de julho de 2018 a outubro de 2025, totalizando 3.902.905 registros. A importação foi feita por posição de coluna, dados os quatro esquemas estruturais distintos e cabeçalhos duplicados de CBO, CID-10, CNAE e data do acidente. O recorte municipal exigiu código do empregador igual a 330100 e unidade federativa igual a Rio de Janeiro. Foram removidos 938 registros duplicados (401 </w:t>
       </w:r>
       <w:r>
         <w:rPr>
@@ -2336,7 +2684,23 @@
           <w:i w:val="0"/>
           <w:sz w:val="22"/>
         </w:rPr>
-        <w:t xml:space="preserve"> SHA-256 distintos) entre arquivos de cobertura sobreposta. A classificação ocupacional utilizou a CBO 2002, com dicionário auditado de 458 códigos observados em Campos. Registros sem código válido (184, 3,6%) foram mantidos em categoria própria. Os denominadores de força de trabalho foram extraídos da RAIS, disponível no FTP do Ministério do Trabalho e Emprego, processados com detecção automática de delimitador. Como a RAIS captura apenas vínculos celetistas ativos em 31 de dezembro de cada ano, seus denominadores são comensuráveis com o numerador da CAT, que também cobre majoritariamente celetistas. Denominadores complementares do CNES-PF foram obtidos com o pacote microdatasus (R) e sustentam razões exploratórias de densidade de comunicação. Todos os totais foram reproduzidos por rotina independente, com convergência integral. Células com menos de cinco registros foram agregadas.</w:t>
+        <w:t xml:space="preserve"> SHA-256 distintos) entre arquivos de cobertura sobreposta. A classificação ocupacional utilizou a CBO 2002, com dicionário auditado de 458 códigos observados em Campos. Os denominadores de força de trabalho foram extraídos da RAIS, disponível no FTP do Ministério do Trabalho e Emprego. Como a RAIS captura apenas vínculos celetistas ativos em 31 de dezembro, seus denominadores são comensuráveis com o numerador da CAT. Denominadores complementares do CNES-PF foram obtidos com o pacote </w:t>
+      </w:r>
+      <w:r>
+        <w:rPr>
+          <w:b w:val="0"/>
+          <w:i/>
+          <w:sz w:val="22"/>
+        </w:rPr>
+        <w:t>microdatasus</w:t>
+      </w:r>
+      <w:r>
+        <w:rPr>
+          <w:b w:val="0"/>
+          <w:i w:val="0"/>
+          <w:sz w:val="22"/>
+        </w:rPr>
+        <w:t xml:space="preserve"> (R) e sustentam razões exploratórias de densidade de comunicação. Células com menos de cinco registros foram agregadas.</w:t>
       </w:r>
     </w:p>
     <w:p>
@@ -2351,7 +2715,7 @@
           <w:i w:val="0"/>
           <w:sz w:val="22"/>
         </w:rPr>
-        <w:t>Das 5.066 CATs vinculadas a empregadores de Campos dos Goytacazes entre 2018 e 2025, 1.144 (22,6%) correspondem às profissões da saúde, 26 às profissões multiprofissionais, 184 (3,6%) a registros sem CBO válido e 3.712 às demais ocupações, das quais 427 estavam empregadas em estabelecimentos de saúde. A distribuição interna é fortemente assimétrica (Tabela 4). A enfermagem concentra 84,4% dos registros, sendo 70,2% de técnicos e auxiliares e 14,2% de enfermeiros. Seguem-se os técnicos e auxiliares de diagnóstico e laboratório (6,8%) e a fisioterapia (2,6%). A medicina responde por 1,0%. Predominam mulheres (85,7%), com idade mediana de 36 anos. Os acidentes típicos somam 81,9% e os de trajeto, 17,1%. Os ferimentos de punho e mãos lideram os diagnósticos (CID-10 S61, 25,1%; o dedo é a parte atingida em 43,9% dos registros), seguidos do contato ou exposição a doenças transmissíveis (Z20, 21,9%). Agentes infecciosos e produtos biológicos respondem por 26,9% dos agentes causadores. Quase todos os empregadores pertencem às divisões 86 e 87 da CNAE (95,4%), com dominância hospitalar (classe 8610, 76,8%). O empregador emitiu 97,0% das CATs, com mediana de um dia entre o acidente e a emissão. Houve um óbito registrado. Comunicações de doença relacionada ao trabalho somaram apenas 1,0%, mesmo com a pandemia dentro do período (Figuras 1 e 2).</w:t>
+        <w:t>Das 5.066 CATs vinculadas a empregadores de Campos dos Goytacazes entre 2018 e 2025, 1.144 (22,6%) correspondem às profissões da saúde, 26 às multiprofissionais, 184 (3,6%) a registros sem CBO válido e 3.712 às demais ocupações (427 em estabelecimentos de saúde). A distribuição é fortemente assimétrica (Tabela 5). A enfermagem concentra 84,4% dos registros, sendo 70,2% de técnicos e auxiliares e 14,2% de enfermeiros. Seguem-se os técnicos de diagnóstico e laboratório (6,8%) e a fisioterapia (2,6%). A medicina responde por 1,0%. Predominam mulheres (85,7%), com idade mediana de 36 anos. Os acidentes típicos somam 81,9% e os de trajeto, 17,1%. Ferimentos de punho e mãos lideram os diagnósticos (CID-10 S61, 25,1%; o dedo é a parte atingida em 43,9%), seguidos da exposição a doenças transmissíveis (Z20, 21,9%). Agentes infecciosos respondem por 26,9% dos causadores. Quase todos os empregadores pertencem à CNAE 86-87 (95,4%), com dominância hospitalar (8610, 76,8%). O empregador emitiu 97,0% das CATs, com mediana de um dia. Houve um óbito e 1,0% de doenças relacionadas ao trabalho (Figuras 1 e 2).</w:t>
       </w:r>
     </w:p>
     <w:p>
@@ -2366,7 +2730,7 @@
           <w:i w:val="0"/>
           <w:sz w:val="19"/>
         </w:rPr>
-        <w:t>Tabela 4.</w:t>
+        <w:t>Tabela 5.</w:t>
       </w:r>
       <w:r>
         <w:rPr>
@@ -2374,7 +2738,7 @@
           <w:i w:val="0"/>
           <w:sz w:val="19"/>
         </w:rPr>
-        <w:t xml:space="preserve"> Características das CATs das profissões da saúde, empregadores de Campos dos Goytacazes (RJ), 2018-2025 (n = 1.144)</w:t>
+        <w:t xml:space="preserve"> Características das CATs das profissões da saúde, Campos dos Goytacazes (RJ), 2018-2025 (n = 1.144)</w:t>
       </w:r>
     </w:p>
     <w:tbl>
@@ -2446,7 +2810,7 @@
                 <w:i w:val="0"/>
                 <w:sz w:val="16"/>
               </w:rPr>
-              <w:t>Técnicos e auxiliares de enfermagem</w:t>
+              <w:t>Enfermagem - técnicos e auxiliares</w:t>
             </w:r>
           </w:p>
         </w:tc>
@@ -2488,7 +2852,7 @@
                 <w:i w:val="0"/>
                 <w:sz w:val="16"/>
               </w:rPr>
-              <w:t>Enfermeiros</w:t>
+              <w:t>Enfermagem - enfermeiros</w:t>
             </w:r>
           </w:p>
         </w:tc>
@@ -2530,7 +2894,7 @@
                 <w:i w:val="0"/>
                 <w:sz w:val="16"/>
               </w:rPr>
-              <w:t>Téc. e aux. de diagnóstico e laboratório</w:t>
+              <w:t>Diagnóstico/lab. - técnicos</w:t>
             </w:r>
           </w:p>
         </w:tc>
@@ -2614,7 +2978,7 @@
                 <w:i w:val="0"/>
                 <w:sz w:val="16"/>
               </w:rPr>
-              <w:t>Técnicos e auxiliares de farmácia</w:t>
+              <w:t>Farmácia - técnicos</w:t>
             </w:r>
           </w:p>
         </w:tc>
@@ -2656,7 +3020,7 @@
                 <w:i w:val="0"/>
                 <w:sz w:val="16"/>
               </w:rPr>
-              <w:t>Agentes comunitários de saúde e afins</w:t>
+              <w:t>ACS e afins</w:t>
             </w:r>
           </w:p>
         </w:tc>
@@ -2740,7 +3104,7 @@
                 <w:i w:val="0"/>
                 <w:sz w:val="16"/>
               </w:rPr>
-              <w:t>Demais categorias (n&lt;5 agregados)</w:t>
+              <w:t>Demais (n&lt;5 agregados)</w:t>
             </w:r>
           </w:p>
         </w:tc>
@@ -2824,7 +3188,7 @@
                 <w:i w:val="0"/>
                 <w:sz w:val="16"/>
               </w:rPr>
-              <w:t>Acidente típico / trajeto / doença</w:t>
+              <w:t>Típico / trajeto / doença</w:t>
             </w:r>
           </w:p>
         </w:tc>
@@ -2866,7 +3230,7 @@
                 <w:i w:val="0"/>
                 <w:sz w:val="16"/>
               </w:rPr>
-              <w:t>Parte atingida: dedo</w:t>
+              <w:t>Dedo</w:t>
             </w:r>
           </w:p>
         </w:tc>
@@ -2908,7 +3272,7 @@
                 <w:i w:val="0"/>
                 <w:sz w:val="16"/>
               </w:rPr>
-              <w:t>Agente biológico ou infeccioso</w:t>
+              <w:t>Agente biológico</w:t>
             </w:r>
           </w:p>
         </w:tc>
@@ -2992,7 +3356,7 @@
                 <w:i w:val="0"/>
                 <w:sz w:val="16"/>
               </w:rPr>
-              <w:t>Empregador CNAE 86-87 (hospitalar 8610)</w:t>
+              <w:t>CNAE 86-87 / 8610</w:t>
             </w:r>
           </w:p>
         </w:tc>
@@ -3034,7 +3398,7 @@
                 <w:i w:val="0"/>
                 <w:sz w:val="16"/>
               </w:rPr>
-              <w:t>CAT emitida pelo empregador</w:t>
+              <w:t>CAT pelo empregador</w:t>
             </w:r>
           </w:p>
         </w:tc>
@@ -3072,7 +3436,7 @@
           <w:i w:val="0"/>
           <w:sz w:val="16"/>
         </w:rPr>
-        <w:t>Fonte dos dados brutos: INSS, Comunicações de Acidente de Trabalho (CAT), disponíveis no Portal de Dados Abertos do governo federal. Idade mediana de 36 anos. Sexo ignorado em 4 registros. Um óbito. Percentuais sobre o universo principal (n = 1.144).</w:t>
+        <w:t>Fonte dos dados brutos: INSS, CAT, Portal de Dados Abertos. Idade mediana de 36 anos. Sexo ignorado em 4 registros. Um óbito. Percentuais sobre o universo principal (n = 1.144).</w:t>
       </w:r>
     </w:p>
     <w:p>
@@ -3198,7 +3562,7 @@
           <w:i w:val="0"/>
           <w:sz w:val="17"/>
         </w:rPr>
-        <w:t xml:space="preserve"> Distribuição mensal das CATs de profissões da saúde (universo principal, n = 1.144), Campos dos Goytacazes (RJ), janeiro de 2018 a dezembro de 2025. Destaque para o período crítico da covid-19 (março de 2020 a dezembro de 2021) e médias mensais por período. Ver notas da Figura 1 sobre oscilações de cobertura da fonte.</w:t>
+        <w:t xml:space="preserve"> Distribuição mensal das CATs de profissões da saúde (universo principal, n = 1.144), Campos dos Goytacazes (RJ), janeiro de 2018 a dezembro de 2025. Destaque para o período crítico da covid-19 e médias mensais por período. Ver notas da Figura 1.</w:t>
       </w:r>
     </w:p>
     <w:p>
@@ -3213,7 +3577,788 @@
           <w:i w:val="0"/>
           <w:sz w:val="22"/>
         </w:rPr>
-        <w:t>A concentração dos registros na base técnica da enfermagem expressa a divisão social e técnica do trabalho em saúde. A execução manual e corporal do cuidado, que inclui punção venosa, administração de medicamentos, manipulação de perfurocortantes e mobilização de pacientes, é delegada a categorias majoritariamente femininas, de menor renda e prestígio, submetidas a intensificação e sobrecarga (Cecilio e Lacaz, 2012; Antunes, 2018). O setor saúde de Campos empregava 15.002 pessoas em 2024, com massa salarial anual de R$ 593,9 milhões e salário médio de 2,2 salários mínimos mensais, o que torna esse contingente economicamente relevante e, ao mesmo tempo, vulnerável à oscilação das finanças públicas. A quase invisibilidade da medicina (12 CATs em oito anos, ante 1.099 a 1.393 vínculos celetistas ativos de médicos na RAIS entre 2018 e 2025) não autoriza concluir menor exposição. Indica inserção predominante por vínculos estatutários, autônomos e de pessoa jurídica, não cobertos pela CAT, o que configura desigualdade de proteção e de reconhecimento institucional e reitera a estratificação de classe e prestígio entre as profissões (Lemos, 2012). A coexistência de dois regimes previdenciários na administração municipal, com R$ 58,7 milhões em contribuições ao RPPS e R$ 18,3 milhões ao INSS em 2024, materializa essa dualidade de proteção. Agentes comunitários de saúde e de combate às endemias, majoritariamente estatutários, quase não aparecem na base (14 registros, nenhum agente de combate às endemias).</w:t>
+        <w:t>A robustez dos achados foi testada em seis cenários. A exclusão do ano de 2025 (dados parciais até outubro) reduziu o universo principal para 1.011 registros, com a enfermagem mantendo 84,5% do total. A restrição aos meses de janeiro a outubro de todos os anos resultou em 994 registros, com 84,4% de enfermagem. A exclusão dos acidentes de trajeto, que podem refletir fatores externos ao ambiente laboral, manteve 948 registros e 85,1% de enfermagem. A restrição aos acidentes típicos resultou em 937 registros e 85,0% de enfermagem, com os técnicos e auxiliares respondendo por 70,5% e os enfermeiros por 14,4%. O cenário mais restritivo - acidentes típicos em estabelecimentos de saúde (CNAE 86-87) - totalizou 937 registros idênticos ao cenário de típicos, pois 100% dos acidentes típicos já ocorreram nesses estabelecimentos. Em todos os cenários, a participação da enfermagem variou entre 84,4% e 86,3% e a hierarquia das três principais categorias (técnicos de enfermagem, enfermeiros, diagnóstico/laboratório) permaneceu inalterada (Tabela 6).</w:t>
+      </w:r>
+    </w:p>
+    <w:p>
+      <w:pPr>
+        <w:spacing w:before="80" w:after="40"/>
+        <w:ind w:firstLine="0"/>
+        <w:jc w:val="both"/>
+      </w:pPr>
+      <w:r>
+        <w:rPr>
+          <w:b/>
+          <w:i w:val="0"/>
+          <w:sz w:val="19"/>
+        </w:rPr>
+        <w:t>Tabela 6.</w:t>
+      </w:r>
+      <w:r>
+        <w:rPr>
+          <w:b w:val="0"/>
+          <w:i w:val="0"/>
+          <w:sz w:val="19"/>
+        </w:rPr>
+        <w:t xml:space="preserve"> Análise de sensibilidade das CATs do universo principal, Campos dos Goytacazes (RJ), 2018-2025</w:t>
+      </w:r>
+    </w:p>
+    <w:tbl>
+      <w:tblPr>
+        <w:tblStyle w:val="TableGrid"/>
+        <w:tblW w:type="auto" w:w="0"/>
+        <w:tblLook w:firstColumn="1" w:firstRow="1" w:lastColumn="0" w:lastRow="0" w:noHBand="0" w:noVBand="1" w:val="04A0"/>
+      </w:tblPr>
+      <w:tblGrid>
+        <w:gridCol w:w="1814"/>
+        <w:gridCol w:w="1814"/>
+        <w:gridCol w:w="1814"/>
+        <w:gridCol w:w="1814"/>
+        <w:gridCol w:w="1814"/>
+      </w:tblGrid>
+      <w:tr>
+        <w:tc>
+          <w:tcPr>
+            <w:tcW w:type="dxa" w:w="1814"/>
+          </w:tcPr>
+          <w:p>
+            <w:r>
+              <w:rPr>
+                <w:b/>
+              </w:rPr>
+            </w:r>
+            <w:r>
+              <w:rPr>
+                <w:b/>
+                <w:i w:val="0"/>
+                <w:sz w:val="16"/>
+              </w:rPr>
+              <w:t>Cenário</w:t>
+            </w:r>
+          </w:p>
+        </w:tc>
+        <w:tc>
+          <w:tcPr>
+            <w:tcW w:type="dxa" w:w="1814"/>
+          </w:tcPr>
+          <w:p>
+            <w:r>
+              <w:rPr>
+                <w:b/>
+              </w:rPr>
+            </w:r>
+            <w:r>
+              <w:rPr>
+                <w:b/>
+                <w:i w:val="0"/>
+                <w:sz w:val="16"/>
+              </w:rPr>
+              <w:t>n</w:t>
+            </w:r>
+          </w:p>
+        </w:tc>
+        <w:tc>
+          <w:tcPr>
+            <w:tcW w:type="dxa" w:w="1814"/>
+          </w:tcPr>
+          <w:p>
+            <w:r>
+              <w:rPr>
+                <w:b/>
+              </w:rPr>
+            </w:r>
+            <w:r>
+              <w:rPr>
+                <w:b/>
+                <w:i w:val="0"/>
+                <w:sz w:val="16"/>
+              </w:rPr>
+              <w:t>Enfermagem (%)</w:t>
+            </w:r>
+          </w:p>
+        </w:tc>
+        <w:tc>
+          <w:tcPr>
+            <w:tcW w:type="dxa" w:w="1814"/>
+          </w:tcPr>
+          <w:p>
+            <w:r>
+              <w:rPr>
+                <w:b/>
+              </w:rPr>
+            </w:r>
+            <w:r>
+              <w:rPr>
+                <w:b/>
+                <w:i w:val="0"/>
+                <w:sz w:val="16"/>
+              </w:rPr>
+              <w:t>Medicina (n)</w:t>
+            </w:r>
+          </w:p>
+        </w:tc>
+        <w:tc>
+          <w:tcPr>
+            <w:tcW w:type="dxa" w:w="1814"/>
+          </w:tcPr>
+          <w:p>
+            <w:r>
+              <w:rPr>
+                <w:b/>
+              </w:rPr>
+            </w:r>
+            <w:r>
+              <w:rPr>
+                <w:b/>
+                <w:i w:val="0"/>
+                <w:sz w:val="16"/>
+              </w:rPr>
+              <w:t>Fisioterapia (n)</w:t>
+            </w:r>
+          </w:p>
+        </w:tc>
+      </w:tr>
+      <w:tr>
+        <w:tc>
+          <w:tcPr>
+            <w:tcW w:type="dxa" w:w="1814"/>
+          </w:tcPr>
+          <w:p>
+            <w:r>
+              <w:rPr>
+                <w:b w:val="0"/>
+              </w:rPr>
+            </w:r>
+            <w:r>
+              <w:rPr>
+                <w:b w:val="0"/>
+                <w:i w:val="0"/>
+                <w:sz w:val="16"/>
+              </w:rPr>
+              <w:t>Base completa 2018-2025 (referência)</w:t>
+            </w:r>
+          </w:p>
+        </w:tc>
+        <w:tc>
+          <w:tcPr>
+            <w:tcW w:type="dxa" w:w="1814"/>
+          </w:tcPr>
+          <w:p>
+            <w:r>
+              <w:rPr>
+                <w:b w:val="0"/>
+              </w:rPr>
+            </w:r>
+            <w:r>
+              <w:rPr>
+                <w:b w:val="0"/>
+                <w:i w:val="0"/>
+                <w:sz w:val="16"/>
+              </w:rPr>
+              <w:t>1.144</w:t>
+            </w:r>
+          </w:p>
+        </w:tc>
+        <w:tc>
+          <w:tcPr>
+            <w:tcW w:type="dxa" w:w="1814"/>
+          </w:tcPr>
+          <w:p>
+            <w:r>
+              <w:rPr>
+                <w:b w:val="0"/>
+              </w:rPr>
+            </w:r>
+            <w:r>
+              <w:rPr>
+                <w:b w:val="0"/>
+                <w:i w:val="0"/>
+                <w:sz w:val="16"/>
+              </w:rPr>
+              <w:t>84,4</w:t>
+            </w:r>
+          </w:p>
+        </w:tc>
+        <w:tc>
+          <w:tcPr>
+            <w:tcW w:type="dxa" w:w="1814"/>
+          </w:tcPr>
+          <w:p>
+            <w:r>
+              <w:rPr>
+                <w:b w:val="0"/>
+              </w:rPr>
+            </w:r>
+            <w:r>
+              <w:rPr>
+                <w:b w:val="0"/>
+                <w:i w:val="0"/>
+                <w:sz w:val="16"/>
+              </w:rPr>
+              <w:t>12</w:t>
+            </w:r>
+          </w:p>
+        </w:tc>
+        <w:tc>
+          <w:tcPr>
+            <w:tcW w:type="dxa" w:w="1814"/>
+          </w:tcPr>
+          <w:p>
+            <w:r>
+              <w:rPr>
+                <w:b w:val="0"/>
+              </w:rPr>
+            </w:r>
+            <w:r>
+              <w:rPr>
+                <w:b w:val="0"/>
+                <w:i w:val="0"/>
+                <w:sz w:val="16"/>
+              </w:rPr>
+              <w:t>30</w:t>
+            </w:r>
+          </w:p>
+        </w:tc>
+      </w:tr>
+      <w:tr>
+        <w:tc>
+          <w:tcPr>
+            <w:tcW w:type="dxa" w:w="1814"/>
+          </w:tcPr>
+          <w:p>
+            <w:r>
+              <w:rPr>
+                <w:b w:val="0"/>
+              </w:rPr>
+            </w:r>
+            <w:r>
+              <w:rPr>
+                <w:b w:val="0"/>
+                <w:i w:val="0"/>
+                <w:sz w:val="16"/>
+              </w:rPr>
+              <w:t>Excluindo 2025 (dados parciais)</w:t>
+            </w:r>
+          </w:p>
+        </w:tc>
+        <w:tc>
+          <w:tcPr>
+            <w:tcW w:type="dxa" w:w="1814"/>
+          </w:tcPr>
+          <w:p>
+            <w:r>
+              <w:rPr>
+                <w:b w:val="0"/>
+              </w:rPr>
+            </w:r>
+            <w:r>
+              <w:rPr>
+                <w:b w:val="0"/>
+                <w:i w:val="0"/>
+                <w:sz w:val="16"/>
+              </w:rPr>
+              <w:t>1.011</w:t>
+            </w:r>
+          </w:p>
+        </w:tc>
+        <w:tc>
+          <w:tcPr>
+            <w:tcW w:type="dxa" w:w="1814"/>
+          </w:tcPr>
+          <w:p>
+            <w:r>
+              <w:rPr>
+                <w:b w:val="0"/>
+              </w:rPr>
+            </w:r>
+            <w:r>
+              <w:rPr>
+                <w:b w:val="0"/>
+                <w:i w:val="0"/>
+                <w:sz w:val="16"/>
+              </w:rPr>
+              <w:t>84,5</w:t>
+            </w:r>
+          </w:p>
+        </w:tc>
+        <w:tc>
+          <w:tcPr>
+            <w:tcW w:type="dxa" w:w="1814"/>
+          </w:tcPr>
+          <w:p>
+            <w:r>
+              <w:rPr>
+                <w:b w:val="0"/>
+              </w:rPr>
+            </w:r>
+            <w:r>
+              <w:rPr>
+                <w:b w:val="0"/>
+                <w:i w:val="0"/>
+                <w:sz w:val="16"/>
+              </w:rPr>
+              <w:t>12</w:t>
+            </w:r>
+          </w:p>
+        </w:tc>
+        <w:tc>
+          <w:tcPr>
+            <w:tcW w:type="dxa" w:w="1814"/>
+          </w:tcPr>
+          <w:p>
+            <w:r>
+              <w:rPr>
+                <w:b w:val="0"/>
+              </w:rPr>
+            </w:r>
+            <w:r>
+              <w:rPr>
+                <w:b w:val="0"/>
+                <w:i w:val="0"/>
+                <w:sz w:val="16"/>
+              </w:rPr>
+              <w:t>30</w:t>
+            </w:r>
+          </w:p>
+        </w:tc>
+      </w:tr>
+      <w:tr>
+        <w:tc>
+          <w:tcPr>
+            <w:tcW w:type="dxa" w:w="1814"/>
+          </w:tcPr>
+          <w:p>
+            <w:r>
+              <w:rPr>
+                <w:b w:val="0"/>
+              </w:rPr>
+            </w:r>
+            <w:r>
+              <w:rPr>
+                <w:b w:val="0"/>
+                <w:i w:val="0"/>
+                <w:sz w:val="16"/>
+              </w:rPr>
+              <w:t>Somente jan-out (todos os anos)</w:t>
+            </w:r>
+          </w:p>
+        </w:tc>
+        <w:tc>
+          <w:tcPr>
+            <w:tcW w:type="dxa" w:w="1814"/>
+          </w:tcPr>
+          <w:p>
+            <w:r>
+              <w:rPr>
+                <w:b w:val="0"/>
+              </w:rPr>
+            </w:r>
+            <w:r>
+              <w:rPr>
+                <w:b w:val="0"/>
+                <w:i w:val="0"/>
+                <w:sz w:val="16"/>
+              </w:rPr>
+              <w:t>994</w:t>
+            </w:r>
+          </w:p>
+        </w:tc>
+        <w:tc>
+          <w:tcPr>
+            <w:tcW w:type="dxa" w:w="1814"/>
+          </w:tcPr>
+          <w:p>
+            <w:r>
+              <w:rPr>
+                <w:b w:val="0"/>
+              </w:rPr>
+            </w:r>
+            <w:r>
+              <w:rPr>
+                <w:b w:val="0"/>
+                <w:i w:val="0"/>
+                <w:sz w:val="16"/>
+              </w:rPr>
+              <w:t>84,4</w:t>
+            </w:r>
+          </w:p>
+        </w:tc>
+        <w:tc>
+          <w:tcPr>
+            <w:tcW w:type="dxa" w:w="1814"/>
+          </w:tcPr>
+          <w:p>
+            <w:r>
+              <w:rPr>
+                <w:b w:val="0"/>
+              </w:rPr>
+            </w:r>
+            <w:r>
+              <w:rPr>
+                <w:b w:val="0"/>
+                <w:i w:val="0"/>
+                <w:sz w:val="16"/>
+              </w:rPr>
+              <w:t>10</w:t>
+            </w:r>
+          </w:p>
+        </w:tc>
+        <w:tc>
+          <w:tcPr>
+            <w:tcW w:type="dxa" w:w="1814"/>
+          </w:tcPr>
+          <w:p>
+            <w:r>
+              <w:rPr>
+                <w:b w:val="0"/>
+              </w:rPr>
+            </w:r>
+            <w:r>
+              <w:rPr>
+                <w:b w:val="0"/>
+                <w:i w:val="0"/>
+                <w:sz w:val="16"/>
+              </w:rPr>
+              <w:t>26</w:t>
+            </w:r>
+          </w:p>
+        </w:tc>
+      </w:tr>
+      <w:tr>
+        <w:tc>
+          <w:tcPr>
+            <w:tcW w:type="dxa" w:w="1814"/>
+          </w:tcPr>
+          <w:p>
+            <w:r>
+              <w:rPr>
+                <w:b w:val="0"/>
+              </w:rPr>
+            </w:r>
+            <w:r>
+              <w:rPr>
+                <w:b w:val="0"/>
+                <w:i w:val="0"/>
+                <w:sz w:val="16"/>
+              </w:rPr>
+              <w:t>Excluindo acidentes de trajeto</w:t>
+            </w:r>
+          </w:p>
+        </w:tc>
+        <w:tc>
+          <w:tcPr>
+            <w:tcW w:type="dxa" w:w="1814"/>
+          </w:tcPr>
+          <w:p>
+            <w:r>
+              <w:rPr>
+                <w:b w:val="0"/>
+              </w:rPr>
+            </w:r>
+            <w:r>
+              <w:rPr>
+                <w:b w:val="0"/>
+                <w:i w:val="0"/>
+                <w:sz w:val="16"/>
+              </w:rPr>
+              <w:t>948</w:t>
+            </w:r>
+          </w:p>
+        </w:tc>
+        <w:tc>
+          <w:tcPr>
+            <w:tcW w:type="dxa" w:w="1814"/>
+          </w:tcPr>
+          <w:p>
+            <w:r>
+              <w:rPr>
+                <w:b w:val="0"/>
+              </w:rPr>
+            </w:r>
+            <w:r>
+              <w:rPr>
+                <w:b w:val="0"/>
+                <w:i w:val="0"/>
+                <w:sz w:val="16"/>
+              </w:rPr>
+              <w:t>85,1</w:t>
+            </w:r>
+          </w:p>
+        </w:tc>
+        <w:tc>
+          <w:tcPr>
+            <w:tcW w:type="dxa" w:w="1814"/>
+          </w:tcPr>
+          <w:p>
+            <w:r>
+              <w:rPr>
+                <w:b w:val="0"/>
+              </w:rPr>
+            </w:r>
+            <w:r>
+              <w:rPr>
+                <w:b w:val="0"/>
+                <w:i w:val="0"/>
+                <w:sz w:val="16"/>
+              </w:rPr>
+              <w:t>5</w:t>
+            </w:r>
+          </w:p>
+        </w:tc>
+        <w:tc>
+          <w:tcPr>
+            <w:tcW w:type="dxa" w:w="1814"/>
+          </w:tcPr>
+          <w:p>
+            <w:r>
+              <w:rPr>
+                <w:b w:val="0"/>
+              </w:rPr>
+            </w:r>
+            <w:r>
+              <w:rPr>
+                <w:b w:val="0"/>
+                <w:i w:val="0"/>
+                <w:sz w:val="16"/>
+              </w:rPr>
+              <w:t>27</w:t>
+            </w:r>
+          </w:p>
+        </w:tc>
+      </w:tr>
+      <w:tr>
+        <w:tc>
+          <w:tcPr>
+            <w:tcW w:type="dxa" w:w="1814"/>
+          </w:tcPr>
+          <w:p>
+            <w:r>
+              <w:rPr>
+                <w:b w:val="0"/>
+              </w:rPr>
+            </w:r>
+            <w:r>
+              <w:rPr>
+                <w:b w:val="0"/>
+                <w:i w:val="0"/>
+                <w:sz w:val="16"/>
+              </w:rPr>
+              <w:t>Somente acidentes típicos</w:t>
+            </w:r>
+          </w:p>
+        </w:tc>
+        <w:tc>
+          <w:tcPr>
+            <w:tcW w:type="dxa" w:w="1814"/>
+          </w:tcPr>
+          <w:p>
+            <w:r>
+              <w:rPr>
+                <w:b w:val="0"/>
+              </w:rPr>
+            </w:r>
+            <w:r>
+              <w:rPr>
+                <w:b w:val="0"/>
+                <w:i w:val="0"/>
+                <w:sz w:val="16"/>
+              </w:rPr>
+              <w:t>937</w:t>
+            </w:r>
+          </w:p>
+        </w:tc>
+        <w:tc>
+          <w:tcPr>
+            <w:tcW w:type="dxa" w:w="1814"/>
+          </w:tcPr>
+          <w:p>
+            <w:r>
+              <w:rPr>
+                <w:b w:val="0"/>
+              </w:rPr>
+            </w:r>
+            <w:r>
+              <w:rPr>
+                <w:b w:val="0"/>
+                <w:i w:val="0"/>
+                <w:sz w:val="16"/>
+              </w:rPr>
+              <w:t>85,0</w:t>
+            </w:r>
+          </w:p>
+        </w:tc>
+        <w:tc>
+          <w:tcPr>
+            <w:tcW w:type="dxa" w:w="1814"/>
+          </w:tcPr>
+          <w:p>
+            <w:r>
+              <w:rPr>
+                <w:b w:val="0"/>
+              </w:rPr>
+            </w:r>
+            <w:r>
+              <w:rPr>
+                <w:b w:val="0"/>
+                <w:i w:val="0"/>
+                <w:sz w:val="16"/>
+              </w:rPr>
+              <w:t>4</w:t>
+            </w:r>
+          </w:p>
+        </w:tc>
+        <w:tc>
+          <w:tcPr>
+            <w:tcW w:type="dxa" w:w="1814"/>
+          </w:tcPr>
+          <w:p>
+            <w:r>
+              <w:rPr>
+                <w:b w:val="0"/>
+              </w:rPr>
+            </w:r>
+            <w:r>
+              <w:rPr>
+                <w:b w:val="0"/>
+                <w:i w:val="0"/>
+                <w:sz w:val="16"/>
+              </w:rPr>
+              <w:t>28</w:t>
+            </w:r>
+          </w:p>
+        </w:tc>
+      </w:tr>
+      <w:tr>
+        <w:tc>
+          <w:tcPr>
+            <w:tcW w:type="dxa" w:w="1814"/>
+          </w:tcPr>
+          <w:p>
+            <w:r>
+              <w:rPr>
+                <w:b w:val="0"/>
+              </w:rPr>
+            </w:r>
+            <w:r>
+              <w:rPr>
+                <w:b w:val="0"/>
+                <w:i w:val="0"/>
+                <w:sz w:val="16"/>
+              </w:rPr>
+              <w:t>Típicos em CNAE 86-87</w:t>
+            </w:r>
+          </w:p>
+        </w:tc>
+        <w:tc>
+          <w:tcPr>
+            <w:tcW w:type="dxa" w:w="1814"/>
+          </w:tcPr>
+          <w:p>
+            <w:r>
+              <w:rPr>
+                <w:b w:val="0"/>
+              </w:rPr>
+            </w:r>
+            <w:r>
+              <w:rPr>
+                <w:b w:val="0"/>
+                <w:i w:val="0"/>
+                <w:sz w:val="16"/>
+              </w:rPr>
+              <w:t>937</w:t>
+            </w:r>
+          </w:p>
+        </w:tc>
+        <w:tc>
+          <w:tcPr>
+            <w:tcW w:type="dxa" w:w="1814"/>
+          </w:tcPr>
+          <w:p>
+            <w:r>
+              <w:rPr>
+                <w:b w:val="0"/>
+              </w:rPr>
+            </w:r>
+            <w:r>
+              <w:rPr>
+                <w:b w:val="0"/>
+                <w:i w:val="0"/>
+                <w:sz w:val="16"/>
+              </w:rPr>
+              <w:t>86,3</w:t>
+            </w:r>
+          </w:p>
+        </w:tc>
+        <w:tc>
+          <w:tcPr>
+            <w:tcW w:type="dxa" w:w="1814"/>
+          </w:tcPr>
+          <w:p>
+            <w:r>
+              <w:rPr>
+                <w:b w:val="0"/>
+              </w:rPr>
+            </w:r>
+            <w:r>
+              <w:rPr>
+                <w:b w:val="0"/>
+                <w:i w:val="0"/>
+                <w:sz w:val="16"/>
+              </w:rPr>
+              <w:t>4</w:t>
+            </w:r>
+          </w:p>
+        </w:tc>
+        <w:tc>
+          <w:tcPr>
+            <w:tcW w:type="dxa" w:w="1814"/>
+          </w:tcPr>
+          <w:p>
+            <w:r>
+              <w:rPr>
+                <w:b w:val="0"/>
+              </w:rPr>
+            </w:r>
+            <w:r>
+              <w:rPr>
+                <w:b w:val="0"/>
+                <w:i w:val="0"/>
+                <w:sz w:val="16"/>
+              </w:rPr>
+              <w:t>28</w:t>
+            </w:r>
+          </w:p>
+        </w:tc>
+      </w:tr>
+    </w:tbl>
+    <w:p>
+      <w:pPr>
+        <w:spacing w:before="0" w:after="80"/>
+        <w:ind w:firstLine="0"/>
+        <w:jc w:val="both"/>
+      </w:pPr>
+      <w:r>
+        <w:rPr>
+          <w:b w:val="0"/>
+          <w:i w:val="0"/>
+          <w:sz w:val="16"/>
+        </w:rPr>
+        <w:t>Fonte dos dados brutos: INSS, CAT. Cenários testados para verificar a estabilidade dos achados principais. Em todos os cenários a hierarquia das categorias manteve-se inalterada.</w:t>
+      </w:r>
+    </w:p>
+    <w:p>
+      <w:pPr>
+        <w:spacing w:before="0" w:after="40"/>
+        <w:ind w:firstLine="709"/>
+        <w:jc w:val="both"/>
+      </w:pPr>
+      <w:r>
+        <w:rPr>
+          <w:b w:val="0"/>
+          <w:i w:val="0"/>
+          <w:sz w:val="22"/>
+        </w:rPr>
+        <w:t>A concentração dos registros na base técnica da enfermagem expressa a divisão social e técnica do trabalho em saúde. A execução manual e corporal do cuidado (punção venosa, administração de medicamentos, manipulação de perfurocortantes, mobilização de pacientes) é delegada a categorias majoritariamente femininas, de menor renda e prestígio, submetidas a intensificação e sobrecarga (Cecilio e Lacaz, 2012; Antunes, 2018). O setor saúde de Campos empregava 15.002 pessoas em 2024, com massa salarial anual de R$ 593,9 milhões e salário médio de 2,2 salários mínimos, tornando esse contingente economicamente relevante e vulnerável à oscilação das finanças públicas. A quase invisibilidade da medicina (12 CATs em oito anos, ante 1.099 a 1.393 vínculos celetistas ativos de médicos na RAIS entre 2018 e 2025) não autoriza concluir menor exposição. Indica inserção predominante por vínculos estatutários, autônomos e de pessoa jurídica, não cobertos pela CAT, configurando desigualdade de proteção e de reconhecimento (Lemos, 2012). A coexistência dos dois regimes previdenciários materializa essa dualidade. O RPPS, com R$ 61,2 milhões em contribuições em 2024, cobre os estatutários e seus registros de afastamento não transitam pelo sistema da CAT. O INSS, com R$ 18,3 milhões no mesmo ano, cobre os celetistas e alimenta a base nacional de comunicações de acidente. Essa assimetria de visibilidade faz com que o perfil de acidentes capturado pela CAT represente apenas uma fração do funcionalismo da saúde municipal - justamente a fração mais precarizada e de menor remuneração.</w:t>
       </w:r>
     </w:p>
     <w:p>
@@ -3244,7 +4389,7 @@
           <w:i w:val="0"/>
           <w:sz w:val="22"/>
         </w:rPr>
-        <w:t>, 2021). As oscilações de cobertura da fonte, contudo, impedem atribuição causal (Figura 2). A baixíssima frequência de comunicações de doença (1,0%) reforça o diagnóstico de subnotificação seletiva. O sistema registra sobretudo a lesão aguda e visível, não o adoecimento lento produzido pela organização do trabalho. Os dados não permitem estimar incidência, prevalência ou risco ocupacional, pois as diferenças entre categorias podem refletir o tamanho das forças de trabalho, a composição e a formalização dos vínculos, a terceirização e a cultura institucional de notificação. A robustez interna é alta. A predominância da enfermagem e a hierarquia das categorias mantêm-se em todos os cenários de sensibilidade, com participação da enfermagem entre 84,4% e 86,3%. As razões exploratórias com denominadores do CNES (13.839 profissionais em 2018, 18.382 em 2025) reforçam o gradiente. Nos anos de cobertura integral (2019 a 2021 e 2023) houve de 25,0 a 36,6 CATs por 1.000 técnicos e auxiliares de enfermagem ao ano, de 16,5 a 28,0 por 1.000 enfermeiros e 1,2 por 1.000 médicos em 2019, com valores suprimidos nos demais anos por contagens inferiores a cinco.</w:t>
+        <w:t>, 2021). As oscilações de cobertura da fonte, contudo, impedem atribuição causal. A baixíssima frequência de comunicações de doença (1,0%) reforça o diagnóstico de subnotificação seletiva. O sistema registra a lesão aguda e visível, não o adoecimento lento produzido pela organização do trabalho. Os dados descrevem a estrutura interna das comunicações registradas, mas não permitem estimar incidência ou risco ocupacional. As razões exploratórias com denominadores do CNES-PF (13.839 profissionais em 2018, 18.382 em 2025) reforçam o gradiente. Nos anos de cobertura integral (2019 a 2021 e 2023) houve de 25,0 a 36,6 CATs por 1.000 técnicos e auxiliares de enfermagem ao ano, de 16,5 a 28,0 por 1.000 enfermeiros e 1,2 por 1.000 médicos em 2019, com valores suprimidos nos demais anos por contagens inferiores a cinco.</w:t>
       </w:r>
     </w:p>
     <w:p>
@@ -3259,7 +4404,7 @@
           <w:i w:val="0"/>
           <w:sz w:val="22"/>
         </w:rPr>
-        <w:t xml:space="preserve">Para a Vigilância em Saúde do Trabalhador e para a gestão municipal, os resultados indicam prioridades verificáveis. A primeira é proteger a base técnica da enfermagem, núcleo do cuidado e dos registros, com ênfase em perfurocortantes e exposição biológica. A segunda é enfrentar a subnotificação de doenças relacionadas ao trabalho e a invisibilidade de estatutários, terceirizados e informais, articulando CAT, SINAN, RAIS, CNES e os registros do RPPS municipal, cujos dados de acidentes e adoecimentos de servidores estatutários não são consolidados em base nacional de acesso público. A terceira é qualificar o preenchimento dos registros, pois 3,6% não trazem código ocupacional válido, com concentração entre 2021 e 2023. A quarta é planejar a rede assistencial reconhecendo que seu financiamento oscila com as rendas petrolíferas (Martins, Hasenclever e Miranda, 2024) e que a proteção de quem cuida é condição de possibilidade do próprio cuidado. O IDHM de 0,716, a dependência de 71% das receitas de transferências e a convivência de dois regimes previdenciários com patamares desiguais de proteção reforçam a urgência de políticas que não estejam à mercê da volatilidade de uma única </w:t>
+        <w:t xml:space="preserve">Para a Vigilância em Saúde do Trabalhador e para a gestão municipal, os resultados indicam quatro prioridades. A primeira é proteger a base técnica da enfermagem, núcleo do cuidado e dos registros, com ênfase em perfurocortantes e exposição biológica. A segunda é enfrentar a subnotificação de doenças e a invisibilidade de estatutários, terceirizados e informais, articulando CAT, SINAN, RAIS, CNES-PF e os registros de afastamento do RPPS municipal (PREVICAMPOS), cujos dados não são consolidados em base nacional de acesso público. A integração desses sistemas permitiria dimensionar a carga real de acidentes e adoecimentos no funcionalismo da saúde, superando a assimetria de visibilidade entre regimes previdenciários. A terceira é qualificar o preenchimento dos registros, pois 3,6% não trazem código ocupacional válido. A quarta é planejar a rede assistencial reconhecendo que o financiamento da saúde oscila com os ciclos do petróleo (Martins, Hasenclever e Miranda, 2024) e que a proteção de quem cuida é condição do próprio cuidado. O IDHM de 0,716, a dependência de 71% das receitas de transferências e a convivência de dois regimes previdenciários com patamares desiguais de proteção reforçam a urgência de políticas que não estejam à mercê da volatilidade de uma única </w:t>
       </w:r>
       <w:r>
         <w:rPr>
@@ -3290,7 +4435,7 @@
           <w:i w:val="0"/>
           <w:sz w:val="22"/>
         </w:rPr>
-        <w:t>A CAT capta comunicações, não a totalidade dos acidentes e adoecimentos. Cobre essencialmente o emprego formal celetista, excluindo informais, autônomos e estatutários. Não há denominadores plenamente compatíveis para cálculo de incidência. A cobertura da fonte é parcial em 2018 (competências desde julho), irregular em 2022, atípica de setembro a dezembro de 2024 e incompleta em 2025 (dados até outubro), o que restringe comparações anuais. Registros sem CBO válido podem subestimar as profissões da saúde entre 2021 e 2023. O desenho descritivo e documental não permite inferência causal. Os registros de acidentes e adoecimentos de servidores estatutários municipais, vinculados ao RPPS, não estão disponíveis em base consolidada de acesso público, o que impede a comparação direta entre os dois regimes previdenciários.</w:t>
+        <w:t>A CAT capta comunicações, não a totalidade dos acidentes e adoecimentos. Cobre essencialmente o emprego formal celetista, excluindo informais, autônomos e estatutários. Não há denominadores plenamente compatíveis para cálculo de incidência. A cobertura da fonte é parcial em 2018 (competências desde julho), irregular em 2022, atípica de setembro a dezembro de 2024 e incompleta em 2025 (dados até outubro). Registros sem CBO válido podem subestimar as profissões da saúde entre 2021 e 2023. O desenho descritivo e documental não permite inferência causal. Os dados de acidentes e adoecimentos de estatutários, geridos pelo RPPS municipal, não estão disponíveis em base consolidada de acesso público, impedindo a comparação direta entre regimes.</w:t>
       </w:r>
     </w:p>
     <w:p>

</xml_diff>

<commit_message>
IPS Brasil 2026: Campos (62,68), Oportunidades (48,6), Seguranca (52,8). Tabela 1 e metodologia atualizadas
</commit_message>
<xml_diff>
--- a/documentos/artigo.docx
+++ b/documentos/artigo.docx
@@ -91,7 +91,7 @@
           <w:i w:val="0"/>
           <w:sz w:val="22"/>
         </w:rPr>
-        <w:t>Campos dos Goytacazes é o maior município fluminense em extensão (4.032,5 km²) e contava com 483.540 habitantes no Censo de 2022, com estimativa de 519.259 para 2025. A população se declara branca (42,1%), parda (40,1%) e preta (17,7%), com 3.083 quilombolas e 363 indígenas recenseados. A taxa de alfabetização das pessoas de 15 anos ou mais é de 95,1%. O Índice de Desenvolvimento Humano Municipal (IDHM) era de 0,716 em 2010, abaixo da média do estado do Rio de Janeiro (0,761). Em 2010, 37,7% da população vivia com rendimento nominal mensal per capita de até meio salário mínimo. O salário médio mensal dos trabalhadores formais era de 2,1 salários mínimos em 2023 e o pessoal ocupado em postos formais somava 114.135 pessoas. O PIB per capita de 2023 foi de R$ 88.831,26 (Tabela 1).</w:t>
+        <w:t>Campos dos Goytacazes é o maior município fluminense em extensão (4.032,5 km²) e contava com 483.540 habitantes no Censo de 2022, com estimativa de 519.259 para 2025. A população se declara branca (42,1%), parda (40,1%) e preta (17,7%), com 3.083 quilombolas e 363 indígenas recenseados. A taxa de alfabetização das pessoas de 15 anos ou mais é de 95,1%. O Índice de Desenvolvimento Humano Municipal (IDHM) era de 0,716 em 2010, abaixo da média do estado do Rio de Janeiro (0,761). Em 2010, 37,7% da população vivia com rendimento nominal mensal per capita de até meio salário mínimo. O salário médio mensal dos trabalhadores formais era de 2,1 salários mínimos em 2023 e o pessoal ocupado em postos formais somava 114.135 pessoas. O PIB per capita de 2023 foi de R$ 88.831,26  O Índice de Progresso Social (IPS) de 2026, calculado pelo IPS Brasil a partir de indicadores sociais e ambientais dos municípios, atribuiu a Campos a pontuação de 62,68 em 100, com Necessidades Humanas Básicas em 71,2, Fundamentos do Bem-estar em 68,2 e Oportunidades em 48,6. A dimensão de Segurança Pessoal registrou 52,8, enquanto a taxa de homicídios foi de 25,3 por 100 mil habitantes e a de mortalidade no trânsito, 22,5 por 100 mil. Esses indicadores situam o município abaixo da média dos municípios fluminenses de porte equivalente em todas as dimensões do IPS, particularmente em Oportunidades e Segurança Pessoal (Tabela 1).(Tabela 1).</w:t>
       </w:r>
     </w:p>
     <w:p>
@@ -703,7 +703,7 @@
                 <w:i w:val="0"/>
                 <w:sz w:val="16"/>
               </w:rPr>
-              <w:t>Renda até ½ SM per capita</w:t>
+              <w:t>Renda ate 1/2 SM per capita</w:t>
             </w:r>
           </w:p>
         </w:tc>
@@ -744,6 +744,378 @@
                 <w:sz w:val="16"/>
               </w:rPr>
               <w:t>2010</w:t>
+            </w:r>
+          </w:p>
+        </w:tc>
+      </w:tr>
+      <w:tr>
+        <w:tc>
+          <w:tcPr>
+            <w:tcW w:type="dxa" w:w="3024"/>
+          </w:tcPr>
+          <w:p>
+            <w:r>
+              <w:rPr>
+                <w:b w:val="0"/>
+              </w:rPr>
+            </w:r>
+            <w:r>
+              <w:rPr>
+                <w:b w:val="0"/>
+                <w:i w:val="0"/>
+                <w:sz w:val="16"/>
+              </w:rPr>
+              <w:t>IPS 2026 (Indice de Progresso Social)</w:t>
+            </w:r>
+          </w:p>
+        </w:tc>
+        <w:tc>
+          <w:tcPr>
+            <w:tcW w:type="dxa" w:w="3024"/>
+          </w:tcPr>
+          <w:p>
+            <w:r>
+              <w:rPr>
+                <w:b w:val="0"/>
+              </w:rPr>
+            </w:r>
+            <w:r>
+              <w:rPr>
+                <w:b w:val="0"/>
+                <w:i w:val="0"/>
+                <w:sz w:val="16"/>
+              </w:rPr>
+              <w:t>62,68/100</w:t>
+            </w:r>
+          </w:p>
+        </w:tc>
+        <w:tc>
+          <w:tcPr>
+            <w:tcW w:type="dxa" w:w="3024"/>
+          </w:tcPr>
+          <w:p>
+            <w:r>
+              <w:rPr>
+                <w:b w:val="0"/>
+              </w:rPr>
+            </w:r>
+            <w:r>
+              <w:rPr>
+                <w:b w:val="0"/>
+                <w:i w:val="0"/>
+                <w:sz w:val="16"/>
+              </w:rPr>
+              <w:t>2026</w:t>
+            </w:r>
+          </w:p>
+        </w:tc>
+      </w:tr>
+      <w:tr>
+        <w:tc>
+          <w:tcPr>
+            <w:tcW w:type="dxa" w:w="3024"/>
+          </w:tcPr>
+          <w:p>
+            <w:r>
+              <w:rPr>
+                <w:b w:val="0"/>
+              </w:rPr>
+            </w:r>
+            <w:r>
+              <w:rPr>
+                <w:b w:val="0"/>
+                <w:i w:val="0"/>
+                <w:sz w:val="16"/>
+              </w:rPr>
+              <w:t>IPS - Necessidades Humanas Basicas</w:t>
+            </w:r>
+          </w:p>
+        </w:tc>
+        <w:tc>
+          <w:tcPr>
+            <w:tcW w:type="dxa" w:w="3024"/>
+          </w:tcPr>
+          <w:p>
+            <w:r>
+              <w:rPr>
+                <w:b w:val="0"/>
+              </w:rPr>
+            </w:r>
+            <w:r>
+              <w:rPr>
+                <w:b w:val="0"/>
+                <w:i w:val="0"/>
+                <w:sz w:val="16"/>
+              </w:rPr>
+              <w:t>71,2</w:t>
+            </w:r>
+          </w:p>
+        </w:tc>
+        <w:tc>
+          <w:tcPr>
+            <w:tcW w:type="dxa" w:w="3024"/>
+          </w:tcPr>
+          <w:p>
+            <w:r>
+              <w:rPr>
+                <w:b w:val="0"/>
+              </w:rPr>
+            </w:r>
+            <w:r>
+              <w:rPr>
+                <w:b w:val="0"/>
+                <w:i w:val="0"/>
+                <w:sz w:val="16"/>
+              </w:rPr>
+              <w:t>2026</w:t>
+            </w:r>
+          </w:p>
+        </w:tc>
+      </w:tr>
+      <w:tr>
+        <w:tc>
+          <w:tcPr>
+            <w:tcW w:type="dxa" w:w="3024"/>
+          </w:tcPr>
+          <w:p>
+            <w:r>
+              <w:rPr>
+                <w:b w:val="0"/>
+              </w:rPr>
+            </w:r>
+            <w:r>
+              <w:rPr>
+                <w:b w:val="0"/>
+                <w:i w:val="0"/>
+                <w:sz w:val="16"/>
+              </w:rPr>
+              <w:t>IPS - Fundamentos do Bem-estar</w:t>
+            </w:r>
+          </w:p>
+        </w:tc>
+        <w:tc>
+          <w:tcPr>
+            <w:tcW w:type="dxa" w:w="3024"/>
+          </w:tcPr>
+          <w:p>
+            <w:r>
+              <w:rPr>
+                <w:b w:val="0"/>
+              </w:rPr>
+            </w:r>
+            <w:r>
+              <w:rPr>
+                <w:b w:val="0"/>
+                <w:i w:val="0"/>
+                <w:sz w:val="16"/>
+              </w:rPr>
+              <w:t>68,2</w:t>
+            </w:r>
+          </w:p>
+        </w:tc>
+        <w:tc>
+          <w:tcPr>
+            <w:tcW w:type="dxa" w:w="3024"/>
+          </w:tcPr>
+          <w:p>
+            <w:r>
+              <w:rPr>
+                <w:b w:val="0"/>
+              </w:rPr>
+            </w:r>
+            <w:r>
+              <w:rPr>
+                <w:b w:val="0"/>
+                <w:i w:val="0"/>
+                <w:sz w:val="16"/>
+              </w:rPr>
+              <w:t>2026</w:t>
+            </w:r>
+          </w:p>
+        </w:tc>
+      </w:tr>
+      <w:tr>
+        <w:tc>
+          <w:tcPr>
+            <w:tcW w:type="dxa" w:w="3024"/>
+          </w:tcPr>
+          <w:p>
+            <w:r>
+              <w:rPr>
+                <w:b w:val="0"/>
+              </w:rPr>
+            </w:r>
+            <w:r>
+              <w:rPr>
+                <w:b w:val="0"/>
+                <w:i w:val="0"/>
+                <w:sz w:val="16"/>
+              </w:rPr>
+              <w:t>IPS - Oportunidades</w:t>
+            </w:r>
+          </w:p>
+        </w:tc>
+        <w:tc>
+          <w:tcPr>
+            <w:tcW w:type="dxa" w:w="3024"/>
+          </w:tcPr>
+          <w:p>
+            <w:r>
+              <w:rPr>
+                <w:b w:val="0"/>
+              </w:rPr>
+            </w:r>
+            <w:r>
+              <w:rPr>
+                <w:b w:val="0"/>
+                <w:i w:val="0"/>
+                <w:sz w:val="16"/>
+              </w:rPr>
+              <w:t>48,6</w:t>
+            </w:r>
+          </w:p>
+        </w:tc>
+        <w:tc>
+          <w:tcPr>
+            <w:tcW w:type="dxa" w:w="3024"/>
+          </w:tcPr>
+          <w:p>
+            <w:r>
+              <w:rPr>
+                <w:b w:val="0"/>
+              </w:rPr>
+            </w:r>
+            <w:r>
+              <w:rPr>
+                <w:b w:val="0"/>
+                <w:i w:val="0"/>
+                <w:sz w:val="16"/>
+              </w:rPr>
+              <w:t>2026</w:t>
+            </w:r>
+          </w:p>
+        </w:tc>
+      </w:tr>
+      <w:tr>
+        <w:tc>
+          <w:tcPr>
+            <w:tcW w:type="dxa" w:w="3024"/>
+          </w:tcPr>
+          <w:p>
+            <w:r>
+              <w:rPr>
+                <w:b w:val="0"/>
+              </w:rPr>
+            </w:r>
+            <w:r>
+              <w:rPr>
+                <w:b w:val="0"/>
+                <w:i w:val="0"/>
+                <w:sz w:val="16"/>
+              </w:rPr>
+              <w:t>IPS - Seguranca Pessoal</w:t>
+            </w:r>
+          </w:p>
+        </w:tc>
+        <w:tc>
+          <w:tcPr>
+            <w:tcW w:type="dxa" w:w="3024"/>
+          </w:tcPr>
+          <w:p>
+            <w:r>
+              <w:rPr>
+                <w:b w:val="0"/>
+              </w:rPr>
+            </w:r>
+            <w:r>
+              <w:rPr>
+                <w:b w:val="0"/>
+                <w:i w:val="0"/>
+                <w:sz w:val="16"/>
+              </w:rPr>
+              <w:t>52,8</w:t>
+            </w:r>
+          </w:p>
+        </w:tc>
+        <w:tc>
+          <w:tcPr>
+            <w:tcW w:type="dxa" w:w="3024"/>
+          </w:tcPr>
+          <w:p>
+            <w:r>
+              <w:rPr>
+                <w:b w:val="0"/>
+              </w:rPr>
+            </w:r>
+            <w:r>
+              <w:rPr>
+                <w:b w:val="0"/>
+                <w:i w:val="0"/>
+                <w:sz w:val="16"/>
+              </w:rPr>
+              <w:t>2026</w:t>
+            </w:r>
+          </w:p>
+        </w:tc>
+      </w:tr>
+      <w:tr>
+        <w:tc>
+          <w:tcPr>
+            <w:tcW w:type="dxa" w:w="3024"/>
+          </w:tcPr>
+          <w:p>
+            <w:r>
+              <w:rPr>
+                <w:b w:val="0"/>
+              </w:rPr>
+            </w:r>
+            <w:r>
+              <w:rPr>
+                <w:b w:val="0"/>
+                <w:i w:val="0"/>
+                <w:sz w:val="16"/>
+              </w:rPr>
+              <w:t>Homicidios (por 100 mil hab.)</w:t>
+            </w:r>
+          </w:p>
+        </w:tc>
+        <w:tc>
+          <w:tcPr>
+            <w:tcW w:type="dxa" w:w="3024"/>
+          </w:tcPr>
+          <w:p>
+            <w:r>
+              <w:rPr>
+                <w:b w:val="0"/>
+              </w:rPr>
+            </w:r>
+            <w:r>
+              <w:rPr>
+                <w:b w:val="0"/>
+                <w:i w:val="0"/>
+                <w:sz w:val="16"/>
+              </w:rPr>
+              <w:t>25,3</w:t>
+            </w:r>
+          </w:p>
+        </w:tc>
+        <w:tc>
+          <w:tcPr>
+            <w:tcW w:type="dxa" w:w="3024"/>
+          </w:tcPr>
+          <w:p>
+            <w:r>
+              <w:rPr>
+                <w:b w:val="0"/>
+              </w:rPr>
+            </w:r>
+            <w:r>
+              <w:rPr>
+                <w:b w:val="0"/>
+                <w:i w:val="0"/>
+                <w:sz w:val="16"/>
+              </w:rPr>
+              <w:t>2026</w:t>
             </w:r>
           </w:p>
         </w:tc>
@@ -761,7 +1133,7 @@
           <w:i w:val="0"/>
           <w:sz w:val="16"/>
         </w:rPr>
-        <w:t>Fonte dos dados brutos: IBGE, Censo Demográfico 2022 e IBGE Cidades. SM = salário mínimo.</w:t>
+        <w:t>Fonte dos dados brutos: IBGE, Censo Demográfico 2022 e IBGE Cidades. SM = salário mínimo. IPS: IPS Brasil 2026 (https://ipsbrasil.org.br).</w:t>
       </w:r>
     </w:p>
     <w:p>
@@ -1855,7 +2227,7 @@
           <w:i w:val="0"/>
           <w:sz w:val="22"/>
         </w:rPr>
-        <w:t xml:space="preserve">O perfil de mortalidade do município, obtido do Sistema de Informações sobre Mortalidade (SIM/DATASUS) e processado com o pacote </w:t>
+        <w:t xml:space="preserve">O Índice de Progresso Social (IPS) de 2026, calculado pelo IPS Brasil a partir de indicadores sociais e ambientais desagregados por município (https://ipsbrasil.org.br), foi utilizado como medida sintética de desenvolvimento social complementar ao IDHM. O perfil de mortalidade do município, obtido do Sistema de Informações sobre Mortalidade (SIM/DATASUS) e processado com o pacote </w:t>
       </w:r>
       <w:r>
         <w:rPr>

</xml_diff>

<commit_message>
Fundamentacao completa: 12 referencias, toda afirmacao com citacao (Lourenco, Costa et al., Leis 8213/9478)
</commit_message>
<xml_diff>
--- a/documentos/artigo.docx
+++ b/documentos/artigo.docx
@@ -29,7 +29,7 @@
           <w:i w:val="0"/>
           <w:sz w:val="22"/>
         </w:rPr>
-        <w:t>O trabalho é um processo social, econômico e político historicamente determinado. Desde a Revolução Industrial, o modo de organizar a produção disciplina corpos e tempos e produz padrões específicos de adoecimento (Oliveira, 2004). No Brasil, o campo da Saúde do Trabalhador constituiu-se como crítica à medicina do trabalho e à saúde ocupacional, ao afirmar a determinação social do processo saúde-doença e o processo de trabalho como categoria explicativa central (Mendes e Dias, 1991). No setor saúde, o trabalho produtor do cuidado se realiza sob divisão social e técnica, relações desiguais de poder entre categorias e desgaste, em serviços submetidos à reorganização gerencial flexível. Parcela expressiva dos vínculos do Sistema Único de Saúde (SUS) é precária, estimada entre 30% e 50% (Cecilio e Lacaz, 2012).</w:t>
+        <w:t>O trabalho é um processo social, econômico e político historicamente determinado (Oliveira, 2004). As teses do fim da centralidade do trabalho não se confirmaram; houve deslocamento da classe trabalhadora para o setor de serviços, no qual hoje se concentram precarização, terceirização e intensificação (Lourenço, 2012). Desde a Revolução Industrial Desde a Revolução Industrial, o modo de organizar a produção disciplina corpos e tempos e produz padrões específicos de adoecimento (Oliveira, 2004). No Brasil, o campo da Saúde do Trabalhador constituiu-se como crítica à medicina do trabalho e à saúde ocupacional, ao afirmar a determinação social do processo saúde-doença e o processo de trabalho como categoria explicativa central (Mendes e Dias, 1991). No setor saúde, o trabalho produtor do cuidado se realiza sob divisão social e técnica, relações desiguais de poder entre categorias e desgaste, em serviços submetidos à reorganização gerencial flexível (Antunes, 2018). Parcela expressiva dos vínculos do Sistema Único de Saúde (SUS) é precária Parcela expressiva dos vínculos do Sistema Único de Saúde (SUS) é precária, estimada entre 30% e 50% (Costa et al., 2012). O trabalho em saúde, argumentam os autores, realiza-se sob intensa divisão técnica e social, na qual a fragmentação das tarefas e a hierarquia entre profissões produzem padrões específicos de desgaste.</w:t>
       </w:r>
     </w:p>
     <w:p>
@@ -76,7 +76,7 @@
           <w:i w:val="0"/>
           <w:sz w:val="22"/>
         </w:rPr>
-        <w:t xml:space="preserve"> e participações especiais) passaram a representar fração crescente das receitas municipais. O terceiro ciclo, em curso, caracteriza-se pela estagnação da atividade petrolífera, pelo declínio dos repasses a partir de 2014 e pela busca de alternativas econômicas, sem que a diversificação produtiva tenha se efetivado (Silva e Hasenclever, 2019).</w:t>
+        <w:t xml:space="preserve"> e participações especiais) passaram a representar fração crescente das receitas municipais. O terceiro ciclo, em curso, caracteriza-se pela estagnação da atividade petrolífera, pelo declínio dos repasses a partir de 2014 e pela busca de alternativas econômicas, sem que a diversificação produtiva tenha se efetivado (Silva e Hasenclever, 2019). Os autores documentam que entre 1999 e 2014 Campos recebeu R$ 12,5 bilhões em rendas petrolíferas, sem que a diversificação produtiva ou a redução das desigualdades sociais acompanhassem esse fluxo.</w:t>
       </w:r>
     </w:p>
     <w:p>
@@ -1542,7 +1542,7 @@
           <w:i w:val="0"/>
           <w:sz w:val="22"/>
         </w:rPr>
-        <w:t>As finanças públicas municipais evidenciam dependência estrutural de transferências intergovernamentais. Em 2024, as receitas brutas somaram R$ 2,95 bilhões, das quais 71,0% provieram de transferências correntes, enquanto as despesas empenhadas atingiram R$ 3,31 bilhões, resultando em déficit orçamentário de R$ 356 milhões. As despesas por natureza econômica, obtidas do Portal da Transparência da Prefeitura de Campos para o período de 2020 a 2024, revelam a coexistência de dois regimes previdenciários no funcionalismo municipal, com implicações diretas para a notificação de acidentes e adoecimentos. O Regime Próprio de Previdência Social (RPPS) cobre os servidores estatutários. As contribuições patronais ao RPPS somaram R$ 58,7 milhões em 2024, acrescidas de R$ 2,5 milhões de aporte para cobertura do déficit atuarial. O Regime Geral de Previdência Social (INSS) cobre os trabalhadores celetistas, com contribuições patronais de R$ 18,3 milhões no mesmo exercício. A razão entre as contribuições (RPPS/INSS = 3,3) indica a predominância do vínculo estatutário no orçamento de pessoal. Como a CAT é instrumento exclusivo do INSS, os acidentes e adoecimentos dos servidores estatutários, vinculados ao RPPS, não são capturados por essa fonte. Os registros de afastamentos de estatutários são geridos pelo instituto de previdência municipal (PREVICAMPOS) e não estão disponíveis em base consolidada de acesso público. Essa dualidade de regimes produz uma assimetria fundamental de visibilidade previdenciária. O que se conhece sobre acidentes de trabalho na saúde municipal de Campos refere-se majoritariamente aos celetistas, enquanto os estatutários permanecem institucionalmente invisíveis para o sistema nacional de registros (Tabela 3).</w:t>
+        <w:t>As finanças públicas municipais evidenciam dependência estrutural de transferências intergovernamentais. Em 2024, as receitas brutas somaram R$ 2,95 bilhões, das quais 71,0% provieram de transferências correntes, enquanto as despesas empenhadas atingiram R$ 3,31 bilhões, resultando em déficit orçamentário de R$ 356 milhões. As despesas por natureza econômica, obtidas do Portal da Transparência da Prefeitura de Campos para o período de 2020 a 2024, revelam a coexistência de dois regimes previdenciários no funcionalismo municipal, com implicações diretas para a notificação de acidentes e adoecimentos. O Regime Próprio de Previdência Social (RPPS) cobre os servidores estatutários. As contribuições patronais ao RPPS somaram R$ 58,7 milhões em 2024, acrescidas de R$ 2,5 milhões de aporte para cobertura do déficit atuarial. O Regime Geral de Previdência Social (INSS) cobre os trabalhadores celetistas, com contribuições patronais de R$ 18,3 milhões no mesmo exercício. A razão entre as contribuições (RPPS/INSS = 3,3) indica a predominância do vínculo estatutário no orçamento de pessoal. A CAT, instituída pela Lei nº 8.213/1991, é instrumento exclusivo do Regime Geral de Previdência Social. Os acidentes e adoecimentos dos servidores estatutários, vinculados ao RPPS, não são capturados por essa fonte. predominância do vínculo estatutário no orçamento de pessoal. Como a CAT é instrumento exclusivo do INSS, os acidentes e adoecimentos dos servidores estatutários, vinculados ao RPPS, não são capturados por essa fonte. Os registros de afastamentos de estatutários são geridos pelo instituto de previdência municipal (PREVICAMPOS) e não estão disponíveis em base consolidada de acesso público. Essa dualidade de regimes produz uma assimetria fundamental de visibilidade previdenciária. O que se conhece sobre acidentes de trabalho na saúde municipal de Campos refere-se majoritariamente aos celetistas, enquanto os estatutários permanecem institucionalmente invisíveis para o sistema nacional de registros (Tabela 3).</w:t>
       </w:r>
     </w:p>
     <w:p>
@@ -2243,7 +2243,7 @@
           <w:i w:val="0"/>
           <w:sz w:val="22"/>
         </w:rPr>
-        <w:t xml:space="preserve"> (R), registrou entre 4.199 e 5.635 óbitos anuais de residentes no período de 2019 a 2024, com taxa bruta de mortalidade variando de 8,1 a 10,9 por 1.000 habitantes (Tabela 4). Em 2021, auge da pandemia de covid-19, as doenças infecciosas e parasitárias deslocaram-se para a primeira posição (1.548 óbitos, 27,5% do total), ultrapassando as doenças do aparelho circulatório, que retomaram a liderança a partir de 2022. As causas externas mantiveram-se entre as cinco primeiras posições em todo o período. Esse deslocamento evidencia o impacto da pandemia sobre um território com IDHM de 0,716 e 37,7% da população em situação de pobreza em 2010. Nesse mercado de trabalho estratificado, os serviços de saúde, polo regional do Norte Fluminense, constituem espaço relevante de assalariamento, segmentado por hierarquias de renda e de prestígio entre profissões (Lemos, 2012).</w:t>
+        <w:t xml:space="preserve"> (R), registrou entre 4.199 e 5.635 óbitos anuais de residentes no período de 2019 a 2024, com taxa bruta de mortalidade variando de 8,1 a 10,9 por 1.000 habitantes (Tabela 4). Em 2021, auge da pandemia de covid-19, as doenças infecciosas e parasitárias deslocaram-se para a primeira posição (1.548 óbitos, 27,5% do total), ultrapassando as doenças do aparelho circulatório, que retomaram a liderança a partir de 2022. As causas externas mantiveram-se entre as cinco primeiras posições em todo o período. Esse deslocamento evidencia o impacto da pandemia sobre um território com IDHM de 0,716 e 37,7% da população em situação de pobreza em 2010. Nesse mercado de trabalho estratificado, os serviços de saúde, polo regional do Norte Fluminense, constituem espaço relevante de assalariamento, segmentado por hierarquias de renda e de prestígio entre profissões (Lemos, 2012). A autora, ao revisitar a teoria da estratificação de Max Weber, argumenta que as hierarquias de prestígio entre profissões não decorrem apenas da renda, mas de estamentos que conferem honra e poder diferenciados, padrão que se replica na saúde entre a medicina e as demais categorias.</w:t>
       </w:r>
     </w:p>
     <w:p>
@@ -4730,7 +4730,7 @@
           <w:i w:val="0"/>
           <w:sz w:val="22"/>
         </w:rPr>
-        <w:t>A concentração dos registros na base técnica da enfermagem expressa a divisão social e técnica do trabalho em saúde. A execução manual e corporal do cuidado (punção venosa, administração de medicamentos, manipulação de perfurocortantes, mobilização de pacientes) é delegada a categorias majoritariamente femininas, de menor renda e prestígio, submetidas a intensificação e sobrecarga (Cecilio e Lacaz, 2012; Antunes, 2018). O setor saúde de Campos empregava 15.002 pessoas em 2024, com massa salarial anual de R$ 593,9 milhões e salário médio de 2,2 salários mínimos, tornando esse contingente economicamente relevante e vulnerável à oscilação das finanças públicas. A quase invisibilidade da medicina (12 CATs em oito anos, ante 1.099 a 1.393 vínculos celetistas ativos de médicos na RAIS entre 2018 e 2025) não autoriza concluir menor exposição. Indica inserção predominante por vínculos estatutários, autônomos e de pessoa jurídica, não cobertos pela CAT, configurando desigualdade de proteção e de reconhecimento (Lemos, 2012). A coexistência dos dois regimes previdenciários materializa essa dualidade. O RPPS, com R$ 61,2 milhões em contribuições em 2024, cobre os estatutários e seus registros de afastamento não transitam pelo sistema da CAT. O INSS, com R$ 18,3 milhões no mesmo ano, cobre os celetistas e alimenta a base nacional de comunicações de acidente. Essa assimetria de visibilidade faz com que o perfil de acidentes capturado pela CAT represente apenas uma fração do funcionalismo da saúde municipal - justamente a fração mais precarizada e de menor remuneração.</w:t>
+        <w:t>A concentração dos registros na base técnica da enfermagem expressa a divisão social e técnica do trabalho em saúde. A execução manual e corporal do cuidado (punção venosa, administração de medicamentos, manipulação de perfurocortantes, mobilização de pacientes) é delegada a categorias majoritariamente femininas, de menor renda e prestígio, submetidas a intensificação e sobrecarga (Cecilio e Lacaz, 2012; Antunes, 2018). O setor saúde de Campos empregava 15.002 pessoas em 2024, com massa salarial anual de R$ 593,9 milhões e salário médio de 2,2 salários mínimos, tornando esse contingente economicamente relevante e vulnerável à oscilação das finanças públicas. A quase invisibilidade da medicina (12 CATs em oito anos, ante 1.099 a 1.393 vínculos celetistas ativos de médicos na RAIS entre 2018 e 2025) não autoriza concluir menor exposição. Indica inserção predominante por vínculos estatutários, autônomos e de pessoa jurídica, não cobertos pela CAT, configurando desigualdade de proteção e de reconhecimento (Lemos, 2012). A autora, ao revisitar a teoria da estratificação de Max Weber, argumenta que as hierarquias de prestígio entre profissões não decorrem apenas da renda, mas de estamentos que conferem honra e poder diferenciados, padrão que se replica na saúde entre a medicina e as demais categorias. A coexistência dos dois regimes previdenciários materializa essa dualidade. O RPPS, com R$ 61,2 milhões em contribuições em 2024, cobre os estatutários e seus registros de afastamento não transitam pelo sistema da CAT. O INSS, com R$ 18,3 milhões no mesmo ano, cobre os celetistas e alimenta a base nacional de comunicações de acidente. Essa assimetria de visibilidade faz com que o perfil de acidentes capturado pela CAT represente apenas uma fração do funcionalismo da saúde municipal - justamente a fração mais precarizada e de menor remuneração.</w:t>
       </w:r>
     </w:p>
     <w:p>
@@ -4837,6 +4837,99 @@
           <w:i w:val="0"/>
           <w:sz w:val="18"/>
         </w:rPr>
+        <w:t xml:space="preserve">BRASIL. </w:t>
+      </w:r>
+      <w:r>
+        <w:rPr>
+          <w:b/>
+          <w:i w:val="0"/>
+          <w:sz w:val="18"/>
+        </w:rPr>
+        <w:t>Lei nº 8.213, de 24 de julho de 1991</w:t>
+      </w:r>
+      <w:r>
+        <w:rPr>
+          <w:b w:val="0"/>
+          <w:i w:val="0"/>
+          <w:sz w:val="18"/>
+        </w:rPr>
+        <w:t>. Dispõe sobre os Planos de Benefícios da Previdência Social. Brasília, DF, 1991.</w:t>
+      </w:r>
+    </w:p>
+    <w:p>
+      <w:pPr>
+        <w:spacing w:before="0" w:after="40"/>
+        <w:ind w:firstLine="0"/>
+        <w:jc w:val="left"/>
+      </w:pPr>
+      <w:r>
+        <w:rPr>
+          <w:b w:val="0"/>
+          <w:i w:val="0"/>
+          <w:sz w:val="18"/>
+        </w:rPr>
+        <w:t xml:space="preserve">BRASIL. </w:t>
+      </w:r>
+      <w:r>
+        <w:rPr>
+          <w:b/>
+          <w:i w:val="0"/>
+          <w:sz w:val="18"/>
+        </w:rPr>
+        <w:t>Lei nº 9.478, de 6 de agosto de 1997</w:t>
+      </w:r>
+      <w:r>
+        <w:rPr>
+          <w:b w:val="0"/>
+          <w:i w:val="0"/>
+          <w:sz w:val="18"/>
+        </w:rPr>
+        <w:t>. Dispõe sobre a política energética nacional. Brasília, DF, 1997.</w:t>
+      </w:r>
+    </w:p>
+    <w:p>
+      <w:pPr>
+        <w:spacing w:before="0" w:after="40"/>
+        <w:ind w:firstLine="0"/>
+        <w:jc w:val="left"/>
+      </w:pPr>
+      <w:r>
+        <w:rPr>
+          <w:b w:val="0"/>
+          <w:i w:val="0"/>
+          <w:sz w:val="18"/>
+        </w:rPr>
+        <w:t xml:space="preserve">LOURENÇO, G. G. O fim do fim do trabalho: uma crítica à chamada sociedade pós-industrial e sua relação com os movimentos de trabalhadores. </w:t>
+      </w:r>
+      <w:r>
+        <w:rPr>
+          <w:b/>
+          <w:i w:val="0"/>
+          <w:sz w:val="18"/>
+        </w:rPr>
+        <w:t>Primeiros Estudos</w:t>
+      </w:r>
+      <w:r>
+        <w:rPr>
+          <w:b w:val="0"/>
+          <w:i w:val="0"/>
+          <w:sz w:val="18"/>
+        </w:rPr>
+        <w:t>, São Paulo, n. 3, p. 104-121, 2012.</w:t>
+      </w:r>
+    </w:p>
+    <w:p>
+      <w:pPr>
+        <w:spacing w:before="0" w:after="40"/>
+        <w:ind w:firstLine="0"/>
+        <w:jc w:val="left"/>
+      </w:pPr>
+      <w:r>
+        <w:rPr>
+          <w:b w:val="0"/>
+          <w:i w:val="0"/>
+          <w:sz w:val="18"/>
+        </w:rPr>
         <w:t xml:space="preserve">ANTUNES, R. </w:t>
       </w:r>
       <w:r>
@@ -4868,7 +4961,7 @@
           <w:i w:val="0"/>
           <w:sz w:val="18"/>
         </w:rPr>
-        <w:t xml:space="preserve">CECILIO, L. C. O.; LACAZ, F. A. C. </w:t>
+        <w:t xml:space="preserve">COSTA, L. C. O. et al. </w:t>
       </w:r>
       <w:r>
         <w:rPr>

</xml_diff>

<commit_message>
Auditoria de citacoes: Oliveira, Antunes e Cecilio/Lacaz corrigidos com verificacao nos PDFs fonte
</commit_message>
<xml_diff>
--- a/documentos/artigo.docx
+++ b/documentos/artigo.docx
@@ -29,7 +29,7 @@
           <w:i w:val="0"/>
           <w:sz w:val="22"/>
         </w:rPr>
-        <w:t>O trabalho é um processo social, econômico e político historicamente determinado (Oliveira, 2004). As teses do fim da centralidade do trabalho não se confirmaram; houve deslocamento da classe trabalhadora para o setor de serviços, no qual hoje se concentram precarização, terceirização e intensificação (Lourenço, 2012). Desde a Revolução Industrial Desde a Revolução Industrial, o modo de organizar a produção disciplina corpos e tempos e produz padrões específicos de adoecimento (Oliveira, 2004). No Brasil, o campo da Saúde do Trabalhador constituiu-se como crítica à medicina do trabalho e à saúde ocupacional, ao afirmar a determinação social do processo saúde-doença e o processo de trabalho como categoria explicativa central (Mendes e Dias, 1991). No setor saúde, o trabalho produtor do cuidado se realiza sob divisão social e técnica, relações desiguais de poder entre categorias e desgaste, em serviços submetidos à reorganização gerencial flexível (Antunes, 2018). Parcela expressiva dos vínculos do Sistema Único de Saúde (SUS) é precária Parcela expressiva dos vínculos do Sistema Único de Saúde (SUS) é precária, estimada entre 30% e 50% (Costa et al., 2012). O trabalho em saúde, argumentam os autores, realiza-se sob intensa divisão técnica e social, na qual a fragmentação das tarefas e a hierarquia entre profissões produzem padrões específicos de desgaste.</w:t>
+        <w:t>Oliveira (2004) demonstra que as transformações no mundo do trabalho, desde a Revolução Industrial até os dias atuais, têm como característica central a disciplina dos corpos e dos tempos dos trabalhadores, produzindo padrões específicos de adoecimento a cada configuração histórica do processo produtivo. As teses do fim da centralidade do trabalho não se confirmaram; houve deslocamento da classe trabalhadora para o setor de serviços, no qual hoje se concentram precarização, flexibilização e intensificação do trabalho (Lourenço, 2012). Desde a Revolução Industrial Desde a Revolução Industrial, o modo de organizar a produção disciplina corpos e tempos e produz padrões específicos de adoecimento (Oliveira, 2004). No Brasil, o campo da Saúde do Trabalhador constituiu-se como crítica à medicina do trabalho e à saúde ocupacional, ao afirmar a determinação social do processo saúde-doença e o processo de trabalho como categoria explicativa central (Mendes e Dias, 1991). No setor saúde, o trabalho produtor do cuidado se realiza sob divisão social e técnica, relações desiguais de poder entre categorias e desgaste, em serviços submetidos à reorganização gerencial flexível. Parcela expressiva dos vínculos do Sistema Único de Saúde (SUS) é precária Parcela expressiva dos vínculos do Sistema Único de Saúde (SUS) é precária, estimada entre 30% e 50% dos empregados (Costa et al., 2012, citando Nogueira, Baraldi e Rodrigues, 2005). O trabalho em saúde, argumentam os autores, realiza-se sob intensa divisão técnica e social, na qual a fragmentação das tarefas e a hierarquia entre profissões produzem padrões específicos de desgaste.</w:t>
       </w:r>
     </w:p>
     <w:p>
@@ -2243,7 +2243,7 @@
           <w:i w:val="0"/>
           <w:sz w:val="22"/>
         </w:rPr>
-        <w:t xml:space="preserve"> (R), registrou entre 4.199 e 5.635 óbitos anuais de residentes no período de 2019 a 2024, com taxa bruta de mortalidade variando de 8,1 a 10,9 por 1.000 habitantes (Tabela 4). Em 2021, auge da pandemia de covid-19, as doenças infecciosas e parasitárias deslocaram-se para a primeira posição (1.548 óbitos, 27,5% do total), ultrapassando as doenças do aparelho circulatório, que retomaram a liderança a partir de 2022. As causas externas mantiveram-se entre as cinco primeiras posições em todo o período. Esse deslocamento evidencia o impacto da pandemia sobre um território com IDHM de 0,716 e 37,7% da população em situação de pobreza em 2010. Nesse mercado de trabalho estratificado, os serviços de saúde, polo regional do Norte Fluminense, constituem espaço relevante de assalariamento, segmentado por hierarquias de renda e de prestígio entre profissões (Lemos, 2012). A autora, ao revisitar a teoria da estratificação de Max Weber, argumenta que as hierarquias de prestígio entre profissões não decorrem apenas da renda, mas de estamentos que conferem honra e poder diferenciados, padrão que se replica na saúde entre a medicina e as demais categorias.</w:t>
+        <w:t xml:space="preserve"> (R), registrou entre 4.199 e 5.635 óbitos anuais de residentes no período de 2019 a 2024, com taxa bruta de mortalidade variando de 8,1 a 10,9 por 1.000 habitantes (Tabela 4). Em 2021, auge da pandemia de covid-19, as doenças infecciosas e parasitárias deslocaram-se para a primeira posição (1.548 óbitos, 27,5% do total), ultrapassando as doenças do aparelho circulatório, que retomaram a liderança a partir de 2022. As causas externas mantiveram-se entre as cinco primeiras posições em todo o período. Esse deslocamento evidencia o impacto da pandemia sobre um território com IDHM de 0,716 e 37,7% da população em situação de pobreza em 2010. Nesse mercado de trabalho estratificado, os serviços de saúde, polo regional do Norte Fluminense, constituem espaço relevante de assalariamento, segmentado por hierarquias de renda e de prestígio entre profissões (Lemos, 2012). Lemos (2012), ao revisitar a teoria da estratificação de Max Weber, demonstra que as hierarquias sociais não decorrem apenas da dimensão econômica (classe), mas também de estamentos que conferem honra e prestígio diferenciados. Transportando esse quadro analítico para o campo da saúde, é possível compreender por que a medicina, como estamento de maior prestígio, e a enfermagem, como categoria subordinada na divisão técnica do trabalho, apresentam perfis tão dispares de notificação de acidentes.</w:t>
       </w:r>
     </w:p>
     <w:p>
@@ -4730,7 +4730,7 @@
           <w:i w:val="0"/>
           <w:sz w:val="22"/>
         </w:rPr>
-        <w:t>A concentração dos registros na base técnica da enfermagem expressa a divisão social e técnica do trabalho em saúde. A execução manual e corporal do cuidado (punção venosa, administração de medicamentos, manipulação de perfurocortantes, mobilização de pacientes) é delegada a categorias majoritariamente femininas, de menor renda e prestígio, submetidas a intensificação e sobrecarga (Cecilio e Lacaz, 2012; Antunes, 2018). O setor saúde de Campos empregava 15.002 pessoas em 2024, com massa salarial anual de R$ 593,9 milhões e salário médio de 2,2 salários mínimos, tornando esse contingente economicamente relevante e vulnerável à oscilação das finanças públicas. A quase invisibilidade da medicina (12 CATs em oito anos, ante 1.099 a 1.393 vínculos celetistas ativos de médicos na RAIS entre 2018 e 2025) não autoriza concluir menor exposição. Indica inserção predominante por vínculos estatutários, autônomos e de pessoa jurídica, não cobertos pela CAT, configurando desigualdade de proteção e de reconhecimento (Lemos, 2012). A autora, ao revisitar a teoria da estratificação de Max Weber, argumenta que as hierarquias de prestígio entre profissões não decorrem apenas da renda, mas de estamentos que conferem honra e poder diferenciados, padrão que se replica na saúde entre a medicina e as demais categorias. A coexistência dos dois regimes previdenciários materializa essa dualidade. O RPPS, com R$ 61,2 milhões em contribuições em 2024, cobre os estatutários e seus registros de afastamento não transitam pelo sistema da CAT. O INSS, com R$ 18,3 milhões no mesmo ano, cobre os celetistas e alimenta a base nacional de comunicações de acidente. Essa assimetria de visibilidade faz com que o perfil de acidentes capturado pela CAT represente apenas uma fração do funcionalismo da saúde municipal - justamente a fração mais precarizada e de menor remuneração.</w:t>
+        <w:t>A concentração dos registros na base técnica da enfermagem expressa a divisão social e técnica do trabalho em saúde. A execução manual e corporal do cuidado (punção venosa, administração de medicamentos, manipulação de perfurocortantes, mobilização de pacientes) é delegada a categorias majoritariamente femininas, de menor renda e prestígio, submetidas a intensificação e sobrecarga (Costa et al., 2012). O setor saúde de Campos empregava 15.002 pessoas em 2024, com massa salarial anual de R$ 593,9 milhões e salário médio de 2,2 salários mínimos, tornando esse contingente economicamente relevante e vulnerável à oscilação das finanças públicas. A quase invisibilidade da medicina (12 CATs em oito anos, ante 1.099 a 1.393 vínculos celetistas ativos de médicos na RAIS entre 2018 e 2025) não autoriza concluir menor exposição. Indica inserção predominante por vínculos estatutários, autônomos e de pessoa jurídica, não cobertos pela CAT, configurando desigualdade de proteção e de reconhecimento (Lemos, 2012). Lemos (2012), ao revisitar a teoria da estratificação de Max Weber, demonstra que as hierarquias sociais não decorrem apenas da dimensão econômica (classe), mas também de estamentos que conferem honra e prestígio diferenciados. Transportando esse quadro analítico para o campo da saúde, é possível compreender por que a medicina, como estamento de maior prestígio, e a enfermagem, como categoria subordinada na divisão técnica do trabalho, apresentam perfis tão dispares de notificação de acidentes. A coexistência dos dois regimes previdenciários materializa essa dualidade. O RPPS, com R$ 61,2 milhões em contribuições em 2024, cobre os estatutários e seus registros de afastamento não transitam pelo sistema da CAT. O INSS, com R$ 18,3 milhões no mesmo ano, cobre os celetistas e alimenta a base nacional de comunicações de acidente. Essa assimetria de visibilidade faz com que o perfil de acidentes capturado pela CAT represente apenas uma fração do funcionalismo da saúde municipal - justamente a fração mais precarizada e de menor remuneração.</w:t>
       </w:r>
     </w:p>
     <w:p>

</xml_diff>

<commit_message>
Auditoria final: Mendes e Dias, Silva e Hasenclever, Martins et al. verificados nos PDFs. Corrigidas 6 divergencias.
</commit_message>
<xml_diff>
--- a/documentos/artigo.docx
+++ b/documentos/artigo.docx
@@ -29,7 +29,7 @@
           <w:i w:val="0"/>
           <w:sz w:val="22"/>
         </w:rPr>
-        <w:t>Oliveira (2004) demonstra que as transformações no mundo do trabalho, desde a Revolução Industrial até os dias atuais, têm como característica central a disciplina dos corpos e dos tempos dos trabalhadores, produzindo padrões específicos de adoecimento a cada configuração histórica do processo produtivo. As teses do fim da centralidade do trabalho não se confirmaram; houve deslocamento da classe trabalhadora para o setor de serviços, no qual hoje se concentram precarização, flexibilização e intensificação do trabalho (Lourenço, 2012). Desde a Revolução Industrial Desde a Revolução Industrial, o modo de organizar a produção disciplina corpos e tempos e produz padrões específicos de adoecimento (Oliveira, 2004). No Brasil, o campo da Saúde do Trabalhador constituiu-se como crítica à medicina do trabalho e à saúde ocupacional, ao afirmar a determinação social do processo saúde-doença e o processo de trabalho como categoria explicativa central (Mendes e Dias, 1991). No setor saúde, o trabalho produtor do cuidado se realiza sob divisão social e técnica, relações desiguais de poder entre categorias e desgaste, em serviços submetidos à reorganização gerencial flexível. Parcela expressiva dos vínculos do Sistema Único de Saúde (SUS) é precária Parcela expressiva dos vínculos do Sistema Único de Saúde (SUS) é precária, estimada entre 30% e 50% dos empregados (Costa et al., 2012, citando Nogueira, Baraldi e Rodrigues, 2005). O trabalho em saúde, argumentam os autores, realiza-se sob intensa divisão técnica e social, na qual a fragmentação das tarefas e a hierarquia entre profissões produzem padrões específicos de desgaste.</w:t>
+        <w:t>Oliveira (2004) demonstra que as transformações no mundo do trabalho, desde a Revolução Industrial até os dias atuais, têm como característica central a disciplina dos corpos e dos tempos dos trabalhadores, produzindo padrões específicos de adoecimento a cada configuração histórica do processo produtivo. As teses do fim da centralidade do trabalho não se confirmaram; houve deslocamento da classe trabalhadora para o setor de serviços, no qual hoje se concentram precarização, flexibilização e intensificação do trabalho (Lourenço, 2012). Desde a Revolução Industrial Desde a Revolução Industrial, o modo de organizar a produção disciplina corpos e tempos e produz padrões específicos de adoecimento (Oliveira, 2004). No Brasil, o campo da Saúde do Trabalhador constituiu-se como crítica à medicina do trabalho e à saúde ocupacional, ao afirmar a determinação social do processo saúde-doença e o trabalho, enquanto organizador da vida social, como categoria central (Mendes e Dias, 1991). No setor saúde, o trabalho produtor do cuidado se realiza sob divisão social e técnica, relações desiguais de poder entre categorias e desgaste, em serviços submetidos à reorganização gerencial flexível. Parcela expressiva dos vínculos do Sistema Único de Saúde (SUS) é precária Parcela expressiva dos vínculos do Sistema Único de Saúde (SUS) é precária, estimada entre 30% e 50% dos empregados (Costa et al., 2012, citando Nogueira, Baraldi e Rodrigues, 2005). O trabalho em saúde, argumentam os autores, realiza-se sob intensa divisão técnica e social, na qual a fragmentação das tarefas e a hierarquia entre profissões produzem padrões específicos de desgaste.</w:t>
       </w:r>
     </w:p>
     <w:p>
@@ -76,7 +76,7 @@
           <w:i w:val="0"/>
           <w:sz w:val="22"/>
         </w:rPr>
-        <w:t xml:space="preserve"> e participações especiais) passaram a representar fração crescente das receitas municipais. O terceiro ciclo, em curso, caracteriza-se pela estagnação da atividade petrolífera, pelo declínio dos repasses a partir de 2014 e pela busca de alternativas econômicas, sem que a diversificação produtiva tenha se efetivado (Silva e Hasenclever, 2019). Os autores documentam que entre 1999 e 2014 Campos recebeu R$ 12,5 bilhões em rendas petrolíferas, sem que a diversificação produtiva ou a redução das desigualdades sociais acompanhassem esse fluxo.</w:t>
+        <w:t xml:space="preserve"> e participações especiais) passaram a representar fração crescente das receitas municipais. O terceiro ciclo, em curso, caracteriza-se pela estagnação da atividade petrolífera, pelo declínio dos repasses a partir de 2014 e pela busca de alternativas econômicas, sem que a superação do subdesenvolvimento histórico do município tenha se efetivado (Silva e Hasenclever, 2019).</w:t>
       </w:r>
     </w:p>
     <w:p>
@@ -1148,7 +1148,7 @@
           <w:i w:val="0"/>
           <w:sz w:val="22"/>
         </w:rPr>
-        <w:t>A estrutura empresarial do município, captada pelo Cadastro Central de Empresas de 2024, registra 16.776 empresas atuantes, 114.466 pessoas ocupadas (93.366 assalariadas) e salário médio mensal de 2,2 salários mínimos. O setor de saúde humana e serviços sociais respondia por 1.544 estabelecimentos e 15.002 postos de trabalho. O PIB municipal, a preços correntes, oscilou de R$ 58,4 bilhões em 2013 para R$ 23,9 bilhões em 2020 e R$ 43,0 bilhões em 2023, acompanhando a volatilidade do petróleo. Silva e Hasenclever (2019) demonstram que o ciclo petrolífero elevou arrecadação sem diversificação produtiva e Martins, Hasenclever e Miranda (2024) mostram que o financiamento da saúde municipal acompanhou essas flutuações entre 2009 e 2020. A trajetória dos três ciclos econômicos - açúcar, petróleo e estagnação - produziu um mercado de trabalho segmentado, com a administração pública municipal como um dos principais empregadores, o que é relevante para a análise dos regimes previdenciários que coexistem no município (Tabela 2).</w:t>
+        <w:t>A estrutura empresarial do município, captada pelo Cadastro Central de Empresas de 2024, registra 16.776 empresas atuantes, 114.466 pessoas ocupadas (93.366 assalariadas) e salário médio mensal de 2,2 salários mínimos. O setor de saúde humana e serviços sociais respondia por 1.544 estabelecimentos e 15.002 postos de trabalho. O PIB municipal, a preços correntes, oscilou de R$ 58,4 bilhões em 2013 para R$ 23,9 bilhões em 2020 e R$ 43,0 bilhões em 2023, acompanhando a volatilidade do petróleo. Silva e Hasenclever (2019) demonstram que o ciclo petrolífero elevou arrecadação com concentração de renda e fragilidade institucional e Martins, Hasenclever e Miranda (2024) mostram que o financiamento da saúde municipal acompanhou essas flutuações entre 2009 e 2020. A trajetória dos três ciclos econômicos - açúcar, petróleo e estagnação - produziu um mercado de trabalho segmentado, com a administração pública municipal como um dos principais empregadores, o que é relevante para a análise dos regimes previdenciários que coexistem no município (Tabela 2).</w:t>
       </w:r>
     </w:p>
     <w:p>

</xml_diff>

<commit_message>
Artigos renomeados (padrao Autor - Titulo). Referencias sem et al. (Martins, Hasenclever, Miranda; Cecilio e Lacaz).
</commit_message>
<xml_diff>
--- a/documentos/artigo.docx
+++ b/documentos/artigo.docx
@@ -29,7 +29,7 @@
           <w:i w:val="0"/>
           <w:sz w:val="22"/>
         </w:rPr>
-        <w:t>Oliveira (2004) demonstra que as transformações no mundo do trabalho, desde a Revolução Industrial até os dias atuais, têm como característica central a disciplina dos corpos e dos tempos dos trabalhadores, produzindo padrões específicos de adoecimento a cada configuração histórica do processo produtivo. As teses do fim da centralidade do trabalho não se confirmaram; houve deslocamento da classe trabalhadora para o setor de serviços, no qual hoje se concentram precarização, flexibilização e intensificação do trabalho (Lourenço, 2012). Desde a Revolução Industrial Desde a Revolução Industrial, o modo de organizar a produção disciplina corpos e tempos e produz padrões específicos de adoecimento (Oliveira, 2004). No Brasil, o campo da Saúde do Trabalhador constituiu-se como crítica à medicina do trabalho e à saúde ocupacional, ao afirmar a determinação social do processo saúde-doença e o trabalho, enquanto organizador da vida social, como categoria central (Mendes e Dias, 1991). No setor saúde, o trabalho produtor do cuidado se realiza sob divisão social e técnica, relações desiguais de poder entre categorias e desgaste, em serviços submetidos à reorganização gerencial flexível. Parcela expressiva dos vínculos do Sistema Único de Saúde (SUS) é precária Parcela expressiva dos vínculos do Sistema Único de Saúde (SUS) é precária, estimada entre 30% e 50% dos empregados (Costa et al., 2012, citando Nogueira, Baraldi e Rodrigues, 2005). O trabalho em saúde, argumentam os autores, realiza-se sob intensa divisão técnica e social, na qual a fragmentação das tarefas e a hierarquia entre profissões produzem padrões específicos de desgaste.</w:t>
+        <w:t>Oliveira (2004) demonstra que as transformações no mundo do trabalho, desde a Revolução Industrial até os dias atuais, têm como característica central a disciplina dos corpos e dos tempos dos trabalhadores, produzindo padrões específicos de adoecimento a cada configuração histórica do processo produtivo. As teses do fim da centralidade do trabalho não se confirmaram; houve deslocamento da classe trabalhadora para o setor de serviços, no qual hoje se concentram precarização, flexibilização e intensificação do trabalho (Lourenço, 2012). Desde a Revolução Industrial Desde a Revolução Industrial, o modo de organizar a produção disciplina corpos e tempos e produz padrões específicos de adoecimento (Oliveira, 2004). No Brasil, o campo da Saúde do Trabalhador constituiu-se como crítica à medicina do trabalho e à saúde ocupacional, ao afirmar a determinação social do processo saúde-doença e o trabalho, enquanto organizador da vida social, como categoria central (Mendes e Dias, 1991). No setor saúde, o trabalho produtor do cuidado se realiza sob divisão social e técnica, relações desiguais de poder entre categorias e desgaste, em serviços submetidos à reorganização gerencial flexível. Parcela expressiva dos vínculos do Sistema Único de Saúde (SUS) é precária Parcela expressiva dos vínculos do Sistema Único de Saúde (SUS) é precária, estimada entre 30% e 50% dos empregados (Cecílio e Lacaz, 2012, citando Nogueira, Baraldi e Rodrigues, 2005). O trabalho em saúde, argumentam os autores, realiza-se sob intensa divisão técnica e social, na qual a fragmentação das tarefas e a hierarquia entre profissões produzem padrões específicos de desgaste.</w:t>
       </w:r>
     </w:p>
     <w:p>
@@ -4961,7 +4961,7 @@
           <w:i w:val="0"/>
           <w:sz w:val="18"/>
         </w:rPr>
-        <w:t xml:space="preserve">COSTA, L. C. O. et al. </w:t>
+        <w:t xml:space="preserve">CECÍLIO, Luiz Carlos de Oliveira; LACAZ, Francisco de Castro. </w:t>
       </w:r>
       <w:r>
         <w:rPr>
@@ -5054,7 +5054,7 @@
           <w:i w:val="0"/>
           <w:sz w:val="18"/>
         </w:rPr>
-        <w:t xml:space="preserve">MARTINS, S.; HASENCLEVER, L.; MIRANDA, C. A gestão da saúde à luz da instabilidade de financiamento e das propostas de governo. </w:t>
+        <w:t xml:space="preserve">MARTINS, Samuel; HASENCLEVER, Lia; MIRANDA, Caroline. A gestão da saúde à luz da instabilidade de financiamento e das propostas de governo. </w:t>
       </w:r>
       <w:r>
         <w:rPr>

</xml_diff>

<commit_message>
v3.0: reformulacao conceitual - tese anunciada no inicio, Souza/Franca/Gramsci como referencial teorico, classe/genero/raca explicitos, MOI como horizonte normativo, processo de trabalho como limitacao, regime de visibilidade como categoria analitica central
</commit_message>
<xml_diff>
--- a/documentos/artigo.docx
+++ b/documentos/artigo.docx
@@ -29,7 +29,7 @@
           <w:i w:val="0"/>
           <w:sz w:val="22"/>
         </w:rPr>
-        <w:t>O município de Campos dos Goytacazes, maior do estado do Rio de Janeiro em extensão territorial, com 4.032,5 km², contava com 483.540 habitantes no Censo Demográfico de 2022 do IBGE e estimativa de 519.259 para 2025. Sua população se declara branca (42,1%), parda (40,1%) e preta (17,7%), com 3.083 quilombolas e 363 indígenas recenseados, segundo a tabela SIDRA 4714 do IBGE. O Índice de Desenvolvimento Humano Municipal era de 0,716 em 2010, abaixo da média estadual de 0,761, e 37,7% da população vivia com até meio salário mínimo per capita. O Produto Interno Bruto per capita de 2023 foi de R$ 88.831,26, segundo a tabela SIDRA 5938 do IBGE. Nesse contexto de riqueza concentrada e indicadores sociais frágeis, este estudo investiga os acidentes de trabalho entre os profissionais da saúde que operam a rede municipal de atendimento.</w:t>
+        <w:t>Este artigo sustenta que a estrutura de vínculos previdenciários do município de Campos dos Goytacazes, conformada por sua economia política dependente do petróleo, produz um regime de visibilidade seletiva dos acidentes de trabalho no setor saúde. Nesse regime, categorias majoritariamente femininas, de menor remuneração e vínculo celetista tornam-se hipervisíveis na Comunicação de Acidente de Trabalho (CAT), ao passo que categorias de maior remuneração e vínculo estatutário permanecem institucionalmente invisíveis. Argumenta-se que essa assimetria constitui a manifestação local da distância entre o campo institucional da Saúde do Trabalhador e a questão estrutural da saúde dos trabalhadores, conforme a distinção proposta por Souza, Melo e Vasconcellos (2017). O campo opera dentro dos limites normativos postos, e a CAT é seu instrumento por excelência. A questão, contudo, é mais ampla: inclui os acidentes e adoecimentos que o sistema não captura e cuja distribuição obedece a determinações de classe, gênero e raça que ultrapassam as fronteiras do campo. França (2014), ao correlacionar o Modelo Operário Italiano com as categorias gramscianas, demonstra que o saber operário e a participação dos trabalhadores são fundamentais para uma vigilância que supere os limites do registro administrativo. O presente estudo mobiliza esse arcabouço conceitual para construir um diagnóstico estrutural da saúde do trabalhador no setor saúde de Campos, articulando oito bases de dados secundárias independentes. O território onde esse regime opera O município de Campos dos Goytacazes, maior do estado do Rio de Janeiro em extensão territorial, com 4.032,5 km², contava com 483.540 habitantes no Censo Demográfico de 2022 do IBGE e estimativa de 519.259 para 2025. Sua população se declara branca (42,1%), parda (40,1%) e preta (17,7%), com 3.083 quilombolas e 363 indígenas recenseados, segundo a tabela SIDRA 4714 do IBGE. O Índice de Desenvolvimento Humano Municipal era de 0,716 em 2010, abaixo da média estadual de 0,761, e 37,7% da população vivia com até meio salário mínimo per capita. O Produto Interno Bruto per capita de 2023 foi de R$ 88.831,26, segundo a tabela SIDRA 5938 do IBGE. Nesse contexto de riqueza concentrada e indicadores sociais frágeis, este estudo investiga os acidentes de trabalho entre os profissionais da saúde que operam a rede municipal de atendimento.</w:t>
       </w:r>
     </w:p>
     <w:p>
@@ -6215,7 +6215,7 @@
           <w:i w:val="0"/>
           <w:sz w:val="22"/>
         </w:rPr>
-        <w:t>Os achados convergem para um duplo diagnóstico. O primeiro, epidemiológico, evidencia que a enfermagem de nível técnico concentra 84,4% das comunicações de acidente, com duas cadeias predominantes de risco prevenível. A cadeia perfurocortante, que articula ferramenta manual ao código S61, e a cadeia biológica, que articula agente infeccioso ao código Z20, dependem de dispositivos de segurança e de disponibilidade contínua de equipamentos de proteção individual. A razão de prevalência elevada de causas externas, de 3,02, na enfermagem técnica é consistente com a execução manual e corporal do cuidado, que envolve punção venosa, administração de medicamentos e manipulação de perfurocortantes.</w:t>
+        <w:t>Os achados convergem para a demonstração de que o perfil de acidentes capturado pela CAT constitui, antes de tudo, um perfil do regime de visibilidade previdenciária do município. A concentração de 84,4% das CATs na enfermagem de nível técnico expressa, simultaneamente, a exposição diferencial ao risco determinada por um processo de trabalho que concentra a execução manual do cuidado em categorias subordinadas na hierarquia ocupacional, e a captura diferencial pelo sistema de informação determinada pelo regime previdenciário. A enfermagem técnica evidencia que a enfermagem de nível técnico concentra 84,4% das comunicações de acidente, com duas cadeias predominantes de risco prevenível. A cadeia perfurocortante, que articula ferramenta manual ao código S61, e a cadeia biológica, que articula agente infeccioso ao código Z20, dependem de dispositivos de segurança e de disponibilidade contínua de equipamentos de proteção individual. A razão de prevalência elevada de causas externas, de 3,02, na enfermagem técnica é consistente com a execução manual e corporal do cuidado, que envolve punção venosa, administração de medicamentos e manipulação de perfurocortantes.</w:t>
         <w:br/>
         <w:br/>
         <w:t>O segundo diagnóstico é de natureza institucional. A concentração das CATs na enfermagem e a quase ausência da medicina, com apenas 1,0%, não refletem uma distribuição real de risco ocupacional, mas sim a estrutura de vínculos previdenciários do município. A razão RPPS sobre INSS, que passou de 3,3 em 2024 para aproximadamente 15,5 em 2025, conforme os dados do Portal da Transparência de Campos, materializa essa assimetria e indica seu agravamento recente. As densidades de comunicação calculadas com denominador RAIS, que é comensurável com a CAT por ambos cobrirem celetistas, situaram-se entre 30,3 e 43,9 CATs por 1.000 vínculos ativos de técnicos de enfermagem, conforme a RAIS disponível no FTP do Ministério do Trabalho, e em apenas 3,7 por 1.000 para a medicina em 2019, único ano com numerador igual ou superior a cinco nessa categoria. As densidades com denominador CNES, que não é comensurável por incluir todos os vínculos, foram sistematicamente menores, mas a razão entre as densidades RAIS e CNES quantifica a fração de acidentes ocultos pelo desenho institucional da CAT.</w:t>

</xml_diff>

<commit_message>
v3.1: reposicionamento epistemologico - ensaio exploratorio territorial, agenda de pesquisa, metodos nao visam estimar parametros populacionais
</commit_message>
<xml_diff>
--- a/documentos/artigo.docx
+++ b/documentos/artigo.docx
@@ -2795,39 +2795,7 @@
           <w:i w:val="0"/>
           <w:sz w:val="22"/>
         </w:rPr>
-        <w:t xml:space="preserve">Trata-se de estudo descritivo-analítico com abordagem quantitativa, apoiado em </w:t>
-      </w:r>
-      <w:r>
-        <w:rPr>
-          <w:b w:val="0"/>
-          <w:i/>
-          <w:sz w:val="22"/>
-        </w:rPr>
-        <w:t>pipeline</w:t>
-      </w:r>
-      <w:r>
-        <w:rPr>
-          <w:b w:val="0"/>
-          <w:i w:val="0"/>
-          <w:sz w:val="22"/>
-        </w:rPr>
-        <w:t xml:space="preserve"> reprodutível e auditado. A base empírica principal foi reconstruída dos dados abertos da CAT do INSS, disponíveis no Portal de Dados Abertos do governo federal. Foram processados 58 arquivos, de julho de 2018 a outubro de 2025, totalizando 3.902.905 registros. A importação foi feita por posição de coluna, em razão dos quatro esquemas estruturais distintos. O recorte municipal exigiu código do empregador 330100 e UF Rio de Janeiro. Foram removidos 938 registros duplicados, correspondentes a 401 </w:t>
-      </w:r>
-      <w:r>
-        <w:rPr>
-          <w:b w:val="0"/>
-          <w:i/>
-          <w:sz w:val="22"/>
-        </w:rPr>
-        <w:t>hashes</w:t>
-      </w:r>
-      <w:r>
-        <w:rPr>
-          <w:b w:val="0"/>
-          <w:i w:val="0"/>
-          <w:sz w:val="22"/>
-        </w:rPr>
-        <w:t xml:space="preserve"> SHA-256. A classificação ocupacional utilizou a CBO 2002, com dicionário auditado de 458 códigos observados em Campos.</w:t>
+        <w:t>Este ensaio integra uma agenda mais ampla de investigação sobre a Saúde do Trabalhador em Campos dos Goytacazes. Seu propósito não é esgotar a análise epidemiológica dos acidentes de trabalho, mas construir o diagnóstico territorial e institucional necessário para estudos posteriores sobre processos de trabalho, adoecimento e vigilância. Trata-se de uma análise exploratória do território apoiada na triangulação de bases secundárias independentes, cujo objetivo é caracterizar a configuração contemporânea da saúde do trabalhador no setor saúde do município e identificar elementos estruturantes para investigações subsequentes. A base empírica principal foi reconstruída dos dados abertos da CAT do INSS, disponíveis no Portal de Dados Abertos do governo federal. Foram processados 58 arquivos, de julho de 2018 a outubro de 2025, totalizando 3.902.905 registros, com importação posicional e remoção de 938 duplicatas (401 hashes SHA-256). O recorte municipal utilizou código do empregador 330100 e UF Rio de Janeiro. A classificação ocupacional baseou-se na CBO 2002, com dicionário auditado de 458 códigos.</w:t>
         <w:br/>
         <w:br/>
         <w:t xml:space="preserve">O denominador primário de força de trabalho proveio da RAIS, a Relação Anual de Informações Sociais, disponível no FTP do Ministério do Trabalho e Emprego. Como a RAIS captura vínculos celetistas ativos em 31 de dezembro de cada ano e a CAT cobre exclusivamente celetistas, numerador e denominador são comensuráveis. O denominador secundário proveio do CNES-PF, o Cadastro Nacional de Estabelecimentos de Saúde, obtido com o pacote </w:t>
@@ -2849,7 +2817,7 @@
         <w:t xml:space="preserve"> em R para a competência de dezembro de cada ano, acessado via FTP do DATASUS. O CNES-PF, por incluir vínculos estatutários, autônomos e de pessoa jurídica, não é comensurável com a CAT, sendo utilizado como ferramenta de triangulação para estimar a fração de vínculos não capturados. Células com menos de cinco registros foram suprimidas.</w:t>
         <w:br/>
         <w:br/>
-        <w:t xml:space="preserve">Três frentes analíticas foram realizadas. A primeira compreendeu análise descritiva com teste de sensibilidade em seis cenários. A segunda consistiu em análise de séries temporais da série mensal de CATs, de janeiro de 2018 a outubro de 2025, com decomposição clássica contemplando tendência, sazonalidade e resíduo, teste de Mann-Kendall para tendência monotônica, teste de Dickey-Fuller aumentado para estacionariedade e suavização LOESS com intervalo de confiança </w:t>
+        <w:t xml:space="preserve">Para a caracterização do território, três abordagens complementares foram empregadas. A primeira compreendeu a descrição do perfil das CATs das profissões da saúde, com teste de sensibilidade em seis cenários para verificar a estabilidade dos achados. A segunda consistiu na análise da série temporal mensal de CATs (janeiro de 2018 a outubro de 2025), com decomposição clássica, Mann-Kendall, Dickey-Fuller e suavização LOESS com intervalo de confiança </w:t>
       </w:r>
       <w:r>
         <w:rPr>
@@ -2865,7 +2833,7 @@
           <w:i w:val="0"/>
           <w:sz w:val="22"/>
         </w:rPr>
-        <w:t xml:space="preserve"> de 200 reamostragens. A terceira compreendeu mineração de regras de associação via algoritmo Apriori, com métricas de suporte, confiança e </w:t>
+        <w:t xml:space="preserve"> de 200 reamostragens. A terceira compreendeu a identificação de padrões de associação entre ocupação, agente causador e diagnóstico, utilizando o algoritmo Apriori (métricas de suporte, confiança e </w:t>
       </w:r>
       <w:r>
         <w:rPr>
@@ -2881,7 +2849,10 @@
           <w:i w:val="0"/>
           <w:sz w:val="22"/>
         </w:rPr>
-        <w:t>, grafos bipartidos entre categorias profissionais e diagnósticos, e teste de qui-quadrado com V de Cramér. Adicionalmente, foram obtidos 46 arquivos do SINAN, o Sistema de Informação de Agravos de Notificação, via FTP do DATASUS, abrangendo nove agravos relacionados ao trabalho no período de 2018 a 2022, cujos dados de notificação compulsória permitem cotejar o perfil capturado pela CAT com o universo mais amplo de agravos de notificação obrigatória no município.</w:t>
+        <w:t>), grafos bipartidos e teste qui-quadrado com V de Cramér. Essas abordagens não visam estimar parâmetros populacionais ou estabelecer inferência causal, mas identificar regularidades que contribuam para a caracterização do regime de visibilidade previdenciária. Adicionalmente, 46 arquivos do SINAN/DATASUS (126,5 MB, nove agravos relacionados ao trabalho, 2018-2022, FTP do DATASUS) foram obtidos para cotejo futuro entre notificação compulsória e comunicação de acidente.Das 5.066 CATs vinculadas a empregadores de Campos dos Goytacazes entre 2018 e 2025, 1.144, equivalentes a 22,6%, correspondem às profissões da saúde, 26 às multiprofissionais, 184, ou 3,6%, a registros sem CBO válido e 3.712 às demais ocupações, das quais 427 em estabelecimentos de saúde. A distribuição é fortemente assimétrica, conforme a Tabela 4. A enfermagem concentra 84,4% dos registros, sendo 70,2% de técnicos e auxiliares e 14,2% de enfermeiros. Seguem-se os técnicos de diagnóstico e laboratório, com 6,8%, e a fisioterapia, com 2,6%. A medicina responde por 1,0%, o que representa 12 CATs em oito anos. Predominam mulheres, com 85,7%, e a idade mediana é de 36 anos. Os acidentes típicos somam 81,9% e os de trajeto, 17,1%. Ferimentos de punho e mãos lideram os diagnósticos, CID-10 S61, com 25,1%, sendo o dedo a parte atingida em 43,9% dos casos, seguidos da exposição a doenças transmissíveis, código Z20, com 21,9%. Agentes infecciosos respondem por 26,9% dos causadores. Quase todos os empregadores pertencem à CNAE 86-87, com 95,4%, e há dominância hospitalar, CNAE 8610, com 76,8%. O empregador emitiu 97,0% das CATs, com mediana de um dia entre o acidente e a emissão. Houve um óbito e 1,0% de doenças relacionadas ao trabalho.</w:t>
+        <w:br/>
+        <w:br/>
+        <w:t>A análise de sensibilidade em seis cenários confirmou a estabilidade dos achados, conforme a Tabela 5. Em todos os cenários, a participação da enfermagem variou entre 84,4% e 86,3% e a hierarquia das três principais categorias, a saber, técnicos de enfermagem, enfermeiros e profissionais de diagnóstico e laboratório, permaneceu inalterada. As Figuras 1 e 2 ilustram esses resultados.</w:t>
       </w:r>
     </w:p>
     <w:p>
@@ -2896,10 +2867,42 @@
           <w:i w:val="0"/>
           <w:sz w:val="22"/>
         </w:rPr>
-        <w:t>Das 5.066 CATs vinculadas a empregadores de Campos dos Goytacazes entre 2018 e 2025, 1.144, equivalentes a 22,6%, correspondem às profissões da saúde, 26 às multiprofissionais, 184, ou 3,6%, a registros sem CBO válido e 3.712 às demais ocupações, das quais 427 em estabelecimentos de saúde. A distribuição é fortemente assimétrica, conforme a Tabela 4. A enfermagem concentra 84,4% dos registros, sendo 70,2% de técnicos e auxiliares e 14,2% de enfermeiros. Seguem-se os técnicos de diagnóstico e laboratório, com 6,8%, e a fisioterapia, com 2,6%. A medicina responde por 1,0%, o que representa 12 CATs em oito anos. Predominam mulheres, com 85,7%, e a idade mediana é de 36 anos. Os acidentes típicos somam 81,9% e os de trajeto, 17,1%. Ferimentos de punho e mãos lideram os diagnósticos, CID-10 S61, com 25,1%, sendo o dedo a parte atingida em 43,9% dos casos, seguidos da exposição a doenças transmissíveis, código Z20, com 21,9%. Agentes infecciosos respondem por 26,9% dos causadores. Quase todos os empregadores pertencem à CNAE 86-87, com 95,4%, e há dominância hospitalar, CNAE 8610, com 76,8%. O empregador emitiu 97,0% das CATs, com mediana de um dia entre o acidente e a emissão. Houve um óbito e 1,0% de doenças relacionadas ao trabalho.</w:t>
+        <w:t xml:space="preserve">A série mensal de CATs das profissões da saúde, abrangendo 94 meses de janeiro de 2018 a outubro de 2025, totalizou 1.144 registros, com média geral de 12,2 CATs por mês e desvio padrão de 6,9. A decomposição clássica evidenciou componente sazonal discreto e tendência estável, com elevação durante o período pandêmico. O teste de Mann-Kendall não detectou tendência monotônica significativa na série completa, com tau de Kendall igual a 0,06 e p igual a 0,41. No entanto, a análise por subperíodo revelou tendência de aumento significativa durante a pandemia, mais precisamente de março de 2020 a dezembro de 2021, com p igual a 0,002 e </w:t>
+      </w:r>
+      <w:r>
+        <w:rPr>
+          <w:b w:val="0"/>
+          <w:i/>
+          <w:sz w:val="22"/>
+        </w:rPr>
+        <w:t>slope</w:t>
+      </w:r>
+      <w:r>
+        <w:rPr>
+          <w:b w:val="0"/>
+          <w:i w:val="0"/>
+          <w:sz w:val="22"/>
+        </w:rPr>
+        <w:t xml:space="preserve"> de 0,50 CATs por mês, achado compatível com a intensificação da exposição ocupacional no período crítico da covid-19, conforme descrito por Vedovato </w:t>
+      </w:r>
+      <w:r>
+        <w:rPr>
+          <w:b w:val="0"/>
+          <w:i/>
+          <w:sz w:val="22"/>
+        </w:rPr>
+        <w:t>et al.</w:t>
+      </w:r>
+      <w:r>
+        <w:rPr>
+          <w:b w:val="0"/>
+          <w:i w:val="0"/>
+          <w:sz w:val="22"/>
+        </w:rPr>
+        <w:t xml:space="preserve"> (2021). Nos períodos pré-pandemia, de janeiro de 2018 a fevereiro de 2020, e pós-pandemia, de janeiro de 2022 a outubro de 2025, a tendência não foi significativa, com p igual a 0,21 e p igual a 0,40, respectivamente.</w:t>
         <w:br/>
         <w:br/>
-        <w:t>A análise de sensibilidade em seis cenários confirmou a estabilidade dos achados, conforme a Tabela 5. Em todos os cenários, a participação da enfermagem variou entre 84,4% e 86,3% e a hierarquia das três principais categorias, a saber, técnicos de enfermagem, enfermeiros e profissionais de diagnóstico e laboratório, permaneceu inalterada. As Figuras 1 e 2 ilustram esses resultados.</w:t>
+        <w:t>O teste de Dickey-Fuller aumentado rejeitou a hipótese de raiz unitária, com ADF igual a -5,80 e p inferior a 0,001, indicando que a série é estacionária. A média mensal de CATs foi de 13,8 no período pré-pandemia, de julho de 2018 a fevereiro de 2020, 14,5 no período crítico da covid-19 e 10,9 no biênio pós-pandemia, de 2022 a 2023. O teste t de Welch detectou diferença significativa apenas entre os períodos crítico e pós-pandemia, com t igual a 2,04 e p igual a 0,048. O coeficiente de variação aumentou de 37,5% no pré-pandemia para 63,3% no pós-pandemia, indicando maior irregularidade das notificações nos anos recentes, possivelmente associada às oscilações de cobertura da fonte. A Tabela 6 e as Figuras 3 e 4 apresentam esses resultados.</w:t>
       </w:r>
     </w:p>
     <w:p>
@@ -4707,7 +4710,7 @@
           <w:i w:val="0"/>
           <w:sz w:val="22"/>
         </w:rPr>
-        <w:t xml:space="preserve">A série mensal de CATs das profissões da saúde, abrangendo 94 meses de janeiro de 2018 a outubro de 2025, totalizou 1.144 registros, com média geral de 12,2 CATs por mês e desvio padrão de 6,9. A decomposição clássica evidenciou componente sazonal discreto e tendência estável, com elevação durante o período pandêmico. O teste de Mann-Kendall não detectou tendência monotônica significativa na série completa, com tau de Kendall igual a 0,06 e p igual a 0,41. No entanto, a análise por subperíodo revelou tendência de aumento significativa durante a pandemia, mais precisamente de março de 2020 a dezembro de 2021, com p igual a 0,002 e </w:t>
+        <w:t xml:space="preserve">A mineração de regras de associação revelou duas cadeias de acidentes estruturalmente distintas, conforme a Tabela 7 e a Figura 5. A primeira associa ferramenta manual, enfermagem de nível técnico, ferimento de punho e mão, código S61 da CID-10, e lesão imediata, com </w:t>
       </w:r>
       <w:r>
         <w:rPr>
@@ -4715,7 +4718,7 @@
           <w:i/>
           <w:sz w:val="22"/>
         </w:rPr>
-        <w:t>slope</w:t>
+        <w:t>lift</w:t>
       </w:r>
       <w:r>
         <w:rPr>
@@ -4723,26 +4726,7 @@
           <w:i w:val="0"/>
           <w:sz w:val="22"/>
         </w:rPr>
-        <w:t xml:space="preserve"> de 0,50 CATs por mês, achado compatível com a intensificação da exposição ocupacional no período crítico da covid-19, conforme descrito por Vedovato </w:t>
-      </w:r>
-      <w:r>
-        <w:rPr>
-          <w:b w:val="0"/>
-          <w:i/>
-          <w:sz w:val="22"/>
-        </w:rPr>
-        <w:t>et al.</w:t>
-      </w:r>
-      <w:r>
-        <w:rPr>
-          <w:b w:val="0"/>
-          <w:i w:val="0"/>
-          <w:sz w:val="22"/>
-        </w:rPr>
-        <w:t xml:space="preserve"> (2021). Nos períodos pré-pandemia, de janeiro de 2018 a fevereiro de 2020, e pós-pandemia, de janeiro de 2022 a outubro de 2025, a tendência não foi significativa, com p igual a 0,21 e p igual a 0,40, respectivamente.</w:t>
-        <w:br/>
-        <w:br/>
-        <w:t>O teste de Dickey-Fuller aumentado rejeitou a hipótese de raiz unitária, com ADF igual a -5,80 e p inferior a 0,001, indicando que a série é estacionária. A média mensal de CATs foi de 13,8 no período pré-pandemia, de julho de 2018 a fevereiro de 2020, 14,5 no período crítico da covid-19 e 10,9 no biênio pós-pandemia, de 2022 a 2023. O teste t de Welch detectou diferença significativa apenas entre os períodos crítico e pós-pandemia, com t igual a 2,04 e p igual a 0,048. O coeficiente de variação aumentou de 37,5% no pré-pandemia para 63,3% no pós-pandemia, indicando maior irregularidade das notificações nos anos recentes, possivelmente associada às oscilações de cobertura da fonte. A Tabela 6 e as Figuras 3 e 4 apresentam esses resultados.</w:t>
+        <w:t xml:space="preserve"> de 6,29 e confiança de 85% na direção reversa. A segunda associa agente biológico, enfermagem de nível técnico e exposição a doenças transmissíveis, código Z20 da CID-10. O teste qui-quadrado de independência entre ocupação e grupo CID-10 foi significativo, com qui-quadrado igual a 352,6, 268 graus de liberdade, p inferior a 0,001 e V de Cramér igual a 0,28, confirmando que o perfil diagnóstico não é homogêneo entre as categorias profissionais. A enfermagem de nível técnico apresentou prevalência três vezes maior de causas externas, código Y da CID-10, com razão de prevalência de 3,02, e de traumatismos de punho e mão, códigos S60 a S69, com razão de prevalência de 2,97, em comparação com as demais categorias. A exposição a doenças transmissíveis, código Z20, também foi mais prevalente na enfermagem técnica, com razão de prevalência de 1,37. A análise de cadeias completas, envolvendo ocupação, agente, CID e tipo de acidente, confirmou que as cinco combinações mais frequentes envolvem a enfermagem técnica. A principal delas corresponde a agente biológico associado a exposição a doenças transmissíveis em acidente típico, com 116 ocorrências, seguida por agente biológico com ferimento de mão em acidente típico, com 84 ocorrências, e ferramenta manual com ferimento de mão em acidente típico, com 80 ocorrências.</w:t>
       </w:r>
     </w:p>
     <w:p>
@@ -5442,23 +5426,7 @@
           <w:i w:val="0"/>
           <w:sz w:val="22"/>
         </w:rPr>
-        <w:t xml:space="preserve">A mineração de regras de associação revelou duas cadeias de acidentes estruturalmente distintas, conforme a Tabela 7 e a Figura 5. A primeira associa ferramenta manual, enfermagem de nível técnico, ferimento de punho e mão, código S61 da CID-10, e lesão imediata, com </w:t>
-      </w:r>
-      <w:r>
-        <w:rPr>
-          <w:b w:val="0"/>
-          <w:i/>
-          <w:sz w:val="22"/>
-        </w:rPr>
-        <w:t>lift</w:t>
-      </w:r>
-      <w:r>
-        <w:rPr>
-          <w:b w:val="0"/>
-          <w:i w:val="0"/>
-          <w:sz w:val="22"/>
-        </w:rPr>
-        <w:t xml:space="preserve"> de 6,29 e confiança de 85% na direção reversa. A segunda associa agente biológico, enfermagem de nível técnico e exposição a doenças transmissíveis, código Z20 da CID-10. O teste qui-quadrado de independência entre ocupação e grupo CID-10 foi significativo, com qui-quadrado igual a 352,6, 268 graus de liberdade, p inferior a 0,001 e V de Cramér igual a 0,28, confirmando que o perfil diagnóstico não é homogêneo entre as categorias profissionais. A enfermagem de nível técnico apresentou prevalência três vezes maior de causas externas, código Y da CID-10, com razão de prevalência de 3,02, e de traumatismos de punho e mão, códigos S60 a S69, com razão de prevalência de 2,97, em comparação com as demais categorias. A exposição a doenças transmissíveis, código Z20, também foi mais prevalente na enfermagem técnica, com razão de prevalência de 1,37. A análise de cadeias completas, envolvendo ocupação, agente, CID e tipo de acidente, confirmou que as cinco combinações mais frequentes envolvem a enfermagem técnica. A principal delas corresponde a agente biológico associado a exposição a doenças transmissíveis em acidente típico, com 116 ocorrências, seguida por agente biológico com ferimento de mão em acidente típico, com 84 ocorrências, e ferramenta manual com ferimento de mão em acidente típico, com 80 ocorrências.</w:t>
+        <w:t>Os dados do SINAN para Campos (2018-2022), obtidos do FTP do DATASUS, abrangem nove agravos relacionados ao trabalho em 46 arquivos nacionais (126,5 MB). A comparação entre as notificações do SINAN e as comunicações da CAT para o mesmo município permitirá avaliar a complementaridade entre os sistemas. Enquanto a CAT captura majoritariamente acidentes entre celetistas, o SINAN registra agravos de notificação compulsória independentemente do vínculo, oferecendo uma janela para adoecimentos crônicos relacionados ao trabalho que a CAT não alcança.</w:t>
       </w:r>
     </w:p>
     <w:p>
@@ -6186,21 +6154,6 @@
           <w:sz w:val="16"/>
         </w:rPr>
         <w:t xml:space="preserve"> Grafo bipartido de associação entre categorias profissionais e grupos diagnósticos da CID-10. Tamanho do nó proporcional ao número de CATs. Arestas com peso igual ou superior a três co-ocorrências. Fonte dos dados brutos: CAT/INSS.</w:t>
-      </w:r>
-    </w:p>
-    <w:p>
-      <w:pPr>
-        <w:spacing w:before="0" w:after="40"/>
-        <w:ind w:firstLine="709"/>
-        <w:jc w:val="both"/>
-      </w:pPr>
-      <w:r>
-        <w:rPr>
-          <w:b w:val="0"/>
-          <w:i w:val="0"/>
-          <w:sz w:val="22"/>
-        </w:rPr>
-        <w:t>Os dados do SINAN para Campos (2018-2022), obtidos do FTP do DATASUS, abrangem nove agravos relacionados ao trabalho em 46 arquivos nacionais (126,5 MB). A comparação entre as notificações do SINAN e as comunicações da CAT para o mesmo município permitirá avaliar a complementaridade entre os sistemas. Enquanto a CAT captura majoritariamente acidentes entre celetistas, o SINAN registra agravos de notificação compulsória independentemente do vínculo, oferecendo uma janela para adoecimentos crônicos relacionados ao trabalho que a CAT não alcança.</w:t>
       </w:r>
     </w:p>
     <w:p>

</xml_diff>

<commit_message>
v3.2: 'ensaio' substitui 'artigo', 'não é X mas Y' removido, linguagem direta
</commit_message>
<xml_diff>
--- a/documentos/artigo.docx
+++ b/documentos/artigo.docx
@@ -29,7 +29,7 @@
           <w:i w:val="0"/>
           <w:sz w:val="22"/>
         </w:rPr>
-        <w:t>Este artigo sustenta que a estrutura de vínculos previdenciários do município de Campos dos Goytacazes, conformada por sua economia política dependente do petróleo, produz um regime de visibilidade seletiva dos acidentes de trabalho no setor saúde. Nesse regime, categorias majoritariamente femininas, de menor remuneração e vínculo celetista tornam-se hipervisíveis na Comunicação de Acidente de Trabalho (CAT), ao passo que categorias de maior remuneração e vínculo estatutário permanecem institucionalmente invisíveis. Argumenta-se que essa assimetria constitui a manifestação local da distância entre o campo institucional da Saúde do Trabalhador e a questão estrutural da saúde dos trabalhadores, conforme a distinção proposta por Souza, Melo e Vasconcellos (2017). O campo opera dentro dos limites normativos postos, e a CAT é seu instrumento por excelência. A questão, contudo, é mais ampla: inclui os acidentes e adoecimentos que o sistema não captura e cuja distribuição obedece a determinações de classe, gênero e raça que ultrapassam as fronteiras do campo. França (2014), ao correlacionar o Modelo Operário Italiano com as categorias gramscianas, demonstra que o saber operário e a participação dos trabalhadores são fundamentais para uma vigilância que supere os limites do registro administrativo. O presente estudo mobiliza esse arcabouço conceitual para construir um diagnóstico estrutural da saúde do trabalhador no setor saúde de Campos, articulando oito bases de dados secundárias independentes. O território onde esse regime opera O município de Campos dos Goytacazes, maior do estado do Rio de Janeiro em extensão territorial, com 4.032,5 km², contava com 483.540 habitantes no Censo Demográfico de 2022 do IBGE e estimativa de 519.259 para 2025. Sua população se declara branca (42,1%), parda (40,1%) e preta (17,7%), com 3.083 quilombolas e 363 indígenas recenseados, segundo a tabela SIDRA 4714 do IBGE. O Índice de Desenvolvimento Humano Municipal era de 0,716 em 2010, abaixo da média estadual de 0,761, e 37,7% da população vivia com até meio salário mínimo per capita. O Produto Interno Bruto per capita de 2023 foi de R$ 88.831,26, segundo a tabela SIDRA 5938 do IBGE. Nesse contexto de riqueza concentrada e indicadores sociais frágeis, este estudo investiga os acidentes de trabalho entre os profissionais da saúde que operam a rede municipal de atendimento.</w:t>
+        <w:t>Este ensaio sustenta que a estrutura de vínculos previdenciários do município de Campos dos Goytacazes, conformada por sua economia política dependente do petróleo, produz um regime de visibilidade seletiva dos acidentes de trabalho no setor saúde. Nesse regime, categorias majoritariamente femininas, de menor remuneração e vínculo celetista tornam-se hipervisíveis na Comunicação de Acidente de Trabalho (CAT), ao passo que categorias de maior remuneração e vínculo estatutário permanecem institucionalmente invisíveis. Argumenta-se que essa assimetria constitui a manifestação local da distância entre o campo institucional da Saúde do Trabalhador e a questão estrutural da saúde dos trabalhadores, conforme a distinção proposta por Souza, Melo e Vasconcellos (2017). O campo opera dentro dos limites normativos postos, e a CAT é seu instrumento por excelência. A questão, contudo, é mais ampla: inclui os acidentes e adoecimentos que o sistema não captura e cuja distribuição obedece a determinações de classe, gênero e raça que ultrapassam as fronteiras do campo. França (2014), ao correlacionar o Modelo Operário Italiano com as categorias gramscianas, demonstra que o saber operário e a participação dos trabalhadores são fundamentais para uma vigilância que supere os limites do registro administrativo. O presente estudo mobiliza esse arcabouço conceitual para construir um diagnóstico estrutural da saúde do trabalhador no setor saúde de Campos, articulando oito bases de dados secundárias independentes. O território onde esse regime opera O município de Campos dos Goytacazes, maior do estado do Rio de Janeiro em extensão territorial, com 4.032,5 km², contava com 483.540 habitantes no Censo Demográfico de 2022 do IBGE e estimativa de 519.259 para 2025. Sua população se declara branca (42,1%), parda (40,1%) e preta (17,7%), com 3.083 quilombolas e 363 indígenas recenseados, segundo a tabela SIDRA 4714 do IBGE. O Índice de Desenvolvimento Humano Municipal era de 0,716 em 2010, abaixo da média estadual de 0,761, e 37,7% da população vivia com até meio salário mínimo per capita. O Produto Interno Bruto per capita de 2023 foi de R$ 88.831,26, segundo a tabela SIDRA 5938 do IBGE. Nesse contexto de riqueza concentrada e indicadores sociais frágeis, este estudo investiga os acidentes de trabalho entre os profissionais da saúde que operam a rede municipal de atendimento.</w:t>
       </w:r>
     </w:p>
     <w:p>
@@ -2155,7 +2155,7 @@
         <w:t xml:space="preserve"> e participações especiais que expandiram o setor público municipal. O terceiro ciclo, em curso desde 2014, caracteriza-se pela estagnação da atividade petrolífera e pelo declínio dos repasses. A estrutura empresarial do município, captada pelo Cadastro Central de Empresas do IBGE, o CEMPRE 2024, registra 16.776 empresas atuantes, 114.466 pessoas ocupadas, das quais 93.366 assalariadas, e salário médio mensal de 2,2 salários mínimos. O setor de saúde humana e serviços sociais respondia por 1.544 estabelecimentos e 15.002 postos de trabalho, conforme o CEMPRE 2024. O PIB municipal, a preços correntes, oscilou de R$ 58,4 bilhões em 2013 para R$ 23,9 bilhões em 2020 e R$ 43,0 bilhões em 2023, de acordo com a tabela SIDRA 5938 do IBGE, acompanhando a volatilidade do petróleo.</w:t>
         <w:br/>
         <w:br/>
-        <w:t>As finanças públicas municipais evidenciam dependência estrutural de transferências intergovernamentais. Em 2024, as receitas brutas somaram R$ 2,95 bilhões, das quais 71,0% provieram de transferências correntes, segundo o Siconfi da Secretaria do Tesouro Nacional. As despesas por natureza econômica, obtidas do Portal da Transparência da Prefeitura de Campos para o período de 2020 a 2025, na rubrica Despesas por Desdobro, revelam a coexistência de dois regimes previdenciários no funcionalismo municipal. Haja vista a relevância desse achado para o estudo, detalham-se os montantes. O Regime Próprio de Previdência Social, o RPPS, cobre os servidores estatutários e suas contribuições patronais somaram R$ 61,2 milhões em 2024, acrescidas de R$ 2,5 milhões de aporte para cobertura do déficit atuarial. Em 2025, as contribuições ao RPPS para pessoal ativo alcançaram R$ 74,7 milhões, conforme a rubrica 31911308 do Portal da Transparência. O Regime Geral de Previdência Social, o INSS, cobre os trabalhadores celetistas, com contribuições patronais de R$ 18,3 milhões em 2024 e R$ 4,8 milhões em 2025 na principal rubrica do Regime Geral, segundo os mesmos registros do Portal da Transparência de Campos. A razão entre as contribuições, RPPS sobre INSS, foi de 3,3 em 2024 e ampliou-se para aproximadamente 15,5 em 2025, indicando que a predominância orçamentária do vínculo estatutário se acentuou no último exercício. A Comunicação de Acidente de Trabalho, a CAT, instituída pela Lei nº 8.213 de 1991, é instrumento exclusivo do INSS. Os acidentes e adoecimentos dos servidores estatutários, vinculados ao RPPS e geridos pelo PREVICAMPOS, não são capturados por essa fonte. Essa dualidade de regimes produz uma assimetria fundamental de visibilidade previdenciária que estrutura os achados deste estudo, conforme a Tabela 3.</w:t>
+        <w:t>As finanças públicas municipais evidenciam dependência estrutural de transferências intergovernamentais. Em 2024, as receitas brutas somaram R$ 2,95 bilhões, das quais 71,0% provieram de transferências correntes, segundo o Siconfi da Secretaria do Tesouro Nacional. As despesas por natureza econômica, obtidas do Portal da Transparência da Prefeitura de Campos para o período de 2020 a 2025, na rubrica Despesas por Desdobro, revelam a coexistência de dois regimes previdenciários no funcionalismo municipal. Haja vista a relevância desse achado para o estudo, detalham-se os montantes. O Regime Próprio de Previdência Social, o RPPS, cobre os servidores estatutários e suas contribuições patronais somaram R$ 61,2 milhões em 2024, acrescidas de R$ 2,5 milhões de aporte para cobertura do déficit atuarial. Em 2025, as contribuições ao RPPS para pessoal ativo alcançaram R$ 74,7 milhões, conforme a rubrica 31911308 do Portal da Transparência. O Regime Geral de Previdência Social, o INSS, cobre os trabalhadores celetistas, com contribuições patronais de R$ 18,3 milhões em 2024 e R$ 4,8 milhões em 2025 na principal rubrica do Regime Geral, segundo os mesmos registros do Portal da Transparência de Campos. A razão entre as contribuições, RPPS sobre INSS, foi de 3,3 em 2024 e ampliou-se para aproximadamente 15,5 em 2025, indicando que a predominância orçamentária do vínculo estatutário se acentuou no último exercício. A Comunicação de Acidente de Trabalho, a CAT, instituída pela Lei nº 8.213 de 1991, é instrumento exclusivo do INSS. Os acidentes e adoecimentos dos servidores estatutários, vinculados ao RPPS e geridos pelo PREVICAMPOS, não são capturados por essa fonte. Essa dualidade de regimes produz uma assimetria fundamental de visibilidade previdenciária que estrutura os achados deste ensaio, conforme a Tabela 3.</w:t>
       </w:r>
     </w:p>
     <w:p>
@@ -2795,7 +2795,7 @@
           <w:i w:val="0"/>
           <w:sz w:val="22"/>
         </w:rPr>
-        <w:t>Este ensaio integra uma agenda mais ampla de investigação sobre a Saúde do Trabalhador em Campos dos Goytacazes. Seu propósito não é esgotar a análise epidemiológica dos acidentes de trabalho, mas construir o diagnóstico territorial e institucional necessário para estudos posteriores sobre processos de trabalho, adoecimento e vigilância. Trata-se de uma análise exploratória do território apoiada na triangulação de bases secundárias independentes, cujo objetivo é caracterizar a configuração contemporânea da saúde do trabalhador no setor saúde do município e identificar elementos estruturantes para investigações subsequentes. A base empírica principal foi reconstruída dos dados abertos da CAT do INSS, disponíveis no Portal de Dados Abertos do governo federal. Foram processados 58 arquivos, de julho de 2018 a outubro de 2025, totalizando 3.902.905 registros, com importação posicional e remoção de 938 duplicatas (401 hashes SHA-256). O recorte municipal utilizou código do empregador 330100 e UF Rio de Janeiro. A classificação ocupacional baseou-se na CBO 2002, com dicionário auditado de 458 códigos.</w:t>
+        <w:t>Este ensaio integra uma agenda mais ampla de investigação sobre a Saúde do Trabalhador em Campos dos Goytacazes. Seu propósito é construir o diagnóstico territorial e institucional necessário para estudos posteriores sobre processos de trabalho, adoecimento e vigilância. Trata-se de uma análise exploratória do território apoiada na triangulação de bases secundárias independentes, cujo objetivo é caracterizar a configuração contemporânea da saúde do trabalhador no setor saúde do município e identificar elementos estruturantes para investigações subsequentes. A base empírica principal foi reconstruída dos dados abertos da CAT do INSS, disponíveis no Portal de Dados Abertos do governo federal. Foram processados 58 arquivos, de julho de 2018 a outubro de 2025, totalizando 3.902.905 registros, com importação posicional e remoção de 938 duplicatas (401 hashes SHA-256). O recorte municipal utilizou código do empregador 330100 e UF Rio de Janeiro. A classificação ocupacional baseou-se na CBO 2002, com dicionário auditado de 458 códigos.</w:t>
         <w:br/>
         <w:br/>
         <w:t xml:space="preserve">O denominador primário de força de trabalho proveio da RAIS, a Relação Anual de Informações Sociais, disponível no FTP do Ministério do Trabalho e Emprego. Como a RAIS captura vínculos celetistas ativos em 31 de dezembro de cada ano e a CAT cobre exclusivamente celetistas, numerador e denominador são comensuráveis. O denominador secundário proveio do CNES-PF, o Cadastro Nacional de Estabelecimentos de Saúde, obtido com o pacote </w:t>
@@ -2849,7 +2849,7 @@
           <w:i w:val="0"/>
           <w:sz w:val="22"/>
         </w:rPr>
-        <w:t>), grafos bipartidos e teste qui-quadrado com V de Cramér. Essas abordagens não visam estimar parâmetros populacionais ou estabelecer inferência causal, mas identificar regularidades que contribuam para a caracterização do regime de visibilidade previdenciária. Adicionalmente, 46 arquivos do SINAN/DATASUS (126,5 MB, nove agravos relacionados ao trabalho, 2018-2022, FTP do DATASUS) foram obtidos para cotejo futuro entre notificação compulsória e comunicação de acidente.Das 5.066 CATs vinculadas a empregadores de Campos dos Goytacazes entre 2018 e 2025, 1.144, equivalentes a 22,6%, correspondem às profissões da saúde, 26 às multiprofissionais, 184, ou 3,6%, a registros sem CBO válido e 3.712 às demais ocupações, das quais 427 em estabelecimentos de saúde. A distribuição é fortemente assimétrica, conforme a Tabela 4. A enfermagem concentra 84,4% dos registros, sendo 70,2% de técnicos e auxiliares e 14,2% de enfermeiros. Seguem-se os técnicos de diagnóstico e laboratório, com 6,8%, e a fisioterapia, com 2,6%. A medicina responde por 1,0%, o que representa 12 CATs em oito anos. Predominam mulheres, com 85,7%, e a idade mediana é de 36 anos. Os acidentes típicos somam 81,9% e os de trajeto, 17,1%. Ferimentos de punho e mãos lideram os diagnósticos, CID-10 S61, com 25,1%, sendo o dedo a parte atingida em 43,9% dos casos, seguidos da exposição a doenças transmissíveis, código Z20, com 21,9%. Agentes infecciosos respondem por 26,9% dos causadores. Quase todos os empregadores pertencem à CNAE 86-87, com 95,4%, e há dominância hospitalar, CNAE 8610, com 76,8%. O empregador emitiu 97,0% das CATs, com mediana de um dia entre o acidente e a emissão. Houve um óbito e 1,0% de doenças relacionadas ao trabalho.</w:t>
+        <w:t>), grafos bipartidos e teste qui-quadrado com V de Cramér. Essas abordagens identificam regularidades que contribuam para a caracterização do regime de visibilidade previdenciária. Adicionalmente, 46 arquivos do SINAN/DATASUS (126,5 MB, nove agravos relacionados ao trabalho, 2018-2022, FTP do DATASUS) foram obtidos para cotejo futuro entre notificação compulsória e comunicação de acidente.Das 5.066 CATs vinculadas a empregadores de Campos dos Goytacazes entre 2018 e 2025, 1.144, equivalentes a 22,6%, correspondem às profissões da saúde, 26 às multiprofissionais, 184, ou 3,6%, a registros sem CBO válido e 3.712 às demais ocupações, das quais 427 em estabelecimentos de saúde. A distribuição é fortemente assimétrica, conforme a Tabela 4. A enfermagem concentra 84,4% dos registros, sendo 70,2% de técnicos e auxiliares e 14,2% de enfermeiros. Seguem-se os técnicos de diagnóstico e laboratório, com 6,8%, e a fisioterapia, com 2,6%. A medicina responde por 1,0%, o que representa 12 CATs em oito anos. Predominam mulheres, com 85,7%, e a idade mediana é de 36 anos. Os acidentes típicos somam 81,9% e os de trajeto, 17,1%. Ferimentos de punho e mãos lideram os diagnósticos, CID-10 S61, com 25,1%, sendo o dedo a parte atingida em 43,9% dos casos, seguidos da exposição a doenças transmissíveis, código Z20, com 21,9%. Agentes infecciosos respondem por 26,9% dos causadores. Quase todos os empregadores pertencem à CNAE 86-87, com 95,4%, e há dominância hospitalar, CNAE 8610, com 76,8%. O empregador emitiu 97,0% das CATs, com mediana de um dia entre o acidente e a emissão. Houve um óbito e 1,0% de doenças relacionadas ao trabalho.</w:t>
         <w:br/>
         <w:br/>
         <w:t>A análise de sensibilidade em seis cenários confirmou a estabilidade dos achados, conforme a Tabela 5. Em todos os cenários, a participação da enfermagem variou entre 84,4% e 86,3% e a hierarquia das três principais categorias, a saber, técnicos de enfermagem, enfermeiros e profissionais de diagnóstico e laboratório, permaneceu inalterada. As Figuras 1 e 2 ilustram esses resultados.</w:t>
@@ -6171,13 +6171,13 @@
         <w:t>Os achados convergem para a demonstração de que o perfil de acidentes capturado pela CAT constitui, antes de tudo, um perfil do regime de visibilidade previdenciária do município. A concentração de 84,4% das CATs na enfermagem de nível técnico expressa, simultaneamente, a exposição diferencial ao risco determinada por um processo de trabalho que concentra a execução manual do cuidado em categorias subordinadas na hierarquia ocupacional, e a captura diferencial pelo sistema de informação determinada pelo regime previdenciário. A enfermagem técnica evidencia que a enfermagem de nível técnico concentra 84,4% das comunicações de acidente, com duas cadeias predominantes de risco prevenível. A cadeia perfurocortante, que articula ferramenta manual ao código S61, e a cadeia biológica, que articula agente infeccioso ao código Z20, dependem de dispositivos de segurança e de disponibilidade contínua de equipamentos de proteção individual. A razão de prevalência elevada de causas externas, de 3,02, na enfermagem técnica é consistente com a execução manual e corporal do cuidado, que envolve punção venosa, administração de medicamentos e manipulação de perfurocortantes.</w:t>
         <w:br/>
         <w:br/>
-        <w:t>O segundo diagnóstico é de natureza institucional. A concentração das CATs na enfermagem e a quase ausência da medicina, com apenas 1,0%, não refletem uma distribuição real de risco ocupacional, mas sim a estrutura de vínculos previdenciários do município. A razão RPPS sobre INSS, que passou de 3,3 em 2024 para aproximadamente 15,5 em 2025, conforme os dados do Portal da Transparência de Campos, materializa essa assimetria e indica seu agravamento recente. As densidades de comunicação calculadas com denominador RAIS, que é comensurável com a CAT por ambos cobrirem celetistas, situaram-se entre 30,3 e 43,9 CATs por 1.000 vínculos ativos de técnicos de enfermagem, conforme a RAIS disponível no FTP do Ministério do Trabalho, e em apenas 3,7 por 1.000 para a medicina em 2019, único ano com numerador igual ou superior a cinco nessa categoria. As densidades com denominador CNES, que não é comensurável por incluir todos os vínculos, foram sistematicamente menores, mas a razão entre as densidades RAIS e CNES quantifica a fração de acidentes ocultos pelo desenho institucional da CAT.</w:t>
+        <w:t>O segundo diagnóstico é de natureza institucional. A concentração das CATs na enfermagem e a quase ausência da medicina, com apenas 1,0%, refletem a estrutura de vínculos previdenciários do município. A razão RPPS sobre INSS, que passou de 3,3 em 2024 para aproximadamente 15,5 em 2025, conforme os dados do Portal da Transparência de Campos, materializa essa assimetria e indica seu agravamento recente. As densidades de comunicação calculadas com denominador RAIS, que é comensurável com a CAT por ambos cobrirem celetistas, situaram-se entre 30,3 e 43,9 CATs por 1.000 vínculos ativos de técnicos de enfermagem, conforme a RAIS disponível no FTP do Ministério do Trabalho, e em apenas 3,7 por 1.000 para a medicina em 2019, único ano com numerador igual ou superior a cinco nessa categoria. As densidades com denominador CNES, que não é comensurável por incluir todos os vínculos, foram sistematicamente menores, mas a razão entre as densidades RAIS e CNES quantifica a fração de acidentes ocultos pelo desenho institucional da CAT.</w:t>
         <w:br/>
         <w:br/>
         <w:t>Souza, Melo e Vasconcellos (2017) oferecem uma distinção analítica profícua para interpretar esses achados. Os autores diferenciam o campo institucional da Saúde do Trabalhador, que opera dentro dos limites normativos e administrativos postos, da questão estrutural da saúde dos trabalhadores, que ultrapassa as fronteiras institucionais e demanda respostas que o arcabouço existente não oferece. Nesse sentido, a CAT constitui um instrumento do campo, pois captura o que o desenho institucional permite ver. A questão, contudo, é mais ampla, uma vez que os acidentes e adoecimentos dos estatutários, autônomos, informais e terceirizados existem independentemente de sua captura pelo sistema. A dualidade de regimes previdenciários em Campos, com uma razão RPPS sobre INSS que se ampliou de 3,3 para 15,5 entre 2024 e 2025, é a manifestação local dessa distância entre o campo e a questão.</w:t>
         <w:br/>
         <w:br/>
-        <w:t>O pensamento de Antonio Gramsci, particularmente sua concepção do trabalho como princípio educativo e dos trabalhadores como produtores de conhecimento, oferece fundamentos para uma vigilância que articule processo de trabalho, determinação social da saúde e participação dos trabalhadores. França (2014), ao correlacionar o Modelo Operário Italiano com as categorias gramscianas, demonstra que o saber operário e a socialização do conhecimento foram fundamentais na construção de uma metodologia de ação contra a nocividade no trabalho protagonizada pelo próprio trabalhador. A saúde, nessa perspectiva, não é reivindicação externa, mas algo a ser construído com participação direta. A vigilância baseada exclusivamente nos registros da CAT opera na institucionalidade consolidada, ao passo que a vigilância que incorpora a participação ativa dos trabalhadores na identificação dos riscos e na proposição de soluções avança na direção contra-hegemônica demonstrada pela experiência do Modelo Operário Italiano.</w:t>
+        <w:t>O pensamento de Antonio Gramsci, particularmente sua concepção do trabalho como princípio educativo e dos trabalhadores como produtores de conhecimento, oferece fundamentos para uma vigilância que articule processo de trabalho, determinação social da saúde e participação dos trabalhadores. França (2014), ao correlacionar o Modelo Operário Italiano com as categorias gramscianas, demonstra que o saber operário e a socialização do conhecimento foram fundamentais na construção de uma metodologia de ação contra a nocividade no trabalho protagonizada pelo próprio trabalhador. A saúde, nessa perspectiva, é algo a ser construído com participação direta. A vigilância baseada exclusivamente nos registros da CAT opera na institucionalidade consolidada, ao passo que a vigilância que incorpora a participação ativa dos trabalhadores na identificação dos riscos e na proposição de soluções avança na direção contra-hegemônica demonstrada pela experiência do Modelo Operário Italiano.</w:t>
       </w:r>
     </w:p>
     <w:p>

</xml_diff>

<commit_message>
v3.3: 13 pendencias de auditoria resolvidas - fusao de paragrafos, splicing, 'segundo diagnostico', 'descritivo-analitico', redundancia Souza, SINAN futuro, Lei 9.478, dois-pontos, processo de trabalho
</commit_message>
<xml_diff>
--- a/documentos/artigo.docx
+++ b/documentos/artigo.docx
@@ -29,7 +29,10 @@
           <w:i w:val="0"/>
           <w:sz w:val="22"/>
         </w:rPr>
-        <w:t>Este ensaio sustenta que a estrutura de vínculos previdenciários do município de Campos dos Goytacazes, conformada por sua economia política dependente do petróleo, produz um regime de visibilidade seletiva dos acidentes de trabalho no setor saúde. Nesse regime, categorias majoritariamente femininas, de menor remuneração e vínculo celetista tornam-se hipervisíveis na Comunicação de Acidente de Trabalho (CAT), ao passo que categorias de maior remuneração e vínculo estatutário permanecem institucionalmente invisíveis. Argumenta-se que essa assimetria constitui a manifestação local da distância entre o campo institucional da Saúde do Trabalhador e a questão estrutural da saúde dos trabalhadores, conforme a distinção proposta por Souza, Melo e Vasconcellos (2017). O campo opera dentro dos limites normativos postos, e a CAT é seu instrumento por excelência. A questão, contudo, é mais ampla: inclui os acidentes e adoecimentos que o sistema não captura e cuja distribuição obedece a determinações de classe, gênero e raça que ultrapassam as fronteiras do campo. França (2014), ao correlacionar o Modelo Operário Italiano com as categorias gramscianas, demonstra que o saber operário e a participação dos trabalhadores são fundamentais para uma vigilância que supere os limites do registro administrativo. O presente estudo mobiliza esse arcabouço conceitual para construir um diagnóstico estrutural da saúde do trabalhador no setor saúde de Campos, articulando oito bases de dados secundárias independentes. O território onde esse regime opera O município de Campos dos Goytacazes, maior do estado do Rio de Janeiro em extensão territorial, com 4.032,5 km², contava com 483.540 habitantes no Censo Demográfico de 2022 do IBGE e estimativa de 519.259 para 2025. Sua população se declara branca (42,1%), parda (40,1%) e preta (17,7%), com 3.083 quilombolas e 363 indígenas recenseados, segundo a tabela SIDRA 4714 do IBGE. O Índice de Desenvolvimento Humano Municipal era de 0,716 em 2010, abaixo da média estadual de 0,761, e 37,7% da população vivia com até meio salário mínimo per capita. O Produto Interno Bruto per capita de 2023 foi de R$ 88.831,26, segundo a tabela SIDRA 5938 do IBGE. Nesse contexto de riqueza concentrada e indicadores sociais frágeis, este estudo investiga os acidentes de trabalho entre os profissionais da saúde que operam a rede municipal de atendimento.</w:t>
+        <w:t>Este ensaio sustenta que a estrutura de vínculos previdenciários do município de Campos dos Goytacazes, conformada por sua economia política dependente do petróleo, produz um regime de visibilidade seletiva dos acidentes de trabalho no setor saúde. Nesse regime, categorias majoritariamente femininas, de menor remuneração e vínculo celetista tornam-se hipervisíveis na Comunicação de Acidente de Trabalho (CAT), ao passo que categorias de maior remuneração e vínculo estatutário permanecem institucionalmente invisíveis. Argumenta-se que essa assimetria constitui a manifestação local da distância entre o campo institucional da Saúde do Trabalhador e a questão estrutural da saúde dos trabalhadores, conforme a distinção proposta por Souza, Melo e Vasconcellos (2017). O campo opera dentro dos limites normativos postos, e a CAT é seu instrumento por excelência. A questão, contudo, é mais ampla. Inclui os acidentes e adoecimentos que o sistema não captura e cuja distribuição obedece a determinações de classe, gênero e raça que ultrapassam as fronteiras do campo. França (2014), ao correlacionar o Modelo Operário Italiano com as categorias gramscianas, demonstra que o saber operário e a participação dos trabalhadores são fundamentais para uma vigilância que supere os limites do registro administrativo. O presente ensaio mobiliza esse arcabouço conceitual para construir um diagnóstico estrutural da saúde do trabalhador no setor saúde de Campos, articulando oito bases de dados secundárias independentes. O território onde esse regime opera é precisamente o que se descreve a seguir.</w:t>
+        <w:br/>
+        <w:br/>
+        <w:t>O município de Campos dos Goytacazes, maior do estado do Rio de Janeiro em extensão territorial, com 4.032,5 km², contava com 483.540 habitantes no Censo Demográfico de 2022 do IBGE e estimativa de 519.259 para 2025. Sua população se declara branca (42,1%), parda (40,1%) e preta (17,7%), com 3.083 quilombolas e 363 indígenas recenseados, segundo a tabela SIDRA 4714 do IBGE. O Índice de Desenvolvimento Humano Municipal era de 0,716 em 2010, abaixo da média estadual de 0,761, e 37,7% da população vivia com até meio salário mínimo per capita. O Produto Interno Bruto per capita de 2023 foi de R$ 88.831,26, segundo a tabela SIDRA 5938 do IBGE. Nesse contexto de riqueza concentrada e indicadores sociais frágeis, este estudo investiga os acidentes de trabalho entre os profissionais da saúde que operam a rede municipal de atendimento.</w:t>
       </w:r>
     </w:p>
     <w:p>
@@ -2152,7 +2155,7 @@
           <w:i w:val="0"/>
           <w:sz w:val="22"/>
         </w:rPr>
-        <w:t xml:space="preserve"> e participações especiais que expandiram o setor público municipal. O terceiro ciclo, em curso desde 2014, caracteriza-se pela estagnação da atividade petrolífera e pelo declínio dos repasses. A estrutura empresarial do município, captada pelo Cadastro Central de Empresas do IBGE, o CEMPRE 2024, registra 16.776 empresas atuantes, 114.466 pessoas ocupadas, das quais 93.366 assalariadas, e salário médio mensal de 2,2 salários mínimos. O setor de saúde humana e serviços sociais respondia por 1.544 estabelecimentos e 15.002 postos de trabalho, conforme o CEMPRE 2024. O PIB municipal, a preços correntes, oscilou de R$ 58,4 bilhões em 2013 para R$ 23,9 bilhões em 2020 e R$ 43,0 bilhões em 2023, de acordo com a tabela SIDRA 5938 do IBGE, acompanhando a volatilidade do petróleo.</w:t>
+        <w:t xml:space="preserve"> e participações especiais, nos termos da Lei nº 9.478/1997, que expandiram o setor público municipal. O terceiro ciclo, em curso desde 2014, caracteriza-se pela estagnação da atividade petrolífera e pelo declínio dos repasses. A estrutura empresarial do município, captada pelo Cadastro Central de Empresas do IBGE, o CEMPRE 2024, registra 16.776 empresas atuantes, 114.466 pessoas ocupadas, das quais 93.366 assalariadas, e salário médio mensal de 2,2 salários mínimos. O setor de saúde humana e serviços sociais respondia por 1.544 estabelecimentos e 15.002 postos de trabalho, conforme o CEMPRE 2024. O PIB municipal, a preços correntes, oscilou de R$ 58,4 bilhões em 2013 para R$ 23,9 bilhões em 2020 e R$ 43,0 bilhões em 2023, de acordo com a tabela SIDRA 5938 do IBGE, acompanhando a volatilidade do petróleo.</w:t>
         <w:br/>
         <w:br/>
         <w:t>As finanças públicas municipais evidenciam dependência estrutural de transferências intergovernamentais. Em 2024, as receitas brutas somaram R$ 2,95 bilhões, das quais 71,0% provieram de transferências correntes, segundo o Siconfi da Secretaria do Tesouro Nacional. As despesas por natureza econômica, obtidas do Portal da Transparência da Prefeitura de Campos para o período de 2020 a 2025, na rubrica Despesas por Desdobro, revelam a coexistência de dois regimes previdenciários no funcionalismo municipal. Haja vista a relevância desse achado para o estudo, detalham-se os montantes. O Regime Próprio de Previdência Social, o RPPS, cobre os servidores estatutários e suas contribuições patronais somaram R$ 61,2 milhões em 2024, acrescidas de R$ 2,5 milhões de aporte para cobertura do déficit atuarial. Em 2025, as contribuições ao RPPS para pessoal ativo alcançaram R$ 74,7 milhões, conforme a rubrica 31911308 do Portal da Transparência. O Regime Geral de Previdência Social, o INSS, cobre os trabalhadores celetistas, com contribuições patronais de R$ 18,3 milhões em 2024 e R$ 4,8 milhões em 2025 na principal rubrica do Regime Geral, segundo os mesmos registros do Portal da Transparência de Campos. A razão entre as contribuições, RPPS sobre INSS, foi de 3,3 em 2024 e ampliou-se para aproximadamente 15,5 em 2025, indicando que a predominância orçamentária do vínculo estatutário se acentuou no último exercício. A Comunicação de Acidente de Trabalho, a CAT, instituída pela Lei nº 8.213 de 1991, é instrumento exclusivo do INSS. Os acidentes e adoecimentos dos servidores estatutários, vinculados ao RPPS e geridos pelo PREVICAMPOS, não são capturados por essa fonte. Essa dualidade de regimes produz uma assimetria fundamental de visibilidade previdenciária que estrutura os achados deste ensaio, conforme a Tabela 3.</w:t>
@@ -2849,7 +2852,10 @@
           <w:i w:val="0"/>
           <w:sz w:val="22"/>
         </w:rPr>
-        <w:t>), grafos bipartidos e teste qui-quadrado com V de Cramér. Essas abordagens identificam regularidades que contribuam para a caracterização do regime de visibilidade previdenciária. Adicionalmente, 46 arquivos do SINAN/DATASUS (126,5 MB, nove agravos relacionados ao trabalho, 2018-2022, FTP do DATASUS) foram obtidos para cotejo futuro entre notificação compulsória e comunicação de acidente.Das 5.066 CATs vinculadas a empregadores de Campos dos Goytacazes entre 2018 e 2025, 1.144, equivalentes a 22,6%, correspondem às profissões da saúde, 26 às multiprofissionais, 184, ou 3,6%, a registros sem CBO válido e 3.712 às demais ocupações, das quais 427 em estabelecimentos de saúde. A distribuição é fortemente assimétrica, conforme a Tabela 4. A enfermagem concentra 84,4% dos registros, sendo 70,2% de técnicos e auxiliares e 14,2% de enfermeiros. Seguem-se os técnicos de diagnóstico e laboratório, com 6,8%, e a fisioterapia, com 2,6%. A medicina responde por 1,0%, o que representa 12 CATs em oito anos. Predominam mulheres, com 85,7%, e a idade mediana é de 36 anos. Os acidentes típicos somam 81,9% e os de trajeto, 17,1%. Ferimentos de punho e mãos lideram os diagnósticos, CID-10 S61, com 25,1%, sendo o dedo a parte atingida em 43,9% dos casos, seguidos da exposição a doenças transmissíveis, código Z20, com 21,9%. Agentes infecciosos respondem por 26,9% dos causadores. Quase todos os empregadores pertencem à CNAE 86-87, com 95,4%, e há dominância hospitalar, CNAE 8610, com 76,8%. O empregador emitiu 97,0% das CATs, com mediana de um dia entre o acidente e a emissão. Houve um óbito e 1,0% de doenças relacionadas ao trabalho.</w:t>
+        <w:t>), grafos bipartidos e teste qui-quadrado com V de Cramér. Essas abordagens identificam regularidades que contribuam para a caracterização do regime de visibilidade previdenciária. Adicionalmente, 46 arquivos do SINAN/DATASUS (126,5 MB, nove agravos relacionados ao trabalho, 2018-2022, FTP do DATASUS) foram obtidos para cotejo futuro entre notificação compulsória e comunicação de acidente.</w:t>
+        <w:br/>
+        <w:br/>
+        <w:t>Das 5.066 CATs vinculadas a empregadores de Campos dos Goytacazes entre 2018 e 2025, 1.144, equivalentes a 22,6%, correspondem às profissões da saúde, 26 às multiprofissionais, 184, ou 3,6%, a registros sem CBO válido e 3.712 às demais ocupações, das quais 427 em estabelecimentos de saúde. A distribuição é fortemente assimétrica, conforme a Tabela 4. A enfermagem concentra 84,4% dos registros, sendo 70,2% de técnicos e auxiliares e 14,2% de enfermeiros. Seguem-se os técnicos de diagnóstico e laboratório, com 6,8%, e a fisioterapia, com 2,6%. A medicina responde por 1,0%, o que representa 12 CATs em oito anos. Predominam mulheres, com 85,7%, e a idade mediana é de 36 anos. Os acidentes típicos somam 81,9% e os de trajeto, 17,1%. Ferimentos de punho e mãos lideram os diagnósticos, CID-10 S61, com 25,1%, sendo o dedo a parte atingida em 43,9% dos casos, seguidos da exposição a doenças transmissíveis, código Z20, com 21,9%. Agentes infecciosos respondem por 26,9% dos causadores. Quase todos os empregadores pertencem à CNAE 86-87, com 95,4%, e há dominância hospitalar, CNAE 8610, com 76,8%. O empregador emitiu 97,0% das CATs, com mediana de um dia entre o acidente e a emissão. Houve um óbito e 1,0% de doenças relacionadas ao trabalho.</w:t>
         <w:br/>
         <w:br/>
         <w:t>A análise de sensibilidade em seis cenários confirmou a estabilidade dos achados, conforme a Tabela 5. Em todos os cenários, a participação da enfermagem variou entre 84,4% e 86,3% e a hierarquia das três principais categorias, a saber, técnicos de enfermagem, enfermeiros e profissionais de diagnóstico e laboratório, permaneceu inalterada. As Figuras 1 e 2 ilustram esses resultados.</w:t>
@@ -5426,7 +5432,7 @@
           <w:i w:val="0"/>
           <w:sz w:val="22"/>
         </w:rPr>
-        <w:t>Os dados do SINAN para Campos (2018-2022), obtidos do FTP do DATASUS, abrangem nove agravos relacionados ao trabalho em 46 arquivos nacionais (126,5 MB). A comparação entre as notificações do SINAN e as comunicações da CAT para o mesmo município permitirá avaliar a complementaridade entre os sistemas. Enquanto a CAT captura majoritariamente acidentes entre celetistas, o SINAN registra agravos de notificação compulsória independentemente do vínculo, oferecendo uma janela para adoecimentos crônicos relacionados ao trabalho que a CAT não alcança.</w:t>
+        <w:t>Os dados do SINAN para Campos (2018-2022), obtidos do FTP do DATASUS, abrangem nove agravos relacionados ao trabalho em 46 arquivos nacionais (126,5 MB). A comparação entre as notificações do SINAN e as comunicações da CAT para o mesmo município permite antever a complementaridade entre os sistemas. Enquanto a CAT captura majoritariamente acidentes entre celetistas, o SINAN registra agravos de notificação compulsória independentemente do vínculo, oferecendo uma janela para adoecimentos crônicos relacionados ao trabalho que a CAT não alcança.</w:t>
       </w:r>
     </w:p>
     <w:p>
@@ -6168,13 +6174,13 @@
           <w:i w:val="0"/>
           <w:sz w:val="22"/>
         </w:rPr>
-        <w:t>Os achados convergem para a demonstração de que o perfil de acidentes capturado pela CAT constitui, antes de tudo, um perfil do regime de visibilidade previdenciária do município. A concentração de 84,4% das CATs na enfermagem de nível técnico expressa, simultaneamente, a exposição diferencial ao risco determinada por um processo de trabalho que concentra a execução manual do cuidado em categorias subordinadas na hierarquia ocupacional, e a captura diferencial pelo sistema de informação determinada pelo regime previdenciário. A enfermagem técnica evidencia que a enfermagem de nível técnico concentra 84,4% das comunicações de acidente, com duas cadeias predominantes de risco prevenível. A cadeia perfurocortante, que articula ferramenta manual ao código S61, e a cadeia biológica, que articula agente infeccioso ao código Z20, dependem de dispositivos de segurança e de disponibilidade contínua de equipamentos de proteção individual. A razão de prevalência elevada de causas externas, de 3,02, na enfermagem técnica é consistente com a execução manual e corporal do cuidado, que envolve punção venosa, administração de medicamentos e manipulação de perfurocortantes.</w:t>
+        <w:t>Os achados convergem para a demonstração de que o perfil de acidentes capturado pela CAT constitui, antes de tudo, um perfil do regime de visibilidade previdenciária do município. A concentração de 84,4% das CATs na enfermagem de nível técnico expressa, simultaneamente, a exposição diferencial ao risco determinada por um processo de trabalho que concentra a execução manual do cuidado em categorias subordinadas na hierarquia ocupacional, e a captura diferencial pelo sistema de informação determinada pelo regime previdenciário. Duas cadeias predominantes de risco prevenível emergem dessa concentração. A cadeia perfurocortante, que articula ferramenta manual ao código S61, e a cadeia biológica, que articula agente infeccioso ao código Z20, dependem de dispositivos de segurança e de disponibilidade contínua de equipamentos de proteção individual. A razão de prevalência elevada de causas externas, de 3,02, na enfermagem técnica é consistente com a execução manual e corporal do cuidado, que envolve punção venosa, administração de medicamentos e manipulação de perfurocortantes.</w:t>
         <w:br/>
         <w:br/>
-        <w:t>O segundo diagnóstico é de natureza institucional. A concentração das CATs na enfermagem e a quase ausência da medicina, com apenas 1,0%, refletem a estrutura de vínculos previdenciários do município. A razão RPPS sobre INSS, que passou de 3,3 em 2024 para aproximadamente 15,5 em 2025, conforme os dados do Portal da Transparência de Campos, materializa essa assimetria e indica seu agravamento recente. As densidades de comunicação calculadas com denominador RAIS, que é comensurável com a CAT por ambos cobrirem celetistas, situaram-se entre 30,3 e 43,9 CATs por 1.000 vínculos ativos de técnicos de enfermagem, conforme a RAIS disponível no FTP do Ministério do Trabalho, e em apenas 3,7 por 1.000 para a medicina em 2019, único ano com numerador igual ou superior a cinco nessa categoria. As densidades com denominador CNES, que não é comensurável por incluir todos os vínculos, foram sistematicamente menores, mas a razão entre as densidades RAIS e CNES quantifica a fração de acidentes ocultos pelo desenho institucional da CAT.</w:t>
+        <w:t>A concentração das CATs na enfermagem e a quase ausência da medicina, com apenas 1,0%, refletem a estrutura de vínculos previdenciários do município. A razão RPPS sobre INSS, que passou de 3,3 em 2024 para aproximadamente 15,5 em 2025, conforme os dados do Portal da Transparência de Campos, materializa essa assimetria e indica seu agravamento recente. As densidades de comunicação calculadas com denominador RAIS, que é comensurável com a CAT por ambos cobrirem celetistas, situaram-se entre 30,3 e 43,9 CATs por 1.000 vínculos ativos de técnicos de enfermagem, conforme a RAIS disponível no FTP do Ministério do Trabalho, e em apenas 3,7 por 1.000 para a medicina em 2019, único ano com numerador igual ou superior a cinco nessa categoria. As densidades com denominador CNES, que não é comensurável por incluir todos os vínculos, foram sistematicamente menores, mas a razão entre as densidades RAIS e CNES quantifica a fração de acidentes ocultos pelo desenho institucional da CAT.</w:t>
         <w:br/>
         <w:br/>
-        <w:t>Souza, Melo e Vasconcellos (2017) oferecem uma distinção analítica profícua para interpretar esses achados. Os autores diferenciam o campo institucional da Saúde do Trabalhador, que opera dentro dos limites normativos e administrativos postos, da questão estrutural da saúde dos trabalhadores, que ultrapassa as fronteiras institucionais e demanda respostas que o arcabouço existente não oferece. Nesse sentido, a CAT constitui um instrumento do campo, pois captura o que o desenho institucional permite ver. A questão, contudo, é mais ampla, uma vez que os acidentes e adoecimentos dos estatutários, autônomos, informais e terceirizados existem independentemente de sua captura pelo sistema. A dualidade de regimes previdenciários em Campos, com uma razão RPPS sobre INSS que se ampliou de 3,3 para 15,5 entre 2024 e 2025, é a manifestação local dessa distância entre o campo e a questão.</w:t>
+        <w:t>Conforme exposto na abertura deste ensaio, Souza, Melo e Vasconcellos (2017) oferecem uma distinção entre campo e questão que ilumina esses achados. A CAT constitui um instrumento do campo, pois captura o que o desenho institucional permite ver. A questão, contudo, é mais ampla, uma vez que os acidentes e adoecimentos dos estatutários, autônomos, informais e terceirizados existem independentemente de sua captura pelo sistema. A dualidade de regimes previdenciários em Campos, com uma razão RPPS sobre INSS que se ampliou de 3,3 para 15,5 entre 2024 e 2025, é a manifestação local dessa distância entre o campo e a questão.</w:t>
         <w:br/>
         <w:br/>
         <w:t>O pensamento de Antonio Gramsci, particularmente sua concepção do trabalho como princípio educativo e dos trabalhadores como produtores de conhecimento, oferece fundamentos para uma vigilância que articule processo de trabalho, determinação social da saúde e participação dos trabalhadores. França (2014), ao correlacionar o Modelo Operário Italiano com as categorias gramscianas, demonstra que o saber operário e a socialização do conhecimento foram fundamentais na construção de uma metodologia de ação contra a nocividade no trabalho protagonizada pelo próprio trabalhador. A saúde, nessa perspectiva, é algo a ser construído com participação direta. A vigilância baseada exclusivamente nos registros da CAT opera na institucionalidade consolidada, ao passo que a vigilância que incorpora a participação ativa dos trabalhadores na identificação dos riscos e na proposição de soluções avança na direção contra-hegemônica demonstrada pela experiência do Modelo Operário Italiano.</w:t>
@@ -6192,7 +6198,7 @@
           <w:i w:val="0"/>
           <w:sz w:val="22"/>
         </w:rPr>
-        <w:t>A CAT capta comunicações, não a totalidade dos acidentes e adoecimentos, e cobre essencialmente o emprego formal celetista, excluindo informais, autônomos e estatutários. A cobertura da fonte é parcial em 2018, com competências apenas desde julho, irregular em 2022, atípica de setembro a dezembro de 2024 e incompleta em 2025, com dados até outubro, o que introduz ruído nas séries temporais. Registros sem CBO válido, que somam 3,6% do total, podem subestimar as profissões da saúde entre 2021 e 2023. O desenho descritivo-analítico não permite inferência causal. O CNES-PF como denominador não é comensurável com o numerador da CAT, limitação enfrentada com a utilização da RAIS como denominador primário comensurável e a transformação do CNES em ferramenta de triangulação. Ademais, a indisponibilidade dos registros de afastamento do RPPS municipal, geridos pelo PREVICAMPOS, em base pública consolidada impede a comparação direta entre os dois regimes previdenciários para as mesmas categorias profissionais.</w:t>
+        <w:t>A CAT capta comunicações, não a totalidade dos acidentes e adoecimentos, e cobre essencialmente o emprego formal celetista, excluindo informais, autônomos e estatutários. A cobertura da fonte é parcial em 2018, com competências apenas desde julho, irregular em 2022, atípica de setembro a dezembro de 2024 e incompleta em 2025, com dados até outubro, o que introduz ruído nas séries temporais. Registros sem CBO válido, que somam 3,6% do total, podem subestimar as profissões da saúde entre 2021 e 2023. O desenho exploratório do ensaio não comporta inferência causal. O CNES-PF como denominador não é comensurável com o numerador da CAT, limitação enfrentada com a utilização da RAIS como denominador primário comensurável e a transformação do CNES em ferramenta de triangulação. Ademais, a indisponibilidade dos registros de afastamento do RPPS municipal, geridos pelo PREVICAMPOS, em base pública consolidada impede a comparação direta entre os dois regimes previdenciários para as mesmas categorias profissionais. Por fim, o ensaio não contempla análise direta do processo de trabalho, lacuna que demanda estudos qualitativos complementares com participação dos trabalhadores, nos moldes do Modelo Operário Italiano (França, 2014).</w:t>
       </w:r>
     </w:p>
     <w:p>

</xml_diff>

<commit_message>
v4.0: ajustes finais - 'ensaio analitico' substitui 'exploratorio', logica das bases substitui inventario, 'examinar o regime' substitui 'caracterizar o territorio'
</commit_message>
<xml_diff>
--- a/documentos/artigo.docx
+++ b/documentos/artigo.docx
@@ -29,7 +29,7 @@
           <w:i w:val="0"/>
           <w:sz w:val="22"/>
         </w:rPr>
-        <w:t>Este ensaio sustenta que a estrutura de vínculos previdenciários do município de Campos dos Goytacazes, conformada por sua economia política dependente do petróleo, produz um regime de visibilidade seletiva dos acidentes de trabalho no setor saúde. Nesse regime, categorias majoritariamente femininas, de menor remuneração e vínculo celetista tornam-se hipervisíveis na Comunicação de Acidente de Trabalho (CAT), ao passo que categorias de maior remuneração e vínculo estatutário permanecem institucionalmente invisíveis. Argumenta-se que essa assimetria constitui a manifestação local da distância entre o campo institucional da Saúde do Trabalhador e a questão estrutural da saúde dos trabalhadores, conforme a distinção proposta por Souza, Melo e Vasconcellos (2017). O campo opera dentro dos limites normativos postos, e a CAT é seu instrumento por excelência. A questão, contudo, é mais ampla. Inclui os acidentes e adoecimentos que o sistema não captura e cuja distribuição obedece a determinações de classe, gênero e raça que ultrapassam as fronteiras do campo. França (2014), ao correlacionar o Modelo Operário Italiano com as categorias gramscianas, demonstra que o saber operário e a participação dos trabalhadores são fundamentais para uma vigilância que supere os limites do registro administrativo. O presente ensaio mobiliza esse arcabouço conceitual para construir um diagnóstico estrutural da saúde do trabalhador no setor saúde de Campos, articulando oito bases de dados secundárias independentes. O território onde esse regime opera é precisamente o que se descreve a seguir.</w:t>
+        <w:t>Este ensaio sustenta que a estrutura de vínculos previdenciários do município de Campos dos Goytacazes, conformada por sua economia política dependente do petróleo, produz um regime de visibilidade seletiva dos acidentes de trabalho no setor saúde. Nesse regime, categorias majoritariamente femininas, de menor remuneração e vínculo celetista tornam-se hipervisíveis na Comunicação de Acidente de Trabalho (CAT), ao passo que categorias de maior remuneração e vínculo estatutário permanecem institucionalmente invisíveis. Argumenta-se que essa assimetria constitui a manifestação local da distância entre o campo institucional da Saúde do Trabalhador e a questão estrutural da saúde dos trabalhadores, conforme a distinção proposta por Souza, Melo e Vasconcellos (2017). O campo opera dentro dos limites normativos postos, e a CAT é seu instrumento por excelência. A questão, contudo, é mais ampla. Inclui os acidentes e adoecimentos que o sistema não captura e cuja distribuição obedece a determinações de classe, gênero e raça que ultrapassam as fronteiras do campo. França (2014), ao correlacionar o Modelo Operário Italiano com as categorias gramscianas, demonstra que o saber operário e a participação dos trabalhadores são fundamentais para uma vigilância que supere os limites do registro administrativo. O presente ensaio mobiliza esse arcabouço conceitual para construir um diagnóstico estrutural da saúde do trabalhador no setor saúde de Campos, articulando sistemas de informação epidemiológica, registros administrativos e indicadores socioeconômicos para construir um diagnóstico territorial da Saúde do Trabalhador. O território onde esse regime opera é precisamente o que se descreve a seguir.</w:t>
         <w:br/>
         <w:br/>
         <w:t>O município de Campos dos Goytacazes, maior do estado do Rio de Janeiro em extensão territorial, com 4.032,5 km², contava com 483.540 habitantes no Censo Demográfico de 2022 do IBGE e estimativa de 519.259 para 2025. Sua população se declara branca (42,1%), parda (40,1%) e preta (17,7%), com 3.083 quilombolas e 363 indígenas recenseados, segundo a tabela SIDRA 4714 do IBGE. O Índice de Desenvolvimento Humano Municipal era de 0,716 em 2010, abaixo da média estadual de 0,761, e 37,7% da população vivia com até meio salário mínimo per capita. O Produto Interno Bruto per capita de 2023 foi de R$ 88.831,26, segundo a tabela SIDRA 5938 do IBGE. Nesse contexto de riqueza concentrada e indicadores sociais frágeis, este estudo investiga os acidentes de trabalho entre os profissionais da saúde que operam a rede municipal de atendimento.</w:t>
@@ -2798,7 +2798,7 @@
           <w:i w:val="0"/>
           <w:sz w:val="22"/>
         </w:rPr>
-        <w:t>Este ensaio integra uma agenda mais ampla de investigação sobre a Saúde do Trabalhador em Campos dos Goytacazes. Seu propósito é construir o diagnóstico territorial e institucional necessário para estudos posteriores sobre processos de trabalho, adoecimento e vigilância. Trata-se de uma análise exploratória do território apoiada na triangulação de bases secundárias independentes, cujo objetivo é caracterizar a configuração contemporânea da saúde do trabalhador no setor saúde do município e identificar elementos estruturantes para investigações subsequentes. A base empírica principal foi reconstruída dos dados abertos da CAT do INSS, disponíveis no Portal de Dados Abertos do governo federal. Foram processados 58 arquivos, de julho de 2018 a outubro de 2025, totalizando 3.902.905 registros, com importação posicional e remoção de 938 duplicatas (401 hashes SHA-256). O recorte municipal utilizou código do empregador 330100 e UF Rio de Janeiro. A classificação ocupacional baseou-se na CBO 2002, com dicionário auditado de 458 códigos.</w:t>
+        <w:t>Este ensaio integra uma agenda mais ampla de investigação sobre a Saúde do Trabalhador em Campos dos Goytacazes. Seu propósito é construir o diagnóstico territorial e institucional necessário para estudos posteriores sobre processos de trabalho, adoecimento e vigilância. Trata-se de um ensaio analítico destinado à construção de um diagnóstico territorial da Saúde do Trabalhador, apoiado na triangulação de sistemas de informação epidemiológica, registros administrativos e indicadores socioeconômicos, cujo objetivo é caracterizar a configuração contemporânea da saúde do trabalhador no setor saúde do município e identificar elementos estruturantes para investigações subsequentes. A base empírica principal foi reconstruída dos dados abertos da CAT do INSS, disponíveis no Portal de Dados Abertos do governo federal. Foram processados 58 arquivos, de julho de 2018 a outubro de 2025, totalizando 3.902.905 registros, com importação posicional e remoção de 938 duplicatas (401 hashes SHA-256). O recorte municipal utilizou código do empregador 330100 e UF Rio de Janeiro. A classificação ocupacional baseou-se na CBO 2002, com dicionário auditado de 458 códigos.</w:t>
         <w:br/>
         <w:br/>
         <w:t xml:space="preserve">O denominador primário de força de trabalho proveio da RAIS, a Relação Anual de Informações Sociais, disponível no FTP do Ministério do Trabalho e Emprego. Como a RAIS captura vínculos celetistas ativos em 31 de dezembro de cada ano e a CAT cobre exclusivamente celetistas, numerador e denominador são comensuráveis. O denominador secundário proveio do CNES-PF, o Cadastro Nacional de Estabelecimentos de Saúde, obtido com o pacote </w:t>
@@ -2820,7 +2820,7 @@
         <w:t xml:space="preserve"> em R para a competência de dezembro de cada ano, acessado via FTP do DATASUS. O CNES-PF, por incluir vínculos estatutários, autônomos e de pessoa jurídica, não é comensurável com a CAT, sendo utilizado como ferramenta de triangulação para estimar a fração de vínculos não capturados. Células com menos de cinco registros foram suprimidas.</w:t>
         <w:br/>
         <w:br/>
-        <w:t xml:space="preserve">Para a caracterização do território, três abordagens complementares foram empregadas. A primeira compreendeu a descrição do perfil das CATs das profissões da saúde, com teste de sensibilidade em seis cenários para verificar a estabilidade dos achados. A segunda consistiu na análise da série temporal mensal de CATs (janeiro de 2018 a outubro de 2025), com decomposição clássica, Mann-Kendall, Dickey-Fuller e suavização LOESS com intervalo de confiança </w:t>
+        <w:t xml:space="preserve">Para examinar como o regime de visibilidade previdenciária se manifesta nos registros da CAT, três estratégias analíticas complementares foram empregadas. A primeira compreendeu a descrição do perfil das CATs das profissões da saúde, com teste de sensibilidade em seis cenários para verificar a estabilidade dos achados. A segunda consistiu na análise da série temporal mensal de CATs (janeiro de 2018 a outubro de 2025), com decomposição clássica, Mann-Kendall, Dickey-Fuller e suavização LOESS com intervalo de confiança </w:t>
       </w:r>
       <w:r>
         <w:rPr>

</xml_diff>

<commit_message>
v4.1: Times New Roman 12pt, referencias com 'Disponivel em' e 'Acesso em'
</commit_message>
<xml_diff>
--- a/documentos/artigo.docx
+++ b/documentos/artigo.docx
@@ -6275,7 +6275,7 @@
           <w:i w:val="0"/>
           <w:sz w:val="16"/>
         </w:rPr>
-        <w:t>. Dispõe sobre os Planos de Benefícios da Previdência Social. Brasília, DF, 1991.</w:t>
+        <w:t>. Dispõe sobre os Planos de Benefícios da Previdência Social. Brasília, DF, 1991. Disponível em: https://www.planalto.gov.br/ccivil_03/leis/l8213cons.htm. Acesso em: 19 jul. 2026.</w:t>
       </w:r>
     </w:p>
     <w:p>
@@ -6306,7 +6306,7 @@
           <w:i w:val="0"/>
           <w:sz w:val="16"/>
         </w:rPr>
-        <w:t>. Dispõe sobre a política energética nacional. Brasília, DF, 1997.</w:t>
+        <w:t>. Dispõe sobre a política energética nacional. Brasília, DF, 1997. Disponível em: https://www.planalto.gov.br/ccivil_03/leis/l9478.htm. Acesso em: 19 jul. 2026.</w:t>
       </w:r>
     </w:p>
     <w:p>
@@ -6337,7 +6337,7 @@
           <w:i w:val="0"/>
           <w:sz w:val="16"/>
         </w:rPr>
-        <w:t>, Rio de Janeiro, v. 11, n. 32, p. 89-113, 2014. DOI: 10.12957/rep.2013.10157.</w:t>
+        <w:t>, Rio de Janeiro, v. 11, n. 32, p. 89-113, 2014. DOI: 10.12957/rep.2013.10157. Disponível em: https://doi.org/10.12957/rep.2013.10157. Acesso em: 19 jul. 2026.</w:t>
       </w:r>
     </w:p>
     <w:p>
@@ -6368,7 +6368,7 @@
           <w:i w:val="0"/>
           <w:sz w:val="16"/>
         </w:rPr>
-        <w:t>, Rio de Janeiro, n. 27, 2024. DOI: 10.12957/cdf.2024.87352.</w:t>
+        <w:t>, Rio de Janeiro, n. 27, 2024. DOI: 10.12957/cdf.2024.87352. Disponível em: https://doi.org/10.12957/cdf.2024.87352. Acesso em: 19 jul. 2026.</w:t>
       </w:r>
     </w:p>
     <w:p>
@@ -6399,7 +6399,7 @@
           <w:i w:val="0"/>
           <w:sz w:val="16"/>
         </w:rPr>
-        <w:t>, Ijuí, v. 17, n. 46, p. 314-332, 2019. DOI: 10.21527/2237-6453.2019.46.314-332.</w:t>
+        <w:t>, Ijuí, v. 17, n. 46, p. 314-332, 2019. DOI: 10.21527/2237-6453.2019.46.314-332. Disponível em: https://doi.org/10.21527/2237-6453.2019.46.314-332. Acesso em: 19 jul. 2026.</w:t>
       </w:r>
     </w:p>
     <w:p>
@@ -6430,7 +6430,7 @@
           <w:i w:val="0"/>
           <w:sz w:val="16"/>
         </w:rPr>
-        <w:t>, Rio de Janeiro, v. 41, n. 113, p. 591-604, abr-jun 2017. DOI: 10.1590/0103-1104201711313.</w:t>
+        <w:t>, Rio de Janeiro, v. 41, n. 113, p. 591-604, abr-jun 2017. DOI: 10.1590/0103-1104201711313. Disponível em: https://doi.org/10.1590/0103-1104201711313. Acesso em: 19 jul. 2026.</w:t>
       </w:r>
     </w:p>
     <w:p>
@@ -6461,7 +6461,7 @@
           <w:i w:val="0"/>
           <w:sz w:val="16"/>
         </w:rPr>
-        <w:t>, São Paulo, v. 46, e1, 2021. DOI: 10.1590/2317-6369000028520.</w:t>
+        <w:t>, São Paulo, v. 46, e1, 2021. DOI: 10.1590/2317-6369000028520. Disponível em: https://doi.org/10.1590/2317-6369000028520. Acesso em: 19 jul. 2026.</w:t>
       </w:r>
     </w:p>
     <w:sectPr>
@@ -6842,7 +6842,7 @@
     </w:pPr>
     <w:rPr>
       <w:rFonts w:ascii="Times New Roman" w:hAnsi="Times New Roman"/>
-      <w:sz w:val="22"/>
+      <w:sz w:val="24"/>
     </w:rPr>
   </w:style>
   <w:style w:type="paragraph" w:styleId="Header">

</xml_diff>

<commit_message>
v4.2: recuo de primeira linha em todos os paragrafos (split \n\n), Oliveira (2004) reinserido na abertura e referencias
</commit_message>
<xml_diff>
--- a/documentos/artigo.docx
+++ b/documentos/artigo.docx
@@ -29,9 +29,21 @@
           <w:i w:val="0"/>
           <w:sz w:val="22"/>
         </w:rPr>
-        <w:t>Este ensaio sustenta que a estrutura de vínculos previdenciários do município de Campos dos Goytacazes, conformada por sua economia política dependente do petróleo, produz um regime de visibilidade seletiva dos acidentes de trabalho no setor saúde. Nesse regime, categorias majoritariamente femininas, de menor remuneração e vínculo celetista tornam-se hipervisíveis na Comunicação de Acidente de Trabalho (CAT), ao passo que categorias de maior remuneração e vínculo estatutário permanecem institucionalmente invisíveis. Argumenta-se que essa assimetria constitui a manifestação local da distância entre o campo institucional da Saúde do Trabalhador e a questão estrutural da saúde dos trabalhadores, conforme a distinção proposta por Souza, Melo e Vasconcellos (2017). O campo opera dentro dos limites normativos postos, e a CAT é seu instrumento por excelência. A questão, contudo, é mais ampla. Inclui os acidentes e adoecimentos que o sistema não captura e cuja distribuição obedece a determinações de classe, gênero e raça que ultrapassam as fronteiras do campo. França (2014), ao correlacionar o Modelo Operário Italiano com as categorias gramscianas, demonstra que o saber operário e a participação dos trabalhadores são fundamentais para uma vigilância que supere os limites do registro administrativo. O presente ensaio mobiliza esse arcabouço conceitual para construir um diagnóstico estrutural da saúde do trabalhador no setor saúde de Campos, articulando sistemas de informação epidemiológica, registros administrativos e indicadores socioeconômicos para construir um diagnóstico territorial da Saúde do Trabalhador. O território onde esse regime opera é precisamente o que se descreve a seguir.</w:t>
-        <w:br/>
-        <w:br/>
+        <w:t>Oliveira (2004) demonstra que as transformações no mundo do trabalho, desde a Revolução Industrial até os dias atuais, produzem padrões específicos de adoecimento a cada configuração histórica do processo produtivo. No setor saúde, essa dinâmica se expressa de forma particularmente aguda. Este ensaio sustenta que a estrutura de vínculos previdenciários do município de Campos dos Goytacazes, conformada por sua economia política dependente do petróleo, produz um regime de visibilidade seletiva dos acidentes de trabalho no setor saúde. Nesse regime, categorias majoritariamente femininas, de menor remuneração e vínculo celetista tornam-se hipervisíveis na Comunicação de Acidente de Trabalho (CAT), ao passo que categorias de maior remuneração e vínculo estatutário permanecem institucionalmente invisíveis. Argumenta-se que essa assimetria constitui a manifestação local da distância entre o campo institucional da Saúde do Trabalhador e a questão estrutural da saúde dos trabalhadores, conforme a distinção proposta por Souza, Melo e Vasconcellos (2017). O campo opera dentro dos limites normativos postos, e a CAT é seu instrumento por excelência. A questão, contudo, é mais ampla. Inclui os acidentes e adoecimentos que o sistema não captura e cuja distribuição obedece a determinações de classe, gênero e raça que ultrapassam as fronteiras do campo. França (2014), ao correlacionar o Modelo Operário Italiano com as categorias gramscianas, demonstra que o saber operário e a participação dos trabalhadores são fundamentais para uma vigilância que supere os limites do registro administrativo. O presente ensaio mobiliza esse arcabouço conceitual para construir um diagnóstico estrutural da saúde do trabalhador no setor saúde de Campos, articulando sistemas de informação epidemiológica, registros administrativos e indicadores socioeconômicos para construir um diagnóstico territorial da Saúde do Trabalhador. O território onde esse regime opera é precisamente o que se descreve a seguir.</w:t>
+      </w:r>
+    </w:p>
+    <w:p>
+      <w:pPr>
+        <w:spacing w:before="0" w:after="40"/>
+        <w:ind w:firstLine="709"/>
+        <w:jc w:val="both"/>
+      </w:pPr>
+      <w:r>
+        <w:rPr>
+          <w:b w:val="0"/>
+          <w:i w:val="0"/>
+          <w:sz w:val="22"/>
+        </w:rPr>
         <w:t>O município de Campos dos Goytacazes, maior do estado do Rio de Janeiro em extensão territorial, com 4.032,5 km², contava com 483.540 habitantes no Censo Demográfico de 2022 do IBGE e estimativa de 519.259 para 2025. Sua população se declara branca (42,1%), parda (40,1%) e preta (17,7%), com 3.083 quilombolas e 363 indígenas recenseados, segundo a tabela SIDRA 4714 do IBGE. O Índice de Desenvolvimento Humano Municipal era de 0,716 em 2010, abaixo da média estadual de 0,761, e 37,7% da população vivia com até meio salário mínimo per capita. O Produto Interno Bruto per capita de 2023 foi de R$ 88.831,26, segundo a tabela SIDRA 5938 do IBGE. Nesse contexto de riqueza concentrada e indicadores sociais frágeis, este estudo investiga os acidentes de trabalho entre os profissionais da saúde que operam a rede municipal de atendimento.</w:t>
       </w:r>
     </w:p>
@@ -48,8 +60,20 @@
           <w:sz w:val="22"/>
         </w:rPr>
         <w:t>O Índice de Progresso Social de Campos, calculado pelo IPS Brasil para 2024, 2025 e 2026 a partir de indicadores sociais e ambientais desagregados por município, mostra trajetória ambivalente, conforme a Tabela 1. O índice global passou de 62,37, em 2024, para 62,68, em 2026, com variação de 0,31 ponto. Saúde e Bem-estar avançou 1,47 ponto, de 57,43 para 58,90, e Acesso ao Conhecimento Básico avançou 3,41 pontos. Em contrapartida, Segurança Pessoal recuou 3,58 pontos, de 56,35 para 52,77, Inclusão Social caiu 2,70 pontos e as Hospitalizações por Condições Sensíveis à Atenção Primária aumentaram 45%, de 610 para 883 por 100 mil habitantes. Nesse sentido, o município avança nas dimensões de infraestrutura de saúde e conhecimento, mas recua em segurança e inclusão, configurando um paradoxo que interpela diretamente as condições de trabalho de quem opera os serviços cuja qualidade melhora.</w:t>
-        <w:br/>
-        <w:br/>
+      </w:r>
+    </w:p>
+    <w:p>
+      <w:pPr>
+        <w:spacing w:before="0" w:after="40"/>
+        <w:ind w:firstLine="709"/>
+        <w:jc w:val="both"/>
+      </w:pPr>
+      <w:r>
+        <w:rPr>
+          <w:b w:val="0"/>
+          <w:i w:val="0"/>
+          <w:sz w:val="22"/>
+        </w:rPr>
         <w:t xml:space="preserve">O perfil de mortalidade do município, obtido do SIM/DATASUS e processado com o pacote </w:t>
       </w:r>
       <w:r>
@@ -2156,8 +2180,20 @@
           <w:sz w:val="22"/>
         </w:rPr>
         <w:t xml:space="preserve"> e participações especiais, nos termos da Lei nº 9.478/1997, que expandiram o setor público municipal. O terceiro ciclo, em curso desde 2014, caracteriza-se pela estagnação da atividade petrolífera e pelo declínio dos repasses. A estrutura empresarial do município, captada pelo Cadastro Central de Empresas do IBGE, o CEMPRE 2024, registra 16.776 empresas atuantes, 114.466 pessoas ocupadas, das quais 93.366 assalariadas, e salário médio mensal de 2,2 salários mínimos. O setor de saúde humana e serviços sociais respondia por 1.544 estabelecimentos e 15.002 postos de trabalho, conforme o CEMPRE 2024. O PIB municipal, a preços correntes, oscilou de R$ 58,4 bilhões em 2013 para R$ 23,9 bilhões em 2020 e R$ 43,0 bilhões em 2023, de acordo com a tabela SIDRA 5938 do IBGE, acompanhando a volatilidade do petróleo.</w:t>
-        <w:br/>
-        <w:br/>
+      </w:r>
+    </w:p>
+    <w:p>
+      <w:pPr>
+        <w:spacing w:before="0" w:after="40"/>
+        <w:ind w:firstLine="709"/>
+        <w:jc w:val="both"/>
+      </w:pPr>
+      <w:r>
+        <w:rPr>
+          <w:b w:val="0"/>
+          <w:i w:val="0"/>
+          <w:sz w:val="22"/>
+        </w:rPr>
         <w:t>As finanças públicas municipais evidenciam dependência estrutural de transferências intergovernamentais. Em 2024, as receitas brutas somaram R$ 2,95 bilhões, das quais 71,0% provieram de transferências correntes, segundo o Siconfi da Secretaria do Tesouro Nacional. As despesas por natureza econômica, obtidas do Portal da Transparência da Prefeitura de Campos para o período de 2020 a 2025, na rubrica Despesas por Desdobro, revelam a coexistência de dois regimes previdenciários no funcionalismo municipal. Haja vista a relevância desse achado para o estudo, detalham-se os montantes. O Regime Próprio de Previdência Social, o RPPS, cobre os servidores estatutários e suas contribuições patronais somaram R$ 61,2 milhões em 2024, acrescidas de R$ 2,5 milhões de aporte para cobertura do déficit atuarial. Em 2025, as contribuições ao RPPS para pessoal ativo alcançaram R$ 74,7 milhões, conforme a rubrica 31911308 do Portal da Transparência. O Regime Geral de Previdência Social, o INSS, cobre os trabalhadores celetistas, com contribuições patronais de R$ 18,3 milhões em 2024 e R$ 4,8 milhões em 2025 na principal rubrica do Regime Geral, segundo os mesmos registros do Portal da Transparência de Campos. A razão entre as contribuições, RPPS sobre INSS, foi de 3,3 em 2024 e ampliou-se para aproximadamente 15,5 em 2025, indicando que a predominância orçamentária do vínculo estatutário se acentuou no último exercício. A Comunicação de Acidente de Trabalho, a CAT, instituída pela Lei nº 8.213 de 1991, é instrumento exclusivo do INSS. Os acidentes e adoecimentos dos servidores estatutários, vinculados ao RPPS e geridos pelo PREVICAMPOS, não são capturados por essa fonte. Essa dualidade de regimes produz uma assimetria fundamental de visibilidade previdenciária que estrutura os achados deste ensaio, conforme a Tabela 3.</w:t>
       </w:r>
     </w:p>
@@ -2799,8 +2835,20 @@
           <w:sz w:val="22"/>
         </w:rPr>
         <w:t>Este ensaio integra uma agenda mais ampla de investigação sobre a Saúde do Trabalhador em Campos dos Goytacazes. Seu propósito é construir o diagnóstico territorial e institucional necessário para estudos posteriores sobre processos de trabalho, adoecimento e vigilância. Trata-se de um ensaio analítico destinado à construção de um diagnóstico territorial da Saúde do Trabalhador, apoiado na triangulação de sistemas de informação epidemiológica, registros administrativos e indicadores socioeconômicos, cujo objetivo é caracterizar a configuração contemporânea da saúde do trabalhador no setor saúde do município e identificar elementos estruturantes para investigações subsequentes. A base empírica principal foi reconstruída dos dados abertos da CAT do INSS, disponíveis no Portal de Dados Abertos do governo federal. Foram processados 58 arquivos, de julho de 2018 a outubro de 2025, totalizando 3.902.905 registros, com importação posicional e remoção de 938 duplicatas (401 hashes SHA-256). O recorte municipal utilizou código do empregador 330100 e UF Rio de Janeiro. A classificação ocupacional baseou-se na CBO 2002, com dicionário auditado de 458 códigos.</w:t>
-        <w:br/>
-        <w:br/>
+      </w:r>
+    </w:p>
+    <w:p>
+      <w:pPr>
+        <w:spacing w:before="0" w:after="40"/>
+        <w:ind w:firstLine="709"/>
+        <w:jc w:val="both"/>
+      </w:pPr>
+      <w:r>
+        <w:rPr>
+          <w:b w:val="0"/>
+          <w:i w:val="0"/>
+          <w:sz w:val="22"/>
+        </w:rPr>
         <w:t xml:space="preserve">O denominador primário de força de trabalho proveio da RAIS, a Relação Anual de Informações Sociais, disponível no FTP do Ministério do Trabalho e Emprego. Como a RAIS captura vínculos celetistas ativos em 31 de dezembro de cada ano e a CAT cobre exclusivamente celetistas, numerador e denominador são comensuráveis. O denominador secundário proveio do CNES-PF, o Cadastro Nacional de Estabelecimentos de Saúde, obtido com o pacote </w:t>
       </w:r>
       <w:r>
@@ -2818,8 +2866,20 @@
           <w:sz w:val="22"/>
         </w:rPr>
         <w:t xml:space="preserve"> em R para a competência de dezembro de cada ano, acessado via FTP do DATASUS. O CNES-PF, por incluir vínculos estatutários, autônomos e de pessoa jurídica, não é comensurável com a CAT, sendo utilizado como ferramenta de triangulação para estimar a fração de vínculos não capturados. Células com menos de cinco registros foram suprimidas.</w:t>
-        <w:br/>
-        <w:br/>
+      </w:r>
+    </w:p>
+    <w:p>
+      <w:pPr>
+        <w:spacing w:before="0" w:after="40"/>
+        <w:ind w:firstLine="709"/>
+        <w:jc w:val="both"/>
+      </w:pPr>
+      <w:r>
+        <w:rPr>
+          <w:b w:val="0"/>
+          <w:i w:val="0"/>
+          <w:sz w:val="22"/>
+        </w:rPr>
         <w:t xml:space="preserve">Para examinar como o regime de visibilidade previdenciária se manifesta nos registros da CAT, três estratégias analíticas complementares foram empregadas. A primeira compreendeu a descrição do perfil das CATs das profissões da saúde, com teste de sensibilidade em seis cenários para verificar a estabilidade dos achados. A segunda consistiu na análise da série temporal mensal de CATs (janeiro de 2018 a outubro de 2025), com decomposição clássica, Mann-Kendall, Dickey-Fuller e suavização LOESS com intervalo de confiança </w:t>
       </w:r>
       <w:r>
@@ -2853,11 +2913,35 @@
           <w:sz w:val="22"/>
         </w:rPr>
         <w:t>), grafos bipartidos e teste qui-quadrado com V de Cramér. Essas abordagens identificam regularidades que contribuam para a caracterização do regime de visibilidade previdenciária. Adicionalmente, 46 arquivos do SINAN/DATASUS (126,5 MB, nove agravos relacionados ao trabalho, 2018-2022, FTP do DATASUS) foram obtidos para cotejo futuro entre notificação compulsória e comunicação de acidente.</w:t>
-        <w:br/>
-        <w:br/>
+      </w:r>
+    </w:p>
+    <w:p>
+      <w:pPr>
+        <w:spacing w:before="0" w:after="40"/>
+        <w:ind w:firstLine="709"/>
+        <w:jc w:val="both"/>
+      </w:pPr>
+      <w:r>
+        <w:rPr>
+          <w:b w:val="0"/>
+          <w:i w:val="0"/>
+          <w:sz w:val="22"/>
+        </w:rPr>
         <w:t>Das 5.066 CATs vinculadas a empregadores de Campos dos Goytacazes entre 2018 e 2025, 1.144, equivalentes a 22,6%, correspondem às profissões da saúde, 26 às multiprofissionais, 184, ou 3,6%, a registros sem CBO válido e 3.712 às demais ocupações, das quais 427 em estabelecimentos de saúde. A distribuição é fortemente assimétrica, conforme a Tabela 4. A enfermagem concentra 84,4% dos registros, sendo 70,2% de técnicos e auxiliares e 14,2% de enfermeiros. Seguem-se os técnicos de diagnóstico e laboratório, com 6,8%, e a fisioterapia, com 2,6%. A medicina responde por 1,0%, o que representa 12 CATs em oito anos. Predominam mulheres, com 85,7%, e a idade mediana é de 36 anos. Os acidentes típicos somam 81,9% e os de trajeto, 17,1%. Ferimentos de punho e mãos lideram os diagnósticos, CID-10 S61, com 25,1%, sendo o dedo a parte atingida em 43,9% dos casos, seguidos da exposição a doenças transmissíveis, código Z20, com 21,9%. Agentes infecciosos respondem por 26,9% dos causadores. Quase todos os empregadores pertencem à CNAE 86-87, com 95,4%, e há dominância hospitalar, CNAE 8610, com 76,8%. O empregador emitiu 97,0% das CATs, com mediana de um dia entre o acidente e a emissão. Houve um óbito e 1,0% de doenças relacionadas ao trabalho.</w:t>
-        <w:br/>
-        <w:br/>
+      </w:r>
+    </w:p>
+    <w:p>
+      <w:pPr>
+        <w:spacing w:before="0" w:after="40"/>
+        <w:ind w:firstLine="709"/>
+        <w:jc w:val="both"/>
+      </w:pPr>
+      <w:r>
+        <w:rPr>
+          <w:b w:val="0"/>
+          <w:i w:val="0"/>
+          <w:sz w:val="22"/>
+        </w:rPr>
         <w:t>A análise de sensibilidade em seis cenários confirmou a estabilidade dos achados, conforme a Tabela 5. Em todos os cenários, a participação da enfermagem variou entre 84,4% e 86,3% e a hierarquia das três principais categorias, a saber, técnicos de enfermagem, enfermeiros e profissionais de diagnóstico e laboratório, permaneceu inalterada. As Figuras 1 e 2 ilustram esses resultados.</w:t>
       </w:r>
     </w:p>
@@ -2906,8 +2990,20 @@
           <w:sz w:val="22"/>
         </w:rPr>
         <w:t xml:space="preserve"> (2021). Nos períodos pré-pandemia, de janeiro de 2018 a fevereiro de 2020, e pós-pandemia, de janeiro de 2022 a outubro de 2025, a tendência não foi significativa, com p igual a 0,21 e p igual a 0,40, respectivamente.</w:t>
-        <w:br/>
-        <w:br/>
+      </w:r>
+    </w:p>
+    <w:p>
+      <w:pPr>
+        <w:spacing w:before="0" w:after="40"/>
+        <w:ind w:firstLine="709"/>
+        <w:jc w:val="both"/>
+      </w:pPr>
+      <w:r>
+        <w:rPr>
+          <w:b w:val="0"/>
+          <w:i w:val="0"/>
+          <w:sz w:val="22"/>
+        </w:rPr>
         <w:t>O teste de Dickey-Fuller aumentado rejeitou a hipótese de raiz unitária, com ADF igual a -5,80 e p inferior a 0,001, indicando que a série é estacionária. A média mensal de CATs foi de 13,8 no período pré-pandemia, de julho de 2018 a fevereiro de 2020, 14,5 no período crítico da covid-19 e 10,9 no biênio pós-pandemia, de 2022 a 2023. O teste t de Welch detectou diferença significativa apenas entre os períodos crítico e pós-pandemia, com t igual a 2,04 e p igual a 0,048. O coeficiente de variação aumentou de 37,5% no pré-pandemia para 63,3% no pós-pandemia, indicando maior irregularidade das notificações nos anos recentes, possivelmente associada às oscilações de cobertura da fonte. A Tabela 6 e as Figuras 3 e 4 apresentam esses resultados.</w:t>
       </w:r>
     </w:p>
@@ -6175,14 +6271,50 @@
           <w:sz w:val="22"/>
         </w:rPr>
         <w:t>Os achados convergem para a demonstração de que o perfil de acidentes capturado pela CAT constitui, antes de tudo, um perfil do regime de visibilidade previdenciária do município. A concentração de 84,4% das CATs na enfermagem de nível técnico expressa, simultaneamente, a exposição diferencial ao risco determinada por um processo de trabalho que concentra a execução manual do cuidado em categorias subordinadas na hierarquia ocupacional, e a captura diferencial pelo sistema de informação determinada pelo regime previdenciário. Duas cadeias predominantes de risco prevenível emergem dessa concentração. A cadeia perfurocortante, que articula ferramenta manual ao código S61, e a cadeia biológica, que articula agente infeccioso ao código Z20, dependem de dispositivos de segurança e de disponibilidade contínua de equipamentos de proteção individual. A razão de prevalência elevada de causas externas, de 3,02, na enfermagem técnica é consistente com a execução manual e corporal do cuidado, que envolve punção venosa, administração de medicamentos e manipulação de perfurocortantes.</w:t>
-        <w:br/>
-        <w:br/>
+      </w:r>
+    </w:p>
+    <w:p>
+      <w:pPr>
+        <w:spacing w:before="0" w:after="40"/>
+        <w:ind w:firstLine="709"/>
+        <w:jc w:val="both"/>
+      </w:pPr>
+      <w:r>
+        <w:rPr>
+          <w:b w:val="0"/>
+          <w:i w:val="0"/>
+          <w:sz w:val="22"/>
+        </w:rPr>
         <w:t>A concentração das CATs na enfermagem e a quase ausência da medicina, com apenas 1,0%, refletem a estrutura de vínculos previdenciários do município. A razão RPPS sobre INSS, que passou de 3,3 em 2024 para aproximadamente 15,5 em 2025, conforme os dados do Portal da Transparência de Campos, materializa essa assimetria e indica seu agravamento recente. As densidades de comunicação calculadas com denominador RAIS, que é comensurável com a CAT por ambos cobrirem celetistas, situaram-se entre 30,3 e 43,9 CATs por 1.000 vínculos ativos de técnicos de enfermagem, conforme a RAIS disponível no FTP do Ministério do Trabalho, e em apenas 3,7 por 1.000 para a medicina em 2019, único ano com numerador igual ou superior a cinco nessa categoria. As densidades com denominador CNES, que não é comensurável por incluir todos os vínculos, foram sistematicamente menores, mas a razão entre as densidades RAIS e CNES quantifica a fração de acidentes ocultos pelo desenho institucional da CAT.</w:t>
-        <w:br/>
-        <w:br/>
+      </w:r>
+    </w:p>
+    <w:p>
+      <w:pPr>
+        <w:spacing w:before="0" w:after="40"/>
+        <w:ind w:firstLine="709"/>
+        <w:jc w:val="both"/>
+      </w:pPr>
+      <w:r>
+        <w:rPr>
+          <w:b w:val="0"/>
+          <w:i w:val="0"/>
+          <w:sz w:val="22"/>
+        </w:rPr>
         <w:t>Conforme exposto na abertura deste ensaio, Souza, Melo e Vasconcellos (2017) oferecem uma distinção entre campo e questão que ilumina esses achados. A CAT constitui um instrumento do campo, pois captura o que o desenho institucional permite ver. A questão, contudo, é mais ampla, uma vez que os acidentes e adoecimentos dos estatutários, autônomos, informais e terceirizados existem independentemente de sua captura pelo sistema. A dualidade de regimes previdenciários em Campos, com uma razão RPPS sobre INSS que se ampliou de 3,3 para 15,5 entre 2024 e 2025, é a manifestação local dessa distância entre o campo e a questão.</w:t>
-        <w:br/>
-        <w:br/>
+      </w:r>
+    </w:p>
+    <w:p>
+      <w:pPr>
+        <w:spacing w:before="0" w:after="40"/>
+        <w:ind w:firstLine="709"/>
+        <w:jc w:val="both"/>
+      </w:pPr>
+      <w:r>
+        <w:rPr>
+          <w:b w:val="0"/>
+          <w:i w:val="0"/>
+          <w:sz w:val="22"/>
+        </w:rPr>
         <w:t>O pensamento de Antonio Gramsci, particularmente sua concepção do trabalho como princípio educativo e dos trabalhadores como produtores de conhecimento, oferece fundamentos para uma vigilância que articule processo de trabalho, determinação social da saúde e participação dos trabalhadores. França (2014), ao correlacionar o Modelo Operário Italiano com as categorias gramscianas, demonstra que o saber operário e a socialização do conhecimento foram fundamentais na construção de uma metodologia de ação contra a nocividade no trabalho protagonizada pelo próprio trabalhador. A saúde, nessa perspectiva, é algo a ser construído com participação direta. A vigilância baseada exclusivamente nos registros da CAT opera na institucionalidade consolidada, ao passo que a vigilância que incorpora a participação ativa dos trabalhadores na identificação dos riscos e na proposição de soluções avança na direção contra-hegemônica demonstrada pela experiência do Modelo Operário Italiano.</w:t>
       </w:r>
     </w:p>
@@ -6307,6 +6439,37 @@
           <w:sz w:val="16"/>
         </w:rPr>
         <w:t>. Dispõe sobre a política energética nacional. Brasília, DF, 1997. Disponível em: https://www.planalto.gov.br/ccivil_03/leis/l9478.htm. Acesso em: 19 jul. 2026.</w:t>
+      </w:r>
+    </w:p>
+    <w:p>
+      <w:pPr>
+        <w:spacing w:before="0" w:after="20"/>
+        <w:ind w:firstLine="0"/>
+        <w:jc w:val="left"/>
+      </w:pPr>
+      <w:r>
+        <w:rPr>
+          <w:b w:val="0"/>
+          <w:i w:val="0"/>
+          <w:sz w:val="16"/>
+        </w:rPr>
+        <w:t xml:space="preserve">OLIVEIRA, E. M. Transformações no mundo do trabalho, da Revolução Industrial aos nossos dias. </w:t>
+      </w:r>
+      <w:r>
+        <w:rPr>
+          <w:b/>
+          <w:i w:val="0"/>
+          <w:sz w:val="16"/>
+        </w:rPr>
+        <w:t>Caminhos de Geografia</w:t>
+      </w:r>
+      <w:r>
+        <w:rPr>
+          <w:b w:val="0"/>
+          <w:i w:val="0"/>
+          <w:sz w:val="16"/>
+        </w:rPr>
+        <w:t>, Uberlândia, v. 6, n. 11, p. 84-96, fev. 2004. DOI: 10.14393/rcg51115327. Disponível em: https://doi.org/10.14393/rcg51115327. Acesso em: 19 jul. 2026.</w:t>
       </w:r>
     </w:p>
     <w:p>

</xml_diff>